<commit_message>
Split presentation script across five members with Tristan as leader
Co-Authored-By: Claude Opus 5.5 <noreply@anthropic.com>
Claude-Session: https://claude.ai/code/session_01HzDX4JgA3rVyVP8b16fmMh
</commit_message>
<xml_diff>
--- a/deepfake_hitl/docs/Presentation_Script.docx
+++ b/deepfake_hitl/docs/Presentation_Script.docx
@@ -71,7 +71,14 @@
         <w:t xml:space="preserve">–  </w:t>
       </w:r>
       <w:r>
-        <w:t xml:space="preserve">Speaker assignments are a suggestion. Swap them freely, but each person should own a whole block.</w:t>
+        <w:rPr>
+          <w:b/>
+          <w:bCs/>
+        </w:rPr>
+        <w:t xml:space="preserve">Tristan (leader)</w:t>
+      </w:r>
+      <w:r>
+        <w:t xml:space="preserve"> opens, presents the conceptual framework, closes, and leads the Q&amp;A. Each member owns one continuous block, and every block ends with a hand-off line naming the next speaker.</w:t>
       </w:r>
     </w:p>
     <w:p>
@@ -160,9 +167,9 @@
         </w:tblBorders>
       </w:tblPr>
       <w:tblGrid>
-        <w:gridCol w:w="1820"/>
-        <w:gridCol w:w="3962"/>
-        <w:gridCol w:w="3856"/>
+        <w:gridCol w:w="1780"/>
+        <w:gridCol w:w="3876"/>
+        <w:gridCol w:w="3982"/>
       </w:tblGrid>
       <w:tr>
         <w:trPr>
@@ -170,7 +177,7 @@
         </w:trPr>
         <w:tc>
           <w:tcPr>
-            <w:tcW w:type="dxa" w:w="1820"/>
+            <w:tcW w:type="dxa" w:w="1780"/>
             <w:tcBorders>
               <w:top w:val="single" w:color="BFBFBF" w:sz="4"/>
               <w:left w:val="single" w:color="BFBFBF" w:sz="4"/>
@@ -202,7 +209,7 @@
         </w:tc>
         <w:tc>
           <w:tcPr>
-            <w:tcW w:type="dxa" w:w="3962"/>
+            <w:tcW w:type="dxa" w:w="3876"/>
             <w:tcBorders>
               <w:top w:val="single" w:color="BFBFBF" w:sz="4"/>
               <w:left w:val="single" w:color="BFBFBF" w:sz="4"/>
@@ -234,7 +241,7 @@
         </w:tc>
         <w:tc>
           <w:tcPr>
-            <w:tcW w:type="dxa" w:w="3856"/>
+            <w:tcW w:type="dxa" w:w="3982"/>
             <w:tcBorders>
               <w:top w:val="single" w:color="BFBFBF" w:sz="4"/>
               <w:left w:val="single" w:color="BFBFBF" w:sz="4"/>
@@ -271,7 +278,7 @@
         </w:trPr>
         <w:tc>
           <w:tcPr>
-            <w:tcW w:type="dxa" w:w="1820"/>
+            <w:tcW w:type="dxa" w:w="1780"/>
             <w:tcBorders>
               <w:top w:val="single" w:color="BFBFBF" w:sz="4"/>
               <w:left w:val="single" w:color="BFBFBF" w:sz="4"/>
@@ -300,7 +307,7 @@
         </w:tc>
         <w:tc>
           <w:tcPr>
-            <w:tcW w:type="dxa" w:w="3962"/>
+            <w:tcW w:type="dxa" w:w="3876"/>
             <w:tcBorders>
               <w:top w:val="single" w:color="BFBFBF" w:sz="4"/>
               <w:left w:val="single" w:color="BFBFBF" w:sz="4"/>
@@ -329,30 +336,32 @@
         </w:tc>
         <w:tc>
           <w:tcPr>
-            <w:tcW w:type="dxa" w:w="3856"/>
-            <w:tcBorders>
-              <w:top w:val="single" w:color="BFBFBF" w:sz="4"/>
-              <w:left w:val="single" w:color="BFBFBF" w:sz="4"/>
-              <w:bottom w:val="single" w:color="BFBFBF" w:sz="4"/>
-              <w:right w:val="single" w:color="BFBFBF" w:sz="4"/>
-            </w:tcBorders>
-            <w:tcMar>
-              <w:top w:type="dxa" w:w="60"/>
-              <w:left w:type="dxa" w:w="100"/>
-              <w:bottom w:type="dxa" w:w="60"/>
-              <w:right w:type="dxa" w:w="100"/>
-            </w:tcMar>
-          </w:tcPr>
-          <w:p>
-            <w:pPr>
-              <w:spacing w:after="0"/>
-            </w:pPr>
-            <w:r>
-              <w:rPr>
-                <w:sz w:val="19"/>
-                <w:szCs w:val="19"/>
-              </w:rPr>
-              <w:t xml:space="preserve">Alexander</w:t>
+            <w:tcW w:type="dxa" w:w="3982"/>
+            <w:tcBorders>
+              <w:top w:val="single" w:color="BFBFBF" w:sz="4"/>
+              <w:left w:val="single" w:color="BFBFBF" w:sz="4"/>
+              <w:bottom w:val="single" w:color="BFBFBF" w:sz="4"/>
+              <w:right w:val="single" w:color="BFBFBF" w:sz="4"/>
+            </w:tcBorders>
+            <w:tcMar>
+              <w:top w:type="dxa" w:w="60"/>
+              <w:left w:type="dxa" w:w="100"/>
+              <w:bottom w:type="dxa" w:w="60"/>
+              <w:right w:type="dxa" w:w="100"/>
+            </w:tcMar>
+          </w:tcPr>
+          <w:p>
+            <w:pPr>
+              <w:spacing w:after="0"/>
+            </w:pPr>
+            <w:r>
+              <w:rPr>
+                <w:b/>
+                <w:bCs/>
+                <w:sz w:val="19"/>
+                <w:szCs w:val="19"/>
+              </w:rPr>
+              <w:t xml:space="preserve">Tristan (leader)</w:t>
             </w:r>
           </w:p>
         </w:tc>
@@ -363,7 +372,7 @@
         </w:trPr>
         <w:tc>
           <w:tcPr>
-            <w:tcW w:type="dxa" w:w="1820"/>
+            <w:tcW w:type="dxa" w:w="1780"/>
             <w:tcBorders>
               <w:top w:val="single" w:color="BFBFBF" w:sz="4"/>
               <w:left w:val="single" w:color="BFBFBF" w:sz="4"/>
@@ -392,7 +401,7 @@
         </w:tc>
         <w:tc>
           <w:tcPr>
-            <w:tcW w:type="dxa" w:w="3962"/>
+            <w:tcW w:type="dxa" w:w="3876"/>
             <w:tcBorders>
               <w:top w:val="single" w:color="BFBFBF" w:sz="4"/>
               <w:left w:val="single" w:color="BFBFBF" w:sz="4"/>
@@ -421,30 +430,30 @@
         </w:tc>
         <w:tc>
           <w:tcPr>
-            <w:tcW w:type="dxa" w:w="3856"/>
-            <w:tcBorders>
-              <w:top w:val="single" w:color="BFBFBF" w:sz="4"/>
-              <w:left w:val="single" w:color="BFBFBF" w:sz="4"/>
-              <w:bottom w:val="single" w:color="BFBFBF" w:sz="4"/>
-              <w:right w:val="single" w:color="BFBFBF" w:sz="4"/>
-            </w:tcBorders>
-            <w:tcMar>
-              <w:top w:type="dxa" w:w="60"/>
-              <w:left w:type="dxa" w:w="100"/>
-              <w:bottom w:type="dxa" w:w="60"/>
-              <w:right w:type="dxa" w:w="100"/>
-            </w:tcMar>
-          </w:tcPr>
-          <w:p>
-            <w:pPr>
-              <w:spacing w:after="0"/>
-            </w:pPr>
-            <w:r>
-              <w:rPr>
-                <w:sz w:val="19"/>
-                <w:szCs w:val="19"/>
-              </w:rPr>
-              <w:t xml:space="preserve">Alexander</w:t>
+            <w:tcW w:type="dxa" w:w="3982"/>
+            <w:tcBorders>
+              <w:top w:val="single" w:color="BFBFBF" w:sz="4"/>
+              <w:left w:val="single" w:color="BFBFBF" w:sz="4"/>
+              <w:bottom w:val="single" w:color="BFBFBF" w:sz="4"/>
+              <w:right w:val="single" w:color="BFBFBF" w:sz="4"/>
+            </w:tcBorders>
+            <w:tcMar>
+              <w:top w:type="dxa" w:w="60"/>
+              <w:left w:type="dxa" w:w="100"/>
+              <w:bottom w:type="dxa" w:w="60"/>
+              <w:right w:type="dxa" w:w="100"/>
+            </w:tcMar>
+          </w:tcPr>
+          <w:p>
+            <w:pPr>
+              <w:spacing w:after="0"/>
+            </w:pPr>
+            <w:r>
+              <w:rPr>
+                <w:sz w:val="19"/>
+                <w:szCs w:val="19"/>
+              </w:rPr>
+              <w:t xml:space="preserve">Genesis</w:t>
             </w:r>
           </w:p>
         </w:tc>
@@ -455,7 +464,7 @@
         </w:trPr>
         <w:tc>
           <w:tcPr>
-            <w:tcW w:type="dxa" w:w="1820"/>
+            <w:tcW w:type="dxa" w:w="1780"/>
             <w:tcBorders>
               <w:top w:val="single" w:color="BFBFBF" w:sz="4"/>
               <w:left w:val="single" w:color="BFBFBF" w:sz="4"/>
@@ -484,7 +493,7 @@
         </w:tc>
         <w:tc>
           <w:tcPr>
-            <w:tcW w:type="dxa" w:w="3962"/>
+            <w:tcW w:type="dxa" w:w="3876"/>
             <w:tcBorders>
               <w:top w:val="single" w:color="BFBFBF" w:sz="4"/>
               <w:left w:val="single" w:color="BFBFBF" w:sz="4"/>
@@ -513,7 +522,7 @@
         </w:tc>
         <w:tc>
           <w:tcPr>
-            <w:tcW w:type="dxa" w:w="3856"/>
+            <w:tcW w:type="dxa" w:w="3982"/>
             <w:tcBorders>
               <w:top w:val="single" w:color="BFBFBF" w:sz="4"/>
               <w:left w:val="single" w:color="BFBFBF" w:sz="4"/>
@@ -547,7 +556,7 @@
         </w:trPr>
         <w:tc>
           <w:tcPr>
-            <w:tcW w:type="dxa" w:w="1820"/>
+            <w:tcW w:type="dxa" w:w="1780"/>
             <w:tcBorders>
               <w:top w:val="single" w:color="BFBFBF" w:sz="4"/>
               <w:left w:val="single" w:color="BFBFBF" w:sz="4"/>
@@ -576,7 +585,7 @@
         </w:tc>
         <w:tc>
           <w:tcPr>
-            <w:tcW w:type="dxa" w:w="3962"/>
+            <w:tcW w:type="dxa" w:w="3876"/>
             <w:tcBorders>
               <w:top w:val="single" w:color="BFBFBF" w:sz="4"/>
               <w:left w:val="single" w:color="BFBFBF" w:sz="4"/>
@@ -605,7 +614,7 @@
         </w:tc>
         <w:tc>
           <w:tcPr>
-            <w:tcW w:type="dxa" w:w="3856"/>
+            <w:tcW w:type="dxa" w:w="3982"/>
             <w:tcBorders>
               <w:top w:val="single" w:color="BFBFBF" w:sz="4"/>
               <w:left w:val="single" w:color="BFBFBF" w:sz="4"/>
@@ -639,7 +648,7 @@
         </w:trPr>
         <w:tc>
           <w:tcPr>
-            <w:tcW w:type="dxa" w:w="1820"/>
+            <w:tcW w:type="dxa" w:w="1780"/>
             <w:tcBorders>
               <w:top w:val="single" w:color="BFBFBF" w:sz="4"/>
               <w:left w:val="single" w:color="BFBFBF" w:sz="4"/>
@@ -668,7 +677,7 @@
         </w:tc>
         <w:tc>
           <w:tcPr>
-            <w:tcW w:type="dxa" w:w="3962"/>
+            <w:tcW w:type="dxa" w:w="3876"/>
             <w:tcBorders>
               <w:top w:val="single" w:color="BFBFBF" w:sz="4"/>
               <w:left w:val="single" w:color="BFBFBF" w:sz="4"/>
@@ -697,30 +706,30 @@
         </w:tc>
         <w:tc>
           <w:tcPr>
-            <w:tcW w:type="dxa" w:w="3856"/>
-            <w:tcBorders>
-              <w:top w:val="single" w:color="BFBFBF" w:sz="4"/>
-              <w:left w:val="single" w:color="BFBFBF" w:sz="4"/>
-              <w:bottom w:val="single" w:color="BFBFBF" w:sz="4"/>
-              <w:right w:val="single" w:color="BFBFBF" w:sz="4"/>
-            </w:tcBorders>
-            <w:tcMar>
-              <w:top w:type="dxa" w:w="60"/>
-              <w:left w:type="dxa" w:w="100"/>
-              <w:bottom w:type="dxa" w:w="60"/>
-              <w:right w:type="dxa" w:w="100"/>
-            </w:tcMar>
-          </w:tcPr>
-          <w:p>
-            <w:pPr>
-              <w:spacing w:after="0"/>
-            </w:pPr>
-            <w:r>
-              <w:rPr>
-                <w:sz w:val="19"/>
-                <w:szCs w:val="19"/>
-              </w:rPr>
-              <w:t xml:space="preserve">Genesis</w:t>
+            <w:tcW w:type="dxa" w:w="3982"/>
+            <w:tcBorders>
+              <w:top w:val="single" w:color="BFBFBF" w:sz="4"/>
+              <w:left w:val="single" w:color="BFBFBF" w:sz="4"/>
+              <w:bottom w:val="single" w:color="BFBFBF" w:sz="4"/>
+              <w:right w:val="single" w:color="BFBFBF" w:sz="4"/>
+            </w:tcBorders>
+            <w:tcMar>
+              <w:top w:type="dxa" w:w="60"/>
+              <w:left w:type="dxa" w:w="100"/>
+              <w:bottom w:type="dxa" w:w="60"/>
+              <w:right w:type="dxa" w:w="100"/>
+            </w:tcMar>
+          </w:tcPr>
+          <w:p>
+            <w:pPr>
+              <w:spacing w:after="0"/>
+            </w:pPr>
+            <w:r>
+              <w:rPr>
+                <w:sz w:val="19"/>
+                <w:szCs w:val="19"/>
+              </w:rPr>
+              <w:t xml:space="preserve">Charles</w:t>
             </w:r>
           </w:p>
         </w:tc>
@@ -731,7 +740,7 @@
         </w:trPr>
         <w:tc>
           <w:tcPr>
-            <w:tcW w:type="dxa" w:w="1820"/>
+            <w:tcW w:type="dxa" w:w="1780"/>
             <w:tcBorders>
               <w:top w:val="single" w:color="BFBFBF" w:sz="4"/>
               <w:left w:val="single" w:color="BFBFBF" w:sz="4"/>
@@ -760,7 +769,7 @@
         </w:tc>
         <w:tc>
           <w:tcPr>
-            <w:tcW w:type="dxa" w:w="3962"/>
+            <w:tcW w:type="dxa" w:w="3876"/>
             <w:tcBorders>
               <w:top w:val="single" w:color="BFBFBF" w:sz="4"/>
               <w:left w:val="single" w:color="BFBFBF" w:sz="4"/>
@@ -789,7 +798,7 @@
         </w:tc>
         <w:tc>
           <w:tcPr>
-            <w:tcW w:type="dxa" w:w="3856"/>
+            <w:tcW w:type="dxa" w:w="3982"/>
             <w:tcBorders>
               <w:top w:val="single" w:color="BFBFBF" w:sz="4"/>
               <w:left w:val="single" w:color="BFBFBF" w:sz="4"/>
@@ -823,7 +832,7 @@
         </w:trPr>
         <w:tc>
           <w:tcPr>
-            <w:tcW w:type="dxa" w:w="1820"/>
+            <w:tcW w:type="dxa" w:w="1780"/>
             <w:tcBorders>
               <w:top w:val="single" w:color="BFBFBF" w:sz="4"/>
               <w:left w:val="single" w:color="BFBFBF" w:sz="4"/>
@@ -852,7 +861,7 @@
         </w:tc>
         <w:tc>
           <w:tcPr>
-            <w:tcW w:type="dxa" w:w="3962"/>
+            <w:tcW w:type="dxa" w:w="3876"/>
             <w:tcBorders>
               <w:top w:val="single" w:color="BFBFBF" w:sz="4"/>
               <w:left w:val="single" w:color="BFBFBF" w:sz="4"/>
@@ -881,7 +890,7 @@
         </w:tc>
         <w:tc>
           <w:tcPr>
-            <w:tcW w:type="dxa" w:w="3856"/>
+            <w:tcW w:type="dxa" w:w="3982"/>
             <w:tcBorders>
               <w:top w:val="single" w:color="BFBFBF" w:sz="4"/>
               <w:left w:val="single" w:color="BFBFBF" w:sz="4"/>
@@ -915,7 +924,7 @@
         </w:trPr>
         <w:tc>
           <w:tcPr>
-            <w:tcW w:type="dxa" w:w="1820"/>
+            <w:tcW w:type="dxa" w:w="1780"/>
             <w:tcBorders>
               <w:top w:val="single" w:color="BFBFBF" w:sz="4"/>
               <w:left w:val="single" w:color="BFBFBF" w:sz="4"/>
@@ -944,7 +953,7 @@
         </w:tc>
         <w:tc>
           <w:tcPr>
-            <w:tcW w:type="dxa" w:w="3962"/>
+            <w:tcW w:type="dxa" w:w="3876"/>
             <w:tcBorders>
               <w:top w:val="single" w:color="BFBFBF" w:sz="4"/>
               <w:left w:val="single" w:color="BFBFBF" w:sz="4"/>
@@ -973,7 +982,7 @@
         </w:tc>
         <w:tc>
           <w:tcPr>
-            <w:tcW w:type="dxa" w:w="3856"/>
+            <w:tcW w:type="dxa" w:w="3982"/>
             <w:tcBorders>
               <w:top w:val="single" w:color="BFBFBF" w:sz="4"/>
               <w:left w:val="single" w:color="BFBFBF" w:sz="4"/>
@@ -1007,7 +1016,7 @@
         </w:trPr>
         <w:tc>
           <w:tcPr>
-            <w:tcW w:type="dxa" w:w="1820"/>
+            <w:tcW w:type="dxa" w:w="1780"/>
             <w:tcBorders>
               <w:top w:val="single" w:color="BFBFBF" w:sz="4"/>
               <w:left w:val="single" w:color="BFBFBF" w:sz="4"/>
@@ -1036,7 +1045,7 @@
         </w:tc>
         <w:tc>
           <w:tcPr>
-            <w:tcW w:type="dxa" w:w="3962"/>
+            <w:tcW w:type="dxa" w:w="3876"/>
             <w:tcBorders>
               <w:top w:val="single" w:color="BFBFBF" w:sz="4"/>
               <w:left w:val="single" w:color="BFBFBF" w:sz="4"/>
@@ -1065,30 +1074,32 @@
         </w:tc>
         <w:tc>
           <w:tcPr>
-            <w:tcW w:type="dxa" w:w="3856"/>
-            <w:tcBorders>
-              <w:top w:val="single" w:color="BFBFBF" w:sz="4"/>
-              <w:left w:val="single" w:color="BFBFBF" w:sz="4"/>
-              <w:bottom w:val="single" w:color="BFBFBF" w:sz="4"/>
-              <w:right w:val="single" w:color="BFBFBF" w:sz="4"/>
-            </w:tcBorders>
-            <w:tcMar>
-              <w:top w:type="dxa" w:w="60"/>
-              <w:left w:type="dxa" w:w="100"/>
-              <w:bottom w:type="dxa" w:w="60"/>
-              <w:right w:type="dxa" w:w="100"/>
-            </w:tcMar>
-          </w:tcPr>
-          <w:p>
-            <w:pPr>
-              <w:spacing w:after="0"/>
-            </w:pPr>
-            <w:r>
-              <w:rPr>
-                <w:sz w:val="19"/>
-                <w:szCs w:val="19"/>
-              </w:rPr>
-              <w:t xml:space="preserve">Tristan</w:t>
+            <w:tcW w:type="dxa" w:w="3982"/>
+            <w:tcBorders>
+              <w:top w:val="single" w:color="BFBFBF" w:sz="4"/>
+              <w:left w:val="single" w:color="BFBFBF" w:sz="4"/>
+              <w:bottom w:val="single" w:color="BFBFBF" w:sz="4"/>
+              <w:right w:val="single" w:color="BFBFBF" w:sz="4"/>
+            </w:tcBorders>
+            <w:tcMar>
+              <w:top w:type="dxa" w:w="60"/>
+              <w:left w:type="dxa" w:w="100"/>
+              <w:bottom w:type="dxa" w:w="60"/>
+              <w:right w:type="dxa" w:w="100"/>
+            </w:tcMar>
+          </w:tcPr>
+          <w:p>
+            <w:pPr>
+              <w:spacing w:after="0"/>
+            </w:pPr>
+            <w:r>
+              <w:rPr>
+                <w:b/>
+                <w:bCs/>
+                <w:sz w:val="19"/>
+                <w:szCs w:val="19"/>
+              </w:rPr>
+              <w:t xml:space="preserve">Tristan (leader)</w:t>
             </w:r>
           </w:p>
         </w:tc>
@@ -1099,7 +1110,7 @@
         </w:trPr>
         <w:tc>
           <w:tcPr>
-            <w:tcW w:type="dxa" w:w="1820"/>
+            <w:tcW w:type="dxa" w:w="1780"/>
             <w:tcBorders>
               <w:top w:val="single" w:color="BFBFBF" w:sz="4"/>
               <w:left w:val="single" w:color="BFBFBF" w:sz="4"/>
@@ -1128,7 +1139,7 @@
         </w:tc>
         <w:tc>
           <w:tcPr>
-            <w:tcW w:type="dxa" w:w="3962"/>
+            <w:tcW w:type="dxa" w:w="3876"/>
             <w:tcBorders>
               <w:top w:val="single" w:color="BFBFBF" w:sz="4"/>
               <w:left w:val="single" w:color="BFBFBF" w:sz="4"/>
@@ -1157,30 +1168,30 @@
         </w:tc>
         <w:tc>
           <w:tcPr>
-            <w:tcW w:type="dxa" w:w="3856"/>
-            <w:tcBorders>
-              <w:top w:val="single" w:color="BFBFBF" w:sz="4"/>
-              <w:left w:val="single" w:color="BFBFBF" w:sz="4"/>
-              <w:bottom w:val="single" w:color="BFBFBF" w:sz="4"/>
-              <w:right w:val="single" w:color="BFBFBF" w:sz="4"/>
-            </w:tcBorders>
-            <w:tcMar>
-              <w:top w:type="dxa" w:w="60"/>
-              <w:left w:type="dxa" w:w="100"/>
-              <w:bottom w:type="dxa" w:w="60"/>
-              <w:right w:type="dxa" w:w="100"/>
-            </w:tcMar>
-          </w:tcPr>
-          <w:p>
-            <w:pPr>
-              <w:spacing w:after="0"/>
-            </w:pPr>
-            <w:r>
-              <w:rPr>
-                <w:sz w:val="19"/>
-                <w:szCs w:val="19"/>
-              </w:rPr>
-              <w:t xml:space="preserve">Tristan</w:t>
+            <w:tcW w:type="dxa" w:w="3982"/>
+            <w:tcBorders>
+              <w:top w:val="single" w:color="BFBFBF" w:sz="4"/>
+              <w:left w:val="single" w:color="BFBFBF" w:sz="4"/>
+              <w:bottom w:val="single" w:color="BFBFBF" w:sz="4"/>
+              <w:right w:val="single" w:color="BFBFBF" w:sz="4"/>
+            </w:tcBorders>
+            <w:tcMar>
+              <w:top w:type="dxa" w:w="60"/>
+              <w:left w:type="dxa" w:w="100"/>
+              <w:bottom w:type="dxa" w:w="60"/>
+              <w:right w:type="dxa" w:w="100"/>
+            </w:tcMar>
+          </w:tcPr>
+          <w:p>
+            <w:pPr>
+              <w:spacing w:after="0"/>
+            </w:pPr>
+            <w:r>
+              <w:rPr>
+                <w:sz w:val="19"/>
+                <w:szCs w:val="19"/>
+              </w:rPr>
+              <w:t xml:space="preserve">Mark</w:t>
             </w:r>
           </w:p>
         </w:tc>
@@ -1191,7 +1202,7 @@
         </w:trPr>
         <w:tc>
           <w:tcPr>
-            <w:tcW w:type="dxa" w:w="1820"/>
+            <w:tcW w:type="dxa" w:w="1780"/>
             <w:tcBorders>
               <w:top w:val="single" w:color="BFBFBF" w:sz="4"/>
               <w:left w:val="single" w:color="BFBFBF" w:sz="4"/>
@@ -1220,7 +1231,7 @@
         </w:tc>
         <w:tc>
           <w:tcPr>
-            <w:tcW w:type="dxa" w:w="3962"/>
+            <w:tcW w:type="dxa" w:w="3876"/>
             <w:tcBorders>
               <w:top w:val="single" w:color="BFBFBF" w:sz="4"/>
               <w:left w:val="single" w:color="BFBFBF" w:sz="4"/>
@@ -1249,30 +1260,30 @@
         </w:tc>
         <w:tc>
           <w:tcPr>
-            <w:tcW w:type="dxa" w:w="3856"/>
-            <w:tcBorders>
-              <w:top w:val="single" w:color="BFBFBF" w:sz="4"/>
-              <w:left w:val="single" w:color="BFBFBF" w:sz="4"/>
-              <w:bottom w:val="single" w:color="BFBFBF" w:sz="4"/>
-              <w:right w:val="single" w:color="BFBFBF" w:sz="4"/>
-            </w:tcBorders>
-            <w:tcMar>
-              <w:top w:type="dxa" w:w="60"/>
-              <w:left w:type="dxa" w:w="100"/>
-              <w:bottom w:type="dxa" w:w="60"/>
-              <w:right w:type="dxa" w:w="100"/>
-            </w:tcMar>
-          </w:tcPr>
-          <w:p>
-            <w:pPr>
-              <w:spacing w:after="0"/>
-            </w:pPr>
-            <w:r>
-              <w:rPr>
-                <w:sz w:val="19"/>
-                <w:szCs w:val="19"/>
-              </w:rPr>
-              <w:t xml:space="preserve">Tristan</w:t>
+            <w:tcW w:type="dxa" w:w="3982"/>
+            <w:tcBorders>
+              <w:top w:val="single" w:color="BFBFBF" w:sz="4"/>
+              <w:left w:val="single" w:color="BFBFBF" w:sz="4"/>
+              <w:bottom w:val="single" w:color="BFBFBF" w:sz="4"/>
+              <w:right w:val="single" w:color="BFBFBF" w:sz="4"/>
+            </w:tcBorders>
+            <w:tcMar>
+              <w:top w:type="dxa" w:w="60"/>
+              <w:left w:type="dxa" w:w="100"/>
+              <w:bottom w:type="dxa" w:w="60"/>
+              <w:right w:type="dxa" w:w="100"/>
+            </w:tcMar>
+          </w:tcPr>
+          <w:p>
+            <w:pPr>
+              <w:spacing w:after="0"/>
+            </w:pPr>
+            <w:r>
+              <w:rPr>
+                <w:sz w:val="19"/>
+                <w:szCs w:val="19"/>
+              </w:rPr>
+              <w:t xml:space="preserve">Mark</w:t>
             </w:r>
           </w:p>
         </w:tc>
@@ -1283,7 +1294,7 @@
         </w:trPr>
         <w:tc>
           <w:tcPr>
-            <w:tcW w:type="dxa" w:w="1820"/>
+            <w:tcW w:type="dxa" w:w="1780"/>
             <w:tcBorders>
               <w:top w:val="single" w:color="BFBFBF" w:sz="4"/>
               <w:left w:val="single" w:color="BFBFBF" w:sz="4"/>
@@ -1312,7 +1323,7 @@
         </w:tc>
         <w:tc>
           <w:tcPr>
-            <w:tcW w:type="dxa" w:w="3962"/>
+            <w:tcW w:type="dxa" w:w="3876"/>
             <w:tcBorders>
               <w:top w:val="single" w:color="BFBFBF" w:sz="4"/>
               <w:left w:val="single" w:color="BFBFBF" w:sz="4"/>
@@ -1341,30 +1352,30 @@
         </w:tc>
         <w:tc>
           <w:tcPr>
-            <w:tcW w:type="dxa" w:w="3856"/>
-            <w:tcBorders>
-              <w:top w:val="single" w:color="BFBFBF" w:sz="4"/>
-              <w:left w:val="single" w:color="BFBFBF" w:sz="4"/>
-              <w:bottom w:val="single" w:color="BFBFBF" w:sz="4"/>
-              <w:right w:val="single" w:color="BFBFBF" w:sz="4"/>
-            </w:tcBorders>
-            <w:tcMar>
-              <w:top w:type="dxa" w:w="60"/>
-              <w:left w:type="dxa" w:w="100"/>
-              <w:bottom w:type="dxa" w:w="60"/>
-              <w:right w:type="dxa" w:w="100"/>
-            </w:tcMar>
-          </w:tcPr>
-          <w:p>
-            <w:pPr>
-              <w:spacing w:after="0"/>
-            </w:pPr>
-            <w:r>
-              <w:rPr>
-                <w:sz w:val="19"/>
-                <w:szCs w:val="19"/>
-              </w:rPr>
-              <w:t xml:space="preserve">Tristan</w:t>
+            <w:tcW w:type="dxa" w:w="3982"/>
+            <w:tcBorders>
+              <w:top w:val="single" w:color="BFBFBF" w:sz="4"/>
+              <w:left w:val="single" w:color="BFBFBF" w:sz="4"/>
+              <w:bottom w:val="single" w:color="BFBFBF" w:sz="4"/>
+              <w:right w:val="single" w:color="BFBFBF" w:sz="4"/>
+            </w:tcBorders>
+            <w:tcMar>
+              <w:top w:type="dxa" w:w="60"/>
+              <w:left w:type="dxa" w:w="100"/>
+              <w:bottom w:type="dxa" w:w="60"/>
+              <w:right w:type="dxa" w:w="100"/>
+            </w:tcMar>
+          </w:tcPr>
+          <w:p>
+            <w:pPr>
+              <w:spacing w:after="0"/>
+            </w:pPr>
+            <w:r>
+              <w:rPr>
+                <w:sz w:val="19"/>
+                <w:szCs w:val="19"/>
+              </w:rPr>
+              <w:t xml:space="preserve">Mark</w:t>
             </w:r>
           </w:p>
         </w:tc>
@@ -1375,7 +1386,7 @@
         </w:trPr>
         <w:tc>
           <w:tcPr>
-            <w:tcW w:type="dxa" w:w="1820"/>
+            <w:tcW w:type="dxa" w:w="1780"/>
             <w:tcBorders>
               <w:top w:val="single" w:color="BFBFBF" w:sz="4"/>
               <w:left w:val="single" w:color="BFBFBF" w:sz="4"/>
@@ -1404,7 +1415,7 @@
         </w:tc>
         <w:tc>
           <w:tcPr>
-            <w:tcW w:type="dxa" w:w="3962"/>
+            <w:tcW w:type="dxa" w:w="3876"/>
             <w:tcBorders>
               <w:top w:val="single" w:color="BFBFBF" w:sz="4"/>
               <w:left w:val="single" w:color="BFBFBF" w:sz="4"/>
@@ -1433,7 +1444,7 @@
         </w:tc>
         <w:tc>
           <w:tcPr>
-            <w:tcW w:type="dxa" w:w="3856"/>
+            <w:tcW w:type="dxa" w:w="3982"/>
             <w:tcBorders>
               <w:top w:val="single" w:color="BFBFBF" w:sz="4"/>
               <w:left w:val="single" w:color="BFBFBF" w:sz="4"/>
@@ -1467,7 +1478,7 @@
         </w:trPr>
         <w:tc>
           <w:tcPr>
-            <w:tcW w:type="dxa" w:w="1820"/>
+            <w:tcW w:type="dxa" w:w="1780"/>
             <w:tcBorders>
               <w:top w:val="single" w:color="BFBFBF" w:sz="4"/>
               <w:left w:val="single" w:color="BFBFBF" w:sz="4"/>
@@ -1498,7 +1509,7 @@
         </w:tc>
         <w:tc>
           <w:tcPr>
-            <w:tcW w:type="dxa" w:w="3962"/>
+            <w:tcW w:type="dxa" w:w="3876"/>
             <w:tcBorders>
               <w:top w:val="single" w:color="BFBFBF" w:sz="4"/>
               <w:left w:val="single" w:color="BFBFBF" w:sz="4"/>
@@ -1529,7 +1540,7 @@
         </w:tc>
         <w:tc>
           <w:tcPr>
-            <w:tcW w:type="dxa" w:w="3856"/>
+            <w:tcW w:type="dxa" w:w="3982"/>
             <w:tcBorders>
               <w:top w:val="single" w:color="BFBFBF" w:sz="4"/>
               <w:left w:val="single" w:color="BFBFBF" w:sz="4"/>
@@ -1554,7 +1565,14 @@
                 <w:sz w:val="19"/>
                 <w:szCs w:val="19"/>
               </w:rPr>
-              <w:t xml:space="preserve">Alexander drives · Mark narrates</w:t>
+              <w:t xml:space="preserve">Alexander</w:t>
+            </w:r>
+            <w:r>
+              <w:rPr>
+                <w:sz w:val="19"/>
+                <w:szCs w:val="19"/>
+              </w:rPr>
+              <w:t xml:space="preserve"> (Mark = backup operator)</w:t>
             </w:r>
           </w:p>
         </w:tc>
@@ -1565,7 +1583,7 @@
         </w:trPr>
         <w:tc>
           <w:tcPr>
-            <w:tcW w:type="dxa" w:w="1820"/>
+            <w:tcW w:type="dxa" w:w="1780"/>
             <w:tcBorders>
               <w:top w:val="single" w:color="BFBFBF" w:sz="4"/>
               <w:left w:val="single" w:color="BFBFBF" w:sz="4"/>
@@ -1594,7 +1612,7 @@
         </w:tc>
         <w:tc>
           <w:tcPr>
-            <w:tcW w:type="dxa" w:w="3962"/>
+            <w:tcW w:type="dxa" w:w="3876"/>
             <w:tcBorders>
               <w:top w:val="single" w:color="BFBFBF" w:sz="4"/>
               <w:left w:val="single" w:color="BFBFBF" w:sz="4"/>
@@ -1623,30 +1641,32 @@
         </w:tc>
         <w:tc>
           <w:tcPr>
-            <w:tcW w:type="dxa" w:w="3856"/>
-            <w:tcBorders>
-              <w:top w:val="single" w:color="BFBFBF" w:sz="4"/>
-              <w:left w:val="single" w:color="BFBFBF" w:sz="4"/>
-              <w:bottom w:val="single" w:color="BFBFBF" w:sz="4"/>
-              <w:right w:val="single" w:color="BFBFBF" w:sz="4"/>
-            </w:tcBorders>
-            <w:tcMar>
-              <w:top w:type="dxa" w:w="60"/>
-              <w:left w:type="dxa" w:w="100"/>
-              <w:bottom w:type="dxa" w:w="60"/>
-              <w:right w:type="dxa" w:w="100"/>
-            </w:tcMar>
-          </w:tcPr>
-          <w:p>
-            <w:pPr>
-              <w:spacing w:after="0"/>
-            </w:pPr>
-            <w:r>
-              <w:rPr>
-                <w:sz w:val="19"/>
-                <w:szCs w:val="19"/>
-              </w:rPr>
-              <w:t xml:space="preserve">Mark</w:t>
+            <w:tcW w:type="dxa" w:w="3982"/>
+            <w:tcBorders>
+              <w:top w:val="single" w:color="BFBFBF" w:sz="4"/>
+              <w:left w:val="single" w:color="BFBFBF" w:sz="4"/>
+              <w:bottom w:val="single" w:color="BFBFBF" w:sz="4"/>
+              <w:right w:val="single" w:color="BFBFBF" w:sz="4"/>
+            </w:tcBorders>
+            <w:tcMar>
+              <w:top w:type="dxa" w:w="60"/>
+              <w:left w:type="dxa" w:w="100"/>
+              <w:bottom w:type="dxa" w:w="60"/>
+              <w:right w:type="dxa" w:w="100"/>
+            </w:tcMar>
+          </w:tcPr>
+          <w:p>
+            <w:pPr>
+              <w:spacing w:after="0"/>
+            </w:pPr>
+            <w:r>
+              <w:rPr>
+                <w:b/>
+                <w:bCs/>
+                <w:sz w:val="19"/>
+                <w:szCs w:val="19"/>
+              </w:rPr>
+              <w:t xml:space="preserve">Tristan (leader)</w:t>
             </w:r>
           </w:p>
         </w:tc>
@@ -1657,7 +1677,7 @@
         </w:trPr>
         <w:tc>
           <w:tcPr>
-            <w:tcW w:type="dxa" w:w="1820"/>
+            <w:tcW w:type="dxa" w:w="1780"/>
             <w:tcBorders>
               <w:top w:val="single" w:color="BFBFBF" w:sz="4"/>
               <w:left w:val="single" w:color="BFBFBF" w:sz="4"/>
@@ -1686,59 +1706,61 @@
         </w:tc>
         <w:tc>
           <w:tcPr>
-            <w:tcW w:type="dxa" w:w="3962"/>
-            <w:tcBorders>
-              <w:top w:val="single" w:color="BFBFBF" w:sz="4"/>
-              <w:left w:val="single" w:color="BFBFBF" w:sz="4"/>
-              <w:bottom w:val="single" w:color="BFBFBF" w:sz="4"/>
-              <w:right w:val="single" w:color="BFBFBF" w:sz="4"/>
-            </w:tcBorders>
-            <w:tcMar>
-              <w:top w:type="dxa" w:w="60"/>
-              <w:left w:type="dxa" w:w="100"/>
-              <w:bottom w:type="dxa" w:w="60"/>
-              <w:right w:type="dxa" w:w="100"/>
-            </w:tcMar>
-          </w:tcPr>
-          <w:p>
-            <w:pPr>
-              <w:spacing w:after="0"/>
-            </w:pPr>
-            <w:r>
-              <w:rPr>
-                <w:sz w:val="19"/>
-                <w:szCs w:val="19"/>
-              </w:rPr>
-              <w:t xml:space="preserve">15 · Thank You</w:t>
-            </w:r>
-          </w:p>
-        </w:tc>
-        <w:tc>
-          <w:tcPr>
-            <w:tcW w:type="dxa" w:w="3856"/>
-            <w:tcBorders>
-              <w:top w:val="single" w:color="BFBFBF" w:sz="4"/>
-              <w:left w:val="single" w:color="BFBFBF" w:sz="4"/>
-              <w:bottom w:val="single" w:color="BFBFBF" w:sz="4"/>
-              <w:right w:val="single" w:color="BFBFBF" w:sz="4"/>
-            </w:tcBorders>
-            <w:tcMar>
-              <w:top w:type="dxa" w:w="60"/>
-              <w:left w:type="dxa" w:w="100"/>
-              <w:bottom w:type="dxa" w:w="60"/>
-              <w:right w:type="dxa" w:w="100"/>
-            </w:tcMar>
-          </w:tcPr>
-          <w:p>
-            <w:pPr>
-              <w:spacing w:after="0"/>
-            </w:pPr>
-            <w:r>
-              <w:rPr>
-                <w:sz w:val="19"/>
-                <w:szCs w:val="19"/>
-              </w:rPr>
-              <w:t xml:space="preserve">Alexander</w:t>
+            <w:tcW w:type="dxa" w:w="3876"/>
+            <w:tcBorders>
+              <w:top w:val="single" w:color="BFBFBF" w:sz="4"/>
+              <w:left w:val="single" w:color="BFBFBF" w:sz="4"/>
+              <w:bottom w:val="single" w:color="BFBFBF" w:sz="4"/>
+              <w:right w:val="single" w:color="BFBFBF" w:sz="4"/>
+            </w:tcBorders>
+            <w:tcMar>
+              <w:top w:type="dxa" w:w="60"/>
+              <w:left w:type="dxa" w:w="100"/>
+              <w:bottom w:type="dxa" w:w="60"/>
+              <w:right w:type="dxa" w:w="100"/>
+            </w:tcMar>
+          </w:tcPr>
+          <w:p>
+            <w:pPr>
+              <w:spacing w:after="0"/>
+            </w:pPr>
+            <w:r>
+              <w:rPr>
+                <w:sz w:val="19"/>
+                <w:szCs w:val="19"/>
+              </w:rPr>
+              <w:t xml:space="preserve">15 · Thank You + opens Q&amp;A</w:t>
+            </w:r>
+          </w:p>
+        </w:tc>
+        <w:tc>
+          <w:tcPr>
+            <w:tcW w:type="dxa" w:w="3982"/>
+            <w:tcBorders>
+              <w:top w:val="single" w:color="BFBFBF" w:sz="4"/>
+              <w:left w:val="single" w:color="BFBFBF" w:sz="4"/>
+              <w:bottom w:val="single" w:color="BFBFBF" w:sz="4"/>
+              <w:right w:val="single" w:color="BFBFBF" w:sz="4"/>
+            </w:tcBorders>
+            <w:tcMar>
+              <w:top w:type="dxa" w:w="60"/>
+              <w:left w:type="dxa" w:w="100"/>
+              <w:bottom w:type="dxa" w:w="60"/>
+              <w:right w:type="dxa" w:w="100"/>
+            </w:tcMar>
+          </w:tcPr>
+          <w:p>
+            <w:pPr>
+              <w:spacing w:after="0"/>
+            </w:pPr>
+            <w:r>
+              <w:rPr>
+                <w:b/>
+                <w:bCs/>
+                <w:sz w:val="19"/>
+                <w:szCs w:val="19"/>
+              </w:rPr>
+              <w:t xml:space="preserve">Tristan (leader)</w:t>
             </w:r>
           </w:p>
         </w:tc>
@@ -1750,8 +1772,790 @@
       </w:pPr>
     </w:p>
     <w:p>
-      <w:r>
-        <w:t xml:space="preserve">The demo is where time usually runs over. If you're behind, shorten Slides 6 and 8, never the demo.</w:t>
+      <w:pPr>
+        <w:pStyle w:val="Heading2"/>
+      </w:pPr>
+      <w:r>
+        <w:t xml:space="preserve">Per-member summary</w:t>
+      </w:r>
+    </w:p>
+    <w:tbl>
+      <w:tblPr>
+        <w:tblW w:type="dxa" w:w="9638"/>
+        <w:tblBorders>
+          <w:top w:val="single" w:color="auto" w:sz="4"/>
+          <w:left w:val="single" w:color="auto" w:sz="4"/>
+          <w:bottom w:val="single" w:color="auto" w:sz="4"/>
+          <w:right w:val="single" w:color="auto" w:sz="4"/>
+          <w:insideH w:val="single" w:color="auto" w:sz="4"/>
+          <w:insideV w:val="single" w:color="auto" w:sz="4"/>
+        </w:tblBorders>
+      </w:tblPr>
+      <w:tblGrid>
+        <w:gridCol w:w="2502"/>
+        <w:gridCol w:w="4633"/>
+        <w:gridCol w:w="1297"/>
+        <w:gridCol w:w="1206"/>
+      </w:tblGrid>
+      <w:tr>
+        <w:trPr>
+          <w:tblHeader/>
+        </w:trPr>
+        <w:tc>
+          <w:tcPr>
+            <w:tcW w:type="dxa" w:w="2502"/>
+            <w:tcBorders>
+              <w:top w:val="single" w:color="BFBFBF" w:sz="4"/>
+              <w:left w:val="single" w:color="BFBFBF" w:sz="4"/>
+              <w:bottom w:val="single" w:color="BFBFBF" w:sz="4"/>
+              <w:right w:val="single" w:color="BFBFBF" w:sz="4"/>
+            </w:tcBorders>
+            <w:shd w:fill="D9E2F3" w:color="auto" w:val="clear"/>
+            <w:tcMar>
+              <w:top w:type="dxa" w:w="60"/>
+              <w:left w:type="dxa" w:w="100"/>
+              <w:bottom w:type="dxa" w:w="60"/>
+              <w:right w:type="dxa" w:w="100"/>
+            </w:tcMar>
+          </w:tcPr>
+          <w:p>
+            <w:pPr>
+              <w:spacing w:after="0"/>
+            </w:pPr>
+            <w:r>
+              <w:rPr>
+                <w:b/>
+                <w:bCs/>
+                <w:sz w:val="19"/>
+                <w:szCs w:val="19"/>
+              </w:rPr>
+              <w:t xml:space="preserve">Member</w:t>
+            </w:r>
+          </w:p>
+        </w:tc>
+        <w:tc>
+          <w:tcPr>
+            <w:tcW w:type="dxa" w:w="4633"/>
+            <w:tcBorders>
+              <w:top w:val="single" w:color="BFBFBF" w:sz="4"/>
+              <w:left w:val="single" w:color="BFBFBF" w:sz="4"/>
+              <w:bottom w:val="single" w:color="BFBFBF" w:sz="4"/>
+              <w:right w:val="single" w:color="BFBFBF" w:sz="4"/>
+            </w:tcBorders>
+            <w:shd w:fill="D9E2F3" w:color="auto" w:val="clear"/>
+            <w:tcMar>
+              <w:top w:type="dxa" w:w="60"/>
+              <w:left w:type="dxa" w:w="100"/>
+              <w:bottom w:type="dxa" w:w="60"/>
+              <w:right w:type="dxa" w:w="100"/>
+            </w:tcMar>
+          </w:tcPr>
+          <w:p>
+            <w:pPr>
+              <w:spacing w:after="0"/>
+            </w:pPr>
+            <w:r>
+              <w:rPr>
+                <w:b/>
+                <w:bCs/>
+                <w:sz w:val="19"/>
+                <w:szCs w:val="19"/>
+              </w:rPr>
+              <w:t xml:space="preserve">Role</w:t>
+            </w:r>
+          </w:p>
+        </w:tc>
+        <w:tc>
+          <w:tcPr>
+            <w:tcW w:type="dxa" w:w="1297"/>
+            <w:tcBorders>
+              <w:top w:val="single" w:color="BFBFBF" w:sz="4"/>
+              <w:left w:val="single" w:color="BFBFBF" w:sz="4"/>
+              <w:bottom w:val="single" w:color="BFBFBF" w:sz="4"/>
+              <w:right w:val="single" w:color="BFBFBF" w:sz="4"/>
+            </w:tcBorders>
+            <w:shd w:fill="D9E2F3" w:color="auto" w:val="clear"/>
+            <w:tcMar>
+              <w:top w:type="dxa" w:w="60"/>
+              <w:left w:type="dxa" w:w="100"/>
+              <w:bottom w:type="dxa" w:w="60"/>
+              <w:right w:type="dxa" w:w="100"/>
+            </w:tcMar>
+          </w:tcPr>
+          <w:p>
+            <w:pPr>
+              <w:spacing w:after="0"/>
+            </w:pPr>
+            <w:r>
+              <w:rPr>
+                <w:b/>
+                <w:bCs/>
+                <w:sz w:val="19"/>
+                <w:szCs w:val="19"/>
+              </w:rPr>
+              <w:t xml:space="preserve">Slides</w:t>
+            </w:r>
+          </w:p>
+        </w:tc>
+        <w:tc>
+          <w:tcPr>
+            <w:tcW w:type="dxa" w:w="1206"/>
+            <w:tcBorders>
+              <w:top w:val="single" w:color="BFBFBF" w:sz="4"/>
+              <w:left w:val="single" w:color="BFBFBF" w:sz="4"/>
+              <w:bottom w:val="single" w:color="BFBFBF" w:sz="4"/>
+              <w:right w:val="single" w:color="BFBFBF" w:sz="4"/>
+            </w:tcBorders>
+            <w:shd w:fill="D9E2F3" w:color="auto" w:val="clear"/>
+            <w:tcMar>
+              <w:top w:type="dxa" w:w="60"/>
+              <w:left w:type="dxa" w:w="100"/>
+              <w:bottom w:type="dxa" w:w="60"/>
+              <w:right w:type="dxa" w:w="100"/>
+            </w:tcMar>
+          </w:tcPr>
+          <w:p>
+            <w:pPr>
+              <w:spacing w:after="0"/>
+            </w:pPr>
+            <w:r>
+              <w:rPr>
+                <w:b/>
+                <w:bCs/>
+                <w:sz w:val="19"/>
+                <w:szCs w:val="19"/>
+              </w:rPr>
+              <w:t xml:space="preserve">Speaking time</w:t>
+            </w:r>
+          </w:p>
+        </w:tc>
+      </w:tr>
+      <w:tr>
+        <w:trPr>
+          <w:tblHeader w:val="off"/>
+        </w:trPr>
+        <w:tc>
+          <w:tcPr>
+            <w:tcW w:type="dxa" w:w="2502"/>
+            <w:tcBorders>
+              <w:top w:val="single" w:color="BFBFBF" w:sz="4"/>
+              <w:left w:val="single" w:color="BFBFBF" w:sz="4"/>
+              <w:bottom w:val="single" w:color="BFBFBF" w:sz="4"/>
+              <w:right w:val="single" w:color="BFBFBF" w:sz="4"/>
+            </w:tcBorders>
+            <w:tcMar>
+              <w:top w:type="dxa" w:w="60"/>
+              <w:left w:type="dxa" w:w="100"/>
+              <w:bottom w:type="dxa" w:w="60"/>
+              <w:right w:type="dxa" w:w="100"/>
+            </w:tcMar>
+          </w:tcPr>
+          <w:p>
+            <w:pPr>
+              <w:spacing w:after="0"/>
+            </w:pPr>
+            <w:r>
+              <w:rPr>
+                <w:b/>
+                <w:bCs/>
+                <w:sz w:val="19"/>
+                <w:szCs w:val="19"/>
+              </w:rPr>
+              <w:t xml:space="preserve">Tristan Jhay O. Salamat</w:t>
+            </w:r>
+          </w:p>
+        </w:tc>
+        <w:tc>
+          <w:tcPr>
+            <w:tcW w:type="dxa" w:w="4633"/>
+            <w:tcBorders>
+              <w:top w:val="single" w:color="BFBFBF" w:sz="4"/>
+              <w:left w:val="single" w:color="BFBFBF" w:sz="4"/>
+              <w:bottom w:val="single" w:color="BFBFBF" w:sz="4"/>
+              <w:right w:val="single" w:color="BFBFBF" w:sz="4"/>
+            </w:tcBorders>
+            <w:tcMar>
+              <w:top w:type="dxa" w:w="60"/>
+              <w:left w:type="dxa" w:w="100"/>
+              <w:bottom w:type="dxa" w:w="60"/>
+              <w:right w:type="dxa" w:w="100"/>
+            </w:tcMar>
+          </w:tcPr>
+          <w:p>
+            <w:pPr>
+              <w:spacing w:after="0"/>
+            </w:pPr>
+            <w:r>
+              <w:rPr>
+                <w:sz w:val="19"/>
+                <w:szCs w:val="19"/>
+              </w:rPr>
+              <w:t xml:space="preserve">Leader, opening, framework, closing, Q&amp;A moderator</w:t>
+            </w:r>
+          </w:p>
+        </w:tc>
+        <w:tc>
+          <w:tcPr>
+            <w:tcW w:type="dxa" w:w="1297"/>
+            <w:tcBorders>
+              <w:top w:val="single" w:color="BFBFBF" w:sz="4"/>
+              <w:left w:val="single" w:color="BFBFBF" w:sz="4"/>
+              <w:bottom w:val="single" w:color="BFBFBF" w:sz="4"/>
+              <w:right w:val="single" w:color="BFBFBF" w:sz="4"/>
+            </w:tcBorders>
+            <w:tcMar>
+              <w:top w:type="dxa" w:w="60"/>
+              <w:left w:type="dxa" w:w="100"/>
+              <w:bottom w:type="dxa" w:w="60"/>
+              <w:right w:type="dxa" w:w="100"/>
+            </w:tcMar>
+          </w:tcPr>
+          <w:p>
+            <w:pPr>
+              <w:spacing w:after="0"/>
+            </w:pPr>
+            <w:r>
+              <w:rPr>
+                <w:sz w:val="19"/>
+                <w:szCs w:val="19"/>
+              </w:rPr>
+              <w:t xml:space="preserve">1, 9, 14, 15</w:t>
+            </w:r>
+          </w:p>
+        </w:tc>
+        <w:tc>
+          <w:tcPr>
+            <w:tcW w:type="dxa" w:w="1206"/>
+            <w:tcBorders>
+              <w:top w:val="single" w:color="BFBFBF" w:sz="4"/>
+              <w:left w:val="single" w:color="BFBFBF" w:sz="4"/>
+              <w:bottom w:val="single" w:color="BFBFBF" w:sz="4"/>
+              <w:right w:val="single" w:color="BFBFBF" w:sz="4"/>
+            </w:tcBorders>
+            <w:tcMar>
+              <w:top w:type="dxa" w:w="60"/>
+              <w:left w:type="dxa" w:w="100"/>
+              <w:bottom w:type="dxa" w:w="60"/>
+              <w:right w:type="dxa" w:w="100"/>
+            </w:tcMar>
+          </w:tcPr>
+          <w:p>
+            <w:pPr>
+              <w:spacing w:after="0"/>
+            </w:pPr>
+            <w:r>
+              <w:rPr>
+                <w:sz w:val="19"/>
+                <w:szCs w:val="19"/>
+              </w:rPr>
+              <w:t xml:space="preserve">~10½ min</w:t>
+            </w:r>
+          </w:p>
+        </w:tc>
+      </w:tr>
+      <w:tr>
+        <w:trPr>
+          <w:tblHeader w:val="off"/>
+        </w:trPr>
+        <w:tc>
+          <w:tcPr>
+            <w:tcW w:type="dxa" w:w="2502"/>
+            <w:tcBorders>
+              <w:top w:val="single" w:color="BFBFBF" w:sz="4"/>
+              <w:left w:val="single" w:color="BFBFBF" w:sz="4"/>
+              <w:bottom w:val="single" w:color="BFBFBF" w:sz="4"/>
+              <w:right w:val="single" w:color="BFBFBF" w:sz="4"/>
+            </w:tcBorders>
+            <w:tcMar>
+              <w:top w:type="dxa" w:w="60"/>
+              <w:left w:type="dxa" w:w="100"/>
+              <w:bottom w:type="dxa" w:w="60"/>
+              <w:right w:type="dxa" w:w="100"/>
+            </w:tcMar>
+          </w:tcPr>
+          <w:p>
+            <w:pPr>
+              <w:spacing w:after="0"/>
+            </w:pPr>
+            <w:r>
+              <w:rPr>
+                <w:sz w:val="19"/>
+                <w:szCs w:val="19"/>
+              </w:rPr>
+              <w:t xml:space="preserve">Genesis F. Navarro</w:t>
+            </w:r>
+          </w:p>
+        </w:tc>
+        <w:tc>
+          <w:tcPr>
+            <w:tcW w:type="dxa" w:w="4633"/>
+            <w:tcBorders>
+              <w:top w:val="single" w:color="BFBFBF" w:sz="4"/>
+              <w:left w:val="single" w:color="BFBFBF" w:sz="4"/>
+              <w:bottom w:val="single" w:color="BFBFBF" w:sz="4"/>
+              <w:right w:val="single" w:color="BFBFBF" w:sz="4"/>
+            </w:tcBorders>
+            <w:tcMar>
+              <w:top w:type="dxa" w:w="60"/>
+              <w:left w:type="dxa" w:w="100"/>
+              <w:bottom w:type="dxa" w:w="60"/>
+              <w:right w:type="dxa" w:w="100"/>
+            </w:tcMar>
+          </w:tcPr>
+          <w:p>
+            <w:pPr>
+              <w:spacing w:after="0"/>
+            </w:pPr>
+            <w:r>
+              <w:rPr>
+                <w:sz w:val="19"/>
+                <w:szCs w:val="19"/>
+              </w:rPr>
+              <w:t xml:space="preserve">The problem</w:t>
+            </w:r>
+          </w:p>
+        </w:tc>
+        <w:tc>
+          <w:tcPr>
+            <w:tcW w:type="dxa" w:w="1297"/>
+            <w:tcBorders>
+              <w:top w:val="single" w:color="BFBFBF" w:sz="4"/>
+              <w:left w:val="single" w:color="BFBFBF" w:sz="4"/>
+              <w:bottom w:val="single" w:color="BFBFBF" w:sz="4"/>
+              <w:right w:val="single" w:color="BFBFBF" w:sz="4"/>
+            </w:tcBorders>
+            <w:tcMar>
+              <w:top w:type="dxa" w:w="60"/>
+              <w:left w:type="dxa" w:w="100"/>
+              <w:bottom w:type="dxa" w:w="60"/>
+              <w:right w:type="dxa" w:w="100"/>
+            </w:tcMar>
+          </w:tcPr>
+          <w:p>
+            <w:pPr>
+              <w:spacing w:after="0"/>
+            </w:pPr>
+            <w:r>
+              <w:rPr>
+                <w:sz w:val="19"/>
+                <w:szCs w:val="19"/>
+              </w:rPr>
+              <w:t xml:space="preserve">2, 3, 4</w:t>
+            </w:r>
+          </w:p>
+        </w:tc>
+        <w:tc>
+          <w:tcPr>
+            <w:tcW w:type="dxa" w:w="1206"/>
+            <w:tcBorders>
+              <w:top w:val="single" w:color="BFBFBF" w:sz="4"/>
+              <w:left w:val="single" w:color="BFBFBF" w:sz="4"/>
+              <w:bottom w:val="single" w:color="BFBFBF" w:sz="4"/>
+              <w:right w:val="single" w:color="BFBFBF" w:sz="4"/>
+            </w:tcBorders>
+            <w:tcMar>
+              <w:top w:type="dxa" w:w="60"/>
+              <w:left w:type="dxa" w:w="100"/>
+              <w:bottom w:type="dxa" w:w="60"/>
+              <w:right w:type="dxa" w:w="100"/>
+            </w:tcMar>
+          </w:tcPr>
+          <w:p>
+            <w:pPr>
+              <w:spacing w:after="0"/>
+            </w:pPr>
+            <w:r>
+              <w:rPr>
+                <w:sz w:val="19"/>
+                <w:szCs w:val="19"/>
+              </w:rPr>
+              <w:t xml:space="preserve">~10½ min</w:t>
+            </w:r>
+          </w:p>
+        </w:tc>
+      </w:tr>
+      <w:tr>
+        <w:trPr>
+          <w:tblHeader w:val="off"/>
+        </w:trPr>
+        <w:tc>
+          <w:tcPr>
+            <w:tcW w:type="dxa" w:w="2502"/>
+            <w:tcBorders>
+              <w:top w:val="single" w:color="BFBFBF" w:sz="4"/>
+              <w:left w:val="single" w:color="BFBFBF" w:sz="4"/>
+              <w:bottom w:val="single" w:color="BFBFBF" w:sz="4"/>
+              <w:right w:val="single" w:color="BFBFBF" w:sz="4"/>
+            </w:tcBorders>
+            <w:tcMar>
+              <w:top w:type="dxa" w:w="60"/>
+              <w:left w:type="dxa" w:w="100"/>
+              <w:bottom w:type="dxa" w:w="60"/>
+              <w:right w:type="dxa" w:w="100"/>
+            </w:tcMar>
+          </w:tcPr>
+          <w:p>
+            <w:pPr>
+              <w:spacing w:after="0"/>
+            </w:pPr>
+            <w:r>
+              <w:rPr>
+                <w:sz w:val="19"/>
+                <w:szCs w:val="19"/>
+              </w:rPr>
+              <w:t xml:space="preserve">Charles N. Medio</w:t>
+            </w:r>
+          </w:p>
+        </w:tc>
+        <w:tc>
+          <w:tcPr>
+            <w:tcW w:type="dxa" w:w="4633"/>
+            <w:tcBorders>
+              <w:top w:val="single" w:color="BFBFBF" w:sz="4"/>
+              <w:left w:val="single" w:color="BFBFBF" w:sz="4"/>
+              <w:bottom w:val="single" w:color="BFBFBF" w:sz="4"/>
+              <w:right w:val="single" w:color="BFBFBF" w:sz="4"/>
+            </w:tcBorders>
+            <w:tcMar>
+              <w:top w:type="dxa" w:w="60"/>
+              <w:left w:type="dxa" w:w="100"/>
+              <w:bottom w:type="dxa" w:w="60"/>
+              <w:right w:type="dxa" w:w="100"/>
+            </w:tcMar>
+          </w:tcPr>
+          <w:p>
+            <w:pPr>
+              <w:spacing w:after="0"/>
+            </w:pPr>
+            <w:r>
+              <w:rPr>
+                <w:sz w:val="19"/>
+                <w:szCs w:val="19"/>
+              </w:rPr>
+              <w:t xml:space="preserve">Objectives, scope and theory</w:t>
+            </w:r>
+          </w:p>
+        </w:tc>
+        <w:tc>
+          <w:tcPr>
+            <w:tcW w:type="dxa" w:w="1297"/>
+            <w:tcBorders>
+              <w:top w:val="single" w:color="BFBFBF" w:sz="4"/>
+              <w:left w:val="single" w:color="BFBFBF" w:sz="4"/>
+              <w:bottom w:val="single" w:color="BFBFBF" w:sz="4"/>
+              <w:right w:val="single" w:color="BFBFBF" w:sz="4"/>
+            </w:tcBorders>
+            <w:tcMar>
+              <w:top w:type="dxa" w:w="60"/>
+              <w:left w:type="dxa" w:w="100"/>
+              <w:bottom w:type="dxa" w:w="60"/>
+              <w:right w:type="dxa" w:w="100"/>
+            </w:tcMar>
+          </w:tcPr>
+          <w:p>
+            <w:pPr>
+              <w:spacing w:after="0"/>
+            </w:pPr>
+            <w:r>
+              <w:rPr>
+                <w:sz w:val="19"/>
+                <w:szCs w:val="19"/>
+              </w:rPr>
+              <w:t xml:space="preserve">5, 6, 7, 8</w:t>
+            </w:r>
+          </w:p>
+        </w:tc>
+        <w:tc>
+          <w:tcPr>
+            <w:tcW w:type="dxa" w:w="1206"/>
+            <w:tcBorders>
+              <w:top w:val="single" w:color="BFBFBF" w:sz="4"/>
+              <w:left w:val="single" w:color="BFBFBF" w:sz="4"/>
+              <w:bottom w:val="single" w:color="BFBFBF" w:sz="4"/>
+              <w:right w:val="single" w:color="BFBFBF" w:sz="4"/>
+            </w:tcBorders>
+            <w:tcMar>
+              <w:top w:type="dxa" w:w="60"/>
+              <w:left w:type="dxa" w:w="100"/>
+              <w:bottom w:type="dxa" w:w="60"/>
+              <w:right w:type="dxa" w:w="100"/>
+            </w:tcMar>
+          </w:tcPr>
+          <w:p>
+            <w:pPr>
+              <w:spacing w:after="0"/>
+            </w:pPr>
+            <w:r>
+              <w:rPr>
+                <w:sz w:val="19"/>
+                <w:szCs w:val="19"/>
+              </w:rPr>
+              <w:t xml:space="preserve">~13½ min</w:t>
+            </w:r>
+          </w:p>
+        </w:tc>
+      </w:tr>
+      <w:tr>
+        <w:trPr>
+          <w:tblHeader w:val="off"/>
+        </w:trPr>
+        <w:tc>
+          <w:tcPr>
+            <w:tcW w:type="dxa" w:w="2502"/>
+            <w:tcBorders>
+              <w:top w:val="single" w:color="BFBFBF" w:sz="4"/>
+              <w:left w:val="single" w:color="BFBFBF" w:sz="4"/>
+              <w:bottom w:val="single" w:color="BFBFBF" w:sz="4"/>
+              <w:right w:val="single" w:color="BFBFBF" w:sz="4"/>
+            </w:tcBorders>
+            <w:tcMar>
+              <w:top w:type="dxa" w:w="60"/>
+              <w:left w:type="dxa" w:w="100"/>
+              <w:bottom w:type="dxa" w:w="60"/>
+              <w:right w:type="dxa" w:w="100"/>
+            </w:tcMar>
+          </w:tcPr>
+          <w:p>
+            <w:pPr>
+              <w:spacing w:after="0"/>
+            </w:pPr>
+            <w:r>
+              <w:rPr>
+                <w:sz w:val="19"/>
+                <w:szCs w:val="19"/>
+              </w:rPr>
+              <w:t xml:space="preserve">Mark Jhoshua G. Taberna</w:t>
+            </w:r>
+          </w:p>
+        </w:tc>
+        <w:tc>
+          <w:tcPr>
+            <w:tcW w:type="dxa" w:w="4633"/>
+            <w:tcBorders>
+              <w:top w:val="single" w:color="BFBFBF" w:sz="4"/>
+              <w:left w:val="single" w:color="BFBFBF" w:sz="4"/>
+              <w:bottom w:val="single" w:color="BFBFBF" w:sz="4"/>
+              <w:right w:val="single" w:color="BFBFBF" w:sz="4"/>
+            </w:tcBorders>
+            <w:tcMar>
+              <w:top w:type="dxa" w:w="60"/>
+              <w:left w:type="dxa" w:w="100"/>
+              <w:bottom w:type="dxa" w:w="60"/>
+              <w:right w:type="dxa" w:w="100"/>
+            </w:tcMar>
+          </w:tcPr>
+          <w:p>
+            <w:pPr>
+              <w:spacing w:after="0"/>
+            </w:pPr>
+            <w:r>
+              <w:rPr>
+                <w:sz w:val="19"/>
+                <w:szCs w:val="19"/>
+              </w:rPr>
+              <w:t xml:space="preserve">System design and algorithm</w:t>
+            </w:r>
+          </w:p>
+        </w:tc>
+        <w:tc>
+          <w:tcPr>
+            <w:tcW w:type="dxa" w:w="1297"/>
+            <w:tcBorders>
+              <w:top w:val="single" w:color="BFBFBF" w:sz="4"/>
+              <w:left w:val="single" w:color="BFBFBF" w:sz="4"/>
+              <w:bottom w:val="single" w:color="BFBFBF" w:sz="4"/>
+              <w:right w:val="single" w:color="BFBFBF" w:sz="4"/>
+            </w:tcBorders>
+            <w:tcMar>
+              <w:top w:type="dxa" w:w="60"/>
+              <w:left w:type="dxa" w:w="100"/>
+              <w:bottom w:type="dxa" w:w="60"/>
+              <w:right w:type="dxa" w:w="100"/>
+            </w:tcMar>
+          </w:tcPr>
+          <w:p>
+            <w:pPr>
+              <w:spacing w:after="0"/>
+            </w:pPr>
+            <w:r>
+              <w:rPr>
+                <w:sz w:val="19"/>
+                <w:szCs w:val="19"/>
+              </w:rPr>
+              <w:t xml:space="preserve">10, 11, 12, 13</w:t>
+            </w:r>
+          </w:p>
+        </w:tc>
+        <w:tc>
+          <w:tcPr>
+            <w:tcW w:type="dxa" w:w="1206"/>
+            <w:tcBorders>
+              <w:top w:val="single" w:color="BFBFBF" w:sz="4"/>
+              <w:left w:val="single" w:color="BFBFBF" w:sz="4"/>
+              <w:bottom w:val="single" w:color="BFBFBF" w:sz="4"/>
+              <w:right w:val="single" w:color="BFBFBF" w:sz="4"/>
+            </w:tcBorders>
+            <w:tcMar>
+              <w:top w:type="dxa" w:w="60"/>
+              <w:left w:type="dxa" w:w="100"/>
+              <w:bottom w:type="dxa" w:w="60"/>
+              <w:right w:type="dxa" w:w="100"/>
+            </w:tcMar>
+          </w:tcPr>
+          <w:p>
+            <w:pPr>
+              <w:spacing w:after="0"/>
+            </w:pPr>
+            <w:r>
+              <w:rPr>
+                <w:sz w:val="19"/>
+                <w:szCs w:val="19"/>
+              </w:rPr>
+              <w:t xml:space="preserve">~13 min</w:t>
+            </w:r>
+          </w:p>
+        </w:tc>
+      </w:tr>
+      <w:tr>
+        <w:trPr>
+          <w:tblHeader w:val="off"/>
+        </w:trPr>
+        <w:tc>
+          <w:tcPr>
+            <w:tcW w:type="dxa" w:w="2502"/>
+            <w:tcBorders>
+              <w:top w:val="single" w:color="BFBFBF" w:sz="4"/>
+              <w:left w:val="single" w:color="BFBFBF" w:sz="4"/>
+              <w:bottom w:val="single" w:color="BFBFBF" w:sz="4"/>
+              <w:right w:val="single" w:color="BFBFBF" w:sz="4"/>
+            </w:tcBorders>
+            <w:tcMar>
+              <w:top w:type="dxa" w:w="60"/>
+              <w:left w:type="dxa" w:w="100"/>
+              <w:bottom w:type="dxa" w:w="60"/>
+              <w:right w:type="dxa" w:w="100"/>
+            </w:tcMar>
+          </w:tcPr>
+          <w:p>
+            <w:pPr>
+              <w:spacing w:after="0"/>
+            </w:pPr>
+            <w:r>
+              <w:rPr>
+                <w:sz w:val="19"/>
+                <w:szCs w:val="19"/>
+              </w:rPr>
+              <w:t xml:space="preserve">Alexander D. Castillo</w:t>
+            </w:r>
+          </w:p>
+        </w:tc>
+        <w:tc>
+          <w:tcPr>
+            <w:tcW w:type="dxa" w:w="4633"/>
+            <w:tcBorders>
+              <w:top w:val="single" w:color="BFBFBF" w:sz="4"/>
+              <w:left w:val="single" w:color="BFBFBF" w:sz="4"/>
+              <w:bottom w:val="single" w:color="BFBFBF" w:sz="4"/>
+              <w:right w:val="single" w:color="BFBFBF" w:sz="4"/>
+            </w:tcBorders>
+            <w:tcMar>
+              <w:top w:type="dxa" w:w="60"/>
+              <w:left w:type="dxa" w:w="100"/>
+              <w:bottom w:type="dxa" w:w="60"/>
+              <w:right w:type="dxa" w:w="100"/>
+            </w:tcMar>
+          </w:tcPr>
+          <w:p>
+            <w:pPr>
+              <w:spacing w:after="0"/>
+            </w:pPr>
+            <w:r>
+              <w:rPr>
+                <w:sz w:val="19"/>
+                <w:szCs w:val="19"/>
+              </w:rPr>
+              <w:t xml:space="preserve">Live demonstration (drives and narrates)</w:t>
+            </w:r>
+          </w:p>
+        </w:tc>
+        <w:tc>
+          <w:tcPr>
+            <w:tcW w:type="dxa" w:w="1297"/>
+            <w:tcBorders>
+              <w:top w:val="single" w:color="BFBFBF" w:sz="4"/>
+              <w:left w:val="single" w:color="BFBFBF" w:sz="4"/>
+              <w:bottom w:val="single" w:color="BFBFBF" w:sz="4"/>
+              <w:right w:val="single" w:color="BFBFBF" w:sz="4"/>
+            </w:tcBorders>
+            <w:tcMar>
+              <w:top w:type="dxa" w:w="60"/>
+              <w:left w:type="dxa" w:w="100"/>
+              <w:bottom w:type="dxa" w:w="60"/>
+              <w:right w:type="dxa" w:w="100"/>
+            </w:tcMar>
+          </w:tcPr>
+          <w:p>
+            <w:pPr>
+              <w:spacing w:after="0"/>
+            </w:pPr>
+            <w:r>
+              <w:rPr>
+                <w:sz w:val="19"/>
+                <w:szCs w:val="19"/>
+              </w:rPr>
+              <w:t xml:space="preserve">Demo</w:t>
+            </w:r>
+          </w:p>
+        </w:tc>
+        <w:tc>
+          <w:tcPr>
+            <w:tcW w:type="dxa" w:w="1206"/>
+            <w:tcBorders>
+              <w:top w:val="single" w:color="BFBFBF" w:sz="4"/>
+              <w:left w:val="single" w:color="BFBFBF" w:sz="4"/>
+              <w:bottom w:val="single" w:color="BFBFBF" w:sz="4"/>
+              <w:right w:val="single" w:color="BFBFBF" w:sz="4"/>
+            </w:tcBorders>
+            <w:tcMar>
+              <w:top w:type="dxa" w:w="60"/>
+              <w:left w:type="dxa" w:w="100"/>
+              <w:bottom w:type="dxa" w:w="60"/>
+              <w:right w:type="dxa" w:w="100"/>
+            </w:tcMar>
+          </w:tcPr>
+          <w:p>
+            <w:pPr>
+              <w:spacing w:after="0"/>
+            </w:pPr>
+            <w:r>
+              <w:rPr>
+                <w:sz w:val="19"/>
+                <w:szCs w:val="19"/>
+              </w:rPr>
+              <w:t xml:space="preserve">~12½ min</w:t>
+            </w:r>
+          </w:p>
+        </w:tc>
+      </w:tr>
+    </w:tbl>
+    <w:p>
+      <w:pPr>
+        <w:spacing w:after="120"/>
+      </w:pPr>
+    </w:p>
+    <w:p>
+      <w:r>
+        <w:t xml:space="preserve">The demo is where time usually runs over. If you're behind, shorten Slides 6 and 8, never the demo. </w:t>
+      </w:r>
+      <w:r>
+        <w:rPr>
+          <w:b/>
+          <w:bCs/>
+        </w:rPr>
+        <w:t xml:space="preserve">Tristan keeps time</w:t>
+      </w:r>
+      <w:r>
+        <w:t xml:space="preserve">: sit where you can see a clock, and give the next speaker a small signal if a block runs long.</w:t>
       </w:r>
     </w:p>
     <w:p>
@@ -1776,7 +2580,7 @@
           <w:iCs/>
           <w:color w:val="1F4E79"/>
         </w:rPr>
-        <w:t xml:space="preserve">Alexander</w:t>
+        <w:t xml:space="preserve">Tristan (leader)</w:t>
       </w:r>
     </w:p>
     <w:p>
@@ -1796,7 +2600,7 @@
           <w:iCs/>
           <w:color w:val="1F4E79"/>
         </w:rPr>
-        <w:t xml:space="preserve">We are Alexander Castillo, Charles Medio, Genesis Navarro, Tristan Jhay Salamat, and Mark Jhoshua Taberna, from the Computer Science Department of National University. Today we present our thesis, "Deepfake Detection for Pornographic Images with Human-in-the-Loop."</w:t>
+        <w:t xml:space="preserve">I am Tristan Jhay Salamat, the leader of our group. With me are Alexander Castillo, Charles Medio, Genesis Navarro, and Mark Jhoshua Taberna, from the Computer Science Department of National University. Today we present our thesis, "Deepfake Detection for Pornographic Images with Human-in-the-Loop."</w:t>
       </w:r>
     </w:p>
     <w:p>
@@ -1816,7 +2620,17 @@
           <w:iCs/>
           <w:color w:val="1F4E79"/>
         </w:rPr>
-        <w:t xml:space="preserve">We will present the introduction and problem, our objectives and scope, the theoretical and conceptual frameworks, our system architecture and algorithm, our datasets and evaluation plan, then a live demonstration of the working prototype, and finally our contributions.</w:t>
+        <w:t xml:space="preserve">Genesis will present the introduction and the problem. Charles will present our objectives, scope, and theoretical framework. I will present the conceptual framework. Mark will present the system architecture, algorithm, and evaluation plan. Alexander will then demonstrate the working prototype live, and I will close with our contributions.</w:t>
+      </w:r>
+    </w:p>
+    <w:p>
+      <w:r>
+        <w:rPr>
+          <w:i/>
+          <w:iCs/>
+          <w:color w:val="1F4E79"/>
+        </w:rPr>
+        <w:t xml:space="preserve">To begin, here is Genesis.</w:t>
       </w:r>
     </w:p>
     <w:p>
@@ -1840,7 +2654,7 @@
           <w:iCs/>
           <w:color w:val="1F4E79"/>
         </w:rPr>
-        <w:t xml:space="preserve">Alexander</w:t>
+        <w:t xml:space="preserve">Genesis</w:t>
       </w:r>
     </w:p>
     <w:p>
@@ -2060,7 +2874,7 @@
           <w:iCs/>
           <w:color w:val="1F4E79"/>
         </w:rPr>
-        <w:t xml:space="preserve">This leads to our objectives.</w:t>
+        <w:t xml:space="preserve">These problems led to our objectives, which Charles will now present.</w:t>
       </w:r>
     </w:p>
     <w:p>
@@ -2084,7 +2898,7 @@
           <w:iCs/>
           <w:color w:val="1F4E79"/>
         </w:rPr>
-        <w:t xml:space="preserve">Genesis</w:t>
+        <w:t xml:space="preserve">Charles</w:t>
       </w:r>
     </w:p>
     <w:p>
@@ -2815,6 +3629,16 @@
       </w:r>
     </w:p>
     <w:p>
+      <w:r>
+        <w:rPr>
+          <w:i/>
+          <w:iCs/>
+          <w:color w:val="1F4E79"/>
+        </w:rPr>
+        <w:t xml:space="preserve">Our leader, Tristan, will now show how these ideas come together in our conceptual framework.</w:t>
+      </w:r>
+    </w:p>
+    <w:p>
       <w:pPr>
         <w:pBdr>
           <w:bottom w:val="single" w:color="BFBFBF" w:sz="6" w:space="1"/>
@@ -2835,7 +3659,7 @@
           <w:iCs/>
           <w:color w:val="1F4E79"/>
         </w:rPr>
-        <w:t xml:space="preserve">Tristan</w:t>
+        <w:t xml:space="preserve">Tristan (leader)</w:t>
       </w:r>
     </w:p>
     <w:p>
@@ -2976,6 +3800,16 @@
           <w:color w:val="1F4E79"/>
         </w:rPr>
         <w:t xml:space="preserve">, so no one can mistake the AI's preliminary result for the human's conclusion.</w:t>
+      </w:r>
+    </w:p>
+    <w:p>
+      <w:r>
+        <w:rPr>
+          <w:i/>
+          <w:iCs/>
+          <w:color w:val="1F4E79"/>
+        </w:rPr>
+        <w:t xml:space="preserve">Mark will now walk you through the system architecture.</w:t>
       </w:r>
     </w:p>
     <w:p>
@@ -2999,7 +3833,7 @@
           <w:iCs/>
           <w:color w:val="1F4E79"/>
         </w:rPr>
-        <w:t xml:space="preserve">Tristan</w:t>
+        <w:t xml:space="preserve">Mark</w:t>
       </w:r>
     </w:p>
     <w:p>
@@ -3208,7 +4042,7 @@
           <w:iCs/>
           <w:color w:val="1F4E79"/>
         </w:rPr>
-        <w:t xml:space="preserve">Tristan</w:t>
+        <w:t xml:space="preserve">Mark</w:t>
       </w:r>
     </w:p>
     <w:p>
@@ -3262,7 +4096,7 @@
           <w:iCs/>
           <w:color w:val="1F4E79"/>
         </w:rPr>
-        <w:t xml:space="preserve">Tristan</w:t>
+        <w:t xml:space="preserve">Mark</w:t>
       </w:r>
     </w:p>
     <w:p>
@@ -3553,7 +4387,7 @@
           <w:iCs/>
           <w:color w:val="1F4E79"/>
         </w:rPr>
-        <w:t xml:space="preserve">Now let us show you the system working.</w:t>
+        <w:t xml:space="preserve">Alexander will now demonstrate the working system.</w:t>
       </w:r>
     </w:p>
     <w:p>
@@ -3577,7 +4411,10 @@
           <w:iCs/>
           <w:color w:val="1F4E79"/>
         </w:rPr>
-        <w:t xml:space="preserve">Alexander drives · Mark narrates</w:t>
+        <w:t xml:space="preserve">Alexander</w:t>
+      </w:r>
+      <w:r>
+        <w:t xml:space="preserve"> (Mark = backup operator)</w:t>
       </w:r>
     </w:p>
     <w:p>
@@ -3646,7 +4483,7 @@
           <w:bCs/>
           <w:color w:val="1F3864"/>
         </w:rPr>
-        <w:t xml:space="preserve">Mark: </w:t>
+        <w:t xml:space="preserve">Alexander: </w:t>
       </w:r>
       <w:r>
         <w:rPr>
@@ -3690,7 +4527,7 @@
           <w:bCs/>
           <w:color w:val="1F3864"/>
         </w:rPr>
-        <w:t xml:space="preserve">Mark: </w:t>
+        <w:t xml:space="preserve">Alexander: </w:t>
       </w:r>
       <w:r>
         <w:rPr>
@@ -3714,12 +4551,11 @@
         <w:rPr>
           <w:b/>
           <w:bCs/>
-          <w:color w:val="1F3864"/>
-        </w:rPr>
-        <w:t xml:space="preserve">Alexander: </w:t>
-      </w:r>
-      <w:r>
-        <w:t xml:space="preserve">logs in as </w:t>
+        </w:rPr>
+        <w:t xml:space="preserve">Action:</w:t>
+      </w:r>
+      <w:r>
+        <w:t xml:space="preserve"> logs in as </w:t>
       </w:r>
       <w:r>
         <w:rPr>
@@ -3771,7 +4607,7 @@
           <w:bCs/>
           <w:color w:val="1F3864"/>
         </w:rPr>
-        <w:t xml:space="preserve">Mark: </w:t>
+        <w:t xml:space="preserve">Alexander: </w:t>
       </w:r>
       <w:r>
         <w:rPr>
@@ -3787,12 +4623,51 @@
         <w:rPr>
           <w:b/>
           <w:bCs/>
+        </w:rPr>
+        <w:t xml:space="preserve">Action:</w:t>
+      </w:r>
+      <w:r>
+        <w:t xml:space="preserve"> points at the checkbox, ticks it.</w:t>
+      </w:r>
+    </w:p>
+    <w:p>
+      <w:r>
+        <w:rPr>
+          <w:b/>
+          <w:bCs/>
           <w:color w:val="1F3864"/>
         </w:rPr>
         <w:t xml:space="preserve">Alexander: </w:t>
       </w:r>
       <w:r>
-        <w:t xml:space="preserve">points at the checkbox, ticks it.</w:t>
+        <w:rPr>
+          <w:i/>
+          <w:iCs/>
+          <w:color w:val="1F4E79"/>
+        </w:rPr>
+        <w:t xml:space="preserve">Every submission requires this attestation: that the subject is an adult and that the investigator is authorized. This enforces our scope.</w:t>
+      </w:r>
+    </w:p>
+    <w:p>
+      <w:r>
+        <w:rPr>
+          <w:b/>
+          <w:bCs/>
+        </w:rPr>
+        <w:t xml:space="preserve">Action:</w:t>
+      </w:r>
+      <w:r>
+        <w:t xml:space="preserve"> clicks </w:t>
+      </w:r>
+      <w:r>
+        <w:rPr>
+          <w:b/>
+          <w:bCs/>
+        </w:rPr>
+        <w:t xml:space="preserve">Submit for analysis</w:t>
+      </w:r>
+      <w:r>
+        <w:t xml:space="preserve">.</w:t>
       </w:r>
     </w:p>
     <w:p>
@@ -3802,15 +4677,37 @@
           <w:bCs/>
           <w:color w:val="1F3864"/>
         </w:rPr>
-        <w:t xml:space="preserve">Mark: </w:t>
-      </w:r>
-      <w:r>
-        <w:rPr>
-          <w:i/>
-          <w:iCs/>
-          <w:color w:val="1F4E79"/>
-        </w:rPr>
-        <w:t xml:space="preserve">Every submission requires this attestation: that the subject is an adult and that the investigator is authorized. This enforces our scope.</w:t>
+        <w:t xml:space="preserve">Alexander: </w:t>
+      </w:r>
+      <w:r>
+        <w:rPr>
+          <w:i/>
+          <w:iCs/>
+          <w:color w:val="1F4E79"/>
+        </w:rPr>
+        <w:t xml:space="preserve">Right now the system computes a SHA-256 hash of each file for chain of custody, then runs our algorithm, lines 2 to 15: face detection, both neural branches, fusion, the three metrics, and the preliminary classification.</w:t>
+      </w:r>
+    </w:p>
+    <w:p>
+      <w:r>
+        <w:rPr>
+          <w:b/>
+          <w:bCs/>
+        </w:rPr>
+        <w:t xml:space="preserve">Action:</w:t>
+      </w:r>
+      <w:r>
+        <w:t xml:space="preserve"> shows </w:t>
+      </w:r>
+      <w:r>
+        <w:rPr>
+          <w:b/>
+          <w:bCs/>
+        </w:rPr>
+        <w:t xml:space="preserve">My cases</w:t>
+      </w:r>
+      <w:r>
+        <w:t xml:space="preserve">.</w:t>
       </w:r>
     </w:p>
     <w:p>
@@ -3823,70 +4720,6 @@
         <w:t xml:space="preserve">Alexander: </w:t>
       </w:r>
       <w:r>
-        <w:t xml:space="preserve">clicks </w:t>
-      </w:r>
-      <w:r>
-        <w:rPr>
-          <w:b/>
-          <w:bCs/>
-        </w:rPr>
-        <w:t xml:space="preserve">Submit for analysis</w:t>
-      </w:r>
-      <w:r>
-        <w:t xml:space="preserve">.</w:t>
-      </w:r>
-    </w:p>
-    <w:p>
-      <w:r>
-        <w:rPr>
-          <w:b/>
-          <w:bCs/>
-          <w:color w:val="1F3864"/>
-        </w:rPr>
-        <w:t xml:space="preserve">Mark: </w:t>
-      </w:r>
-      <w:r>
-        <w:rPr>
-          <w:i/>
-          <w:iCs/>
-          <w:color w:val="1F4E79"/>
-        </w:rPr>
-        <w:t xml:space="preserve">Right now the system computes a SHA-256 hash of each file for chain of custody, then runs our algorithm, lines 2 to 15: face detection, both neural branches, fusion, the three metrics, and the preliminary classification.</w:t>
-      </w:r>
-    </w:p>
-    <w:p>
-      <w:r>
-        <w:rPr>
-          <w:b/>
-          <w:bCs/>
-          <w:color w:val="1F3864"/>
-        </w:rPr>
-        <w:t xml:space="preserve">Alexander: </w:t>
-      </w:r>
-      <w:r>
-        <w:t xml:space="preserve">shows </w:t>
-      </w:r>
-      <w:r>
-        <w:rPr>
-          <w:b/>
-          <w:bCs/>
-        </w:rPr>
-        <w:t xml:space="preserve">My cases</w:t>
-      </w:r>
-      <w:r>
-        <w:t xml:space="preserve">.</w:t>
-      </w:r>
-    </w:p>
-    <w:p>
-      <w:r>
-        <w:rPr>
-          <w:b/>
-          <w:bCs/>
-          <w:color w:val="1F3864"/>
-        </w:rPr>
-        <w:t xml:space="preserve">Mark: </w:t>
-      </w:r>
-      <w:r>
         <w:rPr>
           <w:i/>
           <w:iCs/>
@@ -3926,12 +4759,11 @@
         <w:rPr>
           <w:b/>
           <w:bCs/>
-          <w:color w:val="1F3864"/>
-        </w:rPr>
-        <w:t xml:space="preserve">Alexander: </w:t>
-      </w:r>
-      <w:r>
-        <w:t xml:space="preserve">submits </w:t>
+        </w:rPr>
+        <w:t xml:space="preserve">Action:</w:t>
+      </w:r>
+      <w:r>
+        <w:t xml:space="preserve"> submits </w:t>
       </w:r>
       <w:r>
         <w:rPr>
@@ -3963,7 +4795,7 @@
           <w:bCs/>
           <w:color w:val="1F3864"/>
         </w:rPr>
-        <w:t xml:space="preserve">Mark: </w:t>
+        <w:t xml:space="preserve">Alexander: </w:t>
       </w:r>
       <w:r>
         <w:rPr>
@@ -3987,19 +4819,66 @@
         <w:rPr>
           <w:b/>
           <w:bCs/>
+        </w:rPr>
+        <w:t xml:space="preserve">Action:</w:t>
+      </w:r>
+      <w:r>
+        <w:t xml:space="preserve"> logs out → logs in as </w:t>
+      </w:r>
+      <w:r>
+        <w:rPr>
+          <w:b/>
+          <w:bCs/>
+        </w:rPr>
+        <w:t xml:space="preserve">ANA-01</w:t>
+      </w:r>
+      <w:r>
+        <w:t xml:space="preserve">.</w:t>
+      </w:r>
+    </w:p>
+    <w:p>
+      <w:r>
+        <w:rPr>
+          <w:b/>
+          <w:bCs/>
           <w:color w:val="1F3864"/>
         </w:rPr>
         <w:t xml:space="preserve">Alexander: </w:t>
       </w:r>
       <w:r>
-        <w:t xml:space="preserve">logs out → logs in as </w:t>
-      </w:r>
-      <w:r>
-        <w:rPr>
-          <w:b/>
-          <w:bCs/>
-        </w:rPr>
-        <w:t xml:space="preserve">ANA-01</w:t>
+        <w:rPr>
+          <w:i/>
+          <w:iCs/>
+          <w:color w:val="1F4E79"/>
+        </w:rPr>
+        <w:t xml:space="preserve">Now we are the forensic analyst. The dashboard shows how many cases are pending, verified, and flagged, and the live agreement rate between the AI and the analysts.</w:t>
+      </w:r>
+    </w:p>
+    <w:p>
+      <w:pPr>
+        <w:pStyle w:val="Heading2"/>
+      </w:pPr>
+      <w:r>
+        <w:t xml:space="preserve">D5 · Review interface, objective 3 (48:30–52:30)</w:t>
+      </w:r>
+    </w:p>
+    <w:p>
+      <w:r>
+        <w:rPr>
+          <w:b/>
+          <w:bCs/>
+        </w:rPr>
+        <w:t xml:space="preserve">Action:</w:t>
+      </w:r>
+      <w:r>
+        <w:t xml:space="preserve"> clicks </w:t>
+      </w:r>
+      <w:r>
+        <w:rPr>
+          <w:b/>
+          <w:bCs/>
+        </w:rPr>
+        <w:t xml:space="preserve">Review</w:t>
       </w:r>
       <w:r>
         <w:t xml:space="preserve">.</w:t>
@@ -4012,56 +4891,7 @@
           <w:bCs/>
           <w:color w:val="1F3864"/>
         </w:rPr>
-        <w:t xml:space="preserve">Mark: </w:t>
-      </w:r>
-      <w:r>
-        <w:rPr>
-          <w:i/>
-          <w:iCs/>
-          <w:color w:val="1F4E79"/>
-        </w:rPr>
-        <w:t xml:space="preserve">Now we are the forensic analyst. The dashboard shows how many cases are pending, verified, and flagged, and the live agreement rate between the AI and the analysts.</w:t>
-      </w:r>
-    </w:p>
-    <w:p>
-      <w:pPr>
-        <w:pStyle w:val="Heading2"/>
-      </w:pPr>
-      <w:r>
-        <w:t xml:space="preserve">D5 · Review interface, objective 3 (48:30–52:30)</w:t>
-      </w:r>
-    </w:p>
-    <w:p>
-      <w:r>
-        <w:rPr>
-          <w:b/>
-          <w:bCs/>
-          <w:color w:val="1F3864"/>
-        </w:rPr>
         <w:t xml:space="preserve">Alexander: </w:t>
-      </w:r>
-      <w:r>
-        <w:t xml:space="preserve">clicks </w:t>
-      </w:r>
-      <w:r>
-        <w:rPr>
-          <w:b/>
-          <w:bCs/>
-        </w:rPr>
-        <w:t xml:space="preserve">Review</w:t>
-      </w:r>
-      <w:r>
-        <w:t xml:space="preserve">.</w:t>
-      </w:r>
-    </w:p>
-    <w:p>
-      <w:r>
-        <w:rPr>
-          <w:b/>
-          <w:bCs/>
-          <w:color w:val="1F3864"/>
-        </w:rPr>
-        <w:t xml:space="preserve">Mark: </w:t>
       </w:r>
       <w:r>
         <w:rPr>
@@ -4181,34 +5011,33 @@
         <w:rPr>
           <w:b/>
           <w:bCs/>
+        </w:rPr>
+        <w:t xml:space="preserve">Action:</w:t>
+      </w:r>
+      <w:r>
+        <w:t xml:space="preserve"> clicks </w:t>
+      </w:r>
+      <w:r>
+        <w:rPr>
+          <w:b/>
+          <w:bCs/>
+        </w:rPr>
+        <w:t xml:space="preserve">Reveal full image</w:t>
+      </w:r>
+      <w:r>
+        <w:t xml:space="preserve"> → confirms.</w:t>
+      </w:r>
+    </w:p>
+    <w:p>
+      <w:r>
+        <w:rPr>
+          <w:b/>
+          <w:bCs/>
           <w:color w:val="1F3864"/>
         </w:rPr>
         <w:t xml:space="preserve">Alexander: </w:t>
       </w:r>
       <w:r>
-        <w:t xml:space="preserve">clicks </w:t>
-      </w:r>
-      <w:r>
-        <w:rPr>
-          <w:b/>
-          <w:bCs/>
-        </w:rPr>
-        <w:t xml:space="preserve">Reveal full image</w:t>
-      </w:r>
-      <w:r>
-        <w:t xml:space="preserve"> → confirms.</w:t>
-      </w:r>
-    </w:p>
-    <w:p>
-      <w:r>
-        <w:rPr>
-          <w:b/>
-          <w:bCs/>
-          <w:color w:val="1F3864"/>
-        </w:rPr>
-        <w:t xml:space="preserve">Mark: </w:t>
-      </w:r>
-      <w:r>
         <w:rPr>
           <w:i/>
           <w:iCs/>
@@ -4222,12 +5051,11 @@
         <w:rPr>
           <w:b/>
           <w:bCs/>
-          <w:color w:val="1F3864"/>
-        </w:rPr>
-        <w:t xml:space="preserve">Alexander: </w:t>
-      </w:r>
-      <w:r>
-        <w:t xml:space="preserve">in the green </w:t>
+        </w:rPr>
+        <w:t xml:space="preserve">Action:</w:t>
+      </w:r>
+      <w:r>
+        <w:t xml:space="preserve"> in the green </w:t>
       </w:r>
       <w:r>
         <w:rPr>
@@ -4297,24 +5125,23 @@
         <w:rPr>
           <w:b/>
           <w:bCs/>
+        </w:rPr>
+        <w:t xml:space="preserve">Action:</w:t>
+      </w:r>
+      <w:r>
+        <w:t xml:space="preserve"> types "fake" and clicks submit.</w:t>
+      </w:r>
+    </w:p>
+    <w:p>
+      <w:r>
+        <w:rPr>
+          <w:b/>
+          <w:bCs/>
           <w:color w:val="1F3864"/>
         </w:rPr>
         <w:t xml:space="preserve">Alexander: </w:t>
       </w:r>
       <w:r>
-        <w:t xml:space="preserve">types "fake" and clicks submit.</w:t>
-      </w:r>
-    </w:p>
-    <w:p>
-      <w:r>
-        <w:rPr>
-          <w:b/>
-          <w:bCs/>
-          <w:color w:val="1F3864"/>
-        </w:rPr>
-        <w:t xml:space="preserve">Mark: </w:t>
-      </w:r>
-      <w:r>
         <w:rPr>
           <w:i/>
           <w:iCs/>
@@ -4328,12 +5155,11 @@
         <w:rPr>
           <w:b/>
           <w:bCs/>
-          <w:color w:val="1F3864"/>
-        </w:rPr>
-        <w:t xml:space="preserve">Alexander: </w:t>
-      </w:r>
-      <w:r>
-        <w:t xml:space="preserve">types the rationale (Override example):</w:t>
+        </w:rPr>
+        <w:t xml:space="preserve">Action:</w:t>
+      </w:r>
+      <w:r>
+        <w:t xml:space="preserve"> types the rationale (Override example):</w:t>
       </w:r>
     </w:p>
     <w:p>
@@ -4358,7 +5184,7 @@
           <w:bCs/>
           <w:color w:val="1F3864"/>
         </w:rPr>
-        <w:t xml:space="preserve">Mark (if Override): </w:t>
+        <w:t xml:space="preserve">Alexander (if Override): </w:t>
       </w:r>
       <w:r>
         <w:rPr>
@@ -4384,7 +5210,7 @@
           <w:bCs/>
           <w:color w:val="1F3864"/>
         </w:rPr>
-        <w:t xml:space="preserve">Mark: </w:t>
+        <w:t xml:space="preserve">Alexander: </w:t>
       </w:r>
       <w:r>
         <w:rPr>
@@ -4542,22 +5368,89 @@
         <w:rPr>
           <w:b/>
           <w:bCs/>
+        </w:rPr>
+        <w:t xml:space="preserve">Action:</w:t>
+      </w:r>
+      <w:r>
+        <w:t xml:space="preserve"> clicks </w:t>
+      </w:r>
+      <w:r>
+        <w:rPr>
+          <w:b/>
+          <w:bCs/>
+        </w:rPr>
+        <w:t xml:space="preserve">Download PDF</w:t>
+      </w:r>
+      <w:r>
+        <w:t xml:space="preserve">, shows it.</w:t>
+      </w:r>
+    </w:p>
+    <w:p>
+      <w:r>
+        <w:rPr>
+          <w:b/>
+          <w:bCs/>
           <w:color w:val="1F3864"/>
         </w:rPr>
         <w:t xml:space="preserve">Alexander: </w:t>
       </w:r>
       <w:r>
-        <w:t xml:space="preserve">clicks </w:t>
-      </w:r>
-      <w:r>
-        <w:rPr>
-          <w:b/>
-          <w:bCs/>
-        </w:rPr>
-        <w:t xml:space="preserve">Download PDF</w:t>
-      </w:r>
-      <w:r>
-        <w:t xml:space="preserve">, shows it.</w:t>
+        <w:rPr>
+          <w:i/>
+          <w:iCs/>
+          <w:color w:val="1F4E79"/>
+        </w:rPr>
+        <w:t xml:space="preserve">The case is now read-only; the review can no longer be changed.</w:t>
+      </w:r>
+    </w:p>
+    <w:p>
+      <w:pPr>
+        <w:pStyle w:val="Heading2"/>
+      </w:pPr>
+      <w:r>
+        <w:t xml:space="preserve">D7 · Admin: evaluation and audit log, objective 4 (54:00–55:00)</w:t>
+      </w:r>
+    </w:p>
+    <w:p>
+      <w:r>
+        <w:rPr>
+          <w:b/>
+          <w:bCs/>
+        </w:rPr>
+        <w:t xml:space="preserve">Action:</w:t>
+      </w:r>
+      <w:r>
+        <w:t xml:space="preserve"> logs in as </w:t>
+      </w:r>
+      <w:r>
+        <w:rPr>
+          <w:b/>
+          <w:bCs/>
+        </w:rPr>
+        <w:t xml:space="preserve">ADM-01</w:t>
+      </w:r>
+      <w:r>
+        <w:t xml:space="preserve"> → </w:t>
+      </w:r>
+      <w:r>
+        <w:rPr>
+          <w:b/>
+          <w:bCs/>
+        </w:rPr>
+        <w:t xml:space="preserve">Evaluation</w:t>
+      </w:r>
+      <w:r>
+        <w:t xml:space="preserve"> → </w:t>
+      </w:r>
+      <w:r>
+        <w:rPr>
+          <w:b/>
+          <w:bCs/>
+        </w:rPr>
+        <w:t xml:space="preserve">Audit log</w:t>
+      </w:r>
+      <w:r>
+        <w:t xml:space="preserve">.</w:t>
       </w:r>
     </w:p>
     <w:p>
@@ -4567,84 +5460,53 @@
           <w:bCs/>
           <w:color w:val="1F3864"/>
         </w:rPr>
-        <w:t xml:space="preserve">Mark: </w:t>
-      </w:r>
-      <w:r>
-        <w:rPr>
-          <w:i/>
-          <w:iCs/>
-          <w:color w:val="1F4E79"/>
-        </w:rPr>
-        <w:t xml:space="preserve">The case is now read-only; the review can no longer be changed.</w:t>
-      </w:r>
-    </w:p>
-    <w:p>
-      <w:pPr>
-        <w:pStyle w:val="Heading2"/>
-      </w:pPr>
-      <w:r>
-        <w:t xml:space="preserve">D7 · Admin: evaluation and audit log, objective 4 (54:00–55:00)</w:t>
-      </w:r>
-    </w:p>
-    <w:p>
-      <w:r>
-        <w:rPr>
-          <w:b/>
-          <w:bCs/>
-          <w:color w:val="1F3864"/>
-        </w:rPr>
         <w:t xml:space="preserve">Alexander: </w:t>
       </w:r>
       <w:r>
-        <w:t xml:space="preserve">logs in as </w:t>
-      </w:r>
-      <w:r>
-        <w:rPr>
-          <w:b/>
-          <w:bCs/>
-        </w:rPr>
-        <w:t xml:space="preserve">ADM-01</w:t>
-      </w:r>
-      <w:r>
-        <w:t xml:space="preserve"> → </w:t>
-      </w:r>
-      <w:r>
-        <w:rPr>
-          <w:b/>
-          <w:bCs/>
-        </w:rPr>
-        <w:t xml:space="preserve">Evaluation</w:t>
-      </w:r>
-      <w:r>
-        <w:t xml:space="preserve"> → </w:t>
-      </w:r>
-      <w:r>
-        <w:rPr>
-          <w:b/>
-          <w:bCs/>
-        </w:rPr>
-        <w:t xml:space="preserve">Audit log</w:t>
-      </w:r>
-      <w:r>
-        <w:t xml:space="preserve">.</w:t>
-      </w:r>
-    </w:p>
-    <w:p>
-      <w:r>
-        <w:rPr>
-          <w:b/>
-          <w:bCs/>
-          <w:color w:val="1F3864"/>
-        </w:rPr>
-        <w:t xml:space="preserve">Mark: </w:t>
-      </w:r>
-      <w:r>
-        <w:rPr>
-          <w:i/>
-          <w:iCs/>
-          <w:color w:val="1F4E79"/>
-        </w:rPr>
-        <w:t xml:space="preserve">The administrator's evaluation page computes the agreement rate and Cohen's kappa from the case records. And this is the append-only audit log: logins, submissions, rejections, image reveals, reviews, and report downloads, each with the user and time. That concludes our demonstration.</w:t>
+        <w:rPr>
+          <w:i/>
+          <w:iCs/>
+          <w:color w:val="1F4E79"/>
+        </w:rPr>
+        <w:t xml:space="preserve">The administrator's evaluation page computes the agreement rate and Cohen's kappa from the case records. And this is the append-only audit log: logins, submissions, rejections, image reveals, reviews, and report downloads, each with the user and time. That concludes our demonstration. I now give the floor back to our leader, Tristan.</w:t>
+      </w:r>
+    </w:p>
+    <w:p>
+      <w:pPr>
+        <w:shd w:fill="FFF2CC" w:color="auto" w:val="clear"/>
+        <w:spacing w:after="40"/>
+        <w:ind w:left="240" w:right="240"/>
+      </w:pPr>
+      <w:r>
+        <w:rPr>
+          <w:b/>
+          <w:bCs/>
+        </w:rPr>
+        <w:t xml:space="preserve">Backup:</w:t>
+      </w:r>
+      <w:r>
+        <w:t xml:space="preserve"> if anything fails, </w:t>
+      </w:r>
+      <w:r>
+        <w:rPr>
+          <w:b/>
+          <w:bCs/>
+        </w:rPr>
+        <w:t xml:space="preserve">Mark</w:t>
+      </w:r>
+      <w:r>
+        <w:t xml:space="preserve"> takes the laptop and opens </w:t>
+      </w:r>
+      <w:r>
+        <w:rPr>
+          <w:rFonts w:ascii="Consolas" w:cs="Consolas" w:eastAsia="Consolas" w:hAnsi="Consolas"/>
+          <w:sz w:val="19"/>
+          <w:szCs w:val="19"/>
+        </w:rPr>
+        <w:t xml:space="preserve">docs\walkthrough\</w:t>
+      </w:r>
+      <w:r>
+        <w:t xml:space="preserve"> (screenshots 01 → 13 plus the sample PDF) while Alexander keeps narrating. Don't troubleshoot live for more than 30 seconds.</w:t>
       </w:r>
     </w:p>
     <w:p>
@@ -4658,21 +5520,21 @@
           <w:b/>
           <w:bCs/>
         </w:rPr>
-        <w:t xml:space="preserve">Backup:</w:t>
-      </w:r>
-      <w:r>
-        <w:t xml:space="preserve"> if anything fails, open </w:t>
-      </w:r>
-      <w:r>
-        <w:rPr>
-          <w:rFonts w:ascii="Consolas" w:cs="Consolas" w:eastAsia="Consolas" w:hAnsi="Consolas"/>
-          <w:sz w:val="19"/>
-          <w:szCs w:val="19"/>
-        </w:rPr>
-        <w:t xml:space="preserve">docs\walkthrough\</w:t>
-      </w:r>
-      <w:r>
-        <w:t xml:space="preserve"> and show screenshots 01 → 13 plus the sample PDF, with the same narration. Don't troubleshoot live for more than 30 seconds.</w:t>
+        <w:t xml:space="preserve">Tip:</w:t>
+      </w:r>
+      <w:r>
+        <w:t xml:space="preserve"> Alexander both clicks and talks. Say each line </w:t>
+      </w:r>
+      <w:r>
+        <w:rPr>
+          <w:i/>
+          <w:iCs/>
+          <w:color w:val="1F4E79"/>
+        </w:rPr>
+        <w:t xml:space="preserve">before</w:t>
+      </w:r>
+      <w:r>
+        <w:t xml:space="preserve"> clicking, then pause while the page loads.</w:t>
       </w:r>
     </w:p>
     <w:p>
@@ -4696,7 +5558,7 @@
           <w:iCs/>
           <w:color w:val="1F4E79"/>
         </w:rPr>
-        <w:t xml:space="preserve">Mark</w:t>
+        <w:t xml:space="preserve">Tristan (leader)</w:t>
       </w:r>
     </w:p>
     <w:p>
@@ -4814,7 +5676,7 @@
           <w:iCs/>
           <w:color w:val="1F4E79"/>
         </w:rPr>
-        <w:t xml:space="preserve">Alexander</w:t>
+        <w:t xml:space="preserve">Tristan (leader)</w:t>
       </w:r>
     </w:p>
     <w:p>
@@ -4834,7 +5696,7 @@
           <w:iCs/>
           <w:color w:val="1F4E79"/>
         </w:rPr>
-        <w:t xml:space="preserve">Thank you very much for your time and attention. We are now open to the panel's questions.</w:t>
+        <w:t xml:space="preserve">On behalf of our group, thank you very much for your time and attention. We are now open to the panel's questions.</w:t>
       </w:r>
     </w:p>
     <w:p>
@@ -6947,6 +7809,481 @@
       <w:pPr>
         <w:pStyle w:val="Heading1"/>
         <w:pageBreakBefore/>
+      </w:pPr>
+      <w:r>
+        <w:t xml:space="preserve">Q&amp;A plan (led by Tristan)</w:t>
+      </w:r>
+    </w:p>
+    <w:p>
+      <w:pPr>
+        <w:pStyle w:val="ListParagraph"/>
+        <w:numPr>
+          <w:ilvl w:val="0"/>
+          <w:numId w:val="3"/>
+        </w:numPr>
+      </w:pPr>
+      <w:r>
+        <w:rPr>
+          <w:b/>
+          <w:bCs/>
+        </w:rPr>
+        <w:t xml:space="preserve">Tristan</w:t>
+      </w:r>
+      <w:r>
+        <w:t xml:space="preserve"> receives each question, repeats it briefly if needed, and passes it to the member who presented that part. Tristan answers overall-design and scope questions directly.</w:t>
+      </w:r>
+    </w:p>
+    <w:p>
+      <w:pPr>
+        <w:pStyle w:val="ListParagraph"/>
+        <w:numPr>
+          <w:ilvl w:val="0"/>
+          <w:numId w:val="3"/>
+        </w:numPr>
+      </w:pPr>
+      <w:r>
+        <w:t xml:space="preserve">The assigned member answers. Others may add </w:t>
+      </w:r>
+      <w:r>
+        <w:rPr>
+          <w:b/>
+          <w:bCs/>
+        </w:rPr>
+        <w:t xml:space="preserve">one</w:t>
+      </w:r>
+      <w:r>
+        <w:t xml:space="preserve"> point only if Tristan invites them.</w:t>
+      </w:r>
+    </w:p>
+    <w:p>
+      <w:pPr>
+        <w:pStyle w:val="ListParagraph"/>
+        <w:numPr>
+          <w:ilvl w:val="0"/>
+          <w:numId w:val="3"/>
+        </w:numPr>
+      </w:pPr>
+      <w:r>
+        <w:t xml:space="preserve">If nobody is sure, don't guess: </w:t>
+      </w:r>
+      <w:r>
+        <w:rPr>
+          <w:i/>
+          <w:iCs/>
+          <w:color w:val="1F4E79"/>
+        </w:rPr>
+        <w:t xml:space="preserve">"That is a valid point; we will verify it and include it in our revisions."</w:t>
+      </w:r>
+    </w:p>
+    <w:tbl>
+      <w:tblPr>
+        <w:tblW w:type="dxa" w:w="9638"/>
+        <w:tblBorders>
+          <w:top w:val="single" w:color="auto" w:sz="4"/>
+          <w:left w:val="single" w:color="auto" w:sz="4"/>
+          <w:bottom w:val="single" w:color="auto" w:sz="4"/>
+          <w:right w:val="single" w:color="auto" w:sz="4"/>
+          <w:insideH w:val="single" w:color="auto" w:sz="4"/>
+          <w:insideV w:val="single" w:color="auto" w:sz="4"/>
+        </w:tblBorders>
+      </w:tblPr>
+      <w:tblGrid>
+        <w:gridCol w:w="8329"/>
+        <w:gridCol w:w="1309"/>
+      </w:tblGrid>
+      <w:tr>
+        <w:trPr>
+          <w:tblHeader/>
+        </w:trPr>
+        <w:tc>
+          <w:tcPr>
+            <w:tcW w:type="dxa" w:w="8329"/>
+            <w:tcBorders>
+              <w:top w:val="single" w:color="BFBFBF" w:sz="4"/>
+              <w:left w:val="single" w:color="BFBFBF" w:sz="4"/>
+              <w:bottom w:val="single" w:color="BFBFBF" w:sz="4"/>
+              <w:right w:val="single" w:color="BFBFBF" w:sz="4"/>
+            </w:tcBorders>
+            <w:shd w:fill="D9E2F3" w:color="auto" w:val="clear"/>
+            <w:tcMar>
+              <w:top w:type="dxa" w:w="60"/>
+              <w:left w:type="dxa" w:w="100"/>
+              <w:bottom w:type="dxa" w:w="60"/>
+              <w:right w:type="dxa" w:w="100"/>
+            </w:tcMar>
+          </w:tcPr>
+          <w:p>
+            <w:pPr>
+              <w:spacing w:after="0"/>
+            </w:pPr>
+            <w:r>
+              <w:rPr>
+                <w:b/>
+                <w:bCs/>
+                <w:sz w:val="19"/>
+                <w:szCs w:val="19"/>
+              </w:rPr>
+              <w:t xml:space="preserve">Question topic</w:t>
+            </w:r>
+          </w:p>
+        </w:tc>
+        <w:tc>
+          <w:tcPr>
+            <w:tcW w:type="dxa" w:w="1309"/>
+            <w:tcBorders>
+              <w:top w:val="single" w:color="BFBFBF" w:sz="4"/>
+              <w:left w:val="single" w:color="BFBFBF" w:sz="4"/>
+              <w:bottom w:val="single" w:color="BFBFBF" w:sz="4"/>
+              <w:right w:val="single" w:color="BFBFBF" w:sz="4"/>
+            </w:tcBorders>
+            <w:shd w:fill="D9E2F3" w:color="auto" w:val="clear"/>
+            <w:tcMar>
+              <w:top w:type="dxa" w:w="60"/>
+              <w:left w:type="dxa" w:w="100"/>
+              <w:bottom w:type="dxa" w:w="60"/>
+              <w:right w:type="dxa" w:w="100"/>
+            </w:tcMar>
+          </w:tcPr>
+          <w:p>
+            <w:pPr>
+              <w:spacing w:after="0"/>
+            </w:pPr>
+            <w:r>
+              <w:rPr>
+                <w:b/>
+                <w:bCs/>
+                <w:sz w:val="19"/>
+                <w:szCs w:val="19"/>
+              </w:rPr>
+              <w:t xml:space="preserve">Answered by</w:t>
+            </w:r>
+          </w:p>
+        </w:tc>
+      </w:tr>
+      <w:tr>
+        <w:trPr>
+          <w:tblHeader w:val="off"/>
+        </w:trPr>
+        <w:tc>
+          <w:tcPr>
+            <w:tcW w:type="dxa" w:w="8329"/>
+            <w:tcBorders>
+              <w:top w:val="single" w:color="BFBFBF" w:sz="4"/>
+              <w:left w:val="single" w:color="BFBFBF" w:sz="4"/>
+              <w:bottom w:val="single" w:color="BFBFBF" w:sz="4"/>
+              <w:right w:val="single" w:color="BFBFBF" w:sz="4"/>
+            </w:tcBorders>
+            <w:tcMar>
+              <w:top w:type="dxa" w:w="60"/>
+              <w:left w:type="dxa" w:w="100"/>
+              <w:bottom w:type="dxa" w:w="60"/>
+              <w:right w:type="dxa" w:w="100"/>
+            </w:tcMar>
+          </w:tcPr>
+          <w:p>
+            <w:pPr>
+              <w:spacing w:after="0"/>
+            </w:pPr>
+            <w:r>
+              <w:rPr>
+                <w:sz w:val="19"/>
+                <w:szCs w:val="19"/>
+              </w:rPr>
+              <w:t xml:space="preserve">Background, problem, motivation, statistics</w:t>
+            </w:r>
+          </w:p>
+        </w:tc>
+        <w:tc>
+          <w:tcPr>
+            <w:tcW w:type="dxa" w:w="1309"/>
+            <w:tcBorders>
+              <w:top w:val="single" w:color="BFBFBF" w:sz="4"/>
+              <w:left w:val="single" w:color="BFBFBF" w:sz="4"/>
+              <w:bottom w:val="single" w:color="BFBFBF" w:sz="4"/>
+              <w:right w:val="single" w:color="BFBFBF" w:sz="4"/>
+            </w:tcBorders>
+            <w:tcMar>
+              <w:top w:type="dxa" w:w="60"/>
+              <w:left w:type="dxa" w:w="100"/>
+              <w:bottom w:type="dxa" w:w="60"/>
+              <w:right w:type="dxa" w:w="100"/>
+            </w:tcMar>
+          </w:tcPr>
+          <w:p>
+            <w:pPr>
+              <w:spacing w:after="0"/>
+            </w:pPr>
+            <w:r>
+              <w:rPr>
+                <w:sz w:val="19"/>
+                <w:szCs w:val="19"/>
+              </w:rPr>
+              <w:t xml:space="preserve">Genesis</w:t>
+            </w:r>
+          </w:p>
+        </w:tc>
+      </w:tr>
+      <w:tr>
+        <w:trPr>
+          <w:tblHeader w:val="off"/>
+        </w:trPr>
+        <w:tc>
+          <w:tcPr>
+            <w:tcW w:type="dxa" w:w="8329"/>
+            <w:tcBorders>
+              <w:top w:val="single" w:color="BFBFBF" w:sz="4"/>
+              <w:left w:val="single" w:color="BFBFBF" w:sz="4"/>
+              <w:bottom w:val="single" w:color="BFBFBF" w:sz="4"/>
+              <w:right w:val="single" w:color="BFBFBF" w:sz="4"/>
+            </w:tcBorders>
+            <w:tcMar>
+              <w:top w:type="dxa" w:w="60"/>
+              <w:left w:type="dxa" w:w="100"/>
+              <w:bottom w:type="dxa" w:w="60"/>
+              <w:right w:type="dxa" w:w="100"/>
+            </w:tcMar>
+          </w:tcPr>
+          <w:p>
+            <w:pPr>
+              <w:spacing w:after="0"/>
+            </w:pPr>
+            <w:r>
+              <w:rPr>
+                <w:sz w:val="19"/>
+                <w:szCs w:val="19"/>
+              </w:rPr>
+              <w:t xml:space="preserve">Objectives, significance, scope and delimitations, theories</w:t>
+            </w:r>
+          </w:p>
+        </w:tc>
+        <w:tc>
+          <w:tcPr>
+            <w:tcW w:type="dxa" w:w="1309"/>
+            <w:tcBorders>
+              <w:top w:val="single" w:color="BFBFBF" w:sz="4"/>
+              <w:left w:val="single" w:color="BFBFBF" w:sz="4"/>
+              <w:bottom w:val="single" w:color="BFBFBF" w:sz="4"/>
+              <w:right w:val="single" w:color="BFBFBF" w:sz="4"/>
+            </w:tcBorders>
+            <w:tcMar>
+              <w:top w:type="dxa" w:w="60"/>
+              <w:left w:type="dxa" w:w="100"/>
+              <w:bottom w:type="dxa" w:w="60"/>
+              <w:right w:type="dxa" w:w="100"/>
+            </w:tcMar>
+          </w:tcPr>
+          <w:p>
+            <w:pPr>
+              <w:spacing w:after="0"/>
+            </w:pPr>
+            <w:r>
+              <w:rPr>
+                <w:sz w:val="19"/>
+                <w:szCs w:val="19"/>
+              </w:rPr>
+              <w:t xml:space="preserve">Charles</w:t>
+            </w:r>
+          </w:p>
+        </w:tc>
+      </w:tr>
+      <w:tr>
+        <w:trPr>
+          <w:tblHeader w:val="off"/>
+        </w:trPr>
+        <w:tc>
+          <w:tcPr>
+            <w:tcW w:type="dxa" w:w="8329"/>
+            <w:tcBorders>
+              <w:top w:val="single" w:color="BFBFBF" w:sz="4"/>
+              <w:left w:val="single" w:color="BFBFBF" w:sz="4"/>
+              <w:bottom w:val="single" w:color="BFBFBF" w:sz="4"/>
+              <w:right w:val="single" w:color="BFBFBF" w:sz="4"/>
+            </w:tcBorders>
+            <w:tcMar>
+              <w:top w:type="dxa" w:w="60"/>
+              <w:left w:type="dxa" w:w="100"/>
+              <w:bottom w:type="dxa" w:w="60"/>
+              <w:right w:type="dxa" w:w="100"/>
+            </w:tcMar>
+          </w:tcPr>
+          <w:p>
+            <w:pPr>
+              <w:spacing w:after="0"/>
+            </w:pPr>
+            <w:r>
+              <w:rPr>
+                <w:sz w:val="19"/>
+                <w:szCs w:val="19"/>
+              </w:rPr>
+              <w:t xml:space="preserve">Overall design, human-in-the-loop, ethics, conceptual framework</w:t>
+            </w:r>
+          </w:p>
+        </w:tc>
+        <w:tc>
+          <w:tcPr>
+            <w:tcW w:type="dxa" w:w="1309"/>
+            <w:tcBorders>
+              <w:top w:val="single" w:color="BFBFBF" w:sz="4"/>
+              <w:left w:val="single" w:color="BFBFBF" w:sz="4"/>
+              <w:bottom w:val="single" w:color="BFBFBF" w:sz="4"/>
+              <w:right w:val="single" w:color="BFBFBF" w:sz="4"/>
+            </w:tcBorders>
+            <w:tcMar>
+              <w:top w:type="dxa" w:w="60"/>
+              <w:left w:type="dxa" w:w="100"/>
+              <w:bottom w:type="dxa" w:w="60"/>
+              <w:right w:type="dxa" w:w="100"/>
+            </w:tcMar>
+          </w:tcPr>
+          <w:p>
+            <w:pPr>
+              <w:spacing w:after="0"/>
+            </w:pPr>
+            <w:r>
+              <w:rPr>
+                <w:sz w:val="19"/>
+                <w:szCs w:val="19"/>
+              </w:rPr>
+              <w:t xml:space="preserve">Tristan</w:t>
+            </w:r>
+          </w:p>
+        </w:tc>
+      </w:tr>
+      <w:tr>
+        <w:trPr>
+          <w:tblHeader w:val="off"/>
+        </w:trPr>
+        <w:tc>
+          <w:tcPr>
+            <w:tcW w:type="dxa" w:w="8329"/>
+            <w:tcBorders>
+              <w:top w:val="single" w:color="BFBFBF" w:sz="4"/>
+              <w:left w:val="single" w:color="BFBFBF" w:sz="4"/>
+              <w:bottom w:val="single" w:color="BFBFBF" w:sz="4"/>
+              <w:right w:val="single" w:color="BFBFBF" w:sz="4"/>
+            </w:tcBorders>
+            <w:tcMar>
+              <w:top w:type="dxa" w:w="60"/>
+              <w:left w:type="dxa" w:w="100"/>
+              <w:bottom w:type="dxa" w:w="60"/>
+              <w:right w:type="dxa" w:w="100"/>
+            </w:tcMar>
+          </w:tcPr>
+          <w:p>
+            <w:pPr>
+              <w:spacing w:after="0"/>
+            </w:pPr>
+            <w:r>
+              <w:rPr>
+                <w:sz w:val="19"/>
+                <w:szCs w:val="19"/>
+              </w:rPr>
+              <w:t xml:space="preserve">Architecture, algorithm, formulas, datasets, training, metrics</w:t>
+            </w:r>
+          </w:p>
+        </w:tc>
+        <w:tc>
+          <w:tcPr>
+            <w:tcW w:type="dxa" w:w="1309"/>
+            <w:tcBorders>
+              <w:top w:val="single" w:color="BFBFBF" w:sz="4"/>
+              <w:left w:val="single" w:color="BFBFBF" w:sz="4"/>
+              <w:bottom w:val="single" w:color="BFBFBF" w:sz="4"/>
+              <w:right w:val="single" w:color="BFBFBF" w:sz="4"/>
+            </w:tcBorders>
+            <w:tcMar>
+              <w:top w:type="dxa" w:w="60"/>
+              <w:left w:type="dxa" w:w="100"/>
+              <w:bottom w:type="dxa" w:w="60"/>
+              <w:right w:type="dxa" w:w="100"/>
+            </w:tcMar>
+          </w:tcPr>
+          <w:p>
+            <w:pPr>
+              <w:spacing w:after="0"/>
+            </w:pPr>
+            <w:r>
+              <w:rPr>
+                <w:sz w:val="19"/>
+                <w:szCs w:val="19"/>
+              </w:rPr>
+              <w:t xml:space="preserve">Mark</w:t>
+            </w:r>
+          </w:p>
+        </w:tc>
+      </w:tr>
+      <w:tr>
+        <w:trPr>
+          <w:tblHeader w:val="off"/>
+        </w:trPr>
+        <w:tc>
+          <w:tcPr>
+            <w:tcW w:type="dxa" w:w="8329"/>
+            <w:tcBorders>
+              <w:top w:val="single" w:color="BFBFBF" w:sz="4"/>
+              <w:left w:val="single" w:color="BFBFBF" w:sz="4"/>
+              <w:bottom w:val="single" w:color="BFBFBF" w:sz="4"/>
+              <w:right w:val="single" w:color="BFBFBF" w:sz="4"/>
+            </w:tcBorders>
+            <w:tcMar>
+              <w:top w:type="dxa" w:w="60"/>
+              <w:left w:type="dxa" w:w="100"/>
+              <w:bottom w:type="dxa" w:w="60"/>
+              <w:right w:type="dxa" w:w="100"/>
+            </w:tcMar>
+          </w:tcPr>
+          <w:p>
+            <w:pPr>
+              <w:spacing w:after="0"/>
+            </w:pPr>
+            <w:r>
+              <w:rPr>
+                <w:sz w:val="19"/>
+                <w:szCs w:val="19"/>
+              </w:rPr>
+              <w:t xml:space="preserve">How the prototype works, code, security features, "UNTRAINED MODEL" banner</w:t>
+            </w:r>
+          </w:p>
+        </w:tc>
+        <w:tc>
+          <w:tcPr>
+            <w:tcW w:type="dxa" w:w="1309"/>
+            <w:tcBorders>
+              <w:top w:val="single" w:color="BFBFBF" w:sz="4"/>
+              <w:left w:val="single" w:color="BFBFBF" w:sz="4"/>
+              <w:bottom w:val="single" w:color="BFBFBF" w:sz="4"/>
+              <w:right w:val="single" w:color="BFBFBF" w:sz="4"/>
+            </w:tcBorders>
+            <w:tcMar>
+              <w:top w:type="dxa" w:w="60"/>
+              <w:left w:type="dxa" w:w="100"/>
+              <w:bottom w:type="dxa" w:w="60"/>
+              <w:right w:type="dxa" w:w="100"/>
+            </w:tcMar>
+          </w:tcPr>
+          <w:p>
+            <w:pPr>
+              <w:spacing w:after="0"/>
+            </w:pPr>
+            <w:r>
+              <w:rPr>
+                <w:sz w:val="19"/>
+                <w:szCs w:val="19"/>
+              </w:rPr>
+              <w:t xml:space="preserve">Alexander</w:t>
+            </w:r>
+          </w:p>
+        </w:tc>
+      </w:tr>
+    </w:tbl>
+    <w:p>
+      <w:pPr>
+        <w:spacing w:after="120"/>
+      </w:pPr>
+    </w:p>
+    <w:p>
+      <w:pPr>
+        <w:pStyle w:val="Heading1"/>
       </w:pPr>
       <w:r>
         <w:t xml:space="preserve">Likely panel questions</w:t>

</xml_diff>

<commit_message>
Extend script to the full 2-hour defense flow
Adds call to order, opening prayer, 45-minute Q&A plan with roles and a
question bank per member, and panel deliberation / after-verdict steps.

Co-Authored-By: Claude Opus 5.5 <noreply@anthropic.com>
Claude-Session: https://claude.ai/code/session_01HzDX4JgA3rVyVP8b16fmMh
</commit_message>
<xml_diff>
--- a/deepfake_hitl/docs/Presentation_Script.docx
+++ b/deepfake_hitl/docs/Presentation_Script.docx
@@ -7,7 +7,7 @@
         <w:pStyle w:val="Title"/>
       </w:pPr>
       <w:r>
-        <w:t xml:space="preserve">Presentation &amp; Demo Script — 60 minutes</w:t>
+        <w:t xml:space="preserve">Thesis Defense Script — Full 2-Hour Flow</w:t>
       </w:r>
     </w:p>
     <w:p>
@@ -48,17 +48,17 @@
         <w:t xml:space="preserve">–  </w:t>
       </w:r>
       <w:r>
-        <w:t xml:space="preserve">It follows your 15-slide deck, with the </w:t>
+        <w:t xml:space="preserve">It covers the whole defense: call to order, prayer, the 60-minute presentation (your 15 slides, with the </w:t>
       </w:r>
       <w:r>
         <w:rPr>
           <w:b/>
           <w:bCs/>
         </w:rPr>
-        <w:t xml:space="preserve">live demo inserted after Slide 13</w:t>
-      </w:r>
-      <w:r>
-        <w:t xml:space="preserve">.</w:t>
+        <w:t xml:space="preserve">live demo after Slide 13</w:t>
+      </w:r>
+      <w:r>
+        <w:t xml:space="preserve">), the 45-minute Q&amp;A, and the panel deliberation.</w:t>
       </w:r>
     </w:p>
     <w:p>
@@ -151,7 +151,932 @@
         <w:pStyle w:val="Heading1"/>
       </w:pPr>
       <w:r>
-        <w:t xml:space="preserve">Time plan</w:t>
+        <w:t xml:space="preserve">Defense day flow (2 hours)</w:t>
+      </w:r>
+    </w:p>
+    <w:tbl>
+      <w:tblPr>
+        <w:tblW w:type="dxa" w:w="9638"/>
+        <w:tblBorders>
+          <w:top w:val="single" w:color="auto" w:sz="4"/>
+          <w:left w:val="single" w:color="auto" w:sz="4"/>
+          <w:bottom w:val="single" w:color="auto" w:sz="4"/>
+          <w:right w:val="single" w:color="auto" w:sz="4"/>
+          <w:insideH w:val="single" w:color="auto" w:sz="4"/>
+          <w:insideV w:val="single" w:color="auto" w:sz="4"/>
+        </w:tblBorders>
+      </w:tblPr>
+      <w:tblGrid>
+        <w:gridCol w:w="921"/>
+        <w:gridCol w:w="3100"/>
+        <w:gridCol w:w="670"/>
+        <w:gridCol w:w="4947"/>
+      </w:tblGrid>
+      <w:tr>
+        <w:trPr>
+          <w:tblHeader/>
+        </w:trPr>
+        <w:tc>
+          <w:tcPr>
+            <w:tcW w:type="dxa" w:w="921"/>
+            <w:tcBorders>
+              <w:top w:val="single" w:color="BFBFBF" w:sz="4"/>
+              <w:left w:val="single" w:color="BFBFBF" w:sz="4"/>
+              <w:bottom w:val="single" w:color="BFBFBF" w:sz="4"/>
+              <w:right w:val="single" w:color="BFBFBF" w:sz="4"/>
+            </w:tcBorders>
+            <w:shd w:fill="D9E2F3" w:color="auto" w:val="clear"/>
+            <w:tcMar>
+              <w:top w:type="dxa" w:w="60"/>
+              <w:left w:type="dxa" w:w="100"/>
+              <w:bottom w:type="dxa" w:w="60"/>
+              <w:right w:type="dxa" w:w="100"/>
+            </w:tcMar>
+          </w:tcPr>
+          <w:p>
+            <w:pPr>
+              <w:spacing w:after="0"/>
+            </w:pPr>
+            <w:r>
+              <w:rPr>
+                <w:b/>
+                <w:bCs/>
+                <w:sz w:val="19"/>
+                <w:szCs w:val="19"/>
+              </w:rPr>
+              <w:t xml:space="preserve">Clock</w:t>
+            </w:r>
+          </w:p>
+        </w:tc>
+        <w:tc>
+          <w:tcPr>
+            <w:tcW w:type="dxa" w:w="3100"/>
+            <w:tcBorders>
+              <w:top w:val="single" w:color="BFBFBF" w:sz="4"/>
+              <w:left w:val="single" w:color="BFBFBF" w:sz="4"/>
+              <w:bottom w:val="single" w:color="BFBFBF" w:sz="4"/>
+              <w:right w:val="single" w:color="BFBFBF" w:sz="4"/>
+            </w:tcBorders>
+            <w:shd w:fill="D9E2F3" w:color="auto" w:val="clear"/>
+            <w:tcMar>
+              <w:top w:type="dxa" w:w="60"/>
+              <w:left w:type="dxa" w:w="100"/>
+              <w:bottom w:type="dxa" w:w="60"/>
+              <w:right w:type="dxa" w:w="100"/>
+            </w:tcMar>
+          </w:tcPr>
+          <w:p>
+            <w:pPr>
+              <w:spacing w:after="0"/>
+            </w:pPr>
+            <w:r>
+              <w:rPr>
+                <w:b/>
+                <w:bCs/>
+                <w:sz w:val="19"/>
+                <w:szCs w:val="19"/>
+              </w:rPr>
+              <w:t xml:space="preserve">Segment</w:t>
+            </w:r>
+          </w:p>
+        </w:tc>
+        <w:tc>
+          <w:tcPr>
+            <w:tcW w:type="dxa" w:w="670"/>
+            <w:tcBorders>
+              <w:top w:val="single" w:color="BFBFBF" w:sz="4"/>
+              <w:left w:val="single" w:color="BFBFBF" w:sz="4"/>
+              <w:bottom w:val="single" w:color="BFBFBF" w:sz="4"/>
+              <w:right w:val="single" w:color="BFBFBF" w:sz="4"/>
+            </w:tcBorders>
+            <w:shd w:fill="D9E2F3" w:color="auto" w:val="clear"/>
+            <w:tcMar>
+              <w:top w:type="dxa" w:w="60"/>
+              <w:left w:type="dxa" w:w="100"/>
+              <w:bottom w:type="dxa" w:w="60"/>
+              <w:right w:type="dxa" w:w="100"/>
+            </w:tcMar>
+          </w:tcPr>
+          <w:p>
+            <w:pPr>
+              <w:spacing w:after="0"/>
+            </w:pPr>
+            <w:r>
+              <w:rPr>
+                <w:b/>
+                <w:bCs/>
+                <w:sz w:val="19"/>
+                <w:szCs w:val="19"/>
+              </w:rPr>
+              <w:t xml:space="preserve">Duration</w:t>
+            </w:r>
+          </w:p>
+        </w:tc>
+        <w:tc>
+          <w:tcPr>
+            <w:tcW w:type="dxa" w:w="4947"/>
+            <w:tcBorders>
+              <w:top w:val="single" w:color="BFBFBF" w:sz="4"/>
+              <w:left w:val="single" w:color="BFBFBF" w:sz="4"/>
+              <w:bottom w:val="single" w:color="BFBFBF" w:sz="4"/>
+              <w:right w:val="single" w:color="BFBFBF" w:sz="4"/>
+            </w:tcBorders>
+            <w:shd w:fill="D9E2F3" w:color="auto" w:val="clear"/>
+            <w:tcMar>
+              <w:top w:type="dxa" w:w="60"/>
+              <w:left w:type="dxa" w:w="100"/>
+              <w:bottom w:type="dxa" w:w="60"/>
+              <w:right w:type="dxa" w:w="100"/>
+            </w:tcMar>
+          </w:tcPr>
+          <w:p>
+            <w:pPr>
+              <w:spacing w:after="0"/>
+            </w:pPr>
+            <w:r>
+              <w:rPr>
+                <w:b/>
+                <w:bCs/>
+                <w:sz w:val="19"/>
+                <w:szCs w:val="19"/>
+              </w:rPr>
+              <w:t xml:space="preserve">Who</w:t>
+            </w:r>
+          </w:p>
+        </w:tc>
+      </w:tr>
+      <w:tr>
+        <w:trPr>
+          <w:tblHeader w:val="off"/>
+        </w:trPr>
+        <w:tc>
+          <w:tcPr>
+            <w:tcW w:type="dxa" w:w="921"/>
+            <w:tcBorders>
+              <w:top w:val="single" w:color="BFBFBF" w:sz="4"/>
+              <w:left w:val="single" w:color="BFBFBF" w:sz="4"/>
+              <w:bottom w:val="single" w:color="BFBFBF" w:sz="4"/>
+              <w:right w:val="single" w:color="BFBFBF" w:sz="4"/>
+            </w:tcBorders>
+            <w:tcMar>
+              <w:top w:type="dxa" w:w="60"/>
+              <w:left w:type="dxa" w:w="100"/>
+              <w:bottom w:type="dxa" w:w="60"/>
+              <w:right w:type="dxa" w:w="100"/>
+            </w:tcMar>
+          </w:tcPr>
+          <w:p>
+            <w:pPr>
+              <w:spacing w:after="0"/>
+            </w:pPr>
+            <w:r>
+              <w:rPr>
+                <w:sz w:val="19"/>
+                <w:szCs w:val="19"/>
+              </w:rPr>
+              <w:t xml:space="preserve">0:00 – 0:02</w:t>
+            </w:r>
+          </w:p>
+        </w:tc>
+        <w:tc>
+          <w:tcPr>
+            <w:tcW w:type="dxa" w:w="3100"/>
+            <w:tcBorders>
+              <w:top w:val="single" w:color="BFBFBF" w:sz="4"/>
+              <w:left w:val="single" w:color="BFBFBF" w:sz="4"/>
+              <w:bottom w:val="single" w:color="BFBFBF" w:sz="4"/>
+              <w:right w:val="single" w:color="BFBFBF" w:sz="4"/>
+            </w:tcBorders>
+            <w:tcMar>
+              <w:top w:type="dxa" w:w="60"/>
+              <w:left w:type="dxa" w:w="100"/>
+              <w:bottom w:type="dxa" w:w="60"/>
+              <w:right w:type="dxa" w:w="100"/>
+            </w:tcMar>
+          </w:tcPr>
+          <w:p>
+            <w:pPr>
+              <w:spacing w:after="0"/>
+            </w:pPr>
+            <w:r>
+              <w:rPr>
+                <w:sz w:val="19"/>
+                <w:szCs w:val="19"/>
+              </w:rPr>
+              <w:t xml:space="preserve">Call to order</w:t>
+            </w:r>
+          </w:p>
+        </w:tc>
+        <w:tc>
+          <w:tcPr>
+            <w:tcW w:type="dxa" w:w="670"/>
+            <w:tcBorders>
+              <w:top w:val="single" w:color="BFBFBF" w:sz="4"/>
+              <w:left w:val="single" w:color="BFBFBF" w:sz="4"/>
+              <w:bottom w:val="single" w:color="BFBFBF" w:sz="4"/>
+              <w:right w:val="single" w:color="BFBFBF" w:sz="4"/>
+            </w:tcBorders>
+            <w:tcMar>
+              <w:top w:type="dxa" w:w="60"/>
+              <w:left w:type="dxa" w:w="100"/>
+              <w:bottom w:type="dxa" w:w="60"/>
+              <w:right w:type="dxa" w:w="100"/>
+            </w:tcMar>
+          </w:tcPr>
+          <w:p>
+            <w:pPr>
+              <w:spacing w:after="0"/>
+            </w:pPr>
+            <w:r>
+              <w:rPr>
+                <w:sz w:val="19"/>
+                <w:szCs w:val="19"/>
+              </w:rPr>
+              <w:t xml:space="preserve">2 min</w:t>
+            </w:r>
+          </w:p>
+        </w:tc>
+        <w:tc>
+          <w:tcPr>
+            <w:tcW w:type="dxa" w:w="4947"/>
+            <w:tcBorders>
+              <w:top w:val="single" w:color="BFBFBF" w:sz="4"/>
+              <w:left w:val="single" w:color="BFBFBF" w:sz="4"/>
+              <w:bottom w:val="single" w:color="BFBFBF" w:sz="4"/>
+              <w:right w:val="single" w:color="BFBFBF" w:sz="4"/>
+            </w:tcBorders>
+            <w:tcMar>
+              <w:top w:type="dxa" w:w="60"/>
+              <w:left w:type="dxa" w:w="100"/>
+              <w:bottom w:type="dxa" w:w="60"/>
+              <w:right w:type="dxa" w:w="100"/>
+            </w:tcMar>
+          </w:tcPr>
+          <w:p>
+            <w:pPr>
+              <w:spacing w:after="0"/>
+            </w:pPr>
+            <w:r>
+              <w:rPr>
+                <w:sz w:val="19"/>
+                <w:szCs w:val="19"/>
+              </w:rPr>
+              <w:t xml:space="preserve">Panel chair / moderator (Tristan, if the group is asked to)</w:t>
+            </w:r>
+          </w:p>
+        </w:tc>
+      </w:tr>
+      <w:tr>
+        <w:trPr>
+          <w:tblHeader w:val="off"/>
+        </w:trPr>
+        <w:tc>
+          <w:tcPr>
+            <w:tcW w:type="dxa" w:w="921"/>
+            <w:tcBorders>
+              <w:top w:val="single" w:color="BFBFBF" w:sz="4"/>
+              <w:left w:val="single" w:color="BFBFBF" w:sz="4"/>
+              <w:bottom w:val="single" w:color="BFBFBF" w:sz="4"/>
+              <w:right w:val="single" w:color="BFBFBF" w:sz="4"/>
+            </w:tcBorders>
+            <w:tcMar>
+              <w:top w:type="dxa" w:w="60"/>
+              <w:left w:type="dxa" w:w="100"/>
+              <w:bottom w:type="dxa" w:w="60"/>
+              <w:right w:type="dxa" w:w="100"/>
+            </w:tcMar>
+          </w:tcPr>
+          <w:p>
+            <w:pPr>
+              <w:spacing w:after="0"/>
+            </w:pPr>
+            <w:r>
+              <w:rPr>
+                <w:sz w:val="19"/>
+                <w:szCs w:val="19"/>
+              </w:rPr>
+              <w:t xml:space="preserve">0:02 – 0:05</w:t>
+            </w:r>
+          </w:p>
+        </w:tc>
+        <w:tc>
+          <w:tcPr>
+            <w:tcW w:type="dxa" w:w="3100"/>
+            <w:tcBorders>
+              <w:top w:val="single" w:color="BFBFBF" w:sz="4"/>
+              <w:left w:val="single" w:color="BFBFBF" w:sz="4"/>
+              <w:bottom w:val="single" w:color="BFBFBF" w:sz="4"/>
+              <w:right w:val="single" w:color="BFBFBF" w:sz="4"/>
+            </w:tcBorders>
+            <w:tcMar>
+              <w:top w:type="dxa" w:w="60"/>
+              <w:left w:type="dxa" w:w="100"/>
+              <w:bottom w:type="dxa" w:w="60"/>
+              <w:right w:type="dxa" w:w="100"/>
+            </w:tcMar>
+          </w:tcPr>
+          <w:p>
+            <w:pPr>
+              <w:spacing w:after="0"/>
+            </w:pPr>
+            <w:r>
+              <w:rPr>
+                <w:sz w:val="19"/>
+                <w:szCs w:val="19"/>
+              </w:rPr>
+              <w:t xml:space="preserve">Opening prayer</w:t>
+            </w:r>
+          </w:p>
+        </w:tc>
+        <w:tc>
+          <w:tcPr>
+            <w:tcW w:type="dxa" w:w="670"/>
+            <w:tcBorders>
+              <w:top w:val="single" w:color="BFBFBF" w:sz="4"/>
+              <w:left w:val="single" w:color="BFBFBF" w:sz="4"/>
+              <w:bottom w:val="single" w:color="BFBFBF" w:sz="4"/>
+              <w:right w:val="single" w:color="BFBFBF" w:sz="4"/>
+            </w:tcBorders>
+            <w:tcMar>
+              <w:top w:type="dxa" w:w="60"/>
+              <w:left w:type="dxa" w:w="100"/>
+              <w:bottom w:type="dxa" w:w="60"/>
+              <w:right w:type="dxa" w:w="100"/>
+            </w:tcMar>
+          </w:tcPr>
+          <w:p>
+            <w:pPr>
+              <w:spacing w:after="0"/>
+            </w:pPr>
+            <w:r>
+              <w:rPr>
+                <w:sz w:val="19"/>
+                <w:szCs w:val="19"/>
+              </w:rPr>
+              <w:t xml:space="preserve">3 min</w:t>
+            </w:r>
+          </w:p>
+        </w:tc>
+        <w:tc>
+          <w:tcPr>
+            <w:tcW w:type="dxa" w:w="4947"/>
+            <w:tcBorders>
+              <w:top w:val="single" w:color="BFBFBF" w:sz="4"/>
+              <w:left w:val="single" w:color="BFBFBF" w:sz="4"/>
+              <w:bottom w:val="single" w:color="BFBFBF" w:sz="4"/>
+              <w:right w:val="single" w:color="BFBFBF" w:sz="4"/>
+            </w:tcBorders>
+            <w:tcMar>
+              <w:top w:type="dxa" w:w="60"/>
+              <w:left w:type="dxa" w:w="100"/>
+              <w:bottom w:type="dxa" w:w="60"/>
+              <w:right w:type="dxa" w:w="100"/>
+            </w:tcMar>
+          </w:tcPr>
+          <w:p>
+            <w:pPr>
+              <w:spacing w:after="0"/>
+            </w:pPr>
+            <w:r>
+              <w:rPr>
+                <w:sz w:val="19"/>
+                <w:szCs w:val="19"/>
+              </w:rPr>
+              <w:t xml:space="preserve">Genesis leads</w:t>
+            </w:r>
+          </w:p>
+        </w:tc>
+      </w:tr>
+      <w:tr>
+        <w:trPr>
+          <w:tblHeader w:val="off"/>
+        </w:trPr>
+        <w:tc>
+          <w:tcPr>
+            <w:tcW w:type="dxa" w:w="921"/>
+            <w:tcBorders>
+              <w:top w:val="single" w:color="BFBFBF" w:sz="4"/>
+              <w:left w:val="single" w:color="BFBFBF" w:sz="4"/>
+              <w:bottom w:val="single" w:color="BFBFBF" w:sz="4"/>
+              <w:right w:val="single" w:color="BFBFBF" w:sz="4"/>
+            </w:tcBorders>
+            <w:tcMar>
+              <w:top w:type="dxa" w:w="60"/>
+              <w:left w:type="dxa" w:w="100"/>
+              <w:bottom w:type="dxa" w:w="60"/>
+              <w:right w:type="dxa" w:w="100"/>
+            </w:tcMar>
+          </w:tcPr>
+          <w:p>
+            <w:pPr>
+              <w:spacing w:after="0"/>
+            </w:pPr>
+            <w:r>
+              <w:rPr>
+                <w:sz w:val="19"/>
+                <w:szCs w:val="19"/>
+              </w:rPr>
+              <w:t xml:space="preserve">0:05 – 1:05</w:t>
+            </w:r>
+          </w:p>
+        </w:tc>
+        <w:tc>
+          <w:tcPr>
+            <w:tcW w:type="dxa" w:w="3100"/>
+            <w:tcBorders>
+              <w:top w:val="single" w:color="BFBFBF" w:sz="4"/>
+              <w:left w:val="single" w:color="BFBFBF" w:sz="4"/>
+              <w:bottom w:val="single" w:color="BFBFBF" w:sz="4"/>
+              <w:right w:val="single" w:color="BFBFBF" w:sz="4"/>
+            </w:tcBorders>
+            <w:tcMar>
+              <w:top w:type="dxa" w:w="60"/>
+              <w:left w:type="dxa" w:w="100"/>
+              <w:bottom w:type="dxa" w:w="60"/>
+              <w:right w:type="dxa" w:w="100"/>
+            </w:tcMar>
+          </w:tcPr>
+          <w:p>
+            <w:pPr>
+              <w:spacing w:after="0"/>
+            </w:pPr>
+            <w:r>
+              <w:rPr>
+                <w:sz w:val="19"/>
+                <w:szCs w:val="19"/>
+              </w:rPr>
+              <w:t xml:space="preserve">Presentation and system demonstration</w:t>
+            </w:r>
+          </w:p>
+        </w:tc>
+        <w:tc>
+          <w:tcPr>
+            <w:tcW w:type="dxa" w:w="670"/>
+            <w:tcBorders>
+              <w:top w:val="single" w:color="BFBFBF" w:sz="4"/>
+              <w:left w:val="single" w:color="BFBFBF" w:sz="4"/>
+              <w:bottom w:val="single" w:color="BFBFBF" w:sz="4"/>
+              <w:right w:val="single" w:color="BFBFBF" w:sz="4"/>
+            </w:tcBorders>
+            <w:tcMar>
+              <w:top w:type="dxa" w:w="60"/>
+              <w:left w:type="dxa" w:w="100"/>
+              <w:bottom w:type="dxa" w:w="60"/>
+              <w:right w:type="dxa" w:w="100"/>
+            </w:tcMar>
+          </w:tcPr>
+          <w:p>
+            <w:pPr>
+              <w:spacing w:after="0"/>
+            </w:pPr>
+            <w:r>
+              <w:rPr>
+                <w:sz w:val="19"/>
+                <w:szCs w:val="19"/>
+              </w:rPr>
+              <w:t xml:space="preserve">60 min</w:t>
+            </w:r>
+          </w:p>
+        </w:tc>
+        <w:tc>
+          <w:tcPr>
+            <w:tcW w:type="dxa" w:w="4947"/>
+            <w:tcBorders>
+              <w:top w:val="single" w:color="BFBFBF" w:sz="4"/>
+              <w:left w:val="single" w:color="BFBFBF" w:sz="4"/>
+              <w:bottom w:val="single" w:color="BFBFBF" w:sz="4"/>
+              <w:right w:val="single" w:color="BFBFBF" w:sz="4"/>
+            </w:tcBorders>
+            <w:tcMar>
+              <w:top w:type="dxa" w:w="60"/>
+              <w:left w:type="dxa" w:w="100"/>
+              <w:bottom w:type="dxa" w:w="60"/>
+              <w:right w:type="dxa" w:w="100"/>
+            </w:tcMar>
+          </w:tcPr>
+          <w:p>
+            <w:pPr>
+              <w:spacing w:after="0"/>
+            </w:pPr>
+            <w:r>
+              <w:rPr>
+                <w:sz w:val="19"/>
+                <w:szCs w:val="19"/>
+              </w:rPr>
+              <w:t xml:space="preserve">All five members (see the time plan below)</w:t>
+            </w:r>
+          </w:p>
+        </w:tc>
+      </w:tr>
+      <w:tr>
+        <w:trPr>
+          <w:tblHeader w:val="off"/>
+        </w:trPr>
+        <w:tc>
+          <w:tcPr>
+            <w:tcW w:type="dxa" w:w="921"/>
+            <w:tcBorders>
+              <w:top w:val="single" w:color="BFBFBF" w:sz="4"/>
+              <w:left w:val="single" w:color="BFBFBF" w:sz="4"/>
+              <w:bottom w:val="single" w:color="BFBFBF" w:sz="4"/>
+              <w:right w:val="single" w:color="BFBFBF" w:sz="4"/>
+            </w:tcBorders>
+            <w:tcMar>
+              <w:top w:type="dxa" w:w="60"/>
+              <w:left w:type="dxa" w:w="100"/>
+              <w:bottom w:type="dxa" w:w="60"/>
+              <w:right w:type="dxa" w:w="100"/>
+            </w:tcMar>
+          </w:tcPr>
+          <w:p>
+            <w:pPr>
+              <w:spacing w:after="0"/>
+            </w:pPr>
+            <w:r>
+              <w:rPr>
+                <w:sz w:val="19"/>
+                <w:szCs w:val="19"/>
+              </w:rPr>
+              <w:t xml:space="preserve">1:05 – 1:50</w:t>
+            </w:r>
+          </w:p>
+        </w:tc>
+        <w:tc>
+          <w:tcPr>
+            <w:tcW w:type="dxa" w:w="3100"/>
+            <w:tcBorders>
+              <w:top w:val="single" w:color="BFBFBF" w:sz="4"/>
+              <w:left w:val="single" w:color="BFBFBF" w:sz="4"/>
+              <w:bottom w:val="single" w:color="BFBFBF" w:sz="4"/>
+              <w:right w:val="single" w:color="BFBFBF" w:sz="4"/>
+            </w:tcBorders>
+            <w:tcMar>
+              <w:top w:type="dxa" w:w="60"/>
+              <w:left w:type="dxa" w:w="100"/>
+              <w:bottom w:type="dxa" w:w="60"/>
+              <w:right w:type="dxa" w:w="100"/>
+            </w:tcMar>
+          </w:tcPr>
+          <w:p>
+            <w:pPr>
+              <w:spacing w:after="0"/>
+            </w:pPr>
+            <w:r>
+              <w:rPr>
+                <w:sz w:val="19"/>
+                <w:szCs w:val="19"/>
+              </w:rPr>
+              <w:t xml:space="preserve">Question and answer</w:t>
+            </w:r>
+          </w:p>
+        </w:tc>
+        <w:tc>
+          <w:tcPr>
+            <w:tcW w:type="dxa" w:w="670"/>
+            <w:tcBorders>
+              <w:top w:val="single" w:color="BFBFBF" w:sz="4"/>
+              <w:left w:val="single" w:color="BFBFBF" w:sz="4"/>
+              <w:bottom w:val="single" w:color="BFBFBF" w:sz="4"/>
+              <w:right w:val="single" w:color="BFBFBF" w:sz="4"/>
+            </w:tcBorders>
+            <w:tcMar>
+              <w:top w:type="dxa" w:w="60"/>
+              <w:left w:type="dxa" w:w="100"/>
+              <w:bottom w:type="dxa" w:w="60"/>
+              <w:right w:type="dxa" w:w="100"/>
+            </w:tcMar>
+          </w:tcPr>
+          <w:p>
+            <w:pPr>
+              <w:spacing w:after="0"/>
+            </w:pPr>
+            <w:r>
+              <w:rPr>
+                <w:sz w:val="19"/>
+                <w:szCs w:val="19"/>
+              </w:rPr>
+              <w:t xml:space="preserve">45 min</w:t>
+            </w:r>
+          </w:p>
+        </w:tc>
+        <w:tc>
+          <w:tcPr>
+            <w:tcW w:type="dxa" w:w="4947"/>
+            <w:tcBorders>
+              <w:top w:val="single" w:color="BFBFBF" w:sz="4"/>
+              <w:left w:val="single" w:color="BFBFBF" w:sz="4"/>
+              <w:bottom w:val="single" w:color="BFBFBF" w:sz="4"/>
+              <w:right w:val="single" w:color="BFBFBF" w:sz="4"/>
+            </w:tcBorders>
+            <w:tcMar>
+              <w:top w:type="dxa" w:w="60"/>
+              <w:left w:type="dxa" w:w="100"/>
+              <w:bottom w:type="dxa" w:w="60"/>
+              <w:right w:type="dxa" w:w="100"/>
+            </w:tcMar>
+          </w:tcPr>
+          <w:p>
+            <w:pPr>
+              <w:spacing w:after="0"/>
+            </w:pPr>
+            <w:r>
+              <w:rPr>
+                <w:sz w:val="19"/>
+                <w:szCs w:val="19"/>
+              </w:rPr>
+              <w:t xml:space="preserve">Tristan moderates · everyone answers</w:t>
+            </w:r>
+          </w:p>
+        </w:tc>
+      </w:tr>
+      <w:tr>
+        <w:trPr>
+          <w:tblHeader w:val="off"/>
+        </w:trPr>
+        <w:tc>
+          <w:tcPr>
+            <w:tcW w:type="dxa" w:w="921"/>
+            <w:tcBorders>
+              <w:top w:val="single" w:color="BFBFBF" w:sz="4"/>
+              <w:left w:val="single" w:color="BFBFBF" w:sz="4"/>
+              <w:bottom w:val="single" w:color="BFBFBF" w:sz="4"/>
+              <w:right w:val="single" w:color="BFBFBF" w:sz="4"/>
+            </w:tcBorders>
+            <w:tcMar>
+              <w:top w:type="dxa" w:w="60"/>
+              <w:left w:type="dxa" w:w="100"/>
+              <w:bottom w:type="dxa" w:w="60"/>
+              <w:right w:type="dxa" w:w="100"/>
+            </w:tcMar>
+          </w:tcPr>
+          <w:p>
+            <w:pPr>
+              <w:spacing w:after="0"/>
+            </w:pPr>
+            <w:r>
+              <w:rPr>
+                <w:sz w:val="19"/>
+                <w:szCs w:val="19"/>
+              </w:rPr>
+              <w:t xml:space="preserve">1:50 – 2:00</w:t>
+            </w:r>
+          </w:p>
+        </w:tc>
+        <w:tc>
+          <w:tcPr>
+            <w:tcW w:type="dxa" w:w="3100"/>
+            <w:tcBorders>
+              <w:top w:val="single" w:color="BFBFBF" w:sz="4"/>
+              <w:left w:val="single" w:color="BFBFBF" w:sz="4"/>
+              <w:bottom w:val="single" w:color="BFBFBF" w:sz="4"/>
+              <w:right w:val="single" w:color="BFBFBF" w:sz="4"/>
+            </w:tcBorders>
+            <w:tcMar>
+              <w:top w:type="dxa" w:w="60"/>
+              <w:left w:type="dxa" w:w="100"/>
+              <w:bottom w:type="dxa" w:w="60"/>
+              <w:right w:type="dxa" w:w="100"/>
+            </w:tcMar>
+          </w:tcPr>
+          <w:p>
+            <w:pPr>
+              <w:spacing w:after="0"/>
+            </w:pPr>
+            <w:r>
+              <w:rPr>
+                <w:sz w:val="19"/>
+                <w:szCs w:val="19"/>
+              </w:rPr>
+              <w:t xml:space="preserve">Panel deliberation</w:t>
+            </w:r>
+          </w:p>
+        </w:tc>
+        <w:tc>
+          <w:tcPr>
+            <w:tcW w:type="dxa" w:w="670"/>
+            <w:tcBorders>
+              <w:top w:val="single" w:color="BFBFBF" w:sz="4"/>
+              <w:left w:val="single" w:color="BFBFBF" w:sz="4"/>
+              <w:bottom w:val="single" w:color="BFBFBF" w:sz="4"/>
+              <w:right w:val="single" w:color="BFBFBF" w:sz="4"/>
+            </w:tcBorders>
+            <w:tcMar>
+              <w:top w:type="dxa" w:w="60"/>
+              <w:left w:type="dxa" w:w="100"/>
+              <w:bottom w:type="dxa" w:w="60"/>
+              <w:right w:type="dxa" w:w="100"/>
+            </w:tcMar>
+          </w:tcPr>
+          <w:p>
+            <w:pPr>
+              <w:spacing w:after="0"/>
+            </w:pPr>
+            <w:r>
+              <w:rPr>
+                <w:sz w:val="19"/>
+                <w:szCs w:val="19"/>
+              </w:rPr>
+              <w:t xml:space="preserve">10 min</w:t>
+            </w:r>
+          </w:p>
+        </w:tc>
+        <w:tc>
+          <w:tcPr>
+            <w:tcW w:type="dxa" w:w="4947"/>
+            <w:tcBorders>
+              <w:top w:val="single" w:color="BFBFBF" w:sz="4"/>
+              <w:left w:val="single" w:color="BFBFBF" w:sz="4"/>
+              <w:bottom w:val="single" w:color="BFBFBF" w:sz="4"/>
+              <w:right w:val="single" w:color="BFBFBF" w:sz="4"/>
+            </w:tcBorders>
+            <w:tcMar>
+              <w:top w:type="dxa" w:w="60"/>
+              <w:left w:type="dxa" w:w="100"/>
+              <w:bottom w:type="dxa" w:w="60"/>
+              <w:right w:type="dxa" w:w="100"/>
+            </w:tcMar>
+          </w:tcPr>
+          <w:p>
+            <w:pPr>
+              <w:spacing w:after="0"/>
+            </w:pPr>
+            <w:r>
+              <w:rPr>
+                <w:sz w:val="19"/>
+                <w:szCs w:val="19"/>
+              </w:rPr>
+              <w:t xml:space="preserve">Panel only; the group waits outside</w:t>
+            </w:r>
+          </w:p>
+        </w:tc>
+      </w:tr>
+    </w:tbl>
+    <w:p>
+      <w:pPr>
+        <w:spacing w:after="120"/>
+      </w:pPr>
+    </w:p>
+    <w:p>
+      <w:r>
+        <w:rPr>
+          <w:b/>
+          <w:bCs/>
+        </w:rPr>
+        <w:t xml:space="preserve">Before the call to order</w:t>
+      </w:r>
+      <w:r>
+        <w:t xml:space="preserve">, the laptop must already be connected to the projector, the app running, and the deck on Slide 1. Nothing should be set up during the prayer or while the panel is waiting.</w:t>
+      </w:r>
+    </w:p>
+    <w:p>
+      <w:pPr>
+        <w:pStyle w:val="Heading2"/>
+      </w:pPr>
+      <w:r>
+        <w:t xml:space="preserve">Call to order (2 min)</w:t>
+      </w:r>
+    </w:p>
+    <w:p>
+      <w:r>
+        <w:t xml:space="preserve">This is normally done by the panel chair or the program moderator. If your group is asked to do it, </w:t>
+      </w:r>
+      <w:r>
+        <w:rPr>
+          <w:b/>
+          <w:bCs/>
+        </w:rPr>
+        <w:t xml:space="preserve">Tristan</w:t>
+      </w:r>
+      <w:r>
+        <w:t xml:space="preserve"> says:</w:t>
+      </w:r>
+    </w:p>
+    <w:p>
+      <w:r>
+        <w:rPr>
+          <w:i/>
+          <w:iCs/>
+          <w:color w:val="1F4E79"/>
+        </w:rPr>
+        <w:t xml:space="preserve">Good [morning/afternoon], everyone. We now call to order the thesis defense of the group presenting "Deepfake Detection for Pornographic Images with Human-in-the-Loop," under the advisership of Ms. Susan S. Caluya. We are honored to have with us our panel members: [Panelist 1], [Panelist 2], and [Panelist 3]. To begin, may we request everyone to please stand for the opening prayer, to be led by Genesis Navarro.</w:t>
+      </w:r>
+    </w:p>
+    <w:p>
+      <w:pPr>
+        <w:pStyle w:val="Heading2"/>
+      </w:pPr>
+      <w:r>
+        <w:t xml:space="preserve">Opening prayer (3 min) · </w:t>
+      </w:r>
+      <w:r>
+        <w:rPr>
+          <w:i/>
+          <w:iCs/>
+          <w:color w:val="1F4E79"/>
+        </w:rPr>
+        <w:t xml:space="preserve">Genesis</w:t>
+      </w:r>
+    </w:p>
+    <w:p>
+      <w:r>
+        <w:t xml:space="preserve">Use your school's usual prayer if there is one. Otherwise, a sample:</w:t>
+      </w:r>
+    </w:p>
+    <w:p>
+      <w:r>
+        <w:rPr>
+          <w:i/>
+          <w:iCs/>
+          <w:color w:val="1F4E79"/>
+        </w:rPr>
+        <w:t xml:space="preserve">Let us bow our heads and put ourselves in the presence of the Lord.</w:t>
+      </w:r>
+    </w:p>
+    <w:p>
+      <w:r>
+        <w:rPr>
+          <w:i/>
+          <w:iCs/>
+          <w:color w:val="1F4E79"/>
+        </w:rPr>
+        <w:t xml:space="preserve">Heavenly Father, we thank You for this day and for the chance to present the work we have prepared. Thank You for our adviser, Ms. Susan Caluya, for our panel members, and for everyone who guided and supported us throughout this study.</w:t>
+      </w:r>
+    </w:p>
+    <w:p>
+      <w:r>
+        <w:rPr>
+          <w:i/>
+          <w:iCs/>
+          <w:color w:val="1F4E79"/>
+        </w:rPr>
+        <w:t xml:space="preserve">Grant us clear minds and calm hearts, so that we may explain our research truthfully and answer every question with humility and understanding. Give our panel wisdom and fairness as they evaluate our work. May this study serve its purpose: to help protect people, especially victims, from the harm of manipulated images.</w:t>
+      </w:r>
+    </w:p>
+    <w:p>
+      <w:r>
+        <w:rPr>
+          <w:i/>
+          <w:iCs/>
+          <w:color w:val="1F4E79"/>
+        </w:rPr>
+        <w:t xml:space="preserve">We offer all of this to You, and we ask for Your guidance today and always. Amen.</w:t>
+      </w:r>
+    </w:p>
+    <w:p>
+      <w:r>
+        <w:rPr>
+          <w:i/>
+          <w:iCs/>
+          <w:color w:val="1F4E79"/>
+        </w:rPr>
+        <w:t xml:space="preserve">You may now take your seats.</w:t>
+      </w:r>
+    </w:p>
+    <w:p>
+      <w:r>
+        <w:t xml:space="preserve">After the prayer, </w:t>
+      </w:r>
+      <w:r>
+        <w:rPr>
+          <w:b/>
+          <w:bCs/>
+        </w:rPr>
+        <w:t xml:space="preserve">Tristan</w:t>
+      </w:r>
+      <w:r>
+        <w:t xml:space="preserve"> goes straight to Slide 1.</w:t>
+      </w:r>
+    </w:p>
+    <w:p>
+      <w:pPr>
+        <w:pBdr>
+          <w:bottom w:val="single" w:color="BFBFBF" w:sz="6" w:space="1"/>
+        </w:pBdr>
+        <w:spacing w:after="200"/>
+      </w:pPr>
+    </w:p>
+    <w:p>
+      <w:pPr>
+        <w:pStyle w:val="Heading1"/>
+        <w:pageBreakBefore/>
+      </w:pPr>
+      <w:r>
+        <w:t xml:space="preserve">Presentation time plan (the 60-minute block)</w:t>
+      </w:r>
+    </w:p>
+    <w:p>
+      <w:r>
+        <w:t xml:space="preserve">The ⏱ times on each slide count from the start of the presentation: </w:t>
+      </w:r>
+      <w:r>
+        <w:rPr>
+          <w:b/>
+          <w:bCs/>
+        </w:rPr>
+        <w:t xml:space="preserve">0:00 = Tristan begins Slide 1, right after the prayer</w:t>
+      </w:r>
+      <w:r>
+        <w:t xml:space="preserve"> (about 0:05 on the defense clock).</w:t>
       </w:r>
     </w:p>
     <w:tbl>
@@ -7712,15 +8637,6 @@
       </w:r>
     </w:p>
     <w:p>
-      <w:r>
-        <w:rPr>
-          <w:b/>
-          <w:bCs/>
-        </w:rPr>
-        <w:t xml:space="preserve">30 minutes before</w:t>
-      </w:r>
-    </w:p>
-    <w:p>
       <w:pPr>
         <w:pStyle w:val="ListParagraph"/>
         <w:numPr>
@@ -7729,26 +8645,7 @@
         </w:numPr>
       </w:pPr>
       <w:r>
-        <w:rPr>
-          <w:rFonts w:ascii="Consolas" w:cs="Consolas" w:eastAsia="Consolas" w:hAnsi="Consolas"/>
-          <w:sz w:val="19"/>
-          <w:szCs w:val="19"/>
-        </w:rPr>
-        <w:t xml:space="preserve">.venv\Scripts\activate</w:t>
-      </w:r>
-      <w:r>
-        <w:t xml:space="preserve"> → </w:t>
-      </w:r>
-      <w:r>
-        <w:rPr>
-          <w:rFonts w:ascii="Consolas" w:cs="Consolas" w:eastAsia="Consolas" w:hAnsi="Consolas"/>
-          <w:sz w:val="19"/>
-          <w:szCs w:val="19"/>
-        </w:rPr>
-        <w:t xml:space="preserve">flask --app app run</w:t>
-      </w:r>
-      <w:r>
-        <w:t xml:space="preserve"> → Chrome at http://127.0.0.1:5000.</w:t>
+        <w:t xml:space="preserve">Print or save the manuscript PDF on the laptop, for checking page numbers during Q&amp;A.</w:t>
       </w:r>
     </w:p>
     <w:p>
@@ -7760,29 +8657,7 @@
         </w:numPr>
       </w:pPr>
       <w:r>
-        <w:t xml:space="preserve">Open </w:t>
-      </w:r>
-      <w:r>
-        <w:rPr>
-          <w:rFonts w:ascii="Consolas" w:cs="Consolas" w:eastAsia="Consolas" w:hAnsi="Consolas"/>
-          <w:sz w:val="19"/>
-          <w:szCs w:val="19"/>
-        </w:rPr>
-        <w:t xml:space="preserve">demo\samples\</w:t>
-      </w:r>
-      <w:r>
-        <w:t xml:space="preserve"> in File Explorer; keep </w:t>
-      </w:r>
-      <w:r>
-        <w:rPr>
-          <w:rFonts w:ascii="Consolas" w:cs="Consolas" w:eastAsia="Consolas" w:hAnsi="Consolas"/>
-          <w:sz w:val="19"/>
-          <w:szCs w:val="19"/>
-        </w:rPr>
-        <w:t xml:space="preserve">docs\walkthrough\</w:t>
-      </w:r>
-      <w:r>
-        <w:t xml:space="preserve"> ready as the backup.</w:t>
+        <w:t xml:space="preserve">Genesis brings a notebook and pen for recording the panel's comments.</w:t>
       </w:r>
     </w:p>
     <w:p>
@@ -7794,7 +8669,127 @@
         </w:numPr>
       </w:pPr>
       <w:r>
+        <w:t xml:space="preserve">Confirm the panelists' names and titles for the call to order.</w:t>
+      </w:r>
+    </w:p>
+    <w:p>
+      <w:r>
+        <w:rPr>
+          <w:b/>
+          <w:bCs/>
+        </w:rPr>
+        <w:t xml:space="preserve">30 minutes before</w:t>
+      </w:r>
+    </w:p>
+    <w:p>
+      <w:pPr>
+        <w:pStyle w:val="ListParagraph"/>
+        <w:numPr>
+          <w:ilvl w:val="0"/>
+          <w:numId w:val="4"/>
+        </w:numPr>
+      </w:pPr>
+      <w:r>
+        <w:rPr>
+          <w:rFonts w:ascii="Consolas" w:cs="Consolas" w:eastAsia="Consolas" w:hAnsi="Consolas"/>
+          <w:sz w:val="19"/>
+          <w:szCs w:val="19"/>
+        </w:rPr>
+        <w:t xml:space="preserve">.venv\Scripts\activate</w:t>
+      </w:r>
+      <w:r>
+        <w:t xml:space="preserve"> → </w:t>
+      </w:r>
+      <w:r>
+        <w:rPr>
+          <w:rFonts w:ascii="Consolas" w:cs="Consolas" w:eastAsia="Consolas" w:hAnsi="Consolas"/>
+          <w:sz w:val="19"/>
+          <w:szCs w:val="19"/>
+        </w:rPr>
+        <w:t xml:space="preserve">flask --app app run</w:t>
+      </w:r>
+      <w:r>
+        <w:t xml:space="preserve"> → Chrome at http://127.0.0.1:5000.</w:t>
+      </w:r>
+    </w:p>
+    <w:p>
+      <w:pPr>
+        <w:pStyle w:val="ListParagraph"/>
+        <w:numPr>
+          <w:ilvl w:val="0"/>
+          <w:numId w:val="4"/>
+        </w:numPr>
+      </w:pPr>
+      <w:r>
+        <w:t xml:space="preserve">Open </w:t>
+      </w:r>
+      <w:r>
+        <w:rPr>
+          <w:rFonts w:ascii="Consolas" w:cs="Consolas" w:eastAsia="Consolas" w:hAnsi="Consolas"/>
+          <w:sz w:val="19"/>
+          <w:szCs w:val="19"/>
+        </w:rPr>
+        <w:t xml:space="preserve">demo\samples\</w:t>
+      </w:r>
+      <w:r>
+        <w:t xml:space="preserve"> in File Explorer; keep </w:t>
+      </w:r>
+      <w:r>
+        <w:rPr>
+          <w:rFonts w:ascii="Consolas" w:cs="Consolas" w:eastAsia="Consolas" w:hAnsi="Consolas"/>
+          <w:sz w:val="19"/>
+          <w:szCs w:val="19"/>
+        </w:rPr>
+        <w:t xml:space="preserve">docs\walkthrough\</w:t>
+      </w:r>
+      <w:r>
+        <w:t xml:space="preserve"> ready as the backup.</w:t>
+      </w:r>
+    </w:p>
+    <w:p>
+      <w:pPr>
+        <w:pStyle w:val="ListParagraph"/>
+        <w:numPr>
+          <w:ilvl w:val="0"/>
+          <w:numId w:val="4"/>
+        </w:numPr>
+      </w:pPr>
+      <w:r>
         <w:t xml:space="preserve">Zoom the browser to about 125%. Close unrelated apps and turn off notifications.</w:t>
+      </w:r>
+    </w:p>
+    <w:p>
+      <w:pPr>
+        <w:pStyle w:val="ListParagraph"/>
+        <w:numPr>
+          <w:ilvl w:val="0"/>
+          <w:numId w:val="4"/>
+        </w:numPr>
+      </w:pPr>
+      <w:r>
+        <w:t xml:space="preserve">Put phones on silent. Have water ready for the speakers.</w:t>
+      </w:r>
+    </w:p>
+    <w:p>
+      <w:pPr>
+        <w:pStyle w:val="ListParagraph"/>
+        <w:numPr>
+          <w:ilvl w:val="0"/>
+          <w:numId w:val="4"/>
+        </w:numPr>
+      </w:pPr>
+      <w:r>
+        <w:t xml:space="preserve">Deck open on Slide 1, and the projector tested, </w:t>
+      </w:r>
+      <w:r>
+        <w:rPr>
+          <w:b/>
+          <w:bCs/>
+        </w:rPr>
+        <w:t xml:space="preserve">before</w:t>
+      </w:r>
+      <w:r>
+        <w:t xml:space="preserve"> the call to order.</w:t>
       </w:r>
     </w:p>
     <w:p>
@@ -7811,69 +8806,410 @@
         <w:pageBreakBefore/>
       </w:pPr>
       <w:r>
-        <w:t xml:space="preserve">Q&amp;A plan (led by Tristan)</w:t>
-      </w:r>
-    </w:p>
-    <w:p>
-      <w:pPr>
-        <w:pStyle w:val="ListParagraph"/>
-        <w:numPr>
-          <w:ilvl w:val="0"/>
-          <w:numId w:val="3"/>
-        </w:numPr>
-      </w:pPr>
-      <w:r>
-        <w:rPr>
-          <w:b/>
-          <w:bCs/>
-        </w:rPr>
-        <w:t xml:space="preserve">Tristan</w:t>
-      </w:r>
-      <w:r>
-        <w:t xml:space="preserve"> receives each question, repeats it briefly if needed, and passes it to the member who presented that part. Tristan answers overall-design and scope questions directly.</w:t>
-      </w:r>
-    </w:p>
-    <w:p>
-      <w:pPr>
-        <w:pStyle w:val="ListParagraph"/>
-        <w:numPr>
-          <w:ilvl w:val="0"/>
-          <w:numId w:val="3"/>
-        </w:numPr>
-      </w:pPr>
-      <w:r>
-        <w:t xml:space="preserve">The assigned member answers. Others may add </w:t>
-      </w:r>
-      <w:r>
-        <w:rPr>
-          <w:b/>
-          <w:bCs/>
-        </w:rPr>
-        <w:t xml:space="preserve">one</w:t>
-      </w:r>
-      <w:r>
-        <w:t xml:space="preserve"> point only if Tristan invites them.</w:t>
-      </w:r>
-    </w:p>
-    <w:p>
-      <w:pPr>
-        <w:pStyle w:val="ListParagraph"/>
-        <w:numPr>
-          <w:ilvl w:val="0"/>
-          <w:numId w:val="3"/>
-        </w:numPr>
-      </w:pPr>
-      <w:r>
-        <w:t xml:space="preserve">If nobody is sure, don't guess: </w:t>
-      </w:r>
-      <w:r>
-        <w:rPr>
-          <w:i/>
-          <w:iCs/>
-          <w:color w:val="1F4E79"/>
-        </w:rPr>
-        <w:t xml:space="preserve">"That is a valid point; we will verify it and include it in our revisions."</w:t>
-      </w:r>
+        <w:t xml:space="preserve">Question and answer — 45 minutes (led by Tristan)</w:t>
+      </w:r>
+    </w:p>
+    <w:p>
+      <w:pPr>
+        <w:pStyle w:val="Heading2"/>
+      </w:pPr>
+      <w:r>
+        <w:t xml:space="preserve">Roles during Q&amp;A</w:t>
+      </w:r>
+    </w:p>
+    <w:tbl>
+      <w:tblPr>
+        <w:tblW w:type="dxa" w:w="9638"/>
+        <w:tblBorders>
+          <w:top w:val="single" w:color="auto" w:sz="4"/>
+          <w:left w:val="single" w:color="auto" w:sz="4"/>
+          <w:bottom w:val="single" w:color="auto" w:sz="4"/>
+          <w:right w:val="single" w:color="auto" w:sz="4"/>
+          <w:insideH w:val="single" w:color="auto" w:sz="4"/>
+          <w:insideV w:val="single" w:color="auto" w:sz="4"/>
+        </w:tblBorders>
+      </w:tblPr>
+      <w:tblGrid>
+        <w:gridCol w:w="2460"/>
+        <w:gridCol w:w="7178"/>
+      </w:tblGrid>
+      <w:tr>
+        <w:trPr>
+          <w:tblHeader/>
+        </w:trPr>
+        <w:tc>
+          <w:tcPr>
+            <w:tcW w:type="dxa" w:w="2460"/>
+            <w:tcBorders>
+              <w:top w:val="single" w:color="BFBFBF" w:sz="4"/>
+              <w:left w:val="single" w:color="BFBFBF" w:sz="4"/>
+              <w:bottom w:val="single" w:color="BFBFBF" w:sz="4"/>
+              <w:right w:val="single" w:color="BFBFBF" w:sz="4"/>
+            </w:tcBorders>
+            <w:shd w:fill="D9E2F3" w:color="auto" w:val="clear"/>
+            <w:tcMar>
+              <w:top w:type="dxa" w:w="60"/>
+              <w:left w:type="dxa" w:w="100"/>
+              <w:bottom w:type="dxa" w:w="60"/>
+              <w:right w:type="dxa" w:w="100"/>
+            </w:tcMar>
+          </w:tcPr>
+          <w:p>
+            <w:pPr>
+              <w:spacing w:after="0"/>
+            </w:pPr>
+            <w:r>
+              <w:rPr>
+                <w:b/>
+                <w:bCs/>
+                <w:sz w:val="19"/>
+                <w:szCs w:val="19"/>
+              </w:rPr>
+              <w:t xml:space="preserve">Member</w:t>
+            </w:r>
+          </w:p>
+        </w:tc>
+        <w:tc>
+          <w:tcPr>
+            <w:tcW w:type="dxa" w:w="7178"/>
+            <w:tcBorders>
+              <w:top w:val="single" w:color="BFBFBF" w:sz="4"/>
+              <w:left w:val="single" w:color="BFBFBF" w:sz="4"/>
+              <w:bottom w:val="single" w:color="BFBFBF" w:sz="4"/>
+              <w:right w:val="single" w:color="BFBFBF" w:sz="4"/>
+            </w:tcBorders>
+            <w:shd w:fill="D9E2F3" w:color="auto" w:val="clear"/>
+            <w:tcMar>
+              <w:top w:type="dxa" w:w="60"/>
+              <w:left w:type="dxa" w:w="100"/>
+              <w:bottom w:type="dxa" w:w="60"/>
+              <w:right w:type="dxa" w:w="100"/>
+            </w:tcMar>
+          </w:tcPr>
+          <w:p>
+            <w:pPr>
+              <w:spacing w:after="0"/>
+            </w:pPr>
+            <w:r>
+              <w:rPr>
+                <w:b/>
+                <w:bCs/>
+                <w:sz w:val="19"/>
+                <w:szCs w:val="19"/>
+              </w:rPr>
+              <w:t xml:space="preserve">Role</w:t>
+            </w:r>
+          </w:p>
+        </w:tc>
+      </w:tr>
+      <w:tr>
+        <w:trPr>
+          <w:tblHeader w:val="off"/>
+        </w:trPr>
+        <w:tc>
+          <w:tcPr>
+            <w:tcW w:type="dxa" w:w="2460"/>
+            <w:tcBorders>
+              <w:top w:val="single" w:color="BFBFBF" w:sz="4"/>
+              <w:left w:val="single" w:color="BFBFBF" w:sz="4"/>
+              <w:bottom w:val="single" w:color="BFBFBF" w:sz="4"/>
+              <w:right w:val="single" w:color="BFBFBF" w:sz="4"/>
+            </w:tcBorders>
+            <w:tcMar>
+              <w:top w:type="dxa" w:w="60"/>
+              <w:left w:type="dxa" w:w="100"/>
+              <w:bottom w:type="dxa" w:w="60"/>
+              <w:right w:type="dxa" w:w="100"/>
+            </w:tcMar>
+          </w:tcPr>
+          <w:p>
+            <w:pPr>
+              <w:spacing w:after="0"/>
+            </w:pPr>
+            <w:r>
+              <w:rPr>
+                <w:b/>
+                <w:bCs/>
+                <w:sz w:val="19"/>
+                <w:szCs w:val="19"/>
+              </w:rPr>
+              <w:t xml:space="preserve">Tristan</w:t>
+            </w:r>
+          </w:p>
+        </w:tc>
+        <w:tc>
+          <w:tcPr>
+            <w:tcW w:type="dxa" w:w="7178"/>
+            <w:tcBorders>
+              <w:top w:val="single" w:color="BFBFBF" w:sz="4"/>
+              <w:left w:val="single" w:color="BFBFBF" w:sz="4"/>
+              <w:bottom w:val="single" w:color="BFBFBF" w:sz="4"/>
+              <w:right w:val="single" w:color="BFBFBF" w:sz="4"/>
+            </w:tcBorders>
+            <w:tcMar>
+              <w:top w:type="dxa" w:w="60"/>
+              <w:left w:type="dxa" w:w="100"/>
+              <w:bottom w:type="dxa" w:w="60"/>
+              <w:right w:type="dxa" w:w="100"/>
+            </w:tcMar>
+          </w:tcPr>
+          <w:p>
+            <w:pPr>
+              <w:spacing w:after="0"/>
+            </w:pPr>
+            <w:r>
+              <w:rPr>
+                <w:b/>
+                <w:bCs/>
+                <w:sz w:val="19"/>
+                <w:szCs w:val="19"/>
+              </w:rPr>
+              <w:t xml:space="preserve">Moderator.</w:t>
+            </w:r>
+            <w:r>
+              <w:rPr>
+                <w:sz w:val="19"/>
+                <w:szCs w:val="19"/>
+              </w:rPr>
+              <w:t xml:space="preserve"> Receives each question, repeats it briefly if unclear, and passes it to the right member. Answers overall-design and scope questions. Watches the time.</w:t>
+            </w:r>
+          </w:p>
+        </w:tc>
+      </w:tr>
+      <w:tr>
+        <w:trPr>
+          <w:tblHeader w:val="off"/>
+        </w:trPr>
+        <w:tc>
+          <w:tcPr>
+            <w:tcW w:type="dxa" w:w="2460"/>
+            <w:tcBorders>
+              <w:top w:val="single" w:color="BFBFBF" w:sz="4"/>
+              <w:left w:val="single" w:color="BFBFBF" w:sz="4"/>
+              <w:bottom w:val="single" w:color="BFBFBF" w:sz="4"/>
+              <w:right w:val="single" w:color="BFBFBF" w:sz="4"/>
+            </w:tcBorders>
+            <w:tcMar>
+              <w:top w:type="dxa" w:w="60"/>
+              <w:left w:type="dxa" w:w="100"/>
+              <w:bottom w:type="dxa" w:w="60"/>
+              <w:right w:type="dxa" w:w="100"/>
+            </w:tcMar>
+          </w:tcPr>
+          <w:p>
+            <w:pPr>
+              <w:spacing w:after="0"/>
+            </w:pPr>
+            <w:r>
+              <w:rPr>
+                <w:b/>
+                <w:bCs/>
+                <w:sz w:val="19"/>
+                <w:szCs w:val="19"/>
+              </w:rPr>
+              <w:t xml:space="preserve">Genesis</w:t>
+            </w:r>
+          </w:p>
+        </w:tc>
+        <w:tc>
+          <w:tcPr>
+            <w:tcW w:type="dxa" w:w="7178"/>
+            <w:tcBorders>
+              <w:top w:val="single" w:color="BFBFBF" w:sz="4"/>
+              <w:left w:val="single" w:color="BFBFBF" w:sz="4"/>
+              <w:bottom w:val="single" w:color="BFBFBF" w:sz="4"/>
+              <w:right w:val="single" w:color="BFBFBF" w:sz="4"/>
+            </w:tcBorders>
+            <w:tcMar>
+              <w:top w:type="dxa" w:w="60"/>
+              <w:left w:type="dxa" w:w="100"/>
+              <w:bottom w:type="dxa" w:w="60"/>
+              <w:right w:type="dxa" w:w="100"/>
+            </w:tcMar>
+          </w:tcPr>
+          <w:p>
+            <w:pPr>
+              <w:spacing w:after="0"/>
+            </w:pPr>
+            <w:r>
+              <w:rPr>
+                <w:b/>
+                <w:bCs/>
+                <w:sz w:val="19"/>
+                <w:szCs w:val="19"/>
+              </w:rPr>
+              <w:t xml:space="preserve">Scribe.</w:t>
+            </w:r>
+            <w:r>
+              <w:rPr>
+                <w:sz w:val="19"/>
+                <w:szCs w:val="19"/>
+              </w:rPr>
+              <w:t xml:space="preserve"> Writes down every question, comment and suggested revision, with the panelist's name. These notes become your revision list. Still answers their own topics.</w:t>
+            </w:r>
+          </w:p>
+        </w:tc>
+      </w:tr>
+      <w:tr>
+        <w:trPr>
+          <w:tblHeader w:val="off"/>
+        </w:trPr>
+        <w:tc>
+          <w:tcPr>
+            <w:tcW w:type="dxa" w:w="2460"/>
+            <w:tcBorders>
+              <w:top w:val="single" w:color="BFBFBF" w:sz="4"/>
+              <w:left w:val="single" w:color="BFBFBF" w:sz="4"/>
+              <w:bottom w:val="single" w:color="BFBFBF" w:sz="4"/>
+              <w:right w:val="single" w:color="BFBFBF" w:sz="4"/>
+            </w:tcBorders>
+            <w:tcMar>
+              <w:top w:type="dxa" w:w="60"/>
+              <w:left w:type="dxa" w:w="100"/>
+              <w:bottom w:type="dxa" w:w="60"/>
+              <w:right w:type="dxa" w:w="100"/>
+            </w:tcMar>
+          </w:tcPr>
+          <w:p>
+            <w:pPr>
+              <w:spacing w:after="0"/>
+            </w:pPr>
+            <w:r>
+              <w:rPr>
+                <w:b/>
+                <w:bCs/>
+                <w:sz w:val="19"/>
+                <w:szCs w:val="19"/>
+              </w:rPr>
+              <w:t xml:space="preserve">Alexander</w:t>
+            </w:r>
+          </w:p>
+        </w:tc>
+        <w:tc>
+          <w:tcPr>
+            <w:tcW w:type="dxa" w:w="7178"/>
+            <w:tcBorders>
+              <w:top w:val="single" w:color="BFBFBF" w:sz="4"/>
+              <w:left w:val="single" w:color="BFBFBF" w:sz="4"/>
+              <w:bottom w:val="single" w:color="BFBFBF" w:sz="4"/>
+              <w:right w:val="single" w:color="BFBFBF" w:sz="4"/>
+            </w:tcBorders>
+            <w:tcMar>
+              <w:top w:type="dxa" w:w="60"/>
+              <w:left w:type="dxa" w:w="100"/>
+              <w:bottom w:type="dxa" w:w="60"/>
+              <w:right w:type="dxa" w:w="100"/>
+            </w:tcMar>
+          </w:tcPr>
+          <w:p>
+            <w:pPr>
+              <w:spacing w:after="0"/>
+            </w:pPr>
+            <w:r>
+              <w:rPr>
+                <w:b/>
+                <w:bCs/>
+                <w:sz w:val="19"/>
+                <w:szCs w:val="19"/>
+              </w:rPr>
+              <w:t xml:space="preserve">System operator.</w:t>
+            </w:r>
+            <w:r>
+              <w:rPr>
+                <w:sz w:val="19"/>
+                <w:szCs w:val="19"/>
+              </w:rPr>
+              <w:t xml:space="preserve"> Keeps the app open and logged in, ready if a panelist says "show me…".</w:t>
+            </w:r>
+          </w:p>
+        </w:tc>
+      </w:tr>
+      <w:tr>
+        <w:trPr>
+          <w:tblHeader w:val="off"/>
+        </w:trPr>
+        <w:tc>
+          <w:tcPr>
+            <w:tcW w:type="dxa" w:w="2460"/>
+            <w:tcBorders>
+              <w:top w:val="single" w:color="BFBFBF" w:sz="4"/>
+              <w:left w:val="single" w:color="BFBFBF" w:sz="4"/>
+              <w:bottom w:val="single" w:color="BFBFBF" w:sz="4"/>
+              <w:right w:val="single" w:color="BFBFBF" w:sz="4"/>
+            </w:tcBorders>
+            <w:tcMar>
+              <w:top w:type="dxa" w:w="60"/>
+              <w:left w:type="dxa" w:w="100"/>
+              <w:bottom w:type="dxa" w:w="60"/>
+              <w:right w:type="dxa" w:w="100"/>
+            </w:tcMar>
+          </w:tcPr>
+          <w:p>
+            <w:pPr>
+              <w:spacing w:after="0"/>
+            </w:pPr>
+            <w:r>
+              <w:rPr>
+                <w:b/>
+                <w:bCs/>
+                <w:sz w:val="19"/>
+                <w:szCs w:val="19"/>
+              </w:rPr>
+              <w:t xml:space="preserve">Charles</w:t>
+            </w:r>
+            <w:r>
+              <w:rPr>
+                <w:sz w:val="19"/>
+                <w:szCs w:val="19"/>
+              </w:rPr>
+              <w:t xml:space="preserve"> and </w:t>
+            </w:r>
+            <w:r>
+              <w:rPr>
+                <w:b/>
+                <w:bCs/>
+                <w:sz w:val="19"/>
+                <w:szCs w:val="19"/>
+              </w:rPr>
+              <w:t xml:space="preserve">Mark</w:t>
+            </w:r>
+          </w:p>
+        </w:tc>
+        <w:tc>
+          <w:tcPr>
+            <w:tcW w:type="dxa" w:w="7178"/>
+            <w:tcBorders>
+              <w:top w:val="single" w:color="BFBFBF" w:sz="4"/>
+              <w:left w:val="single" w:color="BFBFBF" w:sz="4"/>
+              <w:bottom w:val="single" w:color="BFBFBF" w:sz="4"/>
+              <w:right w:val="single" w:color="BFBFBF" w:sz="4"/>
+            </w:tcBorders>
+            <w:tcMar>
+              <w:top w:type="dxa" w:w="60"/>
+              <w:left w:type="dxa" w:w="100"/>
+              <w:bottom w:type="dxa" w:w="60"/>
+              <w:right w:type="dxa" w:w="100"/>
+            </w:tcMar>
+          </w:tcPr>
+          <w:p>
+            <w:pPr>
+              <w:spacing w:after="0"/>
+            </w:pPr>
+            <w:r>
+              <w:rPr>
+                <w:sz w:val="19"/>
+                <w:szCs w:val="19"/>
+              </w:rPr>
+              <w:t xml:space="preserve">Answer their topics; keep the slide deck ready to jump to Slides 7, 10, 12 or 13.</w:t>
+            </w:r>
+          </w:p>
+        </w:tc>
+      </w:tr>
+    </w:tbl>
+    <w:p>
+      <w:pPr>
+        <w:spacing w:after="120"/>
+      </w:pPr>
     </w:p>
     <w:tbl>
       <w:tblPr>
@@ -7989,7 +9325,7 @@
                 <w:sz w:val="19"/>
                 <w:szCs w:val="19"/>
               </w:rPr>
-              <w:t xml:space="preserve">Background, problem, motivation, statistics</w:t>
+              <w:t xml:space="preserve">Background, problem, motivation, statistics, related studies</w:t>
             </w:r>
           </w:p>
         </w:tc>
@@ -8115,7 +9451,7 @@
                 <w:sz w:val="19"/>
                 <w:szCs w:val="19"/>
               </w:rPr>
-              <w:t xml:space="preserve">Overall design, human-in-the-loop, ethics, conceptual framework</w:t>
+              <w:t xml:space="preserve">Overall design, human-in-the-loop, ethics, conceptual framework, future work</w:t>
             </w:r>
           </w:p>
         </w:tc>
@@ -8178,7 +9514,7 @@
                 <w:sz w:val="19"/>
                 <w:szCs w:val="19"/>
               </w:rPr>
-              <w:t xml:space="preserve">Architecture, algorithm, formulas, datasets, training, metrics</w:t>
+              <w:t xml:space="preserve">Architecture, algorithm, formulas, datasets, training, evaluation metrics</w:t>
             </w:r>
           </w:p>
         </w:tc>
@@ -8241,7 +9577,7 @@
                 <w:sz w:val="19"/>
                 <w:szCs w:val="19"/>
               </w:rPr>
-              <w:t xml:space="preserve">How the prototype works, code, security features, "UNTRAINED MODEL" banner</w:t>
+              <w:t xml:space="preserve">How the prototype works, code, security features, the "UNTRAINED MODEL" banner</w:t>
             </w:r>
           </w:p>
         </w:tc>
@@ -8283,10 +9619,1388 @@
     </w:p>
     <w:p>
       <w:pPr>
-        <w:pStyle w:val="Heading1"/>
-      </w:pPr>
-      <w:r>
-        <w:t xml:space="preserve">Likely panel questions</w:t>
+        <w:pStyle w:val="Heading2"/>
+      </w:pPr>
+      <w:r>
+        <w:t xml:space="preserve">How to answer</w:t>
+      </w:r>
+    </w:p>
+    <w:p>
+      <w:pPr>
+        <w:pStyle w:val="ListParagraph"/>
+        <w:numPr>
+          <w:ilvl w:val="0"/>
+          <w:numId w:val="2"/>
+        </w:numPr>
+      </w:pPr>
+      <w:r>
+        <w:rPr>
+          <w:b/>
+          <w:bCs/>
+        </w:rPr>
+        <w:t xml:space="preserve">Listen to the whole question.</w:t>
+      </w:r>
+      <w:r>
+        <w:t xml:space="preserve"> Don't start answering while the panelist is still talking.</w:t>
+      </w:r>
+    </w:p>
+    <w:p>
+      <w:pPr>
+        <w:pStyle w:val="ListParagraph"/>
+        <w:numPr>
+          <w:ilvl w:val="0"/>
+          <w:numId w:val="2"/>
+        </w:numPr>
+      </w:pPr>
+      <w:r>
+        <w:rPr>
+          <w:i/>
+          <w:iCs/>
+          <w:color w:val="1F4E79"/>
+        </w:rPr>
+        <w:t xml:space="preserve">Start with thanks or agreement</w:t>
+      </w:r>
+      <w:r>
+        <w:rPr>
+          <w:i/>
+          <w:iCs/>
+          <w:color w:val="1F4E79"/>
+        </w:rPr>
+        <w:t xml:space="preserve">: </w:t>
+      </w:r>
+      <w:r>
+        <w:rPr>
+          <w:i/>
+          <w:iCs/>
+          <w:color w:val="1F4E79"/>
+        </w:rPr>
+        <w:t xml:space="preserve">"Thank you for the question, sir/ma'am."</w:t>
+      </w:r>
+    </w:p>
+    <w:p>
+      <w:pPr>
+        <w:pStyle w:val="ListParagraph"/>
+        <w:numPr>
+          <w:ilvl w:val="0"/>
+          <w:numId w:val="2"/>
+        </w:numPr>
+      </w:pPr>
+      <w:r>
+        <w:rPr>
+          <w:i/>
+          <w:iCs/>
+          <w:color w:val="1F4E79"/>
+        </w:rPr>
+        <w:t xml:space="preserve">Answer in 30–90 seconds.</w:t>
+      </w:r>
+      <w:r>
+        <w:rPr>
+          <w:i/>
+          <w:iCs/>
+          <w:color w:val="1F4E79"/>
+        </w:rPr>
+        <w:t xml:space="preserve"> State the answer first, then one reason or example. Point to the chapter or slide if it helps: </w:t>
+      </w:r>
+      <w:r>
+        <w:rPr>
+          <w:i/>
+          <w:iCs/>
+          <w:color w:val="1F4E79"/>
+        </w:rPr>
+        <w:t xml:space="preserve">"As shown in our algorithm, line 9…"</w:t>
+      </w:r>
+    </w:p>
+    <w:p>
+      <w:pPr>
+        <w:pStyle w:val="ListParagraph"/>
+        <w:numPr>
+          <w:ilvl w:val="0"/>
+          <w:numId w:val="2"/>
+        </w:numPr>
+      </w:pPr>
+      <w:r>
+        <w:rPr>
+          <w:b/>
+          <w:bCs/>
+        </w:rPr>
+        <w:t xml:space="preserve">Don't argue or overclaim.</w:t>
+      </w:r>
+      <w:r>
+        <w:t xml:space="preserve"> If a panelist suggests a change, accept it: </w:t>
+      </w:r>
+      <w:r>
+        <w:rPr>
+          <w:i/>
+          <w:iCs/>
+          <w:color w:val="1F4E79"/>
+        </w:rPr>
+        <w:t xml:space="preserve">"Thank you, we will include that in our revisions."</w:t>
+      </w:r>
+      <w:r>
+        <w:t xml:space="preserve"> Genesis writes it down.</w:t>
+      </w:r>
+    </w:p>
+    <w:p>
+      <w:pPr>
+        <w:pStyle w:val="ListParagraph"/>
+        <w:numPr>
+          <w:ilvl w:val="0"/>
+          <w:numId w:val="2"/>
+        </w:numPr>
+      </w:pPr>
+      <w:r>
+        <w:rPr>
+          <w:i/>
+          <w:iCs/>
+          <w:color w:val="1F4E79"/>
+        </w:rPr>
+        <w:t xml:space="preserve">If you don't know,</w:t>
+      </w:r>
+      <w:r>
+        <w:rPr>
+          <w:i/>
+          <w:iCs/>
+          <w:color w:val="1F4E79"/>
+        </w:rPr>
+        <w:t xml:space="preserve"> don't guess: </w:t>
+      </w:r>
+      <w:r>
+        <w:rPr>
+          <w:i/>
+          <w:iCs/>
+          <w:color w:val="1F4E79"/>
+        </w:rPr>
+        <w:t xml:space="preserve">"That is a valid point. We have not tested that yet; we will verify it and include it in our revisions."</w:t>
+      </w:r>
+    </w:p>
+    <w:p>
+      <w:pPr>
+        <w:pStyle w:val="ListParagraph"/>
+        <w:numPr>
+          <w:ilvl w:val="0"/>
+          <w:numId w:val="2"/>
+        </w:numPr>
+      </w:pPr>
+      <w:r>
+        <w:rPr>
+          <w:b/>
+          <w:bCs/>
+        </w:rPr>
+        <w:t xml:space="preserve">Only one member answers each question.</w:t>
+      </w:r>
+      <w:r>
+        <w:t xml:space="preserve"> Others add one point only if Tristan invites them.</w:t>
+      </w:r>
+    </w:p>
+    <w:p>
+      <w:pPr>
+        <w:pStyle w:val="ListParagraph"/>
+        <w:numPr>
+          <w:ilvl w:val="0"/>
+          <w:numId w:val="2"/>
+        </w:numPr>
+      </w:pPr>
+      <w:r>
+        <w:rPr>
+          <w:b/>
+          <w:bCs/>
+        </w:rPr>
+        <w:t xml:space="preserve">If a panelist asks to see the system,</w:t>
+      </w:r>
+      <w:r>
+        <w:t xml:space="preserve"> Tristan says </w:t>
+      </w:r>
+      <w:r>
+        <w:rPr>
+          <w:i/>
+          <w:iCs/>
+          <w:color w:val="1F4E79"/>
+        </w:rPr>
+        <w:t xml:space="preserve">"Alexander will show it,"</w:t>
+      </w:r>
+      <w:r>
+        <w:t xml:space="preserve"> and Alexander logs in as the needed role (INV-01 / ANA-01 / ADM-01).</w:t>
+      </w:r>
+    </w:p>
+    <w:p>
+      <w:r>
+        <w:rPr>
+          <w:i/>
+          <w:iCs/>
+          <w:color w:val="1F4E79"/>
+        </w:rPr>
+        <w:t xml:space="preserve">Pacing:</w:t>
+      </w:r>
+      <w:r>
+        <w:rPr>
+          <w:i/>
+          <w:iCs/>
+          <w:color w:val="1F4E79"/>
+        </w:rPr>
+        <w:t xml:space="preserve"> 45 minutes is usually 12–20 questions. If one topic drags on, Tristan can say: </w:t>
+      </w:r>
+      <w:r>
+        <w:rPr>
+          <w:i/>
+          <w:iCs/>
+          <w:color w:val="1F4E79"/>
+        </w:rPr>
+        <w:t xml:space="preserve">"If we may, we will expand on that in our revised manuscript."</w:t>
+      </w:r>
+    </w:p>
+    <w:p>
+      <w:r>
+        <w:rPr>
+          <w:b/>
+          <w:bCs/>
+        </w:rPr>
+        <w:t xml:space="preserve">Closing the Q&amp;A (Tristan), when the chair ends it:</w:t>
+      </w:r>
+    </w:p>
+    <w:p>
+      <w:r>
+        <w:rPr>
+          <w:i/>
+          <w:iCs/>
+          <w:color w:val="1F4E79"/>
+        </w:rPr>
+        <w:t xml:space="preserve">Thank you very much to our panel for your questions and suggestions. We have noted all of them and will incorporate them in our revisions.</w:t>
+      </w:r>
+    </w:p>
+    <w:p>
+      <w:pPr>
+        <w:pStyle w:val="Heading2"/>
+      </w:pPr>
+      <w:r>
+        <w:t xml:space="preserve">Question bank</w:t>
+      </w:r>
+    </w:p>
+    <w:p>
+      <w:r>
+        <w:rPr>
+          <w:b/>
+          <w:bCs/>
+        </w:rPr>
+        <w:t xml:space="preserve">Genesis: background and problem</w:t>
+      </w:r>
+    </w:p>
+    <w:tbl>
+      <w:tblPr>
+        <w:tblW w:type="dxa" w:w="9638"/>
+        <w:tblBorders>
+          <w:top w:val="single" w:color="auto" w:sz="4"/>
+          <w:left w:val="single" w:color="auto" w:sz="4"/>
+          <w:bottom w:val="single" w:color="auto" w:sz="4"/>
+          <w:right w:val="single" w:color="auto" w:sz="4"/>
+          <w:insideH w:val="single" w:color="auto" w:sz="4"/>
+          <w:insideV w:val="single" w:color="auto" w:sz="4"/>
+        </w:tblBorders>
+      </w:tblPr>
+      <w:tblGrid>
+        <w:gridCol w:w="4283"/>
+        <w:gridCol w:w="5355"/>
+      </w:tblGrid>
+      <w:tr>
+        <w:trPr>
+          <w:tblHeader/>
+        </w:trPr>
+        <w:tc>
+          <w:tcPr>
+            <w:tcW w:type="dxa" w:w="4283"/>
+            <w:tcBorders>
+              <w:top w:val="single" w:color="BFBFBF" w:sz="4"/>
+              <w:left w:val="single" w:color="BFBFBF" w:sz="4"/>
+              <w:bottom w:val="single" w:color="BFBFBF" w:sz="4"/>
+              <w:right w:val="single" w:color="BFBFBF" w:sz="4"/>
+            </w:tcBorders>
+            <w:shd w:fill="D9E2F3" w:color="auto" w:val="clear"/>
+            <w:tcMar>
+              <w:top w:type="dxa" w:w="60"/>
+              <w:left w:type="dxa" w:w="100"/>
+              <w:bottom w:type="dxa" w:w="60"/>
+              <w:right w:type="dxa" w:w="100"/>
+            </w:tcMar>
+          </w:tcPr>
+          <w:p>
+            <w:pPr>
+              <w:spacing w:after="0"/>
+            </w:pPr>
+            <w:r>
+              <w:rPr>
+                <w:b/>
+                <w:bCs/>
+                <w:sz w:val="19"/>
+                <w:szCs w:val="19"/>
+              </w:rPr>
+              <w:t xml:space="preserve">Question</w:t>
+            </w:r>
+          </w:p>
+        </w:tc>
+        <w:tc>
+          <w:tcPr>
+            <w:tcW w:type="dxa" w:w="5355"/>
+            <w:tcBorders>
+              <w:top w:val="single" w:color="BFBFBF" w:sz="4"/>
+              <w:left w:val="single" w:color="BFBFBF" w:sz="4"/>
+              <w:bottom w:val="single" w:color="BFBFBF" w:sz="4"/>
+              <w:right w:val="single" w:color="BFBFBF" w:sz="4"/>
+            </w:tcBorders>
+            <w:shd w:fill="D9E2F3" w:color="auto" w:val="clear"/>
+            <w:tcMar>
+              <w:top w:type="dxa" w:w="60"/>
+              <w:left w:type="dxa" w:w="100"/>
+              <w:bottom w:type="dxa" w:w="60"/>
+              <w:right w:type="dxa" w:w="100"/>
+            </w:tcMar>
+          </w:tcPr>
+          <w:p>
+            <w:pPr>
+              <w:spacing w:after="0"/>
+            </w:pPr>
+            <w:r>
+              <w:rPr>
+                <w:b/>
+                <w:bCs/>
+                <w:sz w:val="19"/>
+                <w:szCs w:val="19"/>
+              </w:rPr>
+              <w:t xml:space="preserve">Suggested answer</w:t>
+            </w:r>
+          </w:p>
+        </w:tc>
+      </w:tr>
+      <w:tr>
+        <w:trPr>
+          <w:tblHeader w:val="off"/>
+        </w:trPr>
+        <w:tc>
+          <w:tcPr>
+            <w:tcW w:type="dxa" w:w="4283"/>
+            <w:tcBorders>
+              <w:top w:val="single" w:color="BFBFBF" w:sz="4"/>
+              <w:left w:val="single" w:color="BFBFBF" w:sz="4"/>
+              <w:bottom w:val="single" w:color="BFBFBF" w:sz="4"/>
+              <w:right w:val="single" w:color="BFBFBF" w:sz="4"/>
+            </w:tcBorders>
+            <w:tcMar>
+              <w:top w:type="dxa" w:w="60"/>
+              <w:left w:type="dxa" w:w="100"/>
+              <w:bottom w:type="dxa" w:w="60"/>
+              <w:right w:type="dxa" w:w="100"/>
+            </w:tcMar>
+          </w:tcPr>
+          <w:p>
+            <w:pPr>
+              <w:spacing w:after="0"/>
+            </w:pPr>
+            <w:r>
+              <w:rPr>
+                <w:sz w:val="19"/>
+                <w:szCs w:val="19"/>
+              </w:rPr>
+              <w:t xml:space="preserve">Why focus on pornographic deepfakes?</w:t>
+            </w:r>
+          </w:p>
+        </w:tc>
+        <w:tc>
+          <w:tcPr>
+            <w:tcW w:type="dxa" w:w="5355"/>
+            <w:tcBorders>
+              <w:top w:val="single" w:color="BFBFBF" w:sz="4"/>
+              <w:left w:val="single" w:color="BFBFBF" w:sz="4"/>
+              <w:bottom w:val="single" w:color="BFBFBF" w:sz="4"/>
+              <w:right w:val="single" w:color="BFBFBF" w:sz="4"/>
+            </w:tcBorders>
+            <w:tcMar>
+              <w:top w:type="dxa" w:w="60"/>
+              <w:left w:type="dxa" w:w="100"/>
+              <w:bottom w:type="dxa" w:w="60"/>
+              <w:right w:type="dxa" w:w="100"/>
+            </w:tcMar>
+          </w:tcPr>
+          <w:p>
+            <w:pPr>
+              <w:spacing w:after="0"/>
+            </w:pPr>
+            <w:r>
+              <w:rPr>
+                <w:sz w:val="19"/>
+                <w:szCs w:val="19"/>
+              </w:rPr>
+              <w:t xml:space="preserve">It is among the most harmful uses of deepfakes: victims suffer reputational, psychological and legal harm, and the content is often used for harassment or extortion. It also needs careful forensic handling.</w:t>
+            </w:r>
+          </w:p>
+        </w:tc>
+      </w:tr>
+      <w:tr>
+        <w:trPr>
+          <w:tblHeader w:val="off"/>
+        </w:trPr>
+        <w:tc>
+          <w:tcPr>
+            <w:tcW w:type="dxa" w:w="4283"/>
+            <w:tcBorders>
+              <w:top w:val="single" w:color="BFBFBF" w:sz="4"/>
+              <w:left w:val="single" w:color="BFBFBF" w:sz="4"/>
+              <w:bottom w:val="single" w:color="BFBFBF" w:sz="4"/>
+              <w:right w:val="single" w:color="BFBFBF" w:sz="4"/>
+            </w:tcBorders>
+            <w:tcMar>
+              <w:top w:type="dxa" w:w="60"/>
+              <w:left w:type="dxa" w:w="100"/>
+              <w:bottom w:type="dxa" w:w="60"/>
+              <w:right w:type="dxa" w:w="100"/>
+            </w:tcMar>
+          </w:tcPr>
+          <w:p>
+            <w:pPr>
+              <w:spacing w:after="0"/>
+            </w:pPr>
+            <w:r>
+              <w:rPr>
+                <w:sz w:val="19"/>
+                <w:szCs w:val="19"/>
+              </w:rPr>
+              <w:t xml:space="preserve">What makes your study different from existing detectors?</w:t>
+            </w:r>
+          </w:p>
+        </w:tc>
+        <w:tc>
+          <w:tcPr>
+            <w:tcW w:type="dxa" w:w="5355"/>
+            <w:tcBorders>
+              <w:top w:val="single" w:color="BFBFBF" w:sz="4"/>
+              <w:left w:val="single" w:color="BFBFBF" w:sz="4"/>
+              <w:bottom w:val="single" w:color="BFBFBF" w:sz="4"/>
+              <w:right w:val="single" w:color="BFBFBF" w:sz="4"/>
+            </w:tcBorders>
+            <w:tcMar>
+              <w:top w:type="dxa" w:w="60"/>
+              <w:left w:type="dxa" w:w="100"/>
+              <w:bottom w:type="dxa" w:w="60"/>
+              <w:right w:type="dxa" w:w="100"/>
+            </w:tcMar>
+          </w:tcPr>
+          <w:p>
+            <w:pPr>
+              <w:spacing w:after="0"/>
+            </w:pPr>
+            <w:r>
+              <w:rPr>
+                <w:sz w:val="19"/>
+                <w:szCs w:val="19"/>
+              </w:rPr>
+              <w:t xml:space="preserve">Most detectors give an automated final verdict. Ours combines a hybrid CNN–Transformer, three similarity metrics, and a mandatory human review, and the report keeps the AI analysis separate from the human decision.</w:t>
+            </w:r>
+          </w:p>
+        </w:tc>
+      </w:tr>
+      <w:tr>
+        <w:trPr>
+          <w:tblHeader w:val="off"/>
+        </w:trPr>
+        <w:tc>
+          <w:tcPr>
+            <w:tcW w:type="dxa" w:w="4283"/>
+            <w:tcBorders>
+              <w:top w:val="single" w:color="BFBFBF" w:sz="4"/>
+              <w:left w:val="single" w:color="BFBFBF" w:sz="4"/>
+              <w:bottom w:val="single" w:color="BFBFBF" w:sz="4"/>
+              <w:right w:val="single" w:color="BFBFBF" w:sz="4"/>
+            </w:tcBorders>
+            <w:tcMar>
+              <w:top w:type="dxa" w:w="60"/>
+              <w:left w:type="dxa" w:w="100"/>
+              <w:bottom w:type="dxa" w:w="60"/>
+              <w:right w:type="dxa" w:w="100"/>
+            </w:tcMar>
+          </w:tcPr>
+          <w:p>
+            <w:pPr>
+              <w:spacing w:after="0"/>
+            </w:pPr>
+            <w:r>
+              <w:rPr>
+                <w:sz w:val="19"/>
+                <w:szCs w:val="19"/>
+              </w:rPr>
+              <w:t xml:space="preserve">What is the harm of a false positive / false negative?</w:t>
+            </w:r>
+          </w:p>
+        </w:tc>
+        <w:tc>
+          <w:tcPr>
+            <w:tcW w:type="dxa" w:w="5355"/>
+            <w:tcBorders>
+              <w:top w:val="single" w:color="BFBFBF" w:sz="4"/>
+              <w:left w:val="single" w:color="BFBFBF" w:sz="4"/>
+              <w:bottom w:val="single" w:color="BFBFBF" w:sz="4"/>
+              <w:right w:val="single" w:color="BFBFBF" w:sz="4"/>
+            </w:tcBorders>
+            <w:tcMar>
+              <w:top w:type="dxa" w:w="60"/>
+              <w:left w:type="dxa" w:w="100"/>
+              <w:bottom w:type="dxa" w:w="60"/>
+              <w:right w:type="dxa" w:w="100"/>
+            </w:tcMar>
+          </w:tcPr>
+          <w:p>
+            <w:pPr>
+              <w:spacing w:after="0"/>
+            </w:pPr>
+            <w:r>
+              <w:rPr>
+                <w:sz w:val="19"/>
+                <w:szCs w:val="19"/>
+              </w:rPr>
+              <w:t xml:space="preserve">A false positive can wrongly accuse someone or dismiss a victim's genuine evidence; a false negative lets harmful content keep circulating. That is why an analyst reviews every case.</w:t>
+            </w:r>
+          </w:p>
+        </w:tc>
+      </w:tr>
+    </w:tbl>
+    <w:p>
+      <w:pPr>
+        <w:spacing w:after="120"/>
+      </w:pPr>
+    </w:p>
+    <w:p>
+      <w:r>
+        <w:rPr>
+          <w:b/>
+          <w:bCs/>
+        </w:rPr>
+        <w:t xml:space="preserve">Charles: objectives, scope and theory</w:t>
+      </w:r>
+    </w:p>
+    <w:tbl>
+      <w:tblPr>
+        <w:tblW w:type="dxa" w:w="9638"/>
+        <w:tblBorders>
+          <w:top w:val="single" w:color="auto" w:sz="4"/>
+          <w:left w:val="single" w:color="auto" w:sz="4"/>
+          <w:bottom w:val="single" w:color="auto" w:sz="4"/>
+          <w:right w:val="single" w:color="auto" w:sz="4"/>
+          <w:insideH w:val="single" w:color="auto" w:sz="4"/>
+          <w:insideV w:val="single" w:color="auto" w:sz="4"/>
+        </w:tblBorders>
+      </w:tblPr>
+      <w:tblGrid>
+        <w:gridCol w:w="3448"/>
+        <w:gridCol w:w="6190"/>
+      </w:tblGrid>
+      <w:tr>
+        <w:trPr>
+          <w:tblHeader/>
+        </w:trPr>
+        <w:tc>
+          <w:tcPr>
+            <w:tcW w:type="dxa" w:w="3448"/>
+            <w:tcBorders>
+              <w:top w:val="single" w:color="BFBFBF" w:sz="4"/>
+              <w:left w:val="single" w:color="BFBFBF" w:sz="4"/>
+              <w:bottom w:val="single" w:color="BFBFBF" w:sz="4"/>
+              <w:right w:val="single" w:color="BFBFBF" w:sz="4"/>
+            </w:tcBorders>
+            <w:shd w:fill="D9E2F3" w:color="auto" w:val="clear"/>
+            <w:tcMar>
+              <w:top w:type="dxa" w:w="60"/>
+              <w:left w:type="dxa" w:w="100"/>
+              <w:bottom w:type="dxa" w:w="60"/>
+              <w:right w:type="dxa" w:w="100"/>
+            </w:tcMar>
+          </w:tcPr>
+          <w:p>
+            <w:pPr>
+              <w:spacing w:after="0"/>
+            </w:pPr>
+            <w:r>
+              <w:rPr>
+                <w:b/>
+                <w:bCs/>
+                <w:sz w:val="19"/>
+                <w:szCs w:val="19"/>
+              </w:rPr>
+              <w:t xml:space="preserve">Question</w:t>
+            </w:r>
+          </w:p>
+        </w:tc>
+        <w:tc>
+          <w:tcPr>
+            <w:tcW w:type="dxa" w:w="6190"/>
+            <w:tcBorders>
+              <w:top w:val="single" w:color="BFBFBF" w:sz="4"/>
+              <w:left w:val="single" w:color="BFBFBF" w:sz="4"/>
+              <w:bottom w:val="single" w:color="BFBFBF" w:sz="4"/>
+              <w:right w:val="single" w:color="BFBFBF" w:sz="4"/>
+            </w:tcBorders>
+            <w:shd w:fill="D9E2F3" w:color="auto" w:val="clear"/>
+            <w:tcMar>
+              <w:top w:type="dxa" w:w="60"/>
+              <w:left w:type="dxa" w:w="100"/>
+              <w:bottom w:type="dxa" w:w="60"/>
+              <w:right w:type="dxa" w:w="100"/>
+            </w:tcMar>
+          </w:tcPr>
+          <w:p>
+            <w:pPr>
+              <w:spacing w:after="0"/>
+            </w:pPr>
+            <w:r>
+              <w:rPr>
+                <w:b/>
+                <w:bCs/>
+                <w:sz w:val="19"/>
+                <w:szCs w:val="19"/>
+              </w:rPr>
+              <w:t xml:space="preserve">Suggested answer</w:t>
+            </w:r>
+          </w:p>
+        </w:tc>
+      </w:tr>
+      <w:tr>
+        <w:trPr>
+          <w:tblHeader w:val="off"/>
+        </w:trPr>
+        <w:tc>
+          <w:tcPr>
+            <w:tcW w:type="dxa" w:w="3448"/>
+            <w:tcBorders>
+              <w:top w:val="single" w:color="BFBFBF" w:sz="4"/>
+              <w:left w:val="single" w:color="BFBFBF" w:sz="4"/>
+              <w:bottom w:val="single" w:color="BFBFBF" w:sz="4"/>
+              <w:right w:val="single" w:color="BFBFBF" w:sz="4"/>
+            </w:tcBorders>
+            <w:tcMar>
+              <w:top w:type="dxa" w:w="60"/>
+              <w:left w:type="dxa" w:w="100"/>
+              <w:bottom w:type="dxa" w:w="60"/>
+              <w:right w:type="dxa" w:w="100"/>
+            </w:tcMar>
+          </w:tcPr>
+          <w:p>
+            <w:pPr>
+              <w:spacing w:after="0"/>
+            </w:pPr>
+            <w:r>
+              <w:rPr>
+                <w:sz w:val="19"/>
+                <w:szCs w:val="19"/>
+              </w:rPr>
+              <w:t xml:space="preserve">Why only adults?</w:t>
+            </w:r>
+          </w:p>
+        </w:tc>
+        <w:tc>
+          <w:tcPr>
+            <w:tcW w:type="dxa" w:w="6190"/>
+            <w:tcBorders>
+              <w:top w:val="single" w:color="BFBFBF" w:sz="4"/>
+              <w:left w:val="single" w:color="BFBFBF" w:sz="4"/>
+              <w:bottom w:val="single" w:color="BFBFBF" w:sz="4"/>
+              <w:right w:val="single" w:color="BFBFBF" w:sz="4"/>
+            </w:tcBorders>
+            <w:tcMar>
+              <w:top w:type="dxa" w:w="60"/>
+              <w:left w:type="dxa" w:w="100"/>
+              <w:bottom w:type="dxa" w:w="60"/>
+              <w:right w:type="dxa" w:w="100"/>
+            </w:tcMar>
+          </w:tcPr>
+          <w:p>
+            <w:pPr>
+              <w:spacing w:after="0"/>
+            </w:pPr>
+            <w:r>
+              <w:rPr>
+                <w:sz w:val="19"/>
+                <w:szCs w:val="19"/>
+              </w:rPr>
+              <w:t xml:space="preserve">Material depicting minors is under absolute legal prohibition and cannot be handled by a student prototype. The system enforces this with a required attestation on every submission.</w:t>
+            </w:r>
+          </w:p>
+        </w:tc>
+      </w:tr>
+      <w:tr>
+        <w:trPr>
+          <w:tblHeader w:val="off"/>
+        </w:trPr>
+        <w:tc>
+          <w:tcPr>
+            <w:tcW w:type="dxa" w:w="3448"/>
+            <w:tcBorders>
+              <w:top w:val="single" w:color="BFBFBF" w:sz="4"/>
+              <w:left w:val="single" w:color="BFBFBF" w:sz="4"/>
+              <w:bottom w:val="single" w:color="BFBFBF" w:sz="4"/>
+              <w:right w:val="single" w:color="BFBFBF" w:sz="4"/>
+            </w:tcBorders>
+            <w:tcMar>
+              <w:top w:type="dxa" w:w="60"/>
+              <w:left w:type="dxa" w:w="100"/>
+              <w:bottom w:type="dxa" w:w="60"/>
+              <w:right w:type="dxa" w:w="100"/>
+            </w:tcMar>
+          </w:tcPr>
+          <w:p>
+            <w:pPr>
+              <w:spacing w:after="0"/>
+            </w:pPr>
+            <w:r>
+              <w:rPr>
+                <w:sz w:val="19"/>
+                <w:szCs w:val="19"/>
+              </w:rPr>
+              <w:t xml:space="preserve">Why still images and not video?</w:t>
+            </w:r>
+          </w:p>
+        </w:tc>
+        <w:tc>
+          <w:tcPr>
+            <w:tcW w:type="dxa" w:w="6190"/>
+            <w:tcBorders>
+              <w:top w:val="single" w:color="BFBFBF" w:sz="4"/>
+              <w:left w:val="single" w:color="BFBFBF" w:sz="4"/>
+              <w:bottom w:val="single" w:color="BFBFBF" w:sz="4"/>
+              <w:right w:val="single" w:color="BFBFBF" w:sz="4"/>
+            </w:tcBorders>
+            <w:tcMar>
+              <w:top w:type="dxa" w:w="60"/>
+              <w:left w:type="dxa" w:w="100"/>
+              <w:bottom w:type="dxa" w:w="60"/>
+              <w:right w:type="dxa" w:w="100"/>
+            </w:tcMar>
+          </w:tcPr>
+          <w:p>
+            <w:pPr>
+              <w:spacing w:after="0"/>
+            </w:pPr>
+            <w:r>
+              <w:rPr>
+                <w:sz w:val="19"/>
+                <w:szCs w:val="19"/>
+              </w:rPr>
+              <w:t xml:space="preserve">Video needs temporal analysis across frames, which is outside our scope; video is in our recommendations.</w:t>
+            </w:r>
+          </w:p>
+        </w:tc>
+      </w:tr>
+      <w:tr>
+        <w:trPr>
+          <w:tblHeader w:val="off"/>
+        </w:trPr>
+        <w:tc>
+          <w:tcPr>
+            <w:tcW w:type="dxa" w:w="3448"/>
+            <w:tcBorders>
+              <w:top w:val="single" w:color="BFBFBF" w:sz="4"/>
+              <w:left w:val="single" w:color="BFBFBF" w:sz="4"/>
+              <w:bottom w:val="single" w:color="BFBFBF" w:sz="4"/>
+              <w:right w:val="single" w:color="BFBFBF" w:sz="4"/>
+            </w:tcBorders>
+            <w:tcMar>
+              <w:top w:type="dxa" w:w="60"/>
+              <w:left w:type="dxa" w:w="100"/>
+              <w:bottom w:type="dxa" w:w="60"/>
+              <w:right w:type="dxa" w:w="100"/>
+            </w:tcMar>
+          </w:tcPr>
+          <w:p>
+            <w:pPr>
+              <w:spacing w:after="0"/>
+            </w:pPr>
+            <w:r>
+              <w:rPr>
+                <w:sz w:val="19"/>
+                <w:szCs w:val="19"/>
+              </w:rPr>
+              <w:t xml:space="preserve">What if only the body is edited?</w:t>
+            </w:r>
+          </w:p>
+        </w:tc>
+        <w:tc>
+          <w:tcPr>
+            <w:tcW w:type="dxa" w:w="6190"/>
+            <w:tcBorders>
+              <w:top w:val="single" w:color="BFBFBF" w:sz="4"/>
+              <w:left w:val="single" w:color="BFBFBF" w:sz="4"/>
+              <w:bottom w:val="single" w:color="BFBFBF" w:sz="4"/>
+              <w:right w:val="single" w:color="BFBFBF" w:sz="4"/>
+            </w:tcBorders>
+            <w:tcMar>
+              <w:top w:type="dxa" w:w="60"/>
+              <w:left w:type="dxa" w:w="100"/>
+              <w:bottom w:type="dxa" w:w="60"/>
+              <w:right w:type="dxa" w:w="100"/>
+            </w:tcMar>
+          </w:tcPr>
+          <w:p>
+            <w:pPr>
+              <w:spacing w:after="0"/>
+            </w:pPr>
+            <w:r>
+              <w:rPr>
+                <w:sz w:val="19"/>
+                <w:szCs w:val="19"/>
+              </w:rPr>
+              <w:t xml:space="preserve">The AI analyzes the facial region only, so a body-only edit is outside its scope. The analyst reviews the full image and can override or flag the case.</w:t>
+            </w:r>
+          </w:p>
+        </w:tc>
+      </w:tr>
+      <w:tr>
+        <w:trPr>
+          <w:tblHeader w:val="off"/>
+        </w:trPr>
+        <w:tc>
+          <w:tcPr>
+            <w:tcW w:type="dxa" w:w="3448"/>
+            <w:tcBorders>
+              <w:top w:val="single" w:color="BFBFBF" w:sz="4"/>
+              <w:left w:val="single" w:color="BFBFBF" w:sz="4"/>
+              <w:bottom w:val="single" w:color="BFBFBF" w:sz="4"/>
+              <w:right w:val="single" w:color="BFBFBF" w:sz="4"/>
+            </w:tcBorders>
+            <w:tcMar>
+              <w:top w:type="dxa" w:w="60"/>
+              <w:left w:type="dxa" w:w="100"/>
+              <w:bottom w:type="dxa" w:w="60"/>
+              <w:right w:type="dxa" w:w="100"/>
+            </w:tcMar>
+          </w:tcPr>
+          <w:p>
+            <w:pPr>
+              <w:spacing w:after="0"/>
+            </w:pPr>
+            <w:r>
+              <w:rPr>
+                <w:sz w:val="19"/>
+                <w:szCs w:val="19"/>
+              </w:rPr>
+              <w:t xml:space="preserve">Why a single reviewer?</w:t>
+            </w:r>
+          </w:p>
+        </w:tc>
+        <w:tc>
+          <w:tcPr>
+            <w:tcW w:type="dxa" w:w="6190"/>
+            <w:tcBorders>
+              <w:top w:val="single" w:color="BFBFBF" w:sz="4"/>
+              <w:left w:val="single" w:color="BFBFBF" w:sz="4"/>
+              <w:bottom w:val="single" w:color="BFBFBF" w:sz="4"/>
+              <w:right w:val="single" w:color="BFBFBF" w:sz="4"/>
+            </w:tcBorders>
+            <w:tcMar>
+              <w:top w:type="dxa" w:w="60"/>
+              <w:left w:type="dxa" w:w="100"/>
+              <w:bottom w:type="dxa" w:w="60"/>
+              <w:right w:type="dxa" w:w="100"/>
+            </w:tcMar>
+          </w:tcPr>
+          <w:p>
+            <w:pPr>
+              <w:spacing w:after="0"/>
+            </w:pPr>
+            <w:r>
+              <w:rPr>
+                <w:sz w:val="19"/>
+                <w:szCs w:val="19"/>
+              </w:rPr>
+              <w:t xml:space="preserve">It's a delimitation for the prototype; multi-rater consensus is planned for later deployment.</w:t>
+            </w:r>
+          </w:p>
+        </w:tc>
+      </w:tr>
+      <w:tr>
+        <w:trPr>
+          <w:tblHeader w:val="off"/>
+        </w:trPr>
+        <w:tc>
+          <w:tcPr>
+            <w:tcW w:type="dxa" w:w="3448"/>
+            <w:tcBorders>
+              <w:top w:val="single" w:color="BFBFBF" w:sz="4"/>
+              <w:left w:val="single" w:color="BFBFBF" w:sz="4"/>
+              <w:bottom w:val="single" w:color="BFBFBF" w:sz="4"/>
+              <w:right w:val="single" w:color="BFBFBF" w:sz="4"/>
+            </w:tcBorders>
+            <w:tcMar>
+              <w:top w:type="dxa" w:w="60"/>
+              <w:left w:type="dxa" w:w="100"/>
+              <w:bottom w:type="dxa" w:w="60"/>
+              <w:right w:type="dxa" w:w="100"/>
+            </w:tcMar>
+          </w:tcPr>
+          <w:p>
+            <w:pPr>
+              <w:spacing w:after="0"/>
+            </w:pPr>
+            <w:r>
+              <w:rPr>
+                <w:sz w:val="19"/>
+                <w:szCs w:val="19"/>
+              </w:rPr>
+              <w:t xml:space="preserve">How is Signal Detection Theory applied?</w:t>
+            </w:r>
+          </w:p>
+        </w:tc>
+        <w:tc>
+          <w:tcPr>
+            <w:tcW w:type="dxa" w:w="6190"/>
+            <w:tcBorders>
+              <w:top w:val="single" w:color="BFBFBF" w:sz="4"/>
+              <w:left w:val="single" w:color="BFBFBF" w:sz="4"/>
+              <w:bottom w:val="single" w:color="BFBFBF" w:sz="4"/>
+              <w:right w:val="single" w:color="BFBFBF" w:sz="4"/>
+            </w:tcBorders>
+            <w:tcMar>
+              <w:top w:type="dxa" w:w="60"/>
+              <w:left w:type="dxa" w:w="100"/>
+              <w:bottom w:type="dxa" w:w="60"/>
+              <w:right w:type="dxa" w:w="100"/>
+            </w:tcMar>
+          </w:tcPr>
+          <w:p>
+            <w:pPr>
+              <w:spacing w:after="0"/>
+            </w:pPr>
+            <w:r>
+              <w:rPr>
+                <w:sz w:val="19"/>
+                <w:szCs w:val="19"/>
+              </w:rPr>
+              <w:t xml:space="preserve">Our threshold τ separates "authentic" from "manipulated" scores, and ROC-AUC measures performance across all thresholds.</w:t>
+            </w:r>
+          </w:p>
+        </w:tc>
+      </w:tr>
+    </w:tbl>
+    <w:p>
+      <w:pPr>
+        <w:spacing w:after="120"/>
+      </w:pPr>
+    </w:p>
+    <w:p>
+      <w:r>
+        <w:rPr>
+          <w:b/>
+          <w:bCs/>
+        </w:rPr>
+        <w:t xml:space="preserve">Tristan: design, human-in-the-loop and ethics</w:t>
+      </w:r>
+    </w:p>
+    <w:tbl>
+      <w:tblPr>
+        <w:tblW w:type="dxa" w:w="9638"/>
+        <w:tblBorders>
+          <w:top w:val="single" w:color="auto" w:sz="4"/>
+          <w:left w:val="single" w:color="auto" w:sz="4"/>
+          <w:bottom w:val="single" w:color="auto" w:sz="4"/>
+          <w:right w:val="single" w:color="auto" w:sz="4"/>
+          <w:insideH w:val="single" w:color="auto" w:sz="4"/>
+          <w:insideV w:val="single" w:color="auto" w:sz="4"/>
+        </w:tblBorders>
+      </w:tblPr>
+      <w:tblGrid>
+        <w:gridCol w:w="3614"/>
+        <w:gridCol w:w="6024"/>
+      </w:tblGrid>
+      <w:tr>
+        <w:trPr>
+          <w:tblHeader/>
+        </w:trPr>
+        <w:tc>
+          <w:tcPr>
+            <w:tcW w:type="dxa" w:w="3614"/>
+            <w:tcBorders>
+              <w:top w:val="single" w:color="BFBFBF" w:sz="4"/>
+              <w:left w:val="single" w:color="BFBFBF" w:sz="4"/>
+              <w:bottom w:val="single" w:color="BFBFBF" w:sz="4"/>
+              <w:right w:val="single" w:color="BFBFBF" w:sz="4"/>
+            </w:tcBorders>
+            <w:shd w:fill="D9E2F3" w:color="auto" w:val="clear"/>
+            <w:tcMar>
+              <w:top w:type="dxa" w:w="60"/>
+              <w:left w:type="dxa" w:w="100"/>
+              <w:bottom w:type="dxa" w:w="60"/>
+              <w:right w:type="dxa" w:w="100"/>
+            </w:tcMar>
+          </w:tcPr>
+          <w:p>
+            <w:pPr>
+              <w:spacing w:after="0"/>
+            </w:pPr>
+            <w:r>
+              <w:rPr>
+                <w:b/>
+                <w:bCs/>
+                <w:sz w:val="19"/>
+                <w:szCs w:val="19"/>
+              </w:rPr>
+              <w:t xml:space="preserve">Question</w:t>
+            </w:r>
+          </w:p>
+        </w:tc>
+        <w:tc>
+          <w:tcPr>
+            <w:tcW w:type="dxa" w:w="6024"/>
+            <w:tcBorders>
+              <w:top w:val="single" w:color="BFBFBF" w:sz="4"/>
+              <w:left w:val="single" w:color="BFBFBF" w:sz="4"/>
+              <w:bottom w:val="single" w:color="BFBFBF" w:sz="4"/>
+              <w:right w:val="single" w:color="BFBFBF" w:sz="4"/>
+            </w:tcBorders>
+            <w:shd w:fill="D9E2F3" w:color="auto" w:val="clear"/>
+            <w:tcMar>
+              <w:top w:type="dxa" w:w="60"/>
+              <w:left w:type="dxa" w:w="100"/>
+              <w:bottom w:type="dxa" w:w="60"/>
+              <w:right w:type="dxa" w:w="100"/>
+            </w:tcMar>
+          </w:tcPr>
+          <w:p>
+            <w:pPr>
+              <w:spacing w:after="0"/>
+            </w:pPr>
+            <w:r>
+              <w:rPr>
+                <w:b/>
+                <w:bCs/>
+                <w:sz w:val="19"/>
+                <w:szCs w:val="19"/>
+              </w:rPr>
+              <w:t xml:space="preserve">Suggested answer</w:t>
+            </w:r>
+          </w:p>
+        </w:tc>
+      </w:tr>
+      <w:tr>
+        <w:trPr>
+          <w:tblHeader w:val="off"/>
+        </w:trPr>
+        <w:tc>
+          <w:tcPr>
+            <w:tcW w:type="dxa" w:w="3614"/>
+            <w:tcBorders>
+              <w:top w:val="single" w:color="BFBFBF" w:sz="4"/>
+              <w:left w:val="single" w:color="BFBFBF" w:sz="4"/>
+              <w:bottom w:val="single" w:color="BFBFBF" w:sz="4"/>
+              <w:right w:val="single" w:color="BFBFBF" w:sz="4"/>
+            </w:tcBorders>
+            <w:tcMar>
+              <w:top w:type="dxa" w:w="60"/>
+              <w:left w:type="dxa" w:w="100"/>
+              <w:bottom w:type="dxa" w:w="60"/>
+              <w:right w:type="dxa" w:w="100"/>
+            </w:tcMar>
+          </w:tcPr>
+          <w:p>
+            <w:pPr>
+              <w:spacing w:after="0"/>
+            </w:pPr>
+            <w:r>
+              <w:rPr>
+                <w:sz w:val="19"/>
+                <w:szCs w:val="19"/>
+              </w:rPr>
+              <w:t xml:space="preserve">Why not let the AI decide?</w:t>
+            </w:r>
+          </w:p>
+        </w:tc>
+        <w:tc>
+          <w:tcPr>
+            <w:tcW w:type="dxa" w:w="6024"/>
+            <w:tcBorders>
+              <w:top w:val="single" w:color="BFBFBF" w:sz="4"/>
+              <w:left w:val="single" w:color="BFBFBF" w:sz="4"/>
+              <w:bottom w:val="single" w:color="BFBFBF" w:sz="4"/>
+              <w:right w:val="single" w:color="BFBFBF" w:sz="4"/>
+            </w:tcBorders>
+            <w:tcMar>
+              <w:top w:type="dxa" w:w="60"/>
+              <w:left w:type="dxa" w:w="100"/>
+              <w:bottom w:type="dxa" w:w="60"/>
+              <w:right w:type="dxa" w:w="100"/>
+            </w:tcMar>
+          </w:tcPr>
+          <w:p>
+            <w:pPr>
+              <w:spacing w:after="0"/>
+            </w:pPr>
+            <w:r>
+              <w:rPr>
+                <w:sz w:val="19"/>
+                <w:szCs w:val="19"/>
+              </w:rPr>
+              <w:t xml:space="preserve">Forensic results can have legal consequences and the AI can be wrong, as shown in our demo. The analyst provides accountability through a documented rationale.</w:t>
+            </w:r>
+          </w:p>
+        </w:tc>
+      </w:tr>
+      <w:tr>
+        <w:trPr>
+          <w:tblHeader w:val="off"/>
+        </w:trPr>
+        <w:tc>
+          <w:tcPr>
+            <w:tcW w:type="dxa" w:w="3614"/>
+            <w:tcBorders>
+              <w:top w:val="single" w:color="BFBFBF" w:sz="4"/>
+              <w:left w:val="single" w:color="BFBFBF" w:sz="4"/>
+              <w:bottom w:val="single" w:color="BFBFBF" w:sz="4"/>
+              <w:right w:val="single" w:color="BFBFBF" w:sz="4"/>
+            </w:tcBorders>
+            <w:tcMar>
+              <w:top w:type="dxa" w:w="60"/>
+              <w:left w:type="dxa" w:w="100"/>
+              <w:bottom w:type="dxa" w:w="60"/>
+              <w:right w:type="dxa" w:w="100"/>
+            </w:tcMar>
+          </w:tcPr>
+          <w:p>
+            <w:pPr>
+              <w:spacing w:after="0"/>
+            </w:pPr>
+            <w:r>
+              <w:rPr>
+                <w:sz w:val="19"/>
+                <w:szCs w:val="19"/>
+              </w:rPr>
+              <w:t xml:space="preserve">What if the analyst is biased or wrong?</w:t>
+            </w:r>
+          </w:p>
+        </w:tc>
+        <w:tc>
+          <w:tcPr>
+            <w:tcW w:type="dxa" w:w="6024"/>
+            <w:tcBorders>
+              <w:top w:val="single" w:color="BFBFBF" w:sz="4"/>
+              <w:left w:val="single" w:color="BFBFBF" w:sz="4"/>
+              <w:bottom w:val="single" w:color="BFBFBF" w:sz="4"/>
+              <w:right w:val="single" w:color="BFBFBF" w:sz="4"/>
+            </w:tcBorders>
+            <w:tcMar>
+              <w:top w:type="dxa" w:w="60"/>
+              <w:left w:type="dxa" w:w="100"/>
+              <w:bottom w:type="dxa" w:w="60"/>
+              <w:right w:type="dxa" w:w="100"/>
+            </w:tcMar>
+          </w:tcPr>
+          <w:p>
+            <w:pPr>
+              <w:spacing w:after="0"/>
+            </w:pPr>
+            <w:r>
+              <w:rPr>
+                <w:sz w:val="19"/>
+                <w:szCs w:val="19"/>
+              </w:rPr>
+              <w:t xml:space="preserve">Every decision needs a written rationale, every action is in the audit log, and the AI analysis stays in the report, so reviewers can be audited. Multi-reviewer consensus is future work.</w:t>
+            </w:r>
+          </w:p>
+        </w:tc>
+      </w:tr>
+      <w:tr>
+        <w:trPr>
+          <w:tblHeader w:val="off"/>
+        </w:trPr>
+        <w:tc>
+          <w:tcPr>
+            <w:tcW w:type="dxa" w:w="3614"/>
+            <w:tcBorders>
+              <w:top w:val="single" w:color="BFBFBF" w:sz="4"/>
+              <w:left w:val="single" w:color="BFBFBF" w:sz="4"/>
+              <w:bottom w:val="single" w:color="BFBFBF" w:sz="4"/>
+              <w:right w:val="single" w:color="BFBFBF" w:sz="4"/>
+            </w:tcBorders>
+            <w:tcMar>
+              <w:top w:type="dxa" w:w="60"/>
+              <w:left w:type="dxa" w:w="100"/>
+              <w:bottom w:type="dxa" w:w="60"/>
+              <w:right w:type="dxa" w:w="100"/>
+            </w:tcMar>
+          </w:tcPr>
+          <w:p>
+            <w:pPr>
+              <w:spacing w:after="0"/>
+            </w:pPr>
+            <w:r>
+              <w:rPr>
+                <w:sz w:val="19"/>
+                <w:szCs w:val="19"/>
+              </w:rPr>
+              <w:t xml:space="preserve">What happens to flagged cases?</w:t>
+            </w:r>
+          </w:p>
+        </w:tc>
+        <w:tc>
+          <w:tcPr>
+            <w:tcW w:type="dxa" w:w="6024"/>
+            <w:tcBorders>
+              <w:top w:val="single" w:color="BFBFBF" w:sz="4"/>
+              <w:left w:val="single" w:color="BFBFBF" w:sz="4"/>
+              <w:bottom w:val="single" w:color="BFBFBF" w:sz="4"/>
+              <w:right w:val="single" w:color="BFBFBF" w:sz="4"/>
+            </w:tcBorders>
+            <w:tcMar>
+              <w:top w:type="dxa" w:w="60"/>
+              <w:left w:type="dxa" w:w="100"/>
+              <w:bottom w:type="dxa" w:w="60"/>
+              <w:right w:type="dxa" w:w="100"/>
+            </w:tcMar>
+          </w:tcPr>
+          <w:p>
+            <w:pPr>
+              <w:spacing w:after="0"/>
+            </w:pPr>
+            <w:r>
+              <w:rPr>
+                <w:sz w:val="19"/>
+                <w:szCs w:val="19"/>
+              </w:rPr>
+              <w:t xml:space="preserve">They are marked "Inconclusive" for further investigation, still get a report, and are counted separately in the evaluation.</w:t>
+            </w:r>
+          </w:p>
+        </w:tc>
+      </w:tr>
+      <w:tr>
+        <w:trPr>
+          <w:tblHeader w:val="off"/>
+        </w:trPr>
+        <w:tc>
+          <w:tcPr>
+            <w:tcW w:type="dxa" w:w="3614"/>
+            <w:tcBorders>
+              <w:top w:val="single" w:color="BFBFBF" w:sz="4"/>
+              <w:left w:val="single" w:color="BFBFBF" w:sz="4"/>
+              <w:bottom w:val="single" w:color="BFBFBF" w:sz="4"/>
+              <w:right w:val="single" w:color="BFBFBF" w:sz="4"/>
+            </w:tcBorders>
+            <w:tcMar>
+              <w:top w:type="dxa" w:w="60"/>
+              <w:left w:type="dxa" w:w="100"/>
+              <w:bottom w:type="dxa" w:w="60"/>
+              <w:right w:type="dxa" w:w="100"/>
+            </w:tcMar>
+          </w:tcPr>
+          <w:p>
+            <w:pPr>
+              <w:spacing w:after="0"/>
+            </w:pPr>
+            <w:r>
+              <w:rPr>
+                <w:sz w:val="19"/>
+                <w:szCs w:val="19"/>
+              </w:rPr>
+              <w:t xml:space="preserve">How do you protect the victims' privacy?</w:t>
+            </w:r>
+          </w:p>
+        </w:tc>
+        <w:tc>
+          <w:tcPr>
+            <w:tcW w:type="dxa" w:w="6024"/>
+            <w:tcBorders>
+              <w:top w:val="single" w:color="BFBFBF" w:sz="4"/>
+              <w:left w:val="single" w:color="BFBFBF" w:sz="4"/>
+              <w:bottom w:val="single" w:color="BFBFBF" w:sz="4"/>
+              <w:right w:val="single" w:color="BFBFBF" w:sz="4"/>
+            </w:tcBorders>
+            <w:tcMar>
+              <w:top w:type="dxa" w:w="60"/>
+              <w:left w:type="dxa" w:w="100"/>
+              <w:bottom w:type="dxa" w:w="60"/>
+              <w:right w:type="dxa" w:w="100"/>
+            </w:tcMar>
+          </w:tcPr>
+          <w:p>
+            <w:pPr>
+              <w:spacing w:after="0"/>
+            </w:pPr>
+            <w:r>
+              <w:rPr>
+                <w:sz w:val="19"/>
+                <w:szCs w:val="19"/>
+              </w:rPr>
+              <w:t xml:space="preserve">Face crops only by default, full images blurred or pixelated, logged reveals, role-based access, uploads outside public folders, and a secure purge for data retention.</w:t>
+            </w:r>
+          </w:p>
+        </w:tc>
+      </w:tr>
+      <w:tr>
+        <w:trPr>
+          <w:tblHeader w:val="off"/>
+        </w:trPr>
+        <w:tc>
+          <w:tcPr>
+            <w:tcW w:type="dxa" w:w="3614"/>
+            <w:tcBorders>
+              <w:top w:val="single" w:color="BFBFBF" w:sz="4"/>
+              <w:left w:val="single" w:color="BFBFBF" w:sz="4"/>
+              <w:bottom w:val="single" w:color="BFBFBF" w:sz="4"/>
+              <w:right w:val="single" w:color="BFBFBF" w:sz="4"/>
+            </w:tcBorders>
+            <w:tcMar>
+              <w:top w:type="dxa" w:w="60"/>
+              <w:left w:type="dxa" w:w="100"/>
+              <w:bottom w:type="dxa" w:w="60"/>
+              <w:right w:type="dxa" w:w="100"/>
+            </w:tcMar>
+          </w:tcPr>
+          <w:p>
+            <w:pPr>
+              <w:spacing w:after="0"/>
+            </w:pPr>
+            <w:r>
+              <w:rPr>
+                <w:sz w:val="19"/>
+                <w:szCs w:val="19"/>
+              </w:rPr>
+              <w:t xml:space="preserve">Why is the demo not using explicit images?</w:t>
+            </w:r>
+          </w:p>
+        </w:tc>
+        <w:tc>
+          <w:tcPr>
+            <w:tcW w:type="dxa" w:w="6024"/>
+            <w:tcBorders>
+              <w:top w:val="single" w:color="BFBFBF" w:sz="4"/>
+              <w:left w:val="single" w:color="BFBFBF" w:sz="4"/>
+              <w:bottom w:val="single" w:color="BFBFBF" w:sz="4"/>
+              <w:right w:val="single" w:color="BFBFBF" w:sz="4"/>
+            </w:tcBorders>
+            <w:tcMar>
+              <w:top w:type="dxa" w:w="60"/>
+              <w:left w:type="dxa" w:w="100"/>
+              <w:bottom w:type="dxa" w:w="60"/>
+              <w:right w:type="dxa" w:w="100"/>
+            </w:tcMar>
+          </w:tcPr>
+          <w:p>
+            <w:pPr>
+              <w:spacing w:after="0"/>
+            </w:pPr>
+            <w:r>
+              <w:rPr>
+                <w:sz w:val="19"/>
+                <w:szCs w:val="19"/>
+              </w:rPr>
+              <w:t xml:space="preserve">The AI analyzes only the face crop, so the process is identical; our ethics protocol forbids explicit material outside authorized casework.</w:t>
+            </w:r>
+          </w:p>
+        </w:tc>
+      </w:tr>
+    </w:tbl>
+    <w:p>
+      <w:pPr>
+        <w:spacing w:after="120"/>
+      </w:pPr>
+    </w:p>
+    <w:p>
+      <w:r>
+        <w:rPr>
+          <w:b/>
+          <w:bCs/>
+        </w:rPr>
+        <w:t xml:space="preserve">Mark: architecture, algorithm, data and metrics</w:t>
       </w:r>
     </w:p>
     <w:tbl>
@@ -8369,7 +11083,7 @@
                 <w:sz w:val="19"/>
                 <w:szCs w:val="19"/>
               </w:rPr>
-              <w:t xml:space="preserve">Short answer</w:t>
+              <w:t xml:space="preserve">Suggested answer</w:t>
             </w:r>
           </w:p>
         </w:tc>
@@ -8403,7 +11117,7 @@
                 <w:sz w:val="19"/>
                 <w:szCs w:val="19"/>
               </w:rPr>
-              <w:t xml:space="preserve">Why "UNTRAINED MODEL"?</w:t>
+              <w:t xml:space="preserve">Why EfficientNet-B4 and not another CNN?</w:t>
             </w:r>
           </w:p>
         </w:tc>
@@ -8432,7 +11146,7 @@
                 <w:sz w:val="19"/>
                 <w:szCs w:val="19"/>
               </w:rPr>
-              <w:t xml:space="preserve">Fine-tuned weights aren't loaded yet; the system states this on every page and report so no one relies on the AI (a stated limitation).</w:t>
+              <w:t xml:space="preserve">It is accurate for its size, and its native 380×380 input keeps fine facial detail where blending artefacts appear.</w:t>
             </w:r>
           </w:p>
         </w:tc>
@@ -8466,7 +11180,7 @@
                 <w:sz w:val="19"/>
                 <w:szCs w:val="19"/>
               </w:rPr>
-              <w:t xml:space="preserve">Why not let the AI decide?</w:t>
+              <w:t xml:space="preserve">Why add a Transformer?</w:t>
             </w:r>
           </w:p>
         </w:tc>
@@ -8495,7 +11209,7 @@
                 <w:sz w:val="19"/>
                 <w:szCs w:val="19"/>
               </w:rPr>
-              <w:t xml:space="preserve">Wrong results have legal consequences; the demo showed the AI can be wrong; the analyst provides accountability through a documented rationale.</w:t>
+              <w:t xml:space="preserve">Self-attention captures relationships across the whole face (structural consistency) that a local CNN can miss.</w:t>
             </w:r>
           </w:p>
         </w:tc>
@@ -8529,7 +11243,7 @@
                 <w:sz w:val="19"/>
                 <w:szCs w:val="19"/>
               </w:rPr>
-              <w:t xml:space="preserve">Why non-explicit demo images?</w:t>
+              <w:t xml:space="preserve">Why resize to 384 in the ViT branch?</w:t>
             </w:r>
           </w:p>
         </w:tc>
@@ -8558,7 +11272,7 @@
                 <w:sz w:val="19"/>
                 <w:szCs w:val="19"/>
               </w:rPr>
-              <w:t xml:space="preserve">The AI analyzes only the face crop, so the pipeline is identical; our ethics protocol forbids explicit material outside authorized casework.</w:t>
+              <w:t xml:space="preserve">Patch-16 Transformers need an input size divisible by 16; 380 isn't.</w:t>
             </w:r>
           </w:p>
         </w:tc>
@@ -8592,7 +11306,7 @@
                 <w:sz w:val="19"/>
                 <w:szCs w:val="19"/>
               </w:rPr>
-              <w:t xml:space="preserve">What if only the body is edited?</w:t>
+              <w:t xml:space="preserve">Why SSIM on face crops, not embeddings?</w:t>
             </w:r>
           </w:p>
         </w:tc>
@@ -8621,7 +11335,7 @@
                 <w:sz w:val="19"/>
                 <w:szCs w:val="19"/>
               </w:rPr>
-              <w:t xml:space="preserve">Outside the AI's scope (face only); the analyst reviews the full image and can override or flag.</w:t>
+              <w:t xml:space="preserve">SSIM compares 2-D image structure (luminance, contrast, structure); it cannot be computed on a 1-D embedding.</w:t>
             </w:r>
           </w:p>
         </w:tc>
@@ -8655,7 +11369,7 @@
                 <w:sz w:val="19"/>
                 <w:szCs w:val="19"/>
               </w:rPr>
-              <w:t xml:space="preserve">Why SSIM on face crops?</w:t>
+              <w:t xml:space="preserve">Why convert the Euclidean distance?</w:t>
             </w:r>
           </w:p>
         </w:tc>
@@ -8684,7 +11398,7 @@
                 <w:sz w:val="19"/>
                 <w:szCs w:val="19"/>
               </w:rPr>
-              <w:t xml:space="preserve">SSIM compares 2-D image structure; it can't be computed on a 1-D embedding.</w:t>
+              <w:t xml:space="preserve">A distance increases as images differ; converting it to 1 − d/2 makes all three metrics "higher = more similar" before averaging.</w:t>
             </w:r>
           </w:p>
         </w:tc>
@@ -8718,7 +11432,7 @@
                 <w:sz w:val="19"/>
                 <w:szCs w:val="19"/>
               </w:rPr>
-              <w:t xml:space="preserve">Why 384 for the ViT?</w:t>
+              <w:t xml:space="preserve">How was τ = 0.70 chosen?</w:t>
             </w:r>
           </w:p>
         </w:tc>
@@ -8747,7 +11461,7 @@
                 <w:sz w:val="19"/>
                 <w:szCs w:val="19"/>
               </w:rPr>
-              <w:t xml:space="preserve">Patch-16 Transformers need an input size divisible by 16; 380 isn't.</w:t>
+              <w:t xml:space="preserve">It is the default; it is calibrated on the validation set by maximizing F1 or Youden's J.</w:t>
             </w:r>
           </w:p>
         </w:tc>
@@ -8781,7 +11495,7 @@
                 <w:sz w:val="19"/>
                 <w:szCs w:val="19"/>
               </w:rPr>
-              <w:t xml:space="preserve">How is τ = 0.70 chosen?</w:t>
+              <w:t xml:space="preserve">Why equal weights (⅓ each)?</w:t>
             </w:r>
           </w:p>
         </w:tc>
@@ -8810,7 +11524,7 @@
                 <w:sz w:val="19"/>
                 <w:szCs w:val="19"/>
               </w:rPr>
-              <w:t xml:space="preserve">Default; calibrated on the validation set by maximizing F1 or Youden's J.</w:t>
+              <w:t xml:space="preserve">Neutral default with no metric favored; the weights are configurable and can be tuned on validation data.</w:t>
             </w:r>
           </w:p>
         </w:tc>
@@ -8873,7 +11587,7 @@
                 <w:sz w:val="19"/>
                 <w:szCs w:val="19"/>
               </w:rPr>
-              <w:t xml:space="preserve">Face-swap artefacts occur in the face region regardless of the rest of the image; the domain gap is acknowledged as a limitation.</w:t>
+              <w:t xml:space="preserve">Face-swap artefacts appear in the face region regardless of the rest of the image, but we acknowledge a domain gap as a limitation.</w:t>
             </w:r>
           </w:p>
         </w:tc>
@@ -8907,7 +11621,7 @@
                 <w:sz w:val="19"/>
                 <w:szCs w:val="19"/>
               </w:rPr>
-              <w:t xml:space="preserve">Why single reviewer?</w:t>
+              <w:t xml:space="preserve">Why compare with XceptionNet?</w:t>
             </w:r>
           </w:p>
         </w:tc>
@@ -8936,7 +11650,7 @@
                 <w:sz w:val="19"/>
                 <w:szCs w:val="19"/>
               </w:rPr>
-              <w:t xml:space="preserve">Delimitation (Slide 7); multi-rater consensus is future work.</w:t>
+              <w:t xml:space="preserve">It is the standard FaceForensics++ baseline.</w:t>
             </w:r>
           </w:p>
         </w:tc>
@@ -8970,7 +11684,7 @@
                 <w:sz w:val="19"/>
                 <w:szCs w:val="19"/>
               </w:rPr>
-              <w:t xml:space="preserve">Why are flagged cases excluded from κ?</w:t>
+              <w:t xml:space="preserve">What is Cohen's kappa?</w:t>
             </w:r>
           </w:p>
         </w:tc>
@@ -8999,7 +11713,7 @@
                 <w:sz w:val="19"/>
                 <w:szCs w:val="19"/>
               </w:rPr>
-              <w:t xml:space="preserve">"Inconclusive" isn't a class the AI can output; flags are reported separately.</w:t>
+              <w:t xml:space="preserve">Agreement between the AI and the analyst beyond chance: κ = (pₒ − pₑ)/(1 − pₑ).</w:t>
             </w:r>
           </w:p>
         </w:tc>
@@ -9033,7 +11747,7 @@
                 <w:sz w:val="19"/>
                 <w:szCs w:val="19"/>
               </w:rPr>
-              <w:t xml:space="preserve">How is evidence protected?</w:t>
+              <w:t xml:space="preserve">What are your results?</w:t>
             </w:r>
           </w:p>
         </w:tc>
@@ -9059,10 +11773,37 @@
             </w:pPr>
             <w:r>
               <w:rPr>
-                <w:sz w:val="19"/>
-                <w:szCs w:val="19"/>
-              </w:rPr>
-              <w:t xml:space="preserve">SHA-256 hashes, storage outside public folders, role-based access, blurred views, logged reveals, audit log, secure purge.</w:t>
+                <w:i/>
+                <w:iCs/>
+                <w:color w:val="1F4E79"/>
+                <w:sz w:val="19"/>
+                <w:szCs w:val="19"/>
+              </w:rPr>
+              <w:t xml:space="preserve">(If trained)</w:t>
+            </w:r>
+            <w:r>
+              <w:rPr>
+                <w:sz w:val="19"/>
+                <w:szCs w:val="19"/>
+              </w:rPr>
+              <w:t xml:space="preserve"> cite your Chapter 4 numbers. </w:t>
+            </w:r>
+            <w:r>
+              <w:rPr>
+                <w:i/>
+                <w:iCs/>
+                <w:color w:val="1F4E79"/>
+                <w:sz w:val="19"/>
+                <w:szCs w:val="19"/>
+              </w:rPr>
+              <w:t xml:space="preserve">(If not)</w:t>
+            </w:r>
+            <w:r>
+              <w:rPr>
+                <w:sz w:val="19"/>
+                <w:szCs w:val="19"/>
+              </w:rPr>
+              <w:t xml:space="preserve"> The pipeline is complete; results will follow training on the requested datasets. Never quote results from the untrained model.</w:t>
             </w:r>
           </w:p>
         </w:tc>
@@ -9072,6 +11813,663 @@
       <w:pPr>
         <w:spacing w:after="120"/>
       </w:pPr>
+    </w:p>
+    <w:p>
+      <w:r>
+        <w:rPr>
+          <w:b/>
+          <w:bCs/>
+        </w:rPr>
+        <w:t xml:space="preserve">Alexander: the prototype</w:t>
+      </w:r>
+    </w:p>
+    <w:tbl>
+      <w:tblPr>
+        <w:tblW w:type="dxa" w:w="9638"/>
+        <w:tblBorders>
+          <w:top w:val="single" w:color="auto" w:sz="4"/>
+          <w:left w:val="single" w:color="auto" w:sz="4"/>
+          <w:bottom w:val="single" w:color="auto" w:sz="4"/>
+          <w:right w:val="single" w:color="auto" w:sz="4"/>
+          <w:insideH w:val="single" w:color="auto" w:sz="4"/>
+          <w:insideV w:val="single" w:color="auto" w:sz="4"/>
+        </w:tblBorders>
+      </w:tblPr>
+      <w:tblGrid>
+        <w:gridCol w:w="3614"/>
+        <w:gridCol w:w="6024"/>
+      </w:tblGrid>
+      <w:tr>
+        <w:trPr>
+          <w:tblHeader/>
+        </w:trPr>
+        <w:tc>
+          <w:tcPr>
+            <w:tcW w:type="dxa" w:w="3614"/>
+            <w:tcBorders>
+              <w:top w:val="single" w:color="BFBFBF" w:sz="4"/>
+              <w:left w:val="single" w:color="BFBFBF" w:sz="4"/>
+              <w:bottom w:val="single" w:color="BFBFBF" w:sz="4"/>
+              <w:right w:val="single" w:color="BFBFBF" w:sz="4"/>
+            </w:tcBorders>
+            <w:shd w:fill="D9E2F3" w:color="auto" w:val="clear"/>
+            <w:tcMar>
+              <w:top w:type="dxa" w:w="60"/>
+              <w:left w:type="dxa" w:w="100"/>
+              <w:bottom w:type="dxa" w:w="60"/>
+              <w:right w:type="dxa" w:w="100"/>
+            </w:tcMar>
+          </w:tcPr>
+          <w:p>
+            <w:pPr>
+              <w:spacing w:after="0"/>
+            </w:pPr>
+            <w:r>
+              <w:rPr>
+                <w:b/>
+                <w:bCs/>
+                <w:sz w:val="19"/>
+                <w:szCs w:val="19"/>
+              </w:rPr>
+              <w:t xml:space="preserve">Question</w:t>
+            </w:r>
+          </w:p>
+        </w:tc>
+        <w:tc>
+          <w:tcPr>
+            <w:tcW w:type="dxa" w:w="6024"/>
+            <w:tcBorders>
+              <w:top w:val="single" w:color="BFBFBF" w:sz="4"/>
+              <w:left w:val="single" w:color="BFBFBF" w:sz="4"/>
+              <w:bottom w:val="single" w:color="BFBFBF" w:sz="4"/>
+              <w:right w:val="single" w:color="BFBFBF" w:sz="4"/>
+            </w:tcBorders>
+            <w:shd w:fill="D9E2F3" w:color="auto" w:val="clear"/>
+            <w:tcMar>
+              <w:top w:type="dxa" w:w="60"/>
+              <w:left w:type="dxa" w:w="100"/>
+              <w:bottom w:type="dxa" w:w="60"/>
+              <w:right w:type="dxa" w:w="100"/>
+            </w:tcMar>
+          </w:tcPr>
+          <w:p>
+            <w:pPr>
+              <w:spacing w:after="0"/>
+            </w:pPr>
+            <w:r>
+              <w:rPr>
+                <w:b/>
+                <w:bCs/>
+                <w:sz w:val="19"/>
+                <w:szCs w:val="19"/>
+              </w:rPr>
+              <w:t xml:space="preserve">Suggested answer</w:t>
+            </w:r>
+          </w:p>
+        </w:tc>
+      </w:tr>
+      <w:tr>
+        <w:trPr>
+          <w:tblHeader w:val="off"/>
+        </w:trPr>
+        <w:tc>
+          <w:tcPr>
+            <w:tcW w:type="dxa" w:w="3614"/>
+            <w:tcBorders>
+              <w:top w:val="single" w:color="BFBFBF" w:sz="4"/>
+              <w:left w:val="single" w:color="BFBFBF" w:sz="4"/>
+              <w:bottom w:val="single" w:color="BFBFBF" w:sz="4"/>
+              <w:right w:val="single" w:color="BFBFBF" w:sz="4"/>
+            </w:tcBorders>
+            <w:tcMar>
+              <w:top w:type="dxa" w:w="60"/>
+              <w:left w:type="dxa" w:w="100"/>
+              <w:bottom w:type="dxa" w:w="60"/>
+              <w:right w:type="dxa" w:w="100"/>
+            </w:tcMar>
+          </w:tcPr>
+          <w:p>
+            <w:pPr>
+              <w:spacing w:after="0"/>
+            </w:pPr>
+            <w:r>
+              <w:rPr>
+                <w:sz w:val="19"/>
+                <w:szCs w:val="19"/>
+              </w:rPr>
+              <w:t xml:space="preserve">Why does it say "UNTRAINED MODEL"?</w:t>
+            </w:r>
+          </w:p>
+        </w:tc>
+        <w:tc>
+          <w:tcPr>
+            <w:tcW w:type="dxa" w:w="6024"/>
+            <w:tcBorders>
+              <w:top w:val="single" w:color="BFBFBF" w:sz="4"/>
+              <w:left w:val="single" w:color="BFBFBF" w:sz="4"/>
+              <w:bottom w:val="single" w:color="BFBFBF" w:sz="4"/>
+              <w:right w:val="single" w:color="BFBFBF" w:sz="4"/>
+            </w:tcBorders>
+            <w:tcMar>
+              <w:top w:type="dxa" w:w="60"/>
+              <w:left w:type="dxa" w:w="100"/>
+              <w:bottom w:type="dxa" w:w="60"/>
+              <w:right w:type="dxa" w:w="100"/>
+            </w:tcMar>
+          </w:tcPr>
+          <w:p>
+            <w:pPr>
+              <w:spacing w:after="0"/>
+            </w:pPr>
+            <w:r>
+              <w:rPr>
+                <w:sz w:val="19"/>
+                <w:szCs w:val="19"/>
+              </w:rPr>
+              <w:t xml:space="preserve">Fine-tuned weights aren't loaded yet; the system states this on every page and report so no one relies on the AI (a stated limitation).</w:t>
+            </w:r>
+          </w:p>
+        </w:tc>
+      </w:tr>
+      <w:tr>
+        <w:trPr>
+          <w:tblHeader w:val="off"/>
+        </w:trPr>
+        <w:tc>
+          <w:tcPr>
+            <w:tcW w:type="dxa" w:w="3614"/>
+            <w:tcBorders>
+              <w:top w:val="single" w:color="BFBFBF" w:sz="4"/>
+              <w:left w:val="single" w:color="BFBFBF" w:sz="4"/>
+              <w:bottom w:val="single" w:color="BFBFBF" w:sz="4"/>
+              <w:right w:val="single" w:color="BFBFBF" w:sz="4"/>
+            </w:tcBorders>
+            <w:tcMar>
+              <w:top w:type="dxa" w:w="60"/>
+              <w:left w:type="dxa" w:w="100"/>
+              <w:bottom w:type="dxa" w:w="60"/>
+              <w:right w:type="dxa" w:w="100"/>
+            </w:tcMar>
+          </w:tcPr>
+          <w:p>
+            <w:pPr>
+              <w:spacing w:after="0"/>
+            </w:pPr>
+            <w:r>
+              <w:rPr>
+                <w:sz w:val="19"/>
+                <w:szCs w:val="19"/>
+              </w:rPr>
+              <w:t xml:space="preserve">How fast is it?</w:t>
+            </w:r>
+          </w:p>
+        </w:tc>
+        <w:tc>
+          <w:tcPr>
+            <w:tcW w:type="dxa" w:w="6024"/>
+            <w:tcBorders>
+              <w:top w:val="single" w:color="BFBFBF" w:sz="4"/>
+              <w:left w:val="single" w:color="BFBFBF" w:sz="4"/>
+              <w:bottom w:val="single" w:color="BFBFBF" w:sz="4"/>
+              <w:right w:val="single" w:color="BFBFBF" w:sz="4"/>
+            </w:tcBorders>
+            <w:tcMar>
+              <w:top w:type="dxa" w:w="60"/>
+              <w:left w:type="dxa" w:w="100"/>
+              <w:bottom w:type="dxa" w:w="60"/>
+              <w:right w:type="dxa" w:w="100"/>
+            </w:tcMar>
+          </w:tcPr>
+          <w:p>
+            <w:pPr>
+              <w:spacing w:after="0"/>
+            </w:pPr>
+            <w:r>
+              <w:rPr>
+                <w:sz w:val="19"/>
+                <w:szCs w:val="19"/>
+              </w:rPr>
+              <w:t xml:space="preserve">A few seconds per case on a normal laptop CPU; no GPU needed for the demo. Training is done on a Colab GPU.</w:t>
+            </w:r>
+          </w:p>
+        </w:tc>
+      </w:tr>
+      <w:tr>
+        <w:trPr>
+          <w:tblHeader w:val="off"/>
+        </w:trPr>
+        <w:tc>
+          <w:tcPr>
+            <w:tcW w:type="dxa" w:w="3614"/>
+            <w:tcBorders>
+              <w:top w:val="single" w:color="BFBFBF" w:sz="4"/>
+              <w:left w:val="single" w:color="BFBFBF" w:sz="4"/>
+              <w:bottom w:val="single" w:color="BFBFBF" w:sz="4"/>
+              <w:right w:val="single" w:color="BFBFBF" w:sz="4"/>
+            </w:tcBorders>
+            <w:tcMar>
+              <w:top w:type="dxa" w:w="60"/>
+              <w:left w:type="dxa" w:w="100"/>
+              <w:bottom w:type="dxa" w:w="60"/>
+              <w:right w:type="dxa" w:w="100"/>
+            </w:tcMar>
+          </w:tcPr>
+          <w:p>
+            <w:pPr>
+              <w:spacing w:after="0"/>
+            </w:pPr>
+            <w:r>
+              <w:rPr>
+                <w:sz w:val="19"/>
+                <w:szCs w:val="19"/>
+              </w:rPr>
+              <w:t xml:space="preserve">How do you ensure chain of custody?</w:t>
+            </w:r>
+          </w:p>
+        </w:tc>
+        <w:tc>
+          <w:tcPr>
+            <w:tcW w:type="dxa" w:w="6024"/>
+            <w:tcBorders>
+              <w:top w:val="single" w:color="BFBFBF" w:sz="4"/>
+              <w:left w:val="single" w:color="BFBFBF" w:sz="4"/>
+              <w:bottom w:val="single" w:color="BFBFBF" w:sz="4"/>
+              <w:right w:val="single" w:color="BFBFBF" w:sz="4"/>
+            </w:tcBorders>
+            <w:tcMar>
+              <w:top w:type="dxa" w:w="60"/>
+              <w:left w:type="dxa" w:w="100"/>
+              <w:bottom w:type="dxa" w:w="60"/>
+              <w:right w:type="dxa" w:w="100"/>
+            </w:tcMar>
+          </w:tcPr>
+          <w:p>
+            <w:pPr>
+              <w:spacing w:after="0"/>
+            </w:pPr>
+            <w:r>
+              <w:rPr>
+                <w:sz w:val="19"/>
+                <w:szCs w:val="19"/>
+              </w:rPr>
+              <w:t xml:space="preserve">A SHA-256 hash of each uploaded file is stored in the case record and shown in the report.</w:t>
+            </w:r>
+          </w:p>
+        </w:tc>
+      </w:tr>
+      <w:tr>
+        <w:trPr>
+          <w:tblHeader w:val="off"/>
+        </w:trPr>
+        <w:tc>
+          <w:tcPr>
+            <w:tcW w:type="dxa" w:w="3614"/>
+            <w:tcBorders>
+              <w:top w:val="single" w:color="BFBFBF" w:sz="4"/>
+              <w:left w:val="single" w:color="BFBFBF" w:sz="4"/>
+              <w:bottom w:val="single" w:color="BFBFBF" w:sz="4"/>
+              <w:right w:val="single" w:color="BFBFBF" w:sz="4"/>
+            </w:tcBorders>
+            <w:tcMar>
+              <w:top w:type="dxa" w:w="60"/>
+              <w:left w:type="dxa" w:w="100"/>
+              <w:bottom w:type="dxa" w:w="60"/>
+              <w:right w:type="dxa" w:w="100"/>
+            </w:tcMar>
+          </w:tcPr>
+          <w:p>
+            <w:pPr>
+              <w:spacing w:after="0"/>
+            </w:pPr>
+            <w:r>
+              <w:rPr>
+                <w:sz w:val="19"/>
+                <w:szCs w:val="19"/>
+              </w:rPr>
+              <w:t xml:space="preserve">Can the analyst change a decision later?</w:t>
+            </w:r>
+          </w:p>
+        </w:tc>
+        <w:tc>
+          <w:tcPr>
+            <w:tcW w:type="dxa" w:w="6024"/>
+            <w:tcBorders>
+              <w:top w:val="single" w:color="BFBFBF" w:sz="4"/>
+              <w:left w:val="single" w:color="BFBFBF" w:sz="4"/>
+              <w:bottom w:val="single" w:color="BFBFBF" w:sz="4"/>
+              <w:right w:val="single" w:color="BFBFBF" w:sz="4"/>
+            </w:tcBorders>
+            <w:tcMar>
+              <w:top w:type="dxa" w:w="60"/>
+              <w:left w:type="dxa" w:w="100"/>
+              <w:bottom w:type="dxa" w:w="60"/>
+              <w:right w:type="dxa" w:w="100"/>
+            </w:tcMar>
+          </w:tcPr>
+          <w:p>
+            <w:pPr>
+              <w:spacing w:after="0"/>
+            </w:pPr>
+            <w:r>
+              <w:rPr>
+                <w:sz w:val="19"/>
+                <w:szCs w:val="19"/>
+              </w:rPr>
+              <w:t xml:space="preserve">No. Reviewed cases are read-only.</w:t>
+            </w:r>
+          </w:p>
+        </w:tc>
+      </w:tr>
+      <w:tr>
+        <w:trPr>
+          <w:tblHeader w:val="off"/>
+        </w:trPr>
+        <w:tc>
+          <w:tcPr>
+            <w:tcW w:type="dxa" w:w="3614"/>
+            <w:tcBorders>
+              <w:top w:val="single" w:color="BFBFBF" w:sz="4"/>
+              <w:left w:val="single" w:color="BFBFBF" w:sz="4"/>
+              <w:bottom w:val="single" w:color="BFBFBF" w:sz="4"/>
+              <w:right w:val="single" w:color="BFBFBF" w:sz="4"/>
+            </w:tcBorders>
+            <w:tcMar>
+              <w:top w:type="dxa" w:w="60"/>
+              <w:left w:type="dxa" w:w="100"/>
+              <w:bottom w:type="dxa" w:w="60"/>
+              <w:right w:type="dxa" w:w="100"/>
+            </w:tcMar>
+          </w:tcPr>
+          <w:p>
+            <w:pPr>
+              <w:spacing w:after="0"/>
+            </w:pPr>
+            <w:r>
+              <w:rPr>
+                <w:sz w:val="19"/>
+                <w:szCs w:val="19"/>
+              </w:rPr>
+              <w:t xml:space="preserve">Who can delete data?</w:t>
+            </w:r>
+          </w:p>
+        </w:tc>
+        <w:tc>
+          <w:tcPr>
+            <w:tcW w:type="dxa" w:w="6024"/>
+            <w:tcBorders>
+              <w:top w:val="single" w:color="BFBFBF" w:sz="4"/>
+              <w:left w:val="single" w:color="BFBFBF" w:sz="4"/>
+              <w:bottom w:val="single" w:color="BFBFBF" w:sz="4"/>
+              <w:right w:val="single" w:color="BFBFBF" w:sz="4"/>
+            </w:tcBorders>
+            <w:tcMar>
+              <w:top w:type="dxa" w:w="60"/>
+              <w:left w:type="dxa" w:w="100"/>
+              <w:bottom w:type="dxa" w:w="60"/>
+              <w:right w:type="dxa" w:w="100"/>
+            </w:tcMar>
+          </w:tcPr>
+          <w:p>
+            <w:pPr>
+              <w:spacing w:after="0"/>
+            </w:pPr>
+            <w:r>
+              <w:rPr>
+                <w:sz w:val="19"/>
+                <w:szCs w:val="19"/>
+              </w:rPr>
+              <w:t xml:space="preserve">Only an admin, through a secure purge command that overwrites the files and logs the deletion.</w:t>
+            </w:r>
+          </w:p>
+        </w:tc>
+      </w:tr>
+      <w:tr>
+        <w:trPr>
+          <w:tblHeader w:val="off"/>
+        </w:trPr>
+        <w:tc>
+          <w:tcPr>
+            <w:tcW w:type="dxa" w:w="3614"/>
+            <w:tcBorders>
+              <w:top w:val="single" w:color="BFBFBF" w:sz="4"/>
+              <w:left w:val="single" w:color="BFBFBF" w:sz="4"/>
+              <w:bottom w:val="single" w:color="BFBFBF" w:sz="4"/>
+              <w:right w:val="single" w:color="BFBFBF" w:sz="4"/>
+            </w:tcBorders>
+            <w:tcMar>
+              <w:top w:type="dxa" w:w="60"/>
+              <w:left w:type="dxa" w:w="100"/>
+              <w:bottom w:type="dxa" w:w="60"/>
+              <w:right w:type="dxa" w:w="100"/>
+            </w:tcMar>
+          </w:tcPr>
+          <w:p>
+            <w:pPr>
+              <w:spacing w:after="0"/>
+            </w:pPr>
+            <w:r>
+              <w:rPr>
+                <w:sz w:val="19"/>
+                <w:szCs w:val="19"/>
+              </w:rPr>
+              <w:t xml:space="preserve">How was it tested?</w:t>
+            </w:r>
+          </w:p>
+        </w:tc>
+        <w:tc>
+          <w:tcPr>
+            <w:tcW w:type="dxa" w:w="6024"/>
+            <w:tcBorders>
+              <w:top w:val="single" w:color="BFBFBF" w:sz="4"/>
+              <w:left w:val="single" w:color="BFBFBF" w:sz="4"/>
+              <w:bottom w:val="single" w:color="BFBFBF" w:sz="4"/>
+              <w:right w:val="single" w:color="BFBFBF" w:sz="4"/>
+            </w:tcBorders>
+            <w:tcMar>
+              <w:top w:type="dxa" w:w="60"/>
+              <w:left w:type="dxa" w:w="100"/>
+              <w:bottom w:type="dxa" w:w="60"/>
+              <w:right w:type="dxa" w:w="100"/>
+            </w:tcMar>
+          </w:tcPr>
+          <w:p>
+            <w:pPr>
+              <w:spacing w:after="0"/>
+            </w:pPr>
+            <w:r>
+              <w:rPr>
+                <w:sz w:val="19"/>
+                <w:szCs w:val="19"/>
+              </w:rPr>
+              <w:t xml:space="preserve">95 automated tests, covering the formulas, classifier, kappa, review workflow, access control, and a full submission-to-PDF run.</w:t>
+            </w:r>
+          </w:p>
+        </w:tc>
+      </w:tr>
+      <w:tr>
+        <w:trPr>
+          <w:tblHeader w:val="off"/>
+        </w:trPr>
+        <w:tc>
+          <w:tcPr>
+            <w:tcW w:type="dxa" w:w="3614"/>
+            <w:tcBorders>
+              <w:top w:val="single" w:color="BFBFBF" w:sz="4"/>
+              <w:left w:val="single" w:color="BFBFBF" w:sz="4"/>
+              <w:bottom w:val="single" w:color="BFBFBF" w:sz="4"/>
+              <w:right w:val="single" w:color="BFBFBF" w:sz="4"/>
+            </w:tcBorders>
+            <w:tcMar>
+              <w:top w:type="dxa" w:w="60"/>
+              <w:left w:type="dxa" w:w="100"/>
+              <w:bottom w:type="dxa" w:w="60"/>
+              <w:right w:type="dxa" w:w="100"/>
+            </w:tcMar>
+          </w:tcPr>
+          <w:p>
+            <w:pPr>
+              <w:spacing w:after="0"/>
+            </w:pPr>
+            <w:r>
+              <w:rPr>
+                <w:sz w:val="19"/>
+                <w:szCs w:val="19"/>
+              </w:rPr>
+              <w:t xml:space="preserve">What happens with an image without a face?</w:t>
+            </w:r>
+          </w:p>
+        </w:tc>
+        <w:tc>
+          <w:tcPr>
+            <w:tcW w:type="dxa" w:w="6024"/>
+            <w:tcBorders>
+              <w:top w:val="single" w:color="BFBFBF" w:sz="4"/>
+              <w:left w:val="single" w:color="BFBFBF" w:sz="4"/>
+              <w:bottom w:val="single" w:color="BFBFBF" w:sz="4"/>
+              <w:right w:val="single" w:color="BFBFBF" w:sz="4"/>
+            </w:tcBorders>
+            <w:tcMar>
+              <w:top w:type="dxa" w:w="60"/>
+              <w:left w:type="dxa" w:w="100"/>
+              <w:bottom w:type="dxa" w:w="60"/>
+              <w:right w:type="dxa" w:w="100"/>
+            </w:tcMar>
+          </w:tcPr>
+          <w:p>
+            <w:pPr>
+              <w:spacing w:after="0"/>
+            </w:pPr>
+            <w:r>
+              <w:rPr>
+                <w:sz w:val="19"/>
+                <w:szCs w:val="19"/>
+              </w:rPr>
+              <w:t xml:space="preserve">The system refuses to analyze it and records the rejection; it never guesses.</w:t>
+            </w:r>
+          </w:p>
+        </w:tc>
+      </w:tr>
+    </w:tbl>
+    <w:p>
+      <w:pPr>
+        <w:spacing w:after="120"/>
+      </w:pPr>
+    </w:p>
+    <w:p>
+      <w:pPr>
+        <w:pBdr>
+          <w:bottom w:val="single" w:color="BFBFBF" w:sz="6" w:space="1"/>
+        </w:pBdr>
+        <w:spacing w:after="200"/>
+      </w:pPr>
+    </w:p>
+    <w:p>
+      <w:pPr>
+        <w:pStyle w:val="Heading1"/>
+        <w:pageBreakBefore/>
+      </w:pPr>
+      <w:r>
+        <w:t xml:space="preserve">Panel deliberation — 10 minutes</w:t>
+      </w:r>
+    </w:p>
+    <w:p>
+      <w:pPr>
+        <w:pStyle w:val="ListParagraph"/>
+        <w:numPr>
+          <w:ilvl w:val="0"/>
+          <w:numId w:val="3"/>
+        </w:numPr>
+      </w:pPr>
+      <w:r>
+        <w:t xml:space="preserve">When the chair asks, </w:t>
+      </w:r>
+      <w:r>
+        <w:rPr>
+          <w:b/>
+          <w:bCs/>
+        </w:rPr>
+        <w:t xml:space="preserve">the group leaves the room</w:t>
+      </w:r>
+      <w:r>
+        <w:t xml:space="preserve"> (or waits quietly, as instructed). Leave the laptop and slides as they are unless told otherwise.</w:t>
+      </w:r>
+    </w:p>
+    <w:p>
+      <w:pPr>
+        <w:pStyle w:val="ListParagraph"/>
+        <w:numPr>
+          <w:ilvl w:val="0"/>
+          <w:numId w:val="3"/>
+        </w:numPr>
+      </w:pPr>
+      <w:r>
+        <w:rPr>
+          <w:b/>
+          <w:bCs/>
+        </w:rPr>
+        <w:t xml:space="preserve">Genesis</w:t>
+      </w:r>
+      <w:r>
+        <w:t xml:space="preserve"> reads the notes to the group; everyone checks whether any comment was missed. Don't discuss loudly near the room.</w:t>
+      </w:r>
+    </w:p>
+    <w:p>
+      <w:pPr>
+        <w:pStyle w:val="ListParagraph"/>
+        <w:numPr>
+          <w:ilvl w:val="0"/>
+          <w:numId w:val="3"/>
+        </w:numPr>
+      </w:pPr>
+      <w:r>
+        <w:t xml:space="preserve">Prepare questions to ask the panel afterwards, e.g. the deadline for revisions and who will check them.</w:t>
+      </w:r>
+    </w:p>
+    <w:p>
+      <w:pPr>
+        <w:pStyle w:val="Heading2"/>
+      </w:pPr>
+      <w:r>
+        <w:t xml:space="preserve">When called back: after the verdict</w:t>
+      </w:r>
+    </w:p>
+    <w:p>
+      <w:r>
+        <w:t xml:space="preserve">Listen to the verdict and the required revisions. Genesis keeps writing. Then </w:t>
+      </w:r>
+      <w:r>
+        <w:rPr>
+          <w:b/>
+          <w:bCs/>
+        </w:rPr>
+        <w:t xml:space="preserve">Tristan</w:t>
+      </w:r>
+      <w:r>
+        <w:t xml:space="preserve"> says:</w:t>
+      </w:r>
+    </w:p>
+    <w:p>
+      <w:r>
+        <w:rPr>
+          <w:i/>
+          <w:iCs/>
+          <w:color w:val="1F4E79"/>
+        </w:rPr>
+        <w:t xml:space="preserve">On behalf of our group, thank you very much to our panel for your time, your guidance, and your valuable suggestions. We accept the recommended revisions and will incorporate them in our manuscript and system. We also thank our adviser, Ms. Susan Caluya, for guiding us throughout this study. Thank you.</w:t>
+      </w:r>
+    </w:p>
+    <w:p>
+      <w:r>
+        <w:t xml:space="preserve">If anything about a revision is unclear, Tristan politely asks before leaving: </w:t>
+      </w:r>
+      <w:r>
+        <w:rPr>
+          <w:i/>
+          <w:iCs/>
+          <w:color w:val="1F4E79"/>
+        </w:rPr>
+        <w:t xml:space="preserve">"May we clarify, sir/ma'am, regarding…"</w:t>
+      </w:r>
     </w:p>
     <w:sectPr>
       <w:footerReference w:type="default" r:id="rId6"/>

</xml_diff>

<commit_message>
Add 'Log in as' role selection to the login page
The chosen role must match the account's role; a mismatch is refused and
logged as login_failed (role_mismatch). Tests, README and the defense
script are updated.

Co-Authored-By: Claude Opus 5.5 <noreply@anthropic.com>
Claude-Session: https://claude.ai/code/session_01HzDX4JgA3rVyVP8b16fmMh
</commit_message>
<xml_diff>
--- a/deepfake_hitl/docs/Presentation_Script.docx
+++ b/deepfake_hitl/docs/Presentation_Script.docx
@@ -5480,7 +5480,17 @@
         <w:t xml:space="preserve">Action:</w:t>
       </w:r>
       <w:r>
-        <w:t xml:space="preserve"> logs in as </w:t>
+        <w:t xml:space="preserve"> on the login page, </w:t>
+      </w:r>
+      <w:r>
+        <w:rPr>
+          <w:b/>
+          <w:bCs/>
+        </w:rPr>
+        <w:t xml:space="preserve">Log in as: Investigator</w:t>
+      </w:r>
+      <w:r>
+        <w:t xml:space="preserve"> → </w:t>
       </w:r>
       <w:r>
         <w:rPr>
@@ -5540,7 +5550,7 @@
           <w:iCs/>
           <w:color w:val="1F4E79"/>
         </w:rPr>
-        <w:t xml:space="preserve">We are logged in as an investigator. The suspect image has a synthetic edit to the inner face region; the reference is the original portrait of the same person.</w:t>
+        <w:t xml:space="preserve">On the login page I choose "Log in as Investigator". The system checks that the chosen role matches the account, so an analyst account cannot enter as an investigator. We are now logged in as an investigator. The suspect image has a synthetic edit to the inner face region; the reference is the original portrait of the same person.</w:t>
       </w:r>
     </w:p>
     <w:p>
@@ -5748,7 +5758,17 @@
         <w:t xml:space="preserve">Action:</w:t>
       </w:r>
       <w:r>
-        <w:t xml:space="preserve"> logs out → logs in as </w:t>
+        <w:t xml:space="preserve"> logs out → </w:t>
+      </w:r>
+      <w:r>
+        <w:rPr>
+          <w:b/>
+          <w:bCs/>
+        </w:rPr>
+        <w:t xml:space="preserve">Log in as: Analyst</w:t>
+      </w:r>
+      <w:r>
+        <w:t xml:space="preserve"> → </w:t>
       </w:r>
       <w:r>
         <w:rPr>
@@ -6345,7 +6365,17 @@
         <w:t xml:space="preserve">Action:</w:t>
       </w:r>
       <w:r>
-        <w:t xml:space="preserve"> logs in as </w:t>
+        <w:t xml:space="preserve"> logs out → </w:t>
+      </w:r>
+      <w:r>
+        <w:rPr>
+          <w:b/>
+          <w:bCs/>
+        </w:rPr>
+        <w:t xml:space="preserve">Log in as: Administrator</w:t>
+      </w:r>
+      <w:r>
+        <w:t xml:space="preserve"> → </w:t>
       </w:r>
       <w:r>
         <w:rPr>
@@ -8528,7 +8558,7 @@
           <w:b/>
           <w:bCs/>
         </w:rPr>
-        <w:t xml:space="preserve">95 passed</w:t>
+        <w:t xml:space="preserve">96 passed</w:t>
       </w:r>
       <w:r>
         <w:t xml:space="preserve">.</w:t>
@@ -12281,7 +12311,7 @@
                 <w:sz w:val="19"/>
                 <w:szCs w:val="19"/>
               </w:rPr>
-              <w:t xml:space="preserve">95 automated tests, covering the formulas, classifier, kappa, review workflow, access control, and a full submission-to-PDF run.</w:t>
+              <w:t xml:space="preserve">96 automated tests, covering the formulas, classifier, kappa, review workflow, access control, and a full submission-to-PDF run.</w:t>
             </w:r>
           </w:p>
         </w:tc>

</xml_diff>

<commit_message>
Open the login page automatically when the app starts
run.py starts the app and opens http://127.0.0.1:5000/login in the default
browser; start.bat does the same on Windows with a double-click.

Co-Authored-By: Claude Opus 5.5 <noreply@anthropic.com>
Claude-Session: https://claude.ai/code/session_01HzDX4JgA3rVyVP8b16fmMh
</commit_message>
<xml_diff>
--- a/deepfake_hitl/docs/Presentation_Script.docx
+++ b/deepfake_hitl/docs/Presentation_Script.docx
@@ -8720,6 +8720,19 @@
         </w:numPr>
       </w:pPr>
       <w:r>
+        <w:t xml:space="preserve">Double-click </w:t>
+      </w:r>
+      <w:r>
+        <w:rPr>
+          <w:b/>
+          <w:bCs/>
+        </w:rPr>
+        <w:t xml:space="preserve">`start.bat`</w:t>
+      </w:r>
+      <w:r>
+        <w:t xml:space="preserve"> (or run </w:t>
+      </w:r>
+      <w:r>
         <w:rPr>
           <w:rFonts w:ascii="Consolas" w:cs="Consolas" w:eastAsia="Consolas" w:hAnsi="Consolas"/>
           <w:sz w:val="19"/>
@@ -8736,10 +8749,10 @@
           <w:sz w:val="19"/>
           <w:szCs w:val="19"/>
         </w:rPr>
-        <w:t xml:space="preserve">flask --app app run</w:t>
-      </w:r>
-      <w:r>
-        <w:t xml:space="preserve"> → Chrome at http://127.0.0.1:5000.</w:t>
+        <w:t xml:space="preserve">python run.py</w:t>
+      </w:r>
+      <w:r>
+        <w:t xml:space="preserve">). The login page opens in the browser automatically; if it opens in the wrong browser, copy the link into Chrome.</w:t>
       </w:r>
     </w:p>
     <w:p>

</xml_diff>

<commit_message>
Redesign the analyst review page
Case header with progress steps, labelled face crops, an overlay comparison
slider, compact hashes with copy, verdict + confidence ring, metric bars
with explanations, a zoned S-vs-tau gauge, decision cards, quick rationale
phrases and a confirmation before submitting. Behaviour and access control
are unchanged.

Co-Authored-By: Claude Opus 5.5 <noreply@anthropic.com>
Claude-Session: https://claude.ai/code/session_01HzDX4JgA3rVyVP8b16fmMh
</commit_message>
<xml_diff>
--- a/deepfake_hitl/docs/Presentation_Script.docx
+++ b/deepfake_hitl/docs/Presentation_Script.docx
@@ -5932,7 +5932,7 @@
           <w:iCs/>
           <w:color w:val="1F4E79"/>
         </w:rPr>
-        <w:t xml:space="preserve">, is the AI's preliminary analysis: the classification, the confidence, the three similarity metrics, and the aggregated score S against τ.</w:t>
+        <w:t xml:space="preserve">, is the AI's preliminary analysis: the classification, the confidence ring, the three similarity metrics, and a gauge showing the aggregated score S against the threshold τ, with the Deepfake zone in red and the Real zone in green.</w:t>
       </w:r>
       <w:r>
         <w:rPr>
@@ -5960,6 +5960,46 @@
         <w:t xml:space="preserve">Action:</w:t>
       </w:r>
       <w:r>
+        <w:t xml:space="preserve"> drags the </w:t>
+      </w:r>
+      <w:r>
+        <w:rPr>
+          <w:b/>
+          <w:bCs/>
+        </w:rPr>
+        <w:t xml:space="preserve">Overlay comparison</w:t>
+      </w:r>
+      <w:r>
+        <w:t xml:space="preserve"> slider back and forth.</w:t>
+      </w:r>
+    </w:p>
+    <w:p>
+      <w:r>
+        <w:rPr>
+          <w:b/>
+          <w:bCs/>
+          <w:color w:val="1F3864"/>
+        </w:rPr>
+        <w:t xml:space="preserve">Alexander: </w:t>
+      </w:r>
+      <w:r>
+        <w:rPr>
+          <w:i/>
+          <w:iCs/>
+          <w:color w:val="1F4E79"/>
+        </w:rPr>
+        <w:t xml:space="preserve">The overlay comparison fades the suspect face over the reference face. Because both are aligned by MTCNN, any edits, such as warping or colour changes, stand out as the faces shift.</w:t>
+      </w:r>
+    </w:p>
+    <w:p>
+      <w:r>
+        <w:rPr>
+          <w:b/>
+          <w:bCs/>
+        </w:rPr>
+        <w:t xml:space="preserve">Action:</w:t>
+      </w:r>
+      <w:r>
         <w:t xml:space="preserve"> clicks </w:t>
       </w:r>
       <w:r>
@@ -6010,7 +6050,7 @@
         <w:t xml:space="preserve">HUMAN-VERIFIED</w:t>
       </w:r>
       <w:r>
-        <w:t xml:space="preserve"> section, chooses:</w:t>
+        <w:t xml:space="preserve"> section, clicks a decision card (each card shows the resulting final classification):</w:t>
       </w:r>
     </w:p>
     <w:p>
@@ -6119,7 +6159,45 @@
     </w:p>
     <w:p>
       <w:r>
-        <w:t xml:space="preserve">…and submits.</w:t>
+        <w:t xml:space="preserve">…(or clicks the quick-phrase chips, then adds a sentence), clicks </w:t>
+      </w:r>
+      <w:r>
+        <w:rPr>
+          <w:b/>
+          <w:bCs/>
+        </w:rPr>
+        <w:t xml:space="preserve">Submit review &amp; generate report</w:t>
+      </w:r>
+      <w:r>
+        <w:t xml:space="preserve">, and clicks </w:t>
+      </w:r>
+      <w:r>
+        <w:rPr>
+          <w:b/>
+          <w:bCs/>
+        </w:rPr>
+        <w:t xml:space="preserve">OK</w:t>
+      </w:r>
+      <w:r>
+        <w:t xml:space="preserve"> on the confirmation popup.</w:t>
+      </w:r>
+    </w:p>
+    <w:p>
+      <w:r>
+        <w:rPr>
+          <w:b/>
+          <w:bCs/>
+          <w:color w:val="1F3864"/>
+        </w:rPr>
+        <w:t xml:space="preserve">Alexander: </w:t>
+      </w:r>
+      <w:r>
+        <w:rPr>
+          <w:i/>
+          <w:iCs/>
+          <w:color w:val="1F4E79"/>
+        </w:rPr>
+        <w:t xml:space="preserve">Before the review is saved, the system asks the analyst to confirm, because the case becomes read-only afterwards.</w:t>
       </w:r>
     </w:p>
     <w:p>

</xml_diff>

<commit_message>
Renumber to the revised 21-line Section 3.6 algorithm
The algorithm now shows both images going through the same steps, the
no-face stop, the ViT resize, the confidence score and the review queue.
verify.py and app.py comments, the README mapping table and the defense
script (Slide 12 narration, demo references, appendix) use the new lines.

Co-Authored-By: Claude Opus 5.5 <noreply@anthropic.com>
Claude-Session: https://claude.ai/code/session_01HzDX4JgA3rVyVP8b16fmMh
</commit_message>
<xml_diff>
--- a/deepfake_hitl/docs/Presentation_Script.docx
+++ b/deepfake_hitl/docs/Presentation_Script.docx
@@ -5031,7 +5031,7 @@
           <w:iCs/>
           <w:color w:val="1F4E79"/>
         </w:rPr>
-        <w:t xml:space="preserve">This is our VERIFY_MEDIA procedure. Its inputs are the suspect image I, the reference R, and the threshold τ.</w:t>
+        <w:t xml:space="preserve">This is our VERIFY_MEDIA procedure. Its inputs are the suspect image I, the reference image R, the threshold τ, and the metric weights.</w:t>
       </w:r>
     </w:p>
     <w:p>
@@ -5048,7 +5048,7 @@
           <w:iCs/>
           <w:color w:val="1F4E79"/>
         </w:rPr>
-        <w:t xml:space="preserve">Lines 2 and 3 are preprocessing: MTCNN detection and alignment, then resizing to 380 by 380 and normalization. The reference image goes through the same steps.</w:t>
+        <w:t xml:space="preserve">Lines 2 to 10 form a loop: the suspect and the reference image go through exactly the same steps.</w:t>
       </w:r>
     </w:p>
     <w:p>
@@ -5065,7 +5065,7 @@
           <w:iCs/>
           <w:color w:val="1F4E79"/>
         </w:rPr>
-        <w:t xml:space="preserve">Lines 4 and 5 run the two branches: EfficientNet-B4 gives F1, the Vision Transformer gives F2.</w:t>
+        <w:t xml:space="preserve">Line 3: MTCNN detects the largest face. Line 4: if there is no face, the system stops with "No face detected. Case cannot be analyzed." It never guesses.</w:t>
       </w:r>
     </w:p>
     <w:p>
@@ -5082,7 +5082,7 @@
           <w:iCs/>
           <w:color w:val="1F4E79"/>
         </w:rPr>
-        <w:t xml:space="preserve">Line 6 fuses them into one embedding.</w:t>
+        <w:t xml:space="preserve">Lines 5 and 6: the face is aligned, cropped, resized to 380 by 380, and normalized.</w:t>
       </w:r>
     </w:p>
     <w:p>
@@ -5099,7 +5099,7 @@
           <w:iCs/>
           <w:color w:val="1F4E79"/>
         </w:rPr>
-        <w:t xml:space="preserve">Lines 7 to 9 compute the three metrics. Cosine similarity measures the angle between the two embeddings. Euclidean distance measures how far apart they are, and we convert it to a similarity, 1 minus d over 2, so that higher always means more similar. SSIM measures the structural similarity of the two aligned face images.</w:t>
+        <w:t xml:space="preserve">Lines 7 and 8 run the two branches: EfficientNet-B4 gives the local features F1, and the Vision Transformer gives the global features F2. The Transformer needs a size divisible by 16, so its input is resized to 384 by 384.</w:t>
       </w:r>
     </w:p>
     <w:p>
@@ -5116,7 +5116,7 @@
           <w:iCs/>
           <w:color w:val="1F4E79"/>
         </w:rPr>
-        <w:t xml:space="preserve">Line 10 combines them into one aggregated score S, a weighted sum with equal weights of one-third by default.</w:t>
+        <w:t xml:space="preserve">Line 9 fuses them into one 512-value embedding.</w:t>
       </w:r>
     </w:p>
     <w:p>
@@ -5133,7 +5133,7 @@
           <w:iCs/>
           <w:color w:val="1F4E79"/>
         </w:rPr>
-        <w:t xml:space="preserve">Lines 11 to 15 apply the threshold: if S is at least τ, 0.70 by default, the preliminary classification is Real; otherwise, Deepfake. The system also computes a confidence score based on how far S is from τ.</w:t>
+        <w:t xml:space="preserve">Lines 11 to 13 compute the three metrics. Cosine similarity measures the angle between the two embeddings. Euclidean distance measures how far apart they are, and we convert it to a similarity, 1 minus d over 2, so that higher always means more similar. SSIM compares the two aligned face images directly.</w:t>
       </w:r>
     </w:p>
     <w:p>
@@ -5150,7 +5150,7 @@
           <w:iCs/>
           <w:color w:val="1F4E79"/>
         </w:rPr>
-        <w:t xml:space="preserve">Line 16 is the human-in-the-loop review: the analyst gives the final decision D and the rationale.</w:t>
+        <w:t xml:space="preserve">Line 14 combines them into the aggregated score S, a weighted sum with equal weights of one-third by default.</w:t>
       </w:r>
     </w:p>
     <w:p>
@@ -5167,684 +5167,7 @@
           <w:iCs/>
           <w:color w:val="1F4E79"/>
         </w:rPr>
-        <w:t xml:space="preserve">Line 17 generates the forensic report, and line 18 returns the decision, the score, and the report.</w:t>
-      </w:r>
-    </w:p>
-    <w:p>
-      <w:r>
-        <w:rPr>
-          <w:i/>
-          <w:iCs/>
-          <w:color w:val="1F4E79"/>
-        </w:rPr>
-        <w:t xml:space="preserve">Lines 2 to 15 run automatically when a case is submitted. Lines 16 and 17 happen only when the analyst acts. The AI's classification C is never the final answer; the analyst's decision D is.</w:t>
-      </w:r>
-    </w:p>
-    <w:p>
-      <w:pPr>
-        <w:shd w:fill="FFF2CC" w:color="auto" w:val="clear"/>
-        <w:spacing w:after="200"/>
-        <w:ind w:left="240" w:right="240"/>
-      </w:pPr>
-      <w:r>
-        <w:rPr>
-          <w:b/>
-          <w:bCs/>
-        </w:rPr>
-        <w:t xml:space="preserve">Fix Slide 12 before the defense</w:t>
-      </w:r>
-      <w:r>
-        <w:t xml:space="preserve"> so it matches this narration (line 9 SSIM, line 8 conversion). See Slide fixes.</w:t>
-      </w:r>
-    </w:p>
-    <w:p>
-      <w:pPr>
-        <w:pBdr>
-          <w:bottom w:val="single" w:color="BFBFBF" w:sz="6" w:space="1"/>
-        </w:pBdr>
-        <w:spacing w:after="200"/>
-      </w:pPr>
-    </w:p>
-    <w:p>
-      <w:pPr>
-        <w:pStyle w:val="Heading1"/>
-      </w:pPr>
-      <w:r>
-        <w:t xml:space="preserve">Slide 13 · Datasets, Training &amp; Evaluation — ⏱ 40:00–42:30 · </w:t>
-      </w:r>
-      <w:r>
-        <w:rPr>
-          <w:i/>
-          <w:iCs/>
-          <w:color w:val="1F4E79"/>
-        </w:rPr>
-        <w:t xml:space="preserve">Mark</w:t>
-      </w:r>
-    </w:p>
-    <w:p>
-      <w:r>
-        <w:rPr>
-          <w:i/>
-          <w:iCs/>
-          <w:color w:val="1F4E79"/>
-        </w:rPr>
-        <w:t xml:space="preserve">For training and evaluation we use three benchmark datasets: </w:t>
-      </w:r>
-      <w:r>
-        <w:rPr>
-          <w:b/>
-          <w:bCs/>
-          <w:i/>
-          <w:iCs/>
-          <w:color w:val="1F4E79"/>
-        </w:rPr>
-        <w:t xml:space="preserve">FaceForensics++, Celeb-DF, and DFDC</w:t>
-      </w:r>
-      <w:r>
-        <w:rPr>
-          <w:i/>
-          <w:iCs/>
-          <w:color w:val="1F4E79"/>
-        </w:rPr>
-        <w:t xml:space="preserve">, obtained through their official request forms. Together they cover several deepfake generation methods, which helps the model generalize.</w:t>
-      </w:r>
-    </w:p>
-    <w:p>
-      <w:r>
-        <w:rPr>
-          <w:i/>
-          <w:iCs/>
-          <w:color w:val="1F4E79"/>
-        </w:rPr>
-        <w:t xml:space="preserve">For </w:t>
-      </w:r>
-      <w:r>
-        <w:rPr>
-          <w:b/>
-          <w:bCs/>
-          <w:i/>
-          <w:iCs/>
-          <w:color w:val="1F4E79"/>
-        </w:rPr>
-        <w:t xml:space="preserve">training</w:t>
-      </w:r>
-      <w:r>
-        <w:rPr>
-          <w:i/>
-          <w:iCs/>
-          <w:color w:val="1F4E79"/>
-        </w:rPr>
-        <w:t xml:space="preserve">, we start from pre-trained ImageNet weights to save computation, and we apply flipping, rotation, and scaling augmentation to reduce overfitting. The model is trained on Google Colab's GPU, with early stopping based on validation ROC-AUC. We then calibrate the threshold τ on the validation set.</w:t>
-      </w:r>
-    </w:p>
-    <w:p>
-      <w:r>
-        <w:rPr>
-          <w:i/>
-          <w:iCs/>
-          <w:color w:val="1F4E79"/>
-        </w:rPr>
-        <w:t xml:space="preserve">Our </w:t>
-      </w:r>
-      <w:r>
-        <w:rPr>
-          <w:b/>
-          <w:bCs/>
-          <w:i/>
-          <w:iCs/>
-          <w:color w:val="1F4E79"/>
-        </w:rPr>
-        <w:t xml:space="preserve">evaluation has two parts</w:t>
-      </w:r>
-      <w:r>
-        <w:rPr>
-          <w:i/>
-          <w:iCs/>
-          <w:color w:val="1F4E79"/>
-        </w:rPr>
-        <w:t xml:space="preserve">. For the machine classification, we measure accuracy, precision, recall, F1-score, and ROC-AUC, and compare our hybrid model with an XceptionNet baseline. For human–AI agreement, we measure the agreement rate and Cohen's kappa between the AI's preliminary classification and the analyst's final decision.</w:t>
-      </w:r>
-    </w:p>
-    <w:p>
-      <w:r>
-        <w:rPr>
-          <w:i/>
-          <w:iCs/>
-          <w:color w:val="1F4E79"/>
-        </w:rPr>
-        <w:t xml:space="preserve">Alexander will now demonstrate the working system.</w:t>
-      </w:r>
-    </w:p>
-    <w:p>
-      <w:pPr>
-        <w:pBdr>
-          <w:bottom w:val="single" w:color="BFBFBF" w:sz="6" w:space="1"/>
-        </w:pBdr>
-        <w:spacing w:after="200"/>
-      </w:pPr>
-    </w:p>
-    <w:p>
-      <w:pPr>
-        <w:pStyle w:val="Heading1"/>
-      </w:pPr>
-      <w:r>
-        <w:t xml:space="preserve">LIVE DEMONSTRATION — ⏱ 42:30–55:00 · </w:t>
-      </w:r>
-      <w:r>
-        <w:rPr>
-          <w:i/>
-          <w:iCs/>
-          <w:color w:val="1F4E79"/>
-        </w:rPr>
-        <w:t xml:space="preserve">Alexander</w:t>
-      </w:r>
-      <w:r>
-        <w:t xml:space="preserve"> (Mark = backup operator)</w:t>
-      </w:r>
-    </w:p>
-    <w:p>
-      <w:pPr>
-        <w:shd w:fill="FFF2CC" w:color="auto" w:val="clear"/>
-        <w:spacing w:after="40"/>
-        <w:ind w:left="240" w:right="240"/>
-      </w:pPr>
-      <w:r>
-        <w:t xml:space="preserve">Use </w:t>
-      </w:r>
-      <w:r>
-        <w:rPr>
-          <w:b/>
-          <w:bCs/>
-        </w:rPr>
-        <w:t xml:space="preserve">only</w:t>
-      </w:r>
-      <w:r>
-        <w:t xml:space="preserve"> the NASA demo images in </w:t>
-      </w:r>
-      <w:r>
-        <w:rPr>
-          <w:rFonts w:ascii="Consolas" w:cs="Consolas" w:eastAsia="Consolas" w:hAnsi="Consolas"/>
-          <w:sz w:val="19"/>
-          <w:szCs w:val="19"/>
-        </w:rPr>
-        <w:t xml:space="preserve">demo\samples\</w:t>
-      </w:r>
-      <w:r>
-        <w:t xml:space="preserve"> (public-domain, non-explicit).</w:t>
-      </w:r>
-    </w:p>
-    <w:p>
-      <w:pPr>
-        <w:shd w:fill="FFF2CC" w:color="auto" w:val="clear"/>
-        <w:spacing w:after="200"/>
-        <w:ind w:left="240" w:right="240"/>
-      </w:pPr>
-      <w:r>
-        <w:t xml:space="preserve">Before the defense, follow the </w:t>
-      </w:r>
-      <w:r>
-        <w:rPr>
-          <w:b/>
-          <w:bCs/>
-        </w:rPr>
-        <w:t xml:space="preserve">checklist</w:t>
-      </w:r>
-      <w:r>
-        <w:t xml:space="preserve"> at the end. Start with fresh data so the case is CASE-0001.</w:t>
-      </w:r>
-    </w:p>
-    <w:p>
-      <w:pPr>
-        <w:pStyle w:val="Heading2"/>
-      </w:pPr>
-      <w:r>
-        <w:t xml:space="preserve">D1 · Introduce the prototype (42:30–43:30)</w:t>
-      </w:r>
-    </w:p>
-    <w:p>
-      <w:r>
-        <w:rPr>
-          <w:b/>
-          <w:bCs/>
-          <w:color w:val="1F3864"/>
-        </w:rPr>
-        <w:t xml:space="preserve">Alexander: </w:t>
-      </w:r>
-      <w:r>
-        <w:rPr>
-          <w:i/>
-          <w:iCs/>
-          <w:color w:val="1F4E79"/>
-        </w:rPr>
-        <w:t xml:space="preserve">Our prototype runs locally on this laptop, on the CPU. It is built with Python, PyTorch, Flask, and ReportLab for the PDF reports.</w:t>
-      </w:r>
-    </w:p>
-    <w:p>
-      <w:r>
-        <w:rPr>
-          <w:i/>
-          <w:iCs/>
-          <w:color w:val="1F4E79"/>
-        </w:rPr>
-        <w:t xml:space="preserve">(If the red banner shows:)</w:t>
-      </w:r>
-      <w:r>
-        <w:rPr>
-          <w:i/>
-          <w:iCs/>
-          <w:color w:val="1F4E79"/>
-        </w:rPr>
-        <w:t xml:space="preserve"> </w:t>
-      </w:r>
-      <w:r>
-        <w:rPr>
-          <w:i/>
-          <w:iCs/>
-          <w:color w:val="1F4E79"/>
-        </w:rPr>
-        <w:t xml:space="preserve">The red banner reads "UNTRAINED MODEL: results not indicative of real accuracy." Our system displays this whenever the fine-tuned weights have not been loaded, on every page and in every report, so that no one relies on an unvalidated AI result.</w:t>
-      </w:r>
-    </w:p>
-    <w:p>
-      <w:r>
-        <w:rPr>
-          <w:b/>
-          <w:bCs/>
-          <w:color w:val="1F3864"/>
-        </w:rPr>
-        <w:t xml:space="preserve">Alexander: </w:t>
-      </w:r>
-      <w:r>
-        <w:rPr>
-          <w:i/>
-          <w:iCs/>
-          <w:color w:val="1F4E79"/>
-        </w:rPr>
-        <w:t xml:space="preserve">For this demonstration we use a public-domain NASA portrait, not explicit material. Our AI analyzes only the face region, so the process is identical, and our ethics protocol forbids showing explicit material outside authorized casework.</w:t>
-      </w:r>
-    </w:p>
-    <w:p>
-      <w:pPr>
-        <w:pStyle w:val="Heading2"/>
-      </w:pPr>
-      <w:r>
-        <w:t xml:space="preserve">D2 · Investigator submits a case (43:30–46:30)</w:t>
-      </w:r>
-    </w:p>
-    <w:p>
-      <w:r>
-        <w:rPr>
-          <w:b/>
-          <w:bCs/>
-        </w:rPr>
-        <w:t xml:space="preserve">Action:</w:t>
-      </w:r>
-      <w:r>
-        <w:t xml:space="preserve"> on the login page, </w:t>
-      </w:r>
-      <w:r>
-        <w:rPr>
-          <w:b/>
-          <w:bCs/>
-        </w:rPr>
-        <w:t xml:space="preserve">Log in as: Investigator</w:t>
-      </w:r>
-      <w:r>
-        <w:t xml:space="preserve"> → </w:t>
-      </w:r>
-      <w:r>
-        <w:rPr>
-          <w:b/>
-          <w:bCs/>
-        </w:rPr>
-        <w:t xml:space="preserve">INV-01</w:t>
-      </w:r>
-      <w:r>
-        <w:t xml:space="preserve"> → </w:t>
-      </w:r>
-      <w:r>
-        <w:rPr>
-          <w:b/>
-          <w:bCs/>
-        </w:rPr>
-        <w:t xml:space="preserve">Submit case</w:t>
-      </w:r>
-      <w:r>
-        <w:t xml:space="preserve"> → Suspect </w:t>
-      </w:r>
-      <w:r>
-        <w:rPr>
-          <w:rFonts w:ascii="Consolas" w:cs="Consolas" w:eastAsia="Consolas" w:hAnsi="Consolas"/>
-          <w:sz w:val="19"/>
-          <w:szCs w:val="19"/>
-        </w:rPr>
-        <w:t xml:space="preserve">suspect_manipulated.png</w:t>
-      </w:r>
-      <w:r>
-        <w:t xml:space="preserve">, Reference </w:t>
-      </w:r>
-      <w:r>
-        <w:rPr>
-          <w:rFonts w:ascii="Consolas" w:cs="Consolas" w:eastAsia="Consolas" w:hAnsi="Consolas"/>
-          <w:sz w:val="19"/>
-          <w:szCs w:val="19"/>
-        </w:rPr>
-        <w:t xml:space="preserve">reference.png</w:t>
-      </w:r>
-      <w:r>
-        <w:t xml:space="preserve">.</w:t>
-      </w:r>
-    </w:p>
-    <w:p>
-      <w:r>
-        <w:rPr>
-          <w:b/>
-          <w:bCs/>
-          <w:color w:val="1F3864"/>
-        </w:rPr>
-        <w:t xml:space="preserve">Alexander: </w:t>
-      </w:r>
-      <w:r>
-        <w:rPr>
-          <w:i/>
-          <w:iCs/>
-          <w:color w:val="1F4E79"/>
-        </w:rPr>
-        <w:t xml:space="preserve">On the login page I choose "Log in as Investigator". The system checks that the chosen role matches the account, so an analyst account cannot enter as an investigator. We are now logged in as an investigator. The suspect image has a synthetic edit to the inner face region; the reference is the original portrait of the same person.</w:t>
-      </w:r>
-    </w:p>
-    <w:p>
-      <w:r>
-        <w:rPr>
-          <w:b/>
-          <w:bCs/>
-        </w:rPr>
-        <w:t xml:space="preserve">Action:</w:t>
-      </w:r>
-      <w:r>
-        <w:t xml:space="preserve"> points at the checkbox, ticks it.</w:t>
-      </w:r>
-    </w:p>
-    <w:p>
-      <w:r>
-        <w:rPr>
-          <w:b/>
-          <w:bCs/>
-          <w:color w:val="1F3864"/>
-        </w:rPr>
-        <w:t xml:space="preserve">Alexander: </w:t>
-      </w:r>
-      <w:r>
-        <w:rPr>
-          <w:i/>
-          <w:iCs/>
-          <w:color w:val="1F4E79"/>
-        </w:rPr>
-        <w:t xml:space="preserve">Every submission requires this attestation: that the subject is an adult and that the investigator is authorized. This enforces our scope.</w:t>
-      </w:r>
-    </w:p>
-    <w:p>
-      <w:r>
-        <w:rPr>
-          <w:b/>
-          <w:bCs/>
-        </w:rPr>
-        <w:t xml:space="preserve">Action:</w:t>
-      </w:r>
-      <w:r>
-        <w:t xml:space="preserve"> clicks </w:t>
-      </w:r>
-      <w:r>
-        <w:rPr>
-          <w:b/>
-          <w:bCs/>
-        </w:rPr>
-        <w:t xml:space="preserve">Submit for analysis</w:t>
-      </w:r>
-      <w:r>
-        <w:t xml:space="preserve">.</w:t>
-      </w:r>
-    </w:p>
-    <w:p>
-      <w:r>
-        <w:rPr>
-          <w:b/>
-          <w:bCs/>
-          <w:color w:val="1F3864"/>
-        </w:rPr>
-        <w:t xml:space="preserve">Alexander: </w:t>
-      </w:r>
-      <w:r>
-        <w:rPr>
-          <w:i/>
-          <w:iCs/>
-          <w:color w:val="1F4E79"/>
-        </w:rPr>
-        <w:t xml:space="preserve">Right now the system computes a SHA-256 hash of each file for chain of custody, then runs our algorithm, lines 2 to 15: face detection, both neural branches, fusion, the three metrics, and the preliminary classification.</w:t>
-      </w:r>
-    </w:p>
-    <w:p>
-      <w:r>
-        <w:rPr>
-          <w:b/>
-          <w:bCs/>
-        </w:rPr>
-        <w:t xml:space="preserve">Action:</w:t>
-      </w:r>
-      <w:r>
-        <w:t xml:space="preserve"> shows </w:t>
-      </w:r>
-      <w:r>
-        <w:rPr>
-          <w:b/>
-          <w:bCs/>
-        </w:rPr>
-        <w:t xml:space="preserve">My cases</w:t>
-      </w:r>
-      <w:r>
-        <w:t xml:space="preserve">.</w:t>
-      </w:r>
-    </w:p>
-    <w:p>
-      <w:r>
-        <w:rPr>
-          <w:b/>
-          <w:bCs/>
-          <w:color w:val="1F3864"/>
-        </w:rPr>
-        <w:t xml:space="preserve">Alexander: </w:t>
-      </w:r>
-      <w:r>
-        <w:rPr>
-          <w:i/>
-          <w:iCs/>
-          <w:color w:val="1F4E79"/>
-        </w:rPr>
-        <w:t xml:space="preserve">The case is </w:t>
-      </w:r>
-      <w:r>
-        <w:rPr>
-          <w:b/>
-          <w:bCs/>
-          <w:i/>
-          <w:iCs/>
-          <w:color w:val="1F4E79"/>
-        </w:rPr>
-        <w:t xml:space="preserve">Pending</w:t>
-      </w:r>
-      <w:r>
-        <w:rPr>
-          <w:i/>
-          <w:iCs/>
-          <w:color w:val="1F4E79"/>
-        </w:rPr>
-        <w:t xml:space="preserve">. Notice that the investigator does not see the AI's result. Nothing is final until an analyst reviews it.</w:t>
-      </w:r>
-    </w:p>
-    <w:p>
-      <w:pPr>
-        <w:pStyle w:val="Heading2"/>
-      </w:pPr>
-      <w:r>
-        <w:t xml:space="preserve">D3 · No face = no analysis (46:30–47:30)</w:t>
-      </w:r>
-    </w:p>
-    <w:p>
-      <w:r>
-        <w:rPr>
-          <w:b/>
-          <w:bCs/>
-        </w:rPr>
-        <w:t xml:space="preserve">Action:</w:t>
-      </w:r>
-      <w:r>
-        <w:t xml:space="preserve"> submits </w:t>
-      </w:r>
-      <w:r>
-        <w:rPr>
-          <w:rFonts w:ascii="Consolas" w:cs="Consolas" w:eastAsia="Consolas" w:hAnsi="Consolas"/>
-          <w:sz w:val="19"/>
-          <w:szCs w:val="19"/>
-        </w:rPr>
-        <w:t xml:space="preserve">no_face.png</w:t>
-      </w:r>
-      <w:r>
-        <w:t xml:space="preserve"> + </w:t>
-      </w:r>
-      <w:r>
-        <w:rPr>
-          <w:rFonts w:ascii="Consolas" w:cs="Consolas" w:eastAsia="Consolas" w:hAnsi="Consolas"/>
-          <w:sz w:val="19"/>
-          <w:szCs w:val="19"/>
-        </w:rPr>
-        <w:t xml:space="preserve">reference.png</w:t>
-      </w:r>
-      <w:r>
-        <w:t xml:space="preserve">.</w:t>
-      </w:r>
-    </w:p>
-    <w:p>
-      <w:r>
-        <w:rPr>
-          <w:b/>
-          <w:bCs/>
-          <w:color w:val="1F3864"/>
-        </w:rPr>
-        <w:t xml:space="preserve">Alexander: </w:t>
-      </w:r>
-      <w:r>
-        <w:rPr>
-          <w:i/>
-          <w:iCs/>
-          <w:color w:val="1F4E79"/>
-        </w:rPr>
-        <w:t xml:space="preserve">If no face is detected, the system does not guess: "No face detected. Case cannot be analyzed." The rejection is still recorded in the audit log.</w:t>
-      </w:r>
-    </w:p>
-    <w:p>
-      <w:pPr>
-        <w:pStyle w:val="Heading2"/>
-      </w:pPr>
-      <w:r>
-        <w:t xml:space="preserve">D4 · Analyst dashboard (47:30–48:30)</w:t>
-      </w:r>
-    </w:p>
-    <w:p>
-      <w:r>
-        <w:rPr>
-          <w:b/>
-          <w:bCs/>
-        </w:rPr>
-        <w:t xml:space="preserve">Action:</w:t>
-      </w:r>
-      <w:r>
-        <w:t xml:space="preserve"> logs out → </w:t>
-      </w:r>
-      <w:r>
-        <w:rPr>
-          <w:b/>
-          <w:bCs/>
-        </w:rPr>
-        <w:t xml:space="preserve">Log in as: Analyst</w:t>
-      </w:r>
-      <w:r>
-        <w:t xml:space="preserve"> → </w:t>
-      </w:r>
-      <w:r>
-        <w:rPr>
-          <w:b/>
-          <w:bCs/>
-        </w:rPr>
-        <w:t xml:space="preserve">ANA-01</w:t>
-      </w:r>
-      <w:r>
-        <w:t xml:space="preserve">.</w:t>
-      </w:r>
-    </w:p>
-    <w:p>
-      <w:r>
-        <w:rPr>
-          <w:b/>
-          <w:bCs/>
-          <w:color w:val="1F3864"/>
-        </w:rPr>
-        <w:t xml:space="preserve">Alexander: </w:t>
-      </w:r>
-      <w:r>
-        <w:rPr>
-          <w:i/>
-          <w:iCs/>
-          <w:color w:val="1F4E79"/>
-        </w:rPr>
-        <w:t xml:space="preserve">Now we are the forensic analyst. The dashboard shows how many cases are pending, verified, and flagged, and the live agreement rate between the AI and the analysts.</w:t>
-      </w:r>
-    </w:p>
-    <w:p>
-      <w:pPr>
-        <w:pStyle w:val="Heading2"/>
-      </w:pPr>
-      <w:r>
-        <w:t xml:space="preserve">D5 · Review interface, objective 3 (48:30–52:30)</w:t>
-      </w:r>
-    </w:p>
-    <w:p>
-      <w:r>
-        <w:rPr>
-          <w:b/>
-          <w:bCs/>
-        </w:rPr>
-        <w:t xml:space="preserve">Action:</w:t>
-      </w:r>
-      <w:r>
-        <w:t xml:space="preserve"> clicks </w:t>
-      </w:r>
-      <w:r>
-        <w:rPr>
-          <w:b/>
-          <w:bCs/>
-        </w:rPr>
-        <w:t xml:space="preserve">Review</w:t>
-      </w:r>
-      <w:r>
-        <w:t xml:space="preserve">.</w:t>
-      </w:r>
-    </w:p>
-    <w:p>
-      <w:r>
-        <w:rPr>
-          <w:b/>
-          <w:bCs/>
-          <w:color w:val="1F3864"/>
-        </w:rPr>
-        <w:t xml:space="preserve">Alexander: </w:t>
-      </w:r>
-      <w:r>
-        <w:rPr>
-          <w:i/>
-          <w:iCs/>
-          <w:color w:val="1F4E79"/>
-        </w:rPr>
-        <w:t xml:space="preserve">This is the core of our study.</w:t>
+        <w:t xml:space="preserve">Line 15 applies the threshold: if S is at least τ, 0.70 by default, the preliminary classification is Real; otherwise, Deepfake. Line 16 computes a confidence score from how far S is from τ.</w:t>
       </w:r>
     </w:p>
     <w:p>
@@ -5861,43 +5184,7 @@
           <w:iCs/>
           <w:color w:val="1F4E79"/>
         </w:rPr>
-        <w:t xml:space="preserve">On the left are only the </w:t>
-      </w:r>
-      <w:r>
-        <w:rPr>
-          <w:b/>
-          <w:bCs/>
-          <w:i/>
-          <w:iCs/>
-          <w:color w:val="1F4E79"/>
-        </w:rPr>
-        <w:t xml:space="preserve">aligned face crops</w:t>
-      </w:r>
-      <w:r>
-        <w:rPr>
-          <w:i/>
-          <w:iCs/>
-          <w:color w:val="1F4E79"/>
-        </w:rPr>
-        <w:t xml:space="preserve">. The full images are </w:t>
-      </w:r>
-      <w:r>
-        <w:rPr>
-          <w:b/>
-          <w:bCs/>
-          <w:i/>
-          <w:iCs/>
-          <w:color w:val="1F4E79"/>
-        </w:rPr>
-        <w:t xml:space="preserve">pixelated</w:t>
-      </w:r>
-      <w:r>
-        <w:rPr>
-          <w:i/>
-          <w:iCs/>
-          <w:color w:val="1F4E79"/>
-        </w:rPr>
-        <w:t xml:space="preserve"> by default. This protects sensitive material.</w:t>
+        <w:t xml:space="preserve">Line 17: the case is added to the review queue as pending. This is where the automated part ends.</w:t>
       </w:r>
     </w:p>
     <w:p>
@@ -5914,143 +5201,7 @@
           <w:iCs/>
           <w:color w:val="1F4E79"/>
         </w:rPr>
-        <w:t xml:space="preserve">On the right, in blue and labeled </w:t>
-      </w:r>
-      <w:r>
-        <w:rPr>
-          <w:b/>
-          <w:bCs/>
-          <w:i/>
-          <w:iCs/>
-          <w:color w:val="1F4E79"/>
-        </w:rPr>
-        <w:t xml:space="preserve">AUTOMATED</w:t>
-      </w:r>
-      <w:r>
-        <w:rPr>
-          <w:i/>
-          <w:iCs/>
-          <w:color w:val="1F4E79"/>
-        </w:rPr>
-        <w:t xml:space="preserve">, is the AI's preliminary analysis: the classification, the confidence ring, the three similarity metrics, and a gauge showing the aggregated score S against the threshold τ, with the Deepfake zone in red and the Real zone in green.</w:t>
-      </w:r>
-      <w:r>
-        <w:rPr>
-          <w:i/>
-          <w:iCs/>
-          <w:color w:val="1F4E79"/>
-        </w:rPr>
-        <w:t xml:space="preserve"> </w:t>
-      </w:r>
-      <w:r>
-        <w:rPr>
-          <w:i/>
-          <w:iCs/>
-          <w:color w:val="1F4E79"/>
-        </w:rPr>
-        <w:t xml:space="preserve">(Read the actual values on screen.)</w:t>
-      </w:r>
-    </w:p>
-    <w:p>
-      <w:r>
-        <w:rPr>
-          <w:b/>
-          <w:bCs/>
-        </w:rPr>
-        <w:t xml:space="preserve">Action:</w:t>
-      </w:r>
-      <w:r>
-        <w:t xml:space="preserve"> drags the </w:t>
-      </w:r>
-      <w:r>
-        <w:rPr>
-          <w:b/>
-          <w:bCs/>
-        </w:rPr>
-        <w:t xml:space="preserve">Overlay comparison</w:t>
-      </w:r>
-      <w:r>
-        <w:t xml:space="preserve"> slider back and forth.</w:t>
-      </w:r>
-    </w:p>
-    <w:p>
-      <w:r>
-        <w:rPr>
-          <w:b/>
-          <w:bCs/>
-          <w:color w:val="1F3864"/>
-        </w:rPr>
-        <w:t xml:space="preserve">Alexander: </w:t>
-      </w:r>
-      <w:r>
-        <w:rPr>
-          <w:i/>
-          <w:iCs/>
-          <w:color w:val="1F4E79"/>
-        </w:rPr>
-        <w:t xml:space="preserve">The overlay comparison fades the suspect face over the reference face. Because both are aligned by MTCNN, any edits, such as warping or colour changes, stand out as the faces shift.</w:t>
-      </w:r>
-    </w:p>
-    <w:p>
-      <w:r>
-        <w:rPr>
-          <w:b/>
-          <w:bCs/>
-        </w:rPr>
-        <w:t xml:space="preserve">Action:</w:t>
-      </w:r>
-      <w:r>
-        <w:t xml:space="preserve"> clicks </w:t>
-      </w:r>
-      <w:r>
-        <w:rPr>
-          <w:b/>
-          <w:bCs/>
-        </w:rPr>
-        <w:t xml:space="preserve">Reveal full image</w:t>
-      </w:r>
-      <w:r>
-        <w:t xml:space="preserve"> → confirms.</w:t>
-      </w:r>
-    </w:p>
-    <w:p>
-      <w:r>
-        <w:rPr>
-          <w:b/>
-          <w:bCs/>
-          <w:color w:val="1F3864"/>
-        </w:rPr>
-        <w:t xml:space="preserve">Alexander: </w:t>
-      </w:r>
-      <w:r>
-        <w:rPr>
-          <w:i/>
-          <w:iCs/>
-          <w:color w:val="1F4E79"/>
-        </w:rPr>
-        <w:t xml:space="preserve">If the analyst must see the full image, they reveal it deliberately. Only analysts can do this, and every reveal is logged with their ID and the time.</w:t>
-      </w:r>
-    </w:p>
-    <w:p>
-      <w:r>
-        <w:rPr>
-          <w:b/>
-          <w:bCs/>
-        </w:rPr>
-        <w:t xml:space="preserve">Action:</w:t>
-      </w:r>
-      <w:r>
-        <w:t xml:space="preserve"> in the green </w:t>
-      </w:r>
-      <w:r>
-        <w:rPr>
-          <w:b/>
-          <w:bCs/>
-        </w:rPr>
-        <w:t xml:space="preserve">HUMAN-VERIFIED</w:t>
-      </w:r>
-      <w:r>
-        <w:t xml:space="preserve"> section, clicks a decision card (each card shows the resulting final classification):</w:t>
+        <w:t xml:space="preserve">Line 18 is the human-in-the-loop review: Confirm keeps the AI result, Override changes it to the other class, and Flag makes it Inconclusive. The analyst must write a rationale.</w:t>
       </w:r>
     </w:p>
     <w:p>
@@ -6062,89 +5213,22 @@
         </w:numPr>
       </w:pPr>
       <w:r>
-        <w:t xml:space="preserve">AI said </w:t>
-      </w:r>
-      <w:r>
-        <w:rPr>
-          <w:b/>
-          <w:bCs/>
-        </w:rPr>
-        <w:t xml:space="preserve">Real</w:t>
-      </w:r>
-      <w:r>
-        <w:t xml:space="preserve"> → </w:t>
-      </w:r>
-      <w:r>
-        <w:rPr>
-          <w:b/>
-          <w:bCs/>
-        </w:rPr>
-        <w:t xml:space="preserve">Override</w:t>
-      </w:r>
-      <w:r>
-        <w:t xml:space="preserve"> · AI said </w:t>
-      </w:r>
-      <w:r>
-        <w:rPr>
-          <w:b/>
-          <w:bCs/>
-        </w:rPr>
-        <w:t xml:space="preserve">Deepfake</w:t>
-      </w:r>
-      <w:r>
-        <w:t xml:space="preserve"> → </w:t>
-      </w:r>
-      <w:r>
-        <w:rPr>
-          <w:b/>
-          <w:bCs/>
-        </w:rPr>
-        <w:t xml:space="preserve">Confirm</w:t>
-      </w:r>
-      <w:r>
-        <w:t xml:space="preserve">.</w:t>
-      </w:r>
-    </w:p>
-    <w:p>
-      <w:r>
-        <w:rPr>
-          <w:b/>
-          <w:bCs/>
-        </w:rPr>
-        <w:t xml:space="preserve">Action:</w:t>
-      </w:r>
-      <w:r>
-        <w:t xml:space="preserve"> types "fake" and clicks submit.</w:t>
-      </w:r>
-    </w:p>
-    <w:p>
-      <w:r>
-        <w:rPr>
-          <w:b/>
-          <w:bCs/>
-          <w:color w:val="1F3864"/>
-        </w:rPr>
-        <w:t xml:space="preserve">Alexander: </w:t>
-      </w:r>
-      <w:r>
-        <w:rPr>
-          <w:i/>
-          <w:iCs/>
-          <w:color w:val="1F4E79"/>
-        </w:rPr>
-        <w:t xml:space="preserve">A rationale is mandatory, at least 30 characters. The analyst must justify every decision.</w:t>
-      </w:r>
-    </w:p>
-    <w:p>
-      <w:r>
-        <w:rPr>
-          <w:b/>
-          <w:bCs/>
-        </w:rPr>
-        <w:t xml:space="preserve">Action:</w:t>
-      </w:r>
-      <w:r>
-        <w:t xml:space="preserve"> types the rationale (Override example):</w:t>
+        <w:rPr>
+          <w:i/>
+          <w:iCs/>
+          <w:color w:val="1F4E79"/>
+        </w:rPr>
+        <w:t xml:space="preserve">Line 19 generates the forensic report, and line 20 returns both the AI result C and the analyst's decision D, with the score and the report.</w:t>
+      </w:r>
+    </w:p>
+    <w:p>
+      <w:r>
+        <w:rPr>
+          <w:i/>
+          <w:iCs/>
+          <w:color w:val="1F4E79"/>
+        </w:rPr>
+        <w:t xml:space="preserve">Lines 2 to 17 run automatically when a case is submitted. Lines 18 to 20 happen only when the analyst acts. The AI's classification C is never the final answer; the analyst's decision D is.</w:t>
       </w:r>
     </w:p>
     <w:p>
@@ -6154,6 +5238,973 @@
         <w:ind w:left="240" w:right="240"/>
       </w:pPr>
       <w:r>
+        <w:rPr>
+          <w:b/>
+          <w:bCs/>
+        </w:rPr>
+        <w:t xml:space="preserve">Replace Slide 12 with the revised 21-line algorithm</w:t>
+      </w:r>
+      <w:r>
+        <w:t xml:space="preserve"> (copy it from "Revised algorithm for Slide 12" at the end of this script) so the slide matches this narration and the manuscript.</w:t>
+      </w:r>
+    </w:p>
+    <w:p>
+      <w:pPr>
+        <w:pBdr>
+          <w:bottom w:val="single" w:color="BFBFBF" w:sz="6" w:space="1"/>
+        </w:pBdr>
+        <w:spacing w:after="200"/>
+      </w:pPr>
+    </w:p>
+    <w:p>
+      <w:pPr>
+        <w:pStyle w:val="Heading1"/>
+      </w:pPr>
+      <w:r>
+        <w:t xml:space="preserve">Slide 13 · Datasets, Training &amp; Evaluation — ⏱ 40:00–42:30 · </w:t>
+      </w:r>
+      <w:r>
+        <w:rPr>
+          <w:i/>
+          <w:iCs/>
+          <w:color w:val="1F4E79"/>
+        </w:rPr>
+        <w:t xml:space="preserve">Mark</w:t>
+      </w:r>
+    </w:p>
+    <w:p>
+      <w:r>
+        <w:rPr>
+          <w:i/>
+          <w:iCs/>
+          <w:color w:val="1F4E79"/>
+        </w:rPr>
+        <w:t xml:space="preserve">For training and evaluation we use three benchmark datasets: </w:t>
+      </w:r>
+      <w:r>
+        <w:rPr>
+          <w:b/>
+          <w:bCs/>
+          <w:i/>
+          <w:iCs/>
+          <w:color w:val="1F4E79"/>
+        </w:rPr>
+        <w:t xml:space="preserve">FaceForensics++, Celeb-DF, and DFDC</w:t>
+      </w:r>
+      <w:r>
+        <w:rPr>
+          <w:i/>
+          <w:iCs/>
+          <w:color w:val="1F4E79"/>
+        </w:rPr>
+        <w:t xml:space="preserve">, obtained through their official request forms. Together they cover several deepfake generation methods, which helps the model generalize.</w:t>
+      </w:r>
+    </w:p>
+    <w:p>
+      <w:r>
+        <w:rPr>
+          <w:i/>
+          <w:iCs/>
+          <w:color w:val="1F4E79"/>
+        </w:rPr>
+        <w:t xml:space="preserve">For </w:t>
+      </w:r>
+      <w:r>
+        <w:rPr>
+          <w:b/>
+          <w:bCs/>
+          <w:i/>
+          <w:iCs/>
+          <w:color w:val="1F4E79"/>
+        </w:rPr>
+        <w:t xml:space="preserve">training</w:t>
+      </w:r>
+      <w:r>
+        <w:rPr>
+          <w:i/>
+          <w:iCs/>
+          <w:color w:val="1F4E79"/>
+        </w:rPr>
+        <w:t xml:space="preserve">, we start from pre-trained ImageNet weights to save computation, and we apply flipping, rotation, and scaling augmentation to reduce overfitting. The model is trained on Google Colab's GPU, with early stopping based on validation ROC-AUC. We then calibrate the threshold τ on the validation set.</w:t>
+      </w:r>
+    </w:p>
+    <w:p>
+      <w:r>
+        <w:rPr>
+          <w:i/>
+          <w:iCs/>
+          <w:color w:val="1F4E79"/>
+        </w:rPr>
+        <w:t xml:space="preserve">Our </w:t>
+      </w:r>
+      <w:r>
+        <w:rPr>
+          <w:b/>
+          <w:bCs/>
+          <w:i/>
+          <w:iCs/>
+          <w:color w:val="1F4E79"/>
+        </w:rPr>
+        <w:t xml:space="preserve">evaluation has two parts</w:t>
+      </w:r>
+      <w:r>
+        <w:rPr>
+          <w:i/>
+          <w:iCs/>
+          <w:color w:val="1F4E79"/>
+        </w:rPr>
+        <w:t xml:space="preserve">. For the machine classification, we measure accuracy, precision, recall, F1-score, and ROC-AUC, and compare our hybrid model with an XceptionNet baseline. For human–AI agreement, we measure the agreement rate and Cohen's kappa between the AI's preliminary classification and the analyst's final decision.</w:t>
+      </w:r>
+    </w:p>
+    <w:p>
+      <w:r>
+        <w:rPr>
+          <w:i/>
+          <w:iCs/>
+          <w:color w:val="1F4E79"/>
+        </w:rPr>
+        <w:t xml:space="preserve">Alexander will now demonstrate the working system.</w:t>
+      </w:r>
+    </w:p>
+    <w:p>
+      <w:pPr>
+        <w:pBdr>
+          <w:bottom w:val="single" w:color="BFBFBF" w:sz="6" w:space="1"/>
+        </w:pBdr>
+        <w:spacing w:after="200"/>
+      </w:pPr>
+    </w:p>
+    <w:p>
+      <w:pPr>
+        <w:pStyle w:val="Heading1"/>
+      </w:pPr>
+      <w:r>
+        <w:t xml:space="preserve">LIVE DEMONSTRATION — ⏱ 42:30–55:00 · </w:t>
+      </w:r>
+      <w:r>
+        <w:rPr>
+          <w:i/>
+          <w:iCs/>
+          <w:color w:val="1F4E79"/>
+        </w:rPr>
+        <w:t xml:space="preserve">Alexander</w:t>
+      </w:r>
+      <w:r>
+        <w:t xml:space="preserve"> (Mark = backup operator)</w:t>
+      </w:r>
+    </w:p>
+    <w:p>
+      <w:pPr>
+        <w:shd w:fill="FFF2CC" w:color="auto" w:val="clear"/>
+        <w:spacing w:after="40"/>
+        <w:ind w:left="240" w:right="240"/>
+      </w:pPr>
+      <w:r>
+        <w:t xml:space="preserve">Use </w:t>
+      </w:r>
+      <w:r>
+        <w:rPr>
+          <w:b/>
+          <w:bCs/>
+        </w:rPr>
+        <w:t xml:space="preserve">only</w:t>
+      </w:r>
+      <w:r>
+        <w:t xml:space="preserve"> the NASA demo images in </w:t>
+      </w:r>
+      <w:r>
+        <w:rPr>
+          <w:rFonts w:ascii="Consolas" w:cs="Consolas" w:eastAsia="Consolas" w:hAnsi="Consolas"/>
+          <w:sz w:val="19"/>
+          <w:szCs w:val="19"/>
+        </w:rPr>
+        <w:t xml:space="preserve">demo\samples\</w:t>
+      </w:r>
+      <w:r>
+        <w:t xml:space="preserve"> (public-domain, non-explicit).</w:t>
+      </w:r>
+    </w:p>
+    <w:p>
+      <w:pPr>
+        <w:shd w:fill="FFF2CC" w:color="auto" w:val="clear"/>
+        <w:spacing w:after="200"/>
+        <w:ind w:left="240" w:right="240"/>
+      </w:pPr>
+      <w:r>
+        <w:t xml:space="preserve">Before the defense, follow the </w:t>
+      </w:r>
+      <w:r>
+        <w:rPr>
+          <w:b/>
+          <w:bCs/>
+        </w:rPr>
+        <w:t xml:space="preserve">checklist</w:t>
+      </w:r>
+      <w:r>
+        <w:t xml:space="preserve"> at the end. Start with fresh data so the case is CASE-0001.</w:t>
+      </w:r>
+    </w:p>
+    <w:p>
+      <w:pPr>
+        <w:pStyle w:val="Heading2"/>
+      </w:pPr>
+      <w:r>
+        <w:t xml:space="preserve">D1 · Introduce the prototype (42:30–43:30)</w:t>
+      </w:r>
+    </w:p>
+    <w:p>
+      <w:r>
+        <w:rPr>
+          <w:b/>
+          <w:bCs/>
+          <w:color w:val="1F3864"/>
+        </w:rPr>
+        <w:t xml:space="preserve">Alexander: </w:t>
+      </w:r>
+      <w:r>
+        <w:rPr>
+          <w:i/>
+          <w:iCs/>
+          <w:color w:val="1F4E79"/>
+        </w:rPr>
+        <w:t xml:space="preserve">Our prototype runs locally on this laptop, on the CPU. It is built with Python, PyTorch, Flask, and ReportLab for the PDF reports.</w:t>
+      </w:r>
+    </w:p>
+    <w:p>
+      <w:r>
+        <w:rPr>
+          <w:i/>
+          <w:iCs/>
+          <w:color w:val="1F4E79"/>
+        </w:rPr>
+        <w:t xml:space="preserve">(If the red banner shows:)</w:t>
+      </w:r>
+      <w:r>
+        <w:rPr>
+          <w:i/>
+          <w:iCs/>
+          <w:color w:val="1F4E79"/>
+        </w:rPr>
+        <w:t xml:space="preserve"> </w:t>
+      </w:r>
+      <w:r>
+        <w:rPr>
+          <w:i/>
+          <w:iCs/>
+          <w:color w:val="1F4E79"/>
+        </w:rPr>
+        <w:t xml:space="preserve">The red banner reads "UNTRAINED MODEL: results not indicative of real accuracy." Our system displays this whenever the fine-tuned weights have not been loaded, on every page and in every report, so that no one relies on an unvalidated AI result.</w:t>
+      </w:r>
+    </w:p>
+    <w:p>
+      <w:r>
+        <w:rPr>
+          <w:b/>
+          <w:bCs/>
+          <w:color w:val="1F3864"/>
+        </w:rPr>
+        <w:t xml:space="preserve">Alexander: </w:t>
+      </w:r>
+      <w:r>
+        <w:rPr>
+          <w:i/>
+          <w:iCs/>
+          <w:color w:val="1F4E79"/>
+        </w:rPr>
+        <w:t xml:space="preserve">For this demonstration we use a public-domain NASA portrait, not explicit material. Our AI analyzes only the face region, so the process is identical, and our ethics protocol forbids showing explicit material outside authorized casework.</w:t>
+      </w:r>
+    </w:p>
+    <w:p>
+      <w:pPr>
+        <w:pStyle w:val="Heading2"/>
+      </w:pPr>
+      <w:r>
+        <w:t xml:space="preserve">D2 · Investigator submits a case (43:30–46:30)</w:t>
+      </w:r>
+    </w:p>
+    <w:p>
+      <w:r>
+        <w:rPr>
+          <w:b/>
+          <w:bCs/>
+        </w:rPr>
+        <w:t xml:space="preserve">Action:</w:t>
+      </w:r>
+      <w:r>
+        <w:t xml:space="preserve"> on the login page, </w:t>
+      </w:r>
+      <w:r>
+        <w:rPr>
+          <w:b/>
+          <w:bCs/>
+        </w:rPr>
+        <w:t xml:space="preserve">Log in as: Investigator</w:t>
+      </w:r>
+      <w:r>
+        <w:t xml:space="preserve"> → </w:t>
+      </w:r>
+      <w:r>
+        <w:rPr>
+          <w:b/>
+          <w:bCs/>
+        </w:rPr>
+        <w:t xml:space="preserve">INV-01</w:t>
+      </w:r>
+      <w:r>
+        <w:t xml:space="preserve"> → </w:t>
+      </w:r>
+      <w:r>
+        <w:rPr>
+          <w:b/>
+          <w:bCs/>
+        </w:rPr>
+        <w:t xml:space="preserve">Submit case</w:t>
+      </w:r>
+      <w:r>
+        <w:t xml:space="preserve"> → Suspect </w:t>
+      </w:r>
+      <w:r>
+        <w:rPr>
+          <w:rFonts w:ascii="Consolas" w:cs="Consolas" w:eastAsia="Consolas" w:hAnsi="Consolas"/>
+          <w:sz w:val="19"/>
+          <w:szCs w:val="19"/>
+        </w:rPr>
+        <w:t xml:space="preserve">suspect_manipulated.png</w:t>
+      </w:r>
+      <w:r>
+        <w:t xml:space="preserve">, Reference </w:t>
+      </w:r>
+      <w:r>
+        <w:rPr>
+          <w:rFonts w:ascii="Consolas" w:cs="Consolas" w:eastAsia="Consolas" w:hAnsi="Consolas"/>
+          <w:sz w:val="19"/>
+          <w:szCs w:val="19"/>
+        </w:rPr>
+        <w:t xml:space="preserve">reference.png</w:t>
+      </w:r>
+      <w:r>
+        <w:t xml:space="preserve">.</w:t>
+      </w:r>
+    </w:p>
+    <w:p>
+      <w:r>
+        <w:rPr>
+          <w:b/>
+          <w:bCs/>
+          <w:color w:val="1F3864"/>
+        </w:rPr>
+        <w:t xml:space="preserve">Alexander: </w:t>
+      </w:r>
+      <w:r>
+        <w:rPr>
+          <w:i/>
+          <w:iCs/>
+          <w:color w:val="1F4E79"/>
+        </w:rPr>
+        <w:t xml:space="preserve">On the login page I choose "Log in as Investigator". The system checks that the chosen role matches the account, so an analyst account cannot enter as an investigator. We are now logged in as an investigator. The suspect image has a synthetic edit to the inner face region; the reference is the original portrait of the same person.</w:t>
+      </w:r>
+    </w:p>
+    <w:p>
+      <w:r>
+        <w:rPr>
+          <w:b/>
+          <w:bCs/>
+        </w:rPr>
+        <w:t xml:space="preserve">Action:</w:t>
+      </w:r>
+      <w:r>
+        <w:t xml:space="preserve"> points at the checkbox, ticks it.</w:t>
+      </w:r>
+    </w:p>
+    <w:p>
+      <w:r>
+        <w:rPr>
+          <w:b/>
+          <w:bCs/>
+          <w:color w:val="1F3864"/>
+        </w:rPr>
+        <w:t xml:space="preserve">Alexander: </w:t>
+      </w:r>
+      <w:r>
+        <w:rPr>
+          <w:i/>
+          <w:iCs/>
+          <w:color w:val="1F4E79"/>
+        </w:rPr>
+        <w:t xml:space="preserve">Every submission requires this attestation: that the subject is an adult and that the investigator is authorized. This enforces our scope.</w:t>
+      </w:r>
+    </w:p>
+    <w:p>
+      <w:r>
+        <w:rPr>
+          <w:b/>
+          <w:bCs/>
+        </w:rPr>
+        <w:t xml:space="preserve">Action:</w:t>
+      </w:r>
+      <w:r>
+        <w:t xml:space="preserve"> clicks </w:t>
+      </w:r>
+      <w:r>
+        <w:rPr>
+          <w:b/>
+          <w:bCs/>
+        </w:rPr>
+        <w:t xml:space="preserve">Submit for analysis</w:t>
+      </w:r>
+      <w:r>
+        <w:t xml:space="preserve">.</w:t>
+      </w:r>
+    </w:p>
+    <w:p>
+      <w:r>
+        <w:rPr>
+          <w:b/>
+          <w:bCs/>
+          <w:color w:val="1F3864"/>
+        </w:rPr>
+        <w:t xml:space="preserve">Alexander: </w:t>
+      </w:r>
+      <w:r>
+        <w:rPr>
+          <w:i/>
+          <w:iCs/>
+          <w:color w:val="1F4E79"/>
+        </w:rPr>
+        <w:t xml:space="preserve">Right now the system computes a SHA-256 hash of each file for chain of custody, then runs our algorithm, lines 2 to 17: face detection, both neural branches, fusion, the three metrics, the preliminary classification, and adding the case to the review queue.</w:t>
+      </w:r>
+    </w:p>
+    <w:p>
+      <w:r>
+        <w:rPr>
+          <w:b/>
+          <w:bCs/>
+        </w:rPr>
+        <w:t xml:space="preserve">Action:</w:t>
+      </w:r>
+      <w:r>
+        <w:t xml:space="preserve"> shows </w:t>
+      </w:r>
+      <w:r>
+        <w:rPr>
+          <w:b/>
+          <w:bCs/>
+        </w:rPr>
+        <w:t xml:space="preserve">My cases</w:t>
+      </w:r>
+      <w:r>
+        <w:t xml:space="preserve">.</w:t>
+      </w:r>
+    </w:p>
+    <w:p>
+      <w:r>
+        <w:rPr>
+          <w:b/>
+          <w:bCs/>
+          <w:color w:val="1F3864"/>
+        </w:rPr>
+        <w:t xml:space="preserve">Alexander: </w:t>
+      </w:r>
+      <w:r>
+        <w:rPr>
+          <w:i/>
+          <w:iCs/>
+          <w:color w:val="1F4E79"/>
+        </w:rPr>
+        <w:t xml:space="preserve">The case is </w:t>
+      </w:r>
+      <w:r>
+        <w:rPr>
+          <w:b/>
+          <w:bCs/>
+          <w:i/>
+          <w:iCs/>
+          <w:color w:val="1F4E79"/>
+        </w:rPr>
+        <w:t xml:space="preserve">Pending</w:t>
+      </w:r>
+      <w:r>
+        <w:rPr>
+          <w:i/>
+          <w:iCs/>
+          <w:color w:val="1F4E79"/>
+        </w:rPr>
+        <w:t xml:space="preserve">. Notice that the investigator does not see the AI's result. Nothing is final until an analyst reviews it.</w:t>
+      </w:r>
+    </w:p>
+    <w:p>
+      <w:pPr>
+        <w:pStyle w:val="Heading2"/>
+      </w:pPr>
+      <w:r>
+        <w:t xml:space="preserve">D3 · No face = no analysis (46:30–47:30)</w:t>
+      </w:r>
+    </w:p>
+    <w:p>
+      <w:r>
+        <w:rPr>
+          <w:b/>
+          <w:bCs/>
+        </w:rPr>
+        <w:t xml:space="preserve">Action:</w:t>
+      </w:r>
+      <w:r>
+        <w:t xml:space="preserve"> submits </w:t>
+      </w:r>
+      <w:r>
+        <w:rPr>
+          <w:rFonts w:ascii="Consolas" w:cs="Consolas" w:eastAsia="Consolas" w:hAnsi="Consolas"/>
+          <w:sz w:val="19"/>
+          <w:szCs w:val="19"/>
+        </w:rPr>
+        <w:t xml:space="preserve">no_face.png</w:t>
+      </w:r>
+      <w:r>
+        <w:t xml:space="preserve"> + </w:t>
+      </w:r>
+      <w:r>
+        <w:rPr>
+          <w:rFonts w:ascii="Consolas" w:cs="Consolas" w:eastAsia="Consolas" w:hAnsi="Consolas"/>
+          <w:sz w:val="19"/>
+          <w:szCs w:val="19"/>
+        </w:rPr>
+        <w:t xml:space="preserve">reference.png</w:t>
+      </w:r>
+      <w:r>
+        <w:t xml:space="preserve">.</w:t>
+      </w:r>
+    </w:p>
+    <w:p>
+      <w:r>
+        <w:rPr>
+          <w:b/>
+          <w:bCs/>
+          <w:color w:val="1F3864"/>
+        </w:rPr>
+        <w:t xml:space="preserve">Alexander: </w:t>
+      </w:r>
+      <w:r>
+        <w:rPr>
+          <w:i/>
+          <w:iCs/>
+          <w:color w:val="1F4E79"/>
+        </w:rPr>
+        <w:t xml:space="preserve">If no face is detected, the system does not guess: "No face detected. Case cannot be analyzed." The rejection is still recorded in the audit log.</w:t>
+      </w:r>
+    </w:p>
+    <w:p>
+      <w:pPr>
+        <w:pStyle w:val="Heading2"/>
+      </w:pPr>
+      <w:r>
+        <w:t xml:space="preserve">D4 · Analyst dashboard (47:30–48:30)</w:t>
+      </w:r>
+    </w:p>
+    <w:p>
+      <w:r>
+        <w:rPr>
+          <w:b/>
+          <w:bCs/>
+        </w:rPr>
+        <w:t xml:space="preserve">Action:</w:t>
+      </w:r>
+      <w:r>
+        <w:t xml:space="preserve"> logs out → </w:t>
+      </w:r>
+      <w:r>
+        <w:rPr>
+          <w:b/>
+          <w:bCs/>
+        </w:rPr>
+        <w:t xml:space="preserve">Log in as: Analyst</w:t>
+      </w:r>
+      <w:r>
+        <w:t xml:space="preserve"> → </w:t>
+      </w:r>
+      <w:r>
+        <w:rPr>
+          <w:b/>
+          <w:bCs/>
+        </w:rPr>
+        <w:t xml:space="preserve">ANA-01</w:t>
+      </w:r>
+      <w:r>
+        <w:t xml:space="preserve">.</w:t>
+      </w:r>
+    </w:p>
+    <w:p>
+      <w:r>
+        <w:rPr>
+          <w:b/>
+          <w:bCs/>
+          <w:color w:val="1F3864"/>
+        </w:rPr>
+        <w:t xml:space="preserve">Alexander: </w:t>
+      </w:r>
+      <w:r>
+        <w:rPr>
+          <w:i/>
+          <w:iCs/>
+          <w:color w:val="1F4E79"/>
+        </w:rPr>
+        <w:t xml:space="preserve">Now we are the forensic analyst. The dashboard shows how many cases are pending, verified, and flagged, and the live agreement rate between the AI and the analysts.</w:t>
+      </w:r>
+    </w:p>
+    <w:p>
+      <w:pPr>
+        <w:pStyle w:val="Heading2"/>
+      </w:pPr>
+      <w:r>
+        <w:t xml:space="preserve">D5 · Review interface, objective 3 (48:30–52:30)</w:t>
+      </w:r>
+    </w:p>
+    <w:p>
+      <w:r>
+        <w:rPr>
+          <w:b/>
+          <w:bCs/>
+        </w:rPr>
+        <w:t xml:space="preserve">Action:</w:t>
+      </w:r>
+      <w:r>
+        <w:t xml:space="preserve"> clicks </w:t>
+      </w:r>
+      <w:r>
+        <w:rPr>
+          <w:b/>
+          <w:bCs/>
+        </w:rPr>
+        <w:t xml:space="preserve">Review</w:t>
+      </w:r>
+      <w:r>
+        <w:t xml:space="preserve">.</w:t>
+      </w:r>
+    </w:p>
+    <w:p>
+      <w:r>
+        <w:rPr>
+          <w:b/>
+          <w:bCs/>
+          <w:color w:val="1F3864"/>
+        </w:rPr>
+        <w:t xml:space="preserve">Alexander: </w:t>
+      </w:r>
+      <w:r>
+        <w:rPr>
+          <w:i/>
+          <w:iCs/>
+          <w:color w:val="1F4E79"/>
+        </w:rPr>
+        <w:t xml:space="preserve">This is the core of our study.</w:t>
+      </w:r>
+    </w:p>
+    <w:p>
+      <w:pPr>
+        <w:pStyle w:val="ListParagraph"/>
+        <w:numPr>
+          <w:ilvl w:val="0"/>
+          <w:numId w:val="3"/>
+        </w:numPr>
+      </w:pPr>
+      <w:r>
+        <w:rPr>
+          <w:i/>
+          <w:iCs/>
+          <w:color w:val="1F4E79"/>
+        </w:rPr>
+        <w:t xml:space="preserve">On the left are only the </w:t>
+      </w:r>
+      <w:r>
+        <w:rPr>
+          <w:b/>
+          <w:bCs/>
+          <w:i/>
+          <w:iCs/>
+          <w:color w:val="1F4E79"/>
+        </w:rPr>
+        <w:t xml:space="preserve">aligned face crops</w:t>
+      </w:r>
+      <w:r>
+        <w:rPr>
+          <w:i/>
+          <w:iCs/>
+          <w:color w:val="1F4E79"/>
+        </w:rPr>
+        <w:t xml:space="preserve">. The full images are </w:t>
+      </w:r>
+      <w:r>
+        <w:rPr>
+          <w:b/>
+          <w:bCs/>
+          <w:i/>
+          <w:iCs/>
+          <w:color w:val="1F4E79"/>
+        </w:rPr>
+        <w:t xml:space="preserve">pixelated</w:t>
+      </w:r>
+      <w:r>
+        <w:rPr>
+          <w:i/>
+          <w:iCs/>
+          <w:color w:val="1F4E79"/>
+        </w:rPr>
+        <w:t xml:space="preserve"> by default. This protects sensitive material.</w:t>
+      </w:r>
+    </w:p>
+    <w:p>
+      <w:pPr>
+        <w:pStyle w:val="ListParagraph"/>
+        <w:numPr>
+          <w:ilvl w:val="0"/>
+          <w:numId w:val="3"/>
+        </w:numPr>
+      </w:pPr>
+      <w:r>
+        <w:rPr>
+          <w:i/>
+          <w:iCs/>
+          <w:color w:val="1F4E79"/>
+        </w:rPr>
+        <w:t xml:space="preserve">On the right, in blue and labeled </w:t>
+      </w:r>
+      <w:r>
+        <w:rPr>
+          <w:b/>
+          <w:bCs/>
+          <w:i/>
+          <w:iCs/>
+          <w:color w:val="1F4E79"/>
+        </w:rPr>
+        <w:t xml:space="preserve">AUTOMATED</w:t>
+      </w:r>
+      <w:r>
+        <w:rPr>
+          <w:i/>
+          <w:iCs/>
+          <w:color w:val="1F4E79"/>
+        </w:rPr>
+        <w:t xml:space="preserve">, is the AI's preliminary analysis: the classification, the confidence ring, the three similarity metrics, and a gauge showing the aggregated score S against the threshold τ, with the Deepfake zone in red and the Real zone in green.</w:t>
+      </w:r>
+      <w:r>
+        <w:rPr>
+          <w:i/>
+          <w:iCs/>
+          <w:color w:val="1F4E79"/>
+        </w:rPr>
+        <w:t xml:space="preserve"> </w:t>
+      </w:r>
+      <w:r>
+        <w:rPr>
+          <w:i/>
+          <w:iCs/>
+          <w:color w:val="1F4E79"/>
+        </w:rPr>
+        <w:t xml:space="preserve">(Read the actual values on screen.)</w:t>
+      </w:r>
+    </w:p>
+    <w:p>
+      <w:r>
+        <w:rPr>
+          <w:b/>
+          <w:bCs/>
+        </w:rPr>
+        <w:t xml:space="preserve">Action:</w:t>
+      </w:r>
+      <w:r>
+        <w:t xml:space="preserve"> drags the </w:t>
+      </w:r>
+      <w:r>
+        <w:rPr>
+          <w:b/>
+          <w:bCs/>
+        </w:rPr>
+        <w:t xml:space="preserve">Overlay comparison</w:t>
+      </w:r>
+      <w:r>
+        <w:t xml:space="preserve"> slider back and forth.</w:t>
+      </w:r>
+    </w:p>
+    <w:p>
+      <w:r>
+        <w:rPr>
+          <w:b/>
+          <w:bCs/>
+          <w:color w:val="1F3864"/>
+        </w:rPr>
+        <w:t xml:space="preserve">Alexander: </w:t>
+      </w:r>
+      <w:r>
+        <w:rPr>
+          <w:i/>
+          <w:iCs/>
+          <w:color w:val="1F4E79"/>
+        </w:rPr>
+        <w:t xml:space="preserve">The overlay comparison fades the suspect face over the reference face. Because both are aligned by MTCNN, any edits, such as warping or colour changes, stand out as the faces shift.</w:t>
+      </w:r>
+    </w:p>
+    <w:p>
+      <w:r>
+        <w:rPr>
+          <w:b/>
+          <w:bCs/>
+        </w:rPr>
+        <w:t xml:space="preserve">Action:</w:t>
+      </w:r>
+      <w:r>
+        <w:t xml:space="preserve"> clicks </w:t>
+      </w:r>
+      <w:r>
+        <w:rPr>
+          <w:b/>
+          <w:bCs/>
+        </w:rPr>
+        <w:t xml:space="preserve">Reveal full image</w:t>
+      </w:r>
+      <w:r>
+        <w:t xml:space="preserve"> → confirms.</w:t>
+      </w:r>
+    </w:p>
+    <w:p>
+      <w:r>
+        <w:rPr>
+          <w:b/>
+          <w:bCs/>
+          <w:color w:val="1F3864"/>
+        </w:rPr>
+        <w:t xml:space="preserve">Alexander: </w:t>
+      </w:r>
+      <w:r>
+        <w:rPr>
+          <w:i/>
+          <w:iCs/>
+          <w:color w:val="1F4E79"/>
+        </w:rPr>
+        <w:t xml:space="preserve">If the analyst must see the full image, they reveal it deliberately. Only analysts can do this, and every reveal is logged with their ID and the time.</w:t>
+      </w:r>
+    </w:p>
+    <w:p>
+      <w:r>
+        <w:rPr>
+          <w:b/>
+          <w:bCs/>
+        </w:rPr>
+        <w:t xml:space="preserve">Action:</w:t>
+      </w:r>
+      <w:r>
+        <w:t xml:space="preserve"> in the green </w:t>
+      </w:r>
+      <w:r>
+        <w:rPr>
+          <w:b/>
+          <w:bCs/>
+        </w:rPr>
+        <w:t xml:space="preserve">HUMAN-VERIFIED</w:t>
+      </w:r>
+      <w:r>
+        <w:t xml:space="preserve"> section, clicks a decision card (each card shows the resulting final classification):</w:t>
+      </w:r>
+    </w:p>
+    <w:p>
+      <w:pPr>
+        <w:pStyle w:val="ListParagraph"/>
+        <w:numPr>
+          <w:ilvl w:val="0"/>
+          <w:numId w:val="3"/>
+        </w:numPr>
+      </w:pPr>
+      <w:r>
+        <w:t xml:space="preserve">AI said </w:t>
+      </w:r>
+      <w:r>
+        <w:rPr>
+          <w:b/>
+          <w:bCs/>
+        </w:rPr>
+        <w:t xml:space="preserve">Real</w:t>
+      </w:r>
+      <w:r>
+        <w:t xml:space="preserve"> → </w:t>
+      </w:r>
+      <w:r>
+        <w:rPr>
+          <w:b/>
+          <w:bCs/>
+        </w:rPr>
+        <w:t xml:space="preserve">Override</w:t>
+      </w:r>
+      <w:r>
+        <w:t xml:space="preserve"> · AI said </w:t>
+      </w:r>
+      <w:r>
+        <w:rPr>
+          <w:b/>
+          <w:bCs/>
+        </w:rPr>
+        <w:t xml:space="preserve">Deepfake</w:t>
+      </w:r>
+      <w:r>
+        <w:t xml:space="preserve"> → </w:t>
+      </w:r>
+      <w:r>
+        <w:rPr>
+          <w:b/>
+          <w:bCs/>
+        </w:rPr>
+        <w:t xml:space="preserve">Confirm</w:t>
+      </w:r>
+      <w:r>
+        <w:t xml:space="preserve">.</w:t>
+      </w:r>
+    </w:p>
+    <w:p>
+      <w:r>
+        <w:rPr>
+          <w:b/>
+          <w:bCs/>
+        </w:rPr>
+        <w:t xml:space="preserve">Action:</w:t>
+      </w:r>
+      <w:r>
+        <w:t xml:space="preserve"> types "fake" and clicks submit.</w:t>
+      </w:r>
+    </w:p>
+    <w:p>
+      <w:r>
+        <w:rPr>
+          <w:b/>
+          <w:bCs/>
+          <w:color w:val="1F3864"/>
+        </w:rPr>
+        <w:t xml:space="preserve">Alexander: </w:t>
+      </w:r>
+      <w:r>
+        <w:rPr>
+          <w:i/>
+          <w:iCs/>
+          <w:color w:val="1F4E79"/>
+        </w:rPr>
+        <w:t xml:space="preserve">A rationale is mandatory, at least 30 characters. The analyst must justify every decision.</w:t>
+      </w:r>
+    </w:p>
+    <w:p>
+      <w:r>
+        <w:rPr>
+          <w:b/>
+          <w:bCs/>
+        </w:rPr>
+        <w:t xml:space="preserve">Action:</w:t>
+      </w:r>
+      <w:r>
+        <w:t xml:space="preserve"> types the rationale (Override example):</w:t>
+      </w:r>
+    </w:p>
+    <w:p>
+      <w:pPr>
+        <w:shd w:fill="FFF2CC" w:color="auto" w:val="clear"/>
+        <w:spacing w:after="200"/>
+        <w:ind w:left="240" w:right="240"/>
+      </w:pPr>
+      <w:r>
         <w:t xml:space="preserve">Although the AI scored the image as Real, the inner face region shows warping around the eyes and nose bridge, and its colour saturation differs from the forehead and neck. These localized distortions are inconsistent with the reference image. Overriding to Deepfake.</w:t>
       </w:r>
     </w:p>
@@ -6215,7 +6266,7 @@
           <w:iCs/>
           <w:color w:val="1F4E79"/>
         </w:rPr>
-        <w:t xml:space="preserve">This is exactly why human review matters. The AI's preliminary result was wrong, and the analyst corrected it, with the reasoning on record. This is line 16 of our algorithm.</w:t>
+        <w:t xml:space="preserve">This is exactly why human review matters. The AI's preliminary result was wrong, and the analyst corrected it, with the reasoning on record. This is line 18 of our algorithm.</w:t>
       </w:r>
     </w:p>
     <w:p>
@@ -6241,7 +6292,7 @@
           <w:iCs/>
           <w:color w:val="1F4E79"/>
         </w:rPr>
-        <w:t xml:space="preserve">This is line 17, the forensic report.</w:t>
+        <w:t xml:space="preserve">This is line 19, the forensic report.</w:t>
       </w:r>
       <w:r>
         <w:t xml:space="preserve"> (Scroll slowly.)</w:t>
@@ -6795,10 +6846,10 @@
         </w:tblBorders>
       </w:tblPr>
       <w:tblGrid>
-        <w:gridCol w:w="477"/>
-        <w:gridCol w:w="2481"/>
-        <w:gridCol w:w="3339"/>
-        <w:gridCol w:w="3341"/>
+        <w:gridCol w:w="926"/>
+        <w:gridCol w:w="2224"/>
+        <w:gridCol w:w="3243"/>
+        <w:gridCol w:w="3245"/>
       </w:tblGrid>
       <w:tr>
         <w:trPr>
@@ -6806,7 +6857,7 @@
         </w:trPr>
         <w:tc>
           <w:tcPr>
-            <w:tcW w:type="dxa" w:w="477"/>
+            <w:tcW w:type="dxa" w:w="926"/>
             <w:tcBorders>
               <w:top w:val="single" w:color="BFBFBF" w:sz="4"/>
               <w:left w:val="single" w:color="BFBFBF" w:sz="4"/>
@@ -6838,7 +6889,7 @@
         </w:tc>
         <w:tc>
           <w:tcPr>
-            <w:tcW w:type="dxa" w:w="2481"/>
+            <w:tcW w:type="dxa" w:w="2224"/>
             <w:tcBorders>
               <w:top w:val="single" w:color="BFBFBF" w:sz="4"/>
               <w:left w:val="single" w:color="BFBFBF" w:sz="4"/>
@@ -6870,7 +6921,7 @@
         </w:tc>
         <w:tc>
           <w:tcPr>
-            <w:tcW w:type="dxa" w:w="3339"/>
+            <w:tcW w:type="dxa" w:w="3243"/>
             <w:tcBorders>
               <w:top w:val="single" w:color="BFBFBF" w:sz="4"/>
               <w:left w:val="single" w:color="BFBFBF" w:sz="4"/>
@@ -6902,7 +6953,7 @@
         </w:tc>
         <w:tc>
           <w:tcPr>
-            <w:tcW w:type="dxa" w:w="3341"/>
+            <w:tcW w:type="dxa" w:w="3245"/>
             <w:tcBorders>
               <w:top w:val="single" w:color="BFBFBF" w:sz="4"/>
               <w:left w:val="single" w:color="BFBFBF" w:sz="4"/>
@@ -6939,119 +6990,133 @@
         </w:trPr>
         <w:tc>
           <w:tcPr>
-            <w:tcW w:type="dxa" w:w="477"/>
-            <w:tcBorders>
-              <w:top w:val="single" w:color="BFBFBF" w:sz="4"/>
-              <w:left w:val="single" w:color="BFBFBF" w:sz="4"/>
-              <w:bottom w:val="single" w:color="BFBFBF" w:sz="4"/>
-              <w:right w:val="single" w:color="BFBFBF" w:sz="4"/>
-            </w:tcBorders>
-            <w:tcMar>
-              <w:top w:type="dxa" w:w="60"/>
-              <w:left w:type="dxa" w:w="100"/>
-              <w:bottom w:type="dxa" w:w="60"/>
-              <w:right w:type="dxa" w:w="100"/>
-            </w:tcMar>
-          </w:tcPr>
-          <w:p>
-            <w:pPr>
-              <w:spacing w:after="0"/>
-            </w:pPr>
-            <w:r>
-              <w:rPr>
-                <w:sz w:val="19"/>
-                <w:szCs w:val="19"/>
-              </w:rPr>
-              <w:t xml:space="preserve">12, line 9</w:t>
-            </w:r>
-          </w:p>
-        </w:tc>
-        <w:tc>
-          <w:tcPr>
-            <w:tcW w:type="dxa" w:w="2481"/>
-            <w:tcBorders>
-              <w:top w:val="single" w:color="BFBFBF" w:sz="4"/>
-              <w:left w:val="single" w:color="BFBFBF" w:sz="4"/>
-              <w:bottom w:val="single" w:color="BFBFBF" w:sz="4"/>
-              <w:right w:val="single" w:color="BFBFBF" w:sz="4"/>
-            </w:tcBorders>
-            <w:tcMar>
-              <w:top w:type="dxa" w:w="60"/>
-              <w:left w:type="dxa" w:w="100"/>
-              <w:bottom w:type="dxa" w:w="60"/>
-              <w:right w:type="dxa" w:w="100"/>
-            </w:tcMar>
-          </w:tcPr>
-          <w:p>
-            <w:pPr>
-              <w:spacing w:after="0"/>
-            </w:pPr>
-            <w:r>
-              <w:rPr>
-                <w:rFonts w:ascii="Consolas" w:cs="Consolas" w:eastAsia="Consolas" w:hAnsi="Consolas"/>
-                <w:sz w:val="19"/>
-                <w:szCs w:val="19"/>
-              </w:rPr>
-              <w:t xml:space="preserve">Score_SSIM ← Calculate_SSIM_Index(F_fused, R)</w:t>
-            </w:r>
-          </w:p>
-        </w:tc>
-        <w:tc>
-          <w:tcPr>
-            <w:tcW w:type="dxa" w:w="3339"/>
-            <w:tcBorders>
-              <w:top w:val="single" w:color="BFBFBF" w:sz="4"/>
-              <w:left w:val="single" w:color="BFBFBF" w:sz="4"/>
-              <w:bottom w:val="single" w:color="BFBFBF" w:sz="4"/>
-              <w:right w:val="single" w:color="BFBFBF" w:sz="4"/>
-            </w:tcBorders>
-            <w:tcMar>
-              <w:top w:type="dxa" w:w="60"/>
-              <w:left w:type="dxa" w:w="100"/>
-              <w:bottom w:type="dxa" w:w="60"/>
-              <w:right w:type="dxa" w:w="100"/>
-            </w:tcMar>
-          </w:tcPr>
-          <w:p>
-            <w:pPr>
-              <w:spacing w:after="0"/>
-            </w:pPr>
-            <w:r>
-              <w:rPr>
-                <w:sz w:val="19"/>
-                <w:szCs w:val="19"/>
-              </w:rPr>
-              <w:t xml:space="preserve">SSIM is a 2-D image measure and cannot be computed on an embedding vector. The system computes it on the aligned face crops.</w:t>
-            </w:r>
-          </w:p>
-        </w:tc>
-        <w:tc>
-          <w:tcPr>
-            <w:tcW w:type="dxa" w:w="3341"/>
-            <w:tcBorders>
-              <w:top w:val="single" w:color="BFBFBF" w:sz="4"/>
-              <w:left w:val="single" w:color="BFBFBF" w:sz="4"/>
-              <w:bottom w:val="single" w:color="BFBFBF" w:sz="4"/>
-              <w:right w:val="single" w:color="BFBFBF" w:sz="4"/>
-            </w:tcBorders>
-            <w:tcMar>
-              <w:top w:type="dxa" w:w="60"/>
-              <w:left w:type="dxa" w:w="100"/>
-              <w:bottom w:type="dxa" w:w="60"/>
-              <w:right w:type="dxa" w:w="100"/>
-            </w:tcMar>
-          </w:tcPr>
-          <w:p>
-            <w:pPr>
-              <w:spacing w:after="0"/>
-            </w:pPr>
-            <w:r>
-              <w:rPr>
-                <w:rFonts w:ascii="Consolas" w:cs="Consolas" w:eastAsia="Consolas" w:hAnsi="Consolas"/>
-                <w:sz w:val="19"/>
-                <w:szCs w:val="19"/>
-              </w:rPr>
-              <w:t xml:space="preserve">Score_SSIM ← Calculate_SSIM_Index(I_aligned, R_aligned)  // structural similarity of aligned face crops</w:t>
+            <w:tcW w:type="dxa" w:w="926"/>
+            <w:tcBorders>
+              <w:top w:val="single" w:color="BFBFBF" w:sz="4"/>
+              <w:left w:val="single" w:color="BFBFBF" w:sz="4"/>
+              <w:bottom w:val="single" w:color="BFBFBF" w:sz="4"/>
+              <w:right w:val="single" w:color="BFBFBF" w:sz="4"/>
+            </w:tcBorders>
+            <w:tcMar>
+              <w:top w:type="dxa" w:w="60"/>
+              <w:left w:type="dxa" w:w="100"/>
+              <w:bottom w:type="dxa" w:w="60"/>
+              <w:right w:type="dxa" w:w="100"/>
+            </w:tcMar>
+          </w:tcPr>
+          <w:p>
+            <w:pPr>
+              <w:spacing w:after="0"/>
+            </w:pPr>
+            <w:r>
+              <w:rPr>
+                <w:sz w:val="19"/>
+                <w:szCs w:val="19"/>
+              </w:rPr>
+              <w:t xml:space="preserve">12 (whole algorithm)</w:t>
+            </w:r>
+          </w:p>
+        </w:tc>
+        <w:tc>
+          <w:tcPr>
+            <w:tcW w:type="dxa" w:w="2224"/>
+            <w:tcBorders>
+              <w:top w:val="single" w:color="BFBFBF" w:sz="4"/>
+              <w:left w:val="single" w:color="BFBFBF" w:sz="4"/>
+              <w:bottom w:val="single" w:color="BFBFBF" w:sz="4"/>
+              <w:right w:val="single" w:color="BFBFBF" w:sz="4"/>
+            </w:tcBorders>
+            <w:tcMar>
+              <w:top w:type="dxa" w:w="60"/>
+              <w:left w:type="dxa" w:w="100"/>
+              <w:bottom w:type="dxa" w:w="60"/>
+              <w:right w:type="dxa" w:w="100"/>
+            </w:tcMar>
+          </w:tcPr>
+          <w:p>
+            <w:pPr>
+              <w:spacing w:after="0"/>
+            </w:pPr>
+            <w:r>
+              <w:rPr>
+                <w:sz w:val="19"/>
+                <w:szCs w:val="19"/>
+              </w:rPr>
+              <w:t xml:space="preserve">The 19-line algorithm</w:t>
+            </w:r>
+          </w:p>
+        </w:tc>
+        <w:tc>
+          <w:tcPr>
+            <w:tcW w:type="dxa" w:w="3243"/>
+            <w:tcBorders>
+              <w:top w:val="single" w:color="BFBFBF" w:sz="4"/>
+              <w:left w:val="single" w:color="BFBFBF" w:sz="4"/>
+              <w:bottom w:val="single" w:color="BFBFBF" w:sz="4"/>
+              <w:right w:val="single" w:color="BFBFBF" w:sz="4"/>
+            </w:tcBorders>
+            <w:tcMar>
+              <w:top w:type="dxa" w:w="60"/>
+              <w:left w:type="dxa" w:w="100"/>
+              <w:bottom w:type="dxa" w:w="60"/>
+              <w:right w:type="dxa" w:w="100"/>
+            </w:tcMar>
+          </w:tcPr>
+          <w:p>
+            <w:pPr>
+              <w:spacing w:after="0"/>
+            </w:pPr>
+            <w:r>
+              <w:rPr>
+                <w:sz w:val="19"/>
+                <w:szCs w:val="19"/>
+              </w:rPr>
+              <w:t xml:space="preserve">It processes only I (not R), has no "no face" stop, no confidence step, computes SSIM on the embeddings and adds a raw distance into S</w:t>
+            </w:r>
+          </w:p>
+        </w:tc>
+        <w:tc>
+          <w:tcPr>
+            <w:tcW w:type="dxa" w:w="3245"/>
+            <w:tcBorders>
+              <w:top w:val="single" w:color="BFBFBF" w:sz="4"/>
+              <w:left w:val="single" w:color="BFBFBF" w:sz="4"/>
+              <w:bottom w:val="single" w:color="BFBFBF" w:sz="4"/>
+              <w:right w:val="single" w:color="BFBFBF" w:sz="4"/>
+            </w:tcBorders>
+            <w:tcMar>
+              <w:top w:type="dxa" w:w="60"/>
+              <w:left w:type="dxa" w:w="100"/>
+              <w:bottom w:type="dxa" w:w="60"/>
+              <w:right w:type="dxa" w:w="100"/>
+            </w:tcMar>
+          </w:tcPr>
+          <w:p>
+            <w:pPr>
+              <w:spacing w:after="0"/>
+            </w:pPr>
+            <w:r>
+              <w:rPr>
+                <w:sz w:val="19"/>
+                <w:szCs w:val="19"/>
+              </w:rPr>
+              <w:t xml:space="preserve">Replace with the </w:t>
+            </w:r>
+            <w:r>
+              <w:rPr>
+                <w:b/>
+                <w:bCs/>
+                <w:sz w:val="19"/>
+                <w:szCs w:val="19"/>
+              </w:rPr>
+              <w:t xml:space="preserve">revised 21-line algorithm</w:t>
+            </w:r>
+            <w:r>
+              <w:rPr>
+                <w:sz w:val="19"/>
+                <w:szCs w:val="19"/>
+              </w:rPr>
+              <w:t xml:space="preserve"> at the end of this script (same as the revised manuscript, Section 3.6)</w:t>
             </w:r>
           </w:p>
         </w:tc>
@@ -7062,136 +7127,117 @@
         </w:trPr>
         <w:tc>
           <w:tcPr>
-            <w:tcW w:type="dxa" w:w="477"/>
-            <w:tcBorders>
-              <w:top w:val="single" w:color="BFBFBF" w:sz="4"/>
-              <w:left w:val="single" w:color="BFBFBF" w:sz="4"/>
-              <w:bottom w:val="single" w:color="BFBFBF" w:sz="4"/>
-              <w:right w:val="single" w:color="BFBFBF" w:sz="4"/>
-            </w:tcBorders>
-            <w:tcMar>
-              <w:top w:type="dxa" w:w="60"/>
-              <w:left w:type="dxa" w:w="100"/>
-              <w:bottom w:type="dxa" w:w="60"/>
-              <w:right w:type="dxa" w:w="100"/>
-            </w:tcMar>
-          </w:tcPr>
-          <w:p>
-            <w:pPr>
-              <w:spacing w:after="0"/>
-            </w:pPr>
-            <w:r>
-              <w:rPr>
-                <w:sz w:val="19"/>
-                <w:szCs w:val="19"/>
-              </w:rPr>
-              <w:t xml:space="preserve">12, line 8</w:t>
-            </w:r>
-          </w:p>
-        </w:tc>
-        <w:tc>
-          <w:tcPr>
-            <w:tcW w:type="dxa" w:w="2481"/>
-            <w:tcBorders>
-              <w:top w:val="single" w:color="BFBFBF" w:sz="4"/>
-              <w:left w:val="single" w:color="BFBFBF" w:sz="4"/>
-              <w:bottom w:val="single" w:color="BFBFBF" w:sz="4"/>
-              <w:right w:val="single" w:color="BFBFBF" w:sz="4"/>
-            </w:tcBorders>
-            <w:tcMar>
-              <w:top w:type="dxa" w:w="60"/>
-              <w:left w:type="dxa" w:w="100"/>
-              <w:bottom w:type="dxa" w:w="60"/>
-              <w:right w:type="dxa" w:w="100"/>
-            </w:tcMar>
-          </w:tcPr>
-          <w:p>
-            <w:pPr>
-              <w:spacing w:after="0"/>
-            </w:pPr>
-            <w:r>
-              <w:rPr>
-                <w:rFonts w:ascii="Consolas" w:cs="Consolas" w:eastAsia="Consolas" w:hAnsi="Consolas"/>
-                <w:sz w:val="19"/>
-                <w:szCs w:val="19"/>
-              </w:rPr>
-              <w:t xml:space="preserve">Score_Euc ← Compute_Euclidean_Distance(F_fused, R)</w:t>
-            </w:r>
-          </w:p>
-        </w:tc>
-        <w:tc>
-          <w:tcPr>
-            <w:tcW w:type="dxa" w:w="3339"/>
-            <w:tcBorders>
-              <w:top w:val="single" w:color="BFBFBF" w:sz="4"/>
-              <w:left w:val="single" w:color="BFBFBF" w:sz="4"/>
-              <w:bottom w:val="single" w:color="BFBFBF" w:sz="4"/>
-              <w:right w:val="single" w:color="BFBFBF" w:sz="4"/>
-            </w:tcBorders>
-            <w:tcMar>
-              <w:top w:type="dxa" w:w="60"/>
-              <w:left w:type="dxa" w:w="100"/>
-              <w:bottom w:type="dxa" w:w="60"/>
-              <w:right w:type="dxa" w:w="100"/>
-            </w:tcMar>
-          </w:tcPr>
-          <w:p>
-            <w:pPr>
-              <w:spacing w:after="0"/>
-            </w:pPr>
-            <w:r>
-              <w:rPr>
-                <w:sz w:val="19"/>
-                <w:szCs w:val="19"/>
-              </w:rPr>
-              <w:t xml:space="preserve">A </w:t>
-            </w:r>
-            <w:r>
-              <w:rPr>
-                <w:i/>
-                <w:iCs/>
-                <w:color w:val="1F4E79"/>
-                <w:sz w:val="19"/>
-                <w:szCs w:val="19"/>
-              </w:rPr>
-              <w:t xml:space="preserve">distance</w:t>
-            </w:r>
-            <w:r>
-              <w:rPr>
-                <w:sz w:val="19"/>
-                <w:szCs w:val="19"/>
-              </w:rPr>
-              <w:t xml:space="preserve"> grows as images differ, so adding it to S would push fakes toward "Real". The system converts it.</w:t>
-            </w:r>
-          </w:p>
-        </w:tc>
-        <w:tc>
-          <w:tcPr>
-            <w:tcW w:type="dxa" w:w="3341"/>
-            <w:tcBorders>
-              <w:top w:val="single" w:color="BFBFBF" w:sz="4"/>
-              <w:left w:val="single" w:color="BFBFBF" w:sz="4"/>
-              <w:bottom w:val="single" w:color="BFBFBF" w:sz="4"/>
-              <w:right w:val="single" w:color="BFBFBF" w:sz="4"/>
-            </w:tcBorders>
-            <w:tcMar>
-              <w:top w:type="dxa" w:w="60"/>
-              <w:left w:type="dxa" w:w="100"/>
-              <w:bottom w:type="dxa" w:w="60"/>
-              <w:right w:type="dxa" w:w="100"/>
-            </w:tcMar>
-          </w:tcPr>
-          <w:p>
-            <w:pPr>
-              <w:spacing w:after="0"/>
-            </w:pPr>
-            <w:r>
-              <w:rPr>
-                <w:rFonts w:ascii="Consolas" w:cs="Consolas" w:eastAsia="Consolas" w:hAnsi="Consolas"/>
-                <w:sz w:val="19"/>
-                <w:szCs w:val="19"/>
-              </w:rPr>
-              <w:t xml:space="preserve">Score_Euc ← 1 − EuclideanDistance(F_fused, R_fused) / 2  // distance converted to similarity</w:t>
+            <w:tcW w:type="dxa" w:w="926"/>
+            <w:tcBorders>
+              <w:top w:val="single" w:color="BFBFBF" w:sz="4"/>
+              <w:left w:val="single" w:color="BFBFBF" w:sz="4"/>
+              <w:bottom w:val="single" w:color="BFBFBF" w:sz="4"/>
+              <w:right w:val="single" w:color="BFBFBF" w:sz="4"/>
+            </w:tcBorders>
+            <w:tcMar>
+              <w:top w:type="dxa" w:w="60"/>
+              <w:left w:type="dxa" w:w="100"/>
+              <w:bottom w:type="dxa" w:w="60"/>
+              <w:right w:type="dxa" w:w="100"/>
+            </w:tcMar>
+          </w:tcPr>
+          <w:p>
+            <w:pPr>
+              <w:spacing w:after="0"/>
+            </w:pPr>
+            <w:r>
+              <w:rPr>
+                <w:sz w:val="19"/>
+                <w:szCs w:val="19"/>
+              </w:rPr>
+              <w:t xml:space="preserve">11, step 4</w:t>
+            </w:r>
+          </w:p>
+        </w:tc>
+        <w:tc>
+          <w:tcPr>
+            <w:tcW w:type="dxa" w:w="2224"/>
+            <w:tcBorders>
+              <w:top w:val="single" w:color="BFBFBF" w:sz="4"/>
+              <w:left w:val="single" w:color="BFBFBF" w:sz="4"/>
+              <w:bottom w:val="single" w:color="BFBFBF" w:sz="4"/>
+              <w:right w:val="single" w:color="BFBFBF" w:sz="4"/>
+            </w:tcBorders>
+            <w:tcMar>
+              <w:top w:type="dxa" w:w="60"/>
+              <w:left w:type="dxa" w:w="100"/>
+              <w:bottom w:type="dxa" w:w="60"/>
+              <w:right w:type="dxa" w:w="100"/>
+            </w:tcMar>
+          </w:tcPr>
+          <w:p>
+            <w:pPr>
+              <w:spacing w:after="0"/>
+            </w:pPr>
+            <w:r>
+              <w:rPr>
+                <w:sz w:val="19"/>
+                <w:szCs w:val="19"/>
+              </w:rPr>
+              <w:t xml:space="preserve">"…SSIM between suspect and reference embeddings"</w:t>
+            </w:r>
+          </w:p>
+        </w:tc>
+        <w:tc>
+          <w:tcPr>
+            <w:tcW w:type="dxa" w:w="3243"/>
+            <w:tcBorders>
+              <w:top w:val="single" w:color="BFBFBF" w:sz="4"/>
+              <w:left w:val="single" w:color="BFBFBF" w:sz="4"/>
+              <w:bottom w:val="single" w:color="BFBFBF" w:sz="4"/>
+              <w:right w:val="single" w:color="BFBFBF" w:sz="4"/>
+            </w:tcBorders>
+            <w:tcMar>
+              <w:top w:type="dxa" w:w="60"/>
+              <w:left w:type="dxa" w:w="100"/>
+              <w:bottom w:type="dxa" w:w="60"/>
+              <w:right w:type="dxa" w:w="100"/>
+            </w:tcMar>
+          </w:tcPr>
+          <w:p>
+            <w:pPr>
+              <w:spacing w:after="0"/>
+            </w:pPr>
+            <w:r>
+              <w:rPr>
+                <w:sz w:val="19"/>
+                <w:szCs w:val="19"/>
+              </w:rPr>
+              <w:t xml:space="preserve">Same SSIM issue.</w:t>
+            </w:r>
+          </w:p>
+        </w:tc>
+        <w:tc>
+          <w:tcPr>
+            <w:tcW w:type="dxa" w:w="3245"/>
+            <w:tcBorders>
+              <w:top w:val="single" w:color="BFBFBF" w:sz="4"/>
+              <w:left w:val="single" w:color="BFBFBF" w:sz="4"/>
+              <w:bottom w:val="single" w:color="BFBFBF" w:sz="4"/>
+              <w:right w:val="single" w:color="BFBFBF" w:sz="4"/>
+            </w:tcBorders>
+            <w:tcMar>
+              <w:top w:type="dxa" w:w="60"/>
+              <w:left w:type="dxa" w:w="100"/>
+              <w:bottom w:type="dxa" w:w="60"/>
+              <w:right w:type="dxa" w:w="100"/>
+            </w:tcMar>
+          </w:tcPr>
+          <w:p>
+            <w:pPr>
+              <w:spacing w:after="0"/>
+            </w:pPr>
+            <w:r>
+              <w:rPr>
+                <w:sz w:val="19"/>
+                <w:szCs w:val="19"/>
+              </w:rPr>
+              <w:t xml:space="preserve">"…Cosine Similarity and Euclidean Distance between the embeddings, and SSIM between the aligned face images"</w:t>
             </w:r>
           </w:p>
         </w:tc>
@@ -7202,415 +7248,7 @@
         </w:trPr>
         <w:tc>
           <w:tcPr>
-            <w:tcW w:type="dxa" w:w="477"/>
-            <w:tcBorders>
-              <w:top w:val="single" w:color="BFBFBF" w:sz="4"/>
-              <w:left w:val="single" w:color="BFBFBF" w:sz="4"/>
-              <w:bottom w:val="single" w:color="BFBFBF" w:sz="4"/>
-              <w:right w:val="single" w:color="BFBFBF" w:sz="4"/>
-            </w:tcBorders>
-            <w:tcMar>
-              <w:top w:type="dxa" w:w="60"/>
-              <w:left w:type="dxa" w:w="100"/>
-              <w:bottom w:type="dxa" w:w="60"/>
-              <w:right w:type="dxa" w:w="100"/>
-            </w:tcMar>
-          </w:tcPr>
-          <w:p>
-            <w:pPr>
-              <w:spacing w:after="0"/>
-            </w:pPr>
-            <w:r>
-              <w:rPr>
-                <w:sz w:val="19"/>
-                <w:szCs w:val="19"/>
-              </w:rPr>
-              <w:t xml:space="preserve">12, header</w:t>
-            </w:r>
-          </w:p>
-        </w:tc>
-        <w:tc>
-          <w:tcPr>
-            <w:tcW w:type="dxa" w:w="2481"/>
-            <w:tcBorders>
-              <w:top w:val="single" w:color="BFBFBF" w:sz="4"/>
-              <w:left w:val="single" w:color="BFBFBF" w:sz="4"/>
-              <w:bottom w:val="single" w:color="BFBFBF" w:sz="4"/>
-              <w:right w:val="single" w:color="BFBFBF" w:sz="4"/>
-            </w:tcBorders>
-            <w:tcMar>
-              <w:top w:type="dxa" w:w="60"/>
-              <w:left w:type="dxa" w:w="100"/>
-              <w:bottom w:type="dxa" w:w="60"/>
-              <w:right w:type="dxa" w:w="100"/>
-            </w:tcMar>
-          </w:tcPr>
-          <w:p>
-            <w:pPr>
-              <w:spacing w:after="0"/>
-            </w:pPr>
-            <w:r>
-              <w:rPr>
-                <w:rFonts w:ascii="Consolas" w:cs="Consolas" w:eastAsia="Consolas" w:hAnsi="Consolas"/>
-                <w:sz w:val="19"/>
-                <w:szCs w:val="19"/>
-              </w:rPr>
-              <w:t xml:space="preserve">Reference Tensor (R), Forensic Threshold (T)</w:t>
-            </w:r>
-          </w:p>
-        </w:tc>
-        <w:tc>
-          <w:tcPr>
-            <w:tcW w:type="dxa" w:w="3339"/>
-            <w:tcBorders>
-              <w:top w:val="single" w:color="BFBFBF" w:sz="4"/>
-              <w:left w:val="single" w:color="BFBFBF" w:sz="4"/>
-              <w:bottom w:val="single" w:color="BFBFBF" w:sz="4"/>
-              <w:right w:val="single" w:color="BFBFBF" w:sz="4"/>
-            </w:tcBorders>
-            <w:tcMar>
-              <w:top w:type="dxa" w:w="60"/>
-              <w:left w:type="dxa" w:w="100"/>
-              <w:bottom w:type="dxa" w:w="60"/>
-              <w:right w:type="dxa" w:w="100"/>
-            </w:tcMar>
-          </w:tcPr>
-          <w:p>
-            <w:pPr>
-              <w:spacing w:after="0"/>
-            </w:pPr>
-            <w:r>
-              <w:rPr>
-                <w:sz w:val="19"/>
-                <w:szCs w:val="19"/>
-              </w:rPr>
-              <w:t xml:space="preserve">The procedure uses τ, not T; R is the reference </w:t>
-            </w:r>
-            <w:r>
-              <w:rPr>
-                <w:i/>
-                <w:iCs/>
-                <w:color w:val="1F4E79"/>
-                <w:sz w:val="19"/>
-                <w:szCs w:val="19"/>
-              </w:rPr>
-              <w:t xml:space="preserve">image</w:t>
-            </w:r>
-            <w:r>
-              <w:rPr>
-                <w:sz w:val="19"/>
-                <w:szCs w:val="19"/>
-              </w:rPr>
-              <w:t xml:space="preserve">, processed by the same lines 2–6.</w:t>
-            </w:r>
-          </w:p>
-        </w:tc>
-        <w:tc>
-          <w:tcPr>
-            <w:tcW w:type="dxa" w:w="3341"/>
-            <w:tcBorders>
-              <w:top w:val="single" w:color="BFBFBF" w:sz="4"/>
-              <w:left w:val="single" w:color="BFBFBF" w:sz="4"/>
-              <w:bottom w:val="single" w:color="BFBFBF" w:sz="4"/>
-              <w:right w:val="single" w:color="BFBFBF" w:sz="4"/>
-            </w:tcBorders>
-            <w:tcMar>
-              <w:top w:type="dxa" w:w="60"/>
-              <w:left w:type="dxa" w:w="100"/>
-              <w:bottom w:type="dxa" w:w="60"/>
-              <w:right w:type="dxa" w:w="100"/>
-            </w:tcMar>
-          </w:tcPr>
-          <w:p>
-            <w:pPr>
-              <w:spacing w:after="0"/>
-            </w:pPr>
-            <w:r>
-              <w:rPr>
-                <w:rFonts w:ascii="Consolas" w:cs="Consolas" w:eastAsia="Consolas" w:hAnsi="Consolas"/>
-                <w:sz w:val="19"/>
-                <w:szCs w:val="19"/>
-              </w:rPr>
-              <w:t xml:space="preserve">// Input: Suspect Image (I), Reference Image (R), Threshold (τ)</w:t>
-            </w:r>
-            <w:r>
-              <w:rPr>
-                <w:sz w:val="19"/>
-                <w:szCs w:val="19"/>
-              </w:rPr>
-              <w:t xml:space="preserve"> and add a note: </w:t>
-            </w:r>
-            <w:r>
-              <w:rPr>
-                <w:i/>
-                <w:iCs/>
-                <w:color w:val="1F4E79"/>
-                <w:sz w:val="19"/>
-                <w:szCs w:val="19"/>
-              </w:rPr>
-              <w:t xml:space="preserve">lines 2–6 are also applied to R</w:t>
-            </w:r>
-          </w:p>
-        </w:tc>
-      </w:tr>
-      <w:tr>
-        <w:trPr>
-          <w:tblHeader w:val="off"/>
-        </w:trPr>
-        <w:tc>
-          <w:tcPr>
-            <w:tcW w:type="dxa" w:w="477"/>
-            <w:tcBorders>
-              <w:top w:val="single" w:color="BFBFBF" w:sz="4"/>
-              <w:left w:val="single" w:color="BFBFBF" w:sz="4"/>
-              <w:bottom w:val="single" w:color="BFBFBF" w:sz="4"/>
-              <w:right w:val="single" w:color="BFBFBF" w:sz="4"/>
-            </w:tcBorders>
-            <w:tcMar>
-              <w:top w:type="dxa" w:w="60"/>
-              <w:left w:type="dxa" w:w="100"/>
-              <w:bottom w:type="dxa" w:w="60"/>
-              <w:right w:type="dxa" w:w="100"/>
-            </w:tcMar>
-          </w:tcPr>
-          <w:p>
-            <w:pPr>
-              <w:spacing w:after="0"/>
-            </w:pPr>
-            <w:r>
-              <w:rPr>
-                <w:sz w:val="19"/>
-                <w:szCs w:val="19"/>
-              </w:rPr>
-              <w:t xml:space="preserve">12, line 6</w:t>
-            </w:r>
-          </w:p>
-        </w:tc>
-        <w:tc>
-          <w:tcPr>
-            <w:tcW w:type="dxa" w:w="2481"/>
-            <w:tcBorders>
-              <w:top w:val="single" w:color="BFBFBF" w:sz="4"/>
-              <w:left w:val="single" w:color="BFBFBF" w:sz="4"/>
-              <w:bottom w:val="single" w:color="BFBFBF" w:sz="4"/>
-              <w:right w:val="single" w:color="BFBFBF" w:sz="4"/>
-            </w:tcBorders>
-            <w:tcMar>
-              <w:top w:type="dxa" w:w="60"/>
-              <w:left w:type="dxa" w:w="100"/>
-              <w:bottom w:type="dxa" w:w="60"/>
-              <w:right w:type="dxa" w:w="100"/>
-            </w:tcMar>
-          </w:tcPr>
-          <w:p>
-            <w:pPr>
-              <w:spacing w:after="0"/>
-            </w:pPr>
-            <w:r>
-              <w:rPr>
-                <w:rFonts w:ascii="Consolas" w:cs="Consolas" w:eastAsia="Consolas" w:hAnsi="Consolas"/>
-                <w:sz w:val="19"/>
-                <w:szCs w:val="19"/>
-              </w:rPr>
-              <w:t xml:space="preserve">Concatenate_Vectors(F_1, F_2)</w:t>
-            </w:r>
-          </w:p>
-        </w:tc>
-        <w:tc>
-          <w:tcPr>
-            <w:tcW w:type="dxa" w:w="3339"/>
-            <w:tcBorders>
-              <w:top w:val="single" w:color="BFBFBF" w:sz="4"/>
-              <w:left w:val="single" w:color="BFBFBF" w:sz="4"/>
-              <w:bottom w:val="single" w:color="BFBFBF" w:sz="4"/>
-              <w:right w:val="single" w:color="BFBFBF" w:sz="4"/>
-            </w:tcBorders>
-            <w:tcMar>
-              <w:top w:type="dxa" w:w="60"/>
-              <w:left w:type="dxa" w:w="100"/>
-              <w:bottom w:type="dxa" w:w="60"/>
-              <w:right w:type="dxa" w:w="100"/>
-            </w:tcMar>
-          </w:tcPr>
-          <w:p>
-            <w:pPr>
-              <w:spacing w:after="0"/>
-            </w:pPr>
-            <w:r>
-              <w:rPr>
-                <w:sz w:val="19"/>
-                <w:szCs w:val="19"/>
-              </w:rPr>
-              <w:t xml:space="preserve">The system also projects to 512 values (Linear → LayerNorm) and L2-normalizes.</w:t>
-            </w:r>
-          </w:p>
-        </w:tc>
-        <w:tc>
-          <w:tcPr>
-            <w:tcW w:type="dxa" w:w="3341"/>
-            <w:tcBorders>
-              <w:top w:val="single" w:color="BFBFBF" w:sz="4"/>
-              <w:left w:val="single" w:color="BFBFBF" w:sz="4"/>
-              <w:bottom w:val="single" w:color="BFBFBF" w:sz="4"/>
-              <w:right w:val="single" w:color="BFBFBF" w:sz="4"/>
-            </w:tcBorders>
-            <w:tcMar>
-              <w:top w:type="dxa" w:w="60"/>
-              <w:left w:type="dxa" w:w="100"/>
-              <w:bottom w:type="dxa" w:w="60"/>
-              <w:right w:type="dxa" w:w="100"/>
-            </w:tcMar>
-          </w:tcPr>
-          <w:p>
-            <w:pPr>
-              <w:spacing w:after="0"/>
-            </w:pPr>
-            <w:r>
-              <w:rPr>
-                <w:sz w:val="19"/>
-                <w:szCs w:val="19"/>
-              </w:rPr>
-              <w:t xml:space="preserve">Optional: </w:t>
-            </w:r>
-            <w:r>
-              <w:rPr>
-                <w:rFonts w:ascii="Consolas" w:cs="Consolas" w:eastAsia="Consolas" w:hAnsi="Consolas"/>
-                <w:sz w:val="19"/>
-                <w:szCs w:val="19"/>
-              </w:rPr>
-              <w:t xml:space="preserve">F_fused ← L2Norm(Project(Concatenate(F_1, F_2)))</w:t>
-            </w:r>
-          </w:p>
-        </w:tc>
-      </w:tr>
-      <w:tr>
-        <w:trPr>
-          <w:tblHeader w:val="off"/>
-        </w:trPr>
-        <w:tc>
-          <w:tcPr>
-            <w:tcW w:type="dxa" w:w="477"/>
-            <w:tcBorders>
-              <w:top w:val="single" w:color="BFBFBF" w:sz="4"/>
-              <w:left w:val="single" w:color="BFBFBF" w:sz="4"/>
-              <w:bottom w:val="single" w:color="BFBFBF" w:sz="4"/>
-              <w:right w:val="single" w:color="BFBFBF" w:sz="4"/>
-            </w:tcBorders>
-            <w:tcMar>
-              <w:top w:type="dxa" w:w="60"/>
-              <w:left w:type="dxa" w:w="100"/>
-              <w:bottom w:type="dxa" w:w="60"/>
-              <w:right w:type="dxa" w:w="100"/>
-            </w:tcMar>
-          </w:tcPr>
-          <w:p>
-            <w:pPr>
-              <w:spacing w:after="0"/>
-            </w:pPr>
-            <w:r>
-              <w:rPr>
-                <w:sz w:val="19"/>
-                <w:szCs w:val="19"/>
-              </w:rPr>
-              <w:t xml:space="preserve">11, step 4</w:t>
-            </w:r>
-          </w:p>
-        </w:tc>
-        <w:tc>
-          <w:tcPr>
-            <w:tcW w:type="dxa" w:w="2481"/>
-            <w:tcBorders>
-              <w:top w:val="single" w:color="BFBFBF" w:sz="4"/>
-              <w:left w:val="single" w:color="BFBFBF" w:sz="4"/>
-              <w:bottom w:val="single" w:color="BFBFBF" w:sz="4"/>
-              <w:right w:val="single" w:color="BFBFBF" w:sz="4"/>
-            </w:tcBorders>
-            <w:tcMar>
-              <w:top w:type="dxa" w:w="60"/>
-              <w:left w:type="dxa" w:w="100"/>
-              <w:bottom w:type="dxa" w:w="60"/>
-              <w:right w:type="dxa" w:w="100"/>
-            </w:tcMar>
-          </w:tcPr>
-          <w:p>
-            <w:pPr>
-              <w:spacing w:after="0"/>
-            </w:pPr>
-            <w:r>
-              <w:rPr>
-                <w:sz w:val="19"/>
-                <w:szCs w:val="19"/>
-              </w:rPr>
-              <w:t xml:space="preserve">"…SSIM between suspect and reference embeddings"</w:t>
-            </w:r>
-          </w:p>
-        </w:tc>
-        <w:tc>
-          <w:tcPr>
-            <w:tcW w:type="dxa" w:w="3339"/>
-            <w:tcBorders>
-              <w:top w:val="single" w:color="BFBFBF" w:sz="4"/>
-              <w:left w:val="single" w:color="BFBFBF" w:sz="4"/>
-              <w:bottom w:val="single" w:color="BFBFBF" w:sz="4"/>
-              <w:right w:val="single" w:color="BFBFBF" w:sz="4"/>
-            </w:tcBorders>
-            <w:tcMar>
-              <w:top w:type="dxa" w:w="60"/>
-              <w:left w:type="dxa" w:w="100"/>
-              <w:bottom w:type="dxa" w:w="60"/>
-              <w:right w:type="dxa" w:w="100"/>
-            </w:tcMar>
-          </w:tcPr>
-          <w:p>
-            <w:pPr>
-              <w:spacing w:after="0"/>
-            </w:pPr>
-            <w:r>
-              <w:rPr>
-                <w:sz w:val="19"/>
-                <w:szCs w:val="19"/>
-              </w:rPr>
-              <w:t xml:space="preserve">Same SSIM issue.</w:t>
-            </w:r>
-          </w:p>
-        </w:tc>
-        <w:tc>
-          <w:tcPr>
-            <w:tcW w:type="dxa" w:w="3341"/>
-            <w:tcBorders>
-              <w:top w:val="single" w:color="BFBFBF" w:sz="4"/>
-              <w:left w:val="single" w:color="BFBFBF" w:sz="4"/>
-              <w:bottom w:val="single" w:color="BFBFBF" w:sz="4"/>
-              <w:right w:val="single" w:color="BFBFBF" w:sz="4"/>
-            </w:tcBorders>
-            <w:tcMar>
-              <w:top w:type="dxa" w:w="60"/>
-              <w:left w:type="dxa" w:w="100"/>
-              <w:bottom w:type="dxa" w:w="60"/>
-              <w:right w:type="dxa" w:w="100"/>
-            </w:tcMar>
-          </w:tcPr>
-          <w:p>
-            <w:pPr>
-              <w:spacing w:after="0"/>
-            </w:pPr>
-            <w:r>
-              <w:rPr>
-                <w:sz w:val="19"/>
-                <w:szCs w:val="19"/>
-              </w:rPr>
-              <w:t xml:space="preserve">"…Cosine Similarity and Euclidean Distance between the embeddings, and SSIM between the aligned face images"</w:t>
-            </w:r>
-          </w:p>
-        </w:tc>
-      </w:tr>
-      <w:tr>
-        <w:trPr>
-          <w:tblHeader w:val="off"/>
-        </w:trPr>
-        <w:tc>
-          <w:tcPr>
-            <w:tcW w:type="dxa" w:w="477"/>
+            <w:tcW w:type="dxa" w:w="926"/>
             <w:tcBorders>
               <w:top w:val="single" w:color="BFBFBF" w:sz="4"/>
               <w:left w:val="single" w:color="BFBFBF" w:sz="4"/>
@@ -7639,7 +7277,7 @@
         </w:tc>
         <w:tc>
           <w:tcPr>
-            <w:tcW w:type="dxa" w:w="2481"/>
+            <w:tcW w:type="dxa" w:w="2224"/>
             <w:tcBorders>
               <w:top w:val="single" w:color="BFBFBF" w:sz="4"/>
               <w:left w:val="single" w:color="BFBFBF" w:sz="4"/>
@@ -7668,7 +7306,7 @@
         </w:tc>
         <w:tc>
           <w:tcPr>
-            <w:tcW w:type="dxa" w:w="3339"/>
+            <w:tcW w:type="dxa" w:w="3243"/>
             <w:tcBorders>
               <w:top w:val="single" w:color="BFBFBF" w:sz="4"/>
               <w:left w:val="single" w:color="BFBFBF" w:sz="4"/>
@@ -7697,7 +7335,7 @@
         </w:tc>
         <w:tc>
           <w:tcPr>
-            <w:tcW w:type="dxa" w:w="3341"/>
+            <w:tcW w:type="dxa" w:w="3245"/>
             <w:tcBorders>
               <w:top w:val="single" w:color="BFBFBF" w:sz="4"/>
               <w:left w:val="single" w:color="BFBFBF" w:sz="4"/>
@@ -7742,7 +7380,7 @@
     </w:p>
     <w:p>
       <w:r>
-        <w:t xml:space="preserve">The confidence score is also computed next to lines 11–15. You can add it as a line or just mention it verbally, as in the script.</w:t>
+        <w:t xml:space="preserve">The revised algorithm already includes the confidence score (line 16) and the review queue (line 17).</w:t>
       </w:r>
     </w:p>
     <w:p>
@@ -9828,7 +9466,7 @@
           <w:iCs/>
           <w:color w:val="1F4E79"/>
         </w:rPr>
-        <w:t xml:space="preserve">"As shown in our algorithm, line 9…"</w:t>
+        <w:t xml:space="preserve">"As shown in our algorithm, line 13…"</w:t>
       </w:r>
     </w:p>
     <w:p>
@@ -12590,6 +12228,432 @@
           <w:color w:val="1F4E79"/>
         </w:rPr>
         <w:t xml:space="preserve">"May we clarify, sir/ma'am, regarding…"</w:t>
+      </w:r>
+    </w:p>
+    <w:p>
+      <w:pPr>
+        <w:pBdr>
+          <w:bottom w:val="single" w:color="BFBFBF" w:sz="6" w:space="1"/>
+        </w:pBdr>
+        <w:spacing w:after="200"/>
+      </w:pPr>
+    </w:p>
+    <w:p>
+      <w:pPr>
+        <w:pStyle w:val="Heading1"/>
+      </w:pPr>
+      <w:r>
+        <w:t xml:space="preserve">Revised algorithm for Slide 12</w:t>
+      </w:r>
+    </w:p>
+    <w:p>
+      <w:r>
+        <w:t xml:space="preserve">Same as the revised manuscript (Section 3.6). Use a monospaced font (e.g. Consolas) on the slide so the indentation stays aligned.</w:t>
+      </w:r>
+    </w:p>
+    <w:p>
+      <w:pPr>
+        <w:shd w:fill="F2F2F2" w:color="auto" w:val="clear"/>
+        <w:spacing w:after="0"/>
+        <w:ind w:left="360"/>
+      </w:pPr>
+      <w:r>
+        <w:rPr>
+          <w:rFonts w:ascii="Consolas" w:cs="Consolas" w:eastAsia="Consolas" w:hAnsi="Consolas"/>
+          <w:sz w:val="19"/>
+          <w:szCs w:val="19"/>
+        </w:rPr>
+        <w:t xml:space="preserve">Algorithm: Hybrid CNN-Transformer Multi-Metric Verification Pipeline with Human-in-the-Loop Review</w:t>
+      </w:r>
+    </w:p>
+    <w:p>
+      <w:pPr>
+        <w:shd w:fill="F2F2F2" w:color="auto" w:val="clear"/>
+        <w:spacing w:after="0"/>
+        <w:ind w:left="360"/>
+      </w:pPr>
+      <w:r>
+        <w:rPr>
+          <w:rFonts w:ascii="Consolas" w:cs="Consolas" w:eastAsia="Consolas" w:hAnsi="Consolas"/>
+          <w:sz w:val="19"/>
+          <w:szCs w:val="19"/>
+        </w:rPr>
+        <w:t xml:space="preserve">Input:  Suspect Image (I), Reference Image (R), Forensic Threshold (τ), Metric Weights (w_cos, w_euc, w_ssim)</w:t>
+      </w:r>
+    </w:p>
+    <w:p>
+      <w:pPr>
+        <w:shd w:fill="F2F2F2" w:color="auto" w:val="clear"/>
+        <w:spacing w:after="0"/>
+        <w:ind w:left="360"/>
+      </w:pPr>
+      <w:r>
+        <w:rPr>
+          <w:rFonts w:ascii="Consolas" w:cs="Consolas" w:eastAsia="Consolas" w:hAnsi="Consolas"/>
+          <w:sz w:val="19"/>
+          <w:szCs w:val="19"/>
+        </w:rPr>
+        <w:t xml:space="preserve">Output: Preliminary Classification (C ∈ {Real, Deepfake}), Confidence (conf), Aggregated Similarity Score (S),</w:t>
+      </w:r>
+    </w:p>
+    <w:p>
+      <w:pPr>
+        <w:shd w:fill="F2F2F2" w:color="auto" w:val="clear"/>
+        <w:spacing w:after="0"/>
+        <w:ind w:left="360"/>
+      </w:pPr>
+      <w:r>
+        <w:rPr>
+          <w:rFonts w:ascii="Consolas" w:cs="Consolas" w:eastAsia="Consolas" w:hAnsi="Consolas"/>
+          <w:sz w:val="19"/>
+          <w:szCs w:val="19"/>
+        </w:rPr>
+        <w:t xml:space="preserve">        Final Human-Verified Decision (D ∈ {Real, Deepfake, Inconclusive}), Forensic Report (FR)</w:t>
+      </w:r>
+    </w:p>
+    <w:p>
+      <w:pPr>
+        <w:shd w:fill="F2F2F2" w:color="auto" w:val="clear"/>
+        <w:spacing w:after="0"/>
+        <w:ind w:left="360"/>
+      </w:pPr>
+      <w:r>
+        <w:rPr>
+          <w:rFonts w:ascii="Consolas" w:cs="Consolas" w:eastAsia="Consolas" w:hAnsi="Consolas"/>
+          <w:sz w:val="19"/>
+          <w:szCs w:val="19"/>
+        </w:rPr>
+        <w:t xml:space="preserve"> </w:t>
+      </w:r>
+    </w:p>
+    <w:p>
+      <w:pPr>
+        <w:shd w:fill="F2F2F2" w:color="auto" w:val="clear"/>
+        <w:spacing w:after="0"/>
+        <w:ind w:left="360"/>
+      </w:pPr>
+      <w:r>
+        <w:rPr>
+          <w:rFonts w:ascii="Consolas" w:cs="Consolas" w:eastAsia="Consolas" w:hAnsi="Consolas"/>
+          <w:sz w:val="19"/>
+          <w:szCs w:val="19"/>
+        </w:rPr>
+        <w:t xml:space="preserve">1:  procedure VERIFY_MEDIA(I, R, τ)</w:t>
+      </w:r>
+    </w:p>
+    <w:p>
+      <w:pPr>
+        <w:shd w:fill="F2F2F2" w:color="auto" w:val="clear"/>
+        <w:spacing w:after="0"/>
+        <w:ind w:left="360"/>
+      </w:pPr>
+      <w:r>
+        <w:rPr>
+          <w:rFonts w:ascii="Consolas" w:cs="Consolas" w:eastAsia="Consolas" w:hAnsi="Consolas"/>
+          <w:sz w:val="19"/>
+          <w:szCs w:val="19"/>
+        </w:rPr>
+        <w:t xml:space="preserve">2:    for each X ∈ {I, R} do                                     // suspect and reference processed identically</w:t>
+      </w:r>
+    </w:p>
+    <w:p>
+      <w:pPr>
+        <w:shd w:fill="F2F2F2" w:color="auto" w:val="clear"/>
+        <w:spacing w:after="0"/>
+        <w:ind w:left="360"/>
+      </w:pPr>
+      <w:r>
+        <w:rPr>
+          <w:rFonts w:ascii="Consolas" w:cs="Consolas" w:eastAsia="Consolas" w:hAnsi="Consolas"/>
+          <w:sz w:val="19"/>
+          <w:szCs w:val="19"/>
+        </w:rPr>
+        <w:t xml:space="preserve">3:      X_face ← MTCNN_Detect_Largest_Face(X)</w:t>
+      </w:r>
+    </w:p>
+    <w:p>
+      <w:pPr>
+        <w:shd w:fill="F2F2F2" w:color="auto" w:val="clear"/>
+        <w:spacing w:after="0"/>
+        <w:ind w:left="360"/>
+      </w:pPr>
+      <w:r>
+        <w:rPr>
+          <w:rFonts w:ascii="Consolas" w:cs="Consolas" w:eastAsia="Consolas" w:hAnsi="Consolas"/>
+          <w:sz w:val="19"/>
+          <w:szCs w:val="19"/>
+        </w:rPr>
+        <w:t xml:space="preserve">4:      if X_face = ∅ then return "No face detected. Case cannot be analyzed."</w:t>
+      </w:r>
+    </w:p>
+    <w:p>
+      <w:pPr>
+        <w:shd w:fill="F2F2F2" w:color="auto" w:val="clear"/>
+        <w:spacing w:after="0"/>
+        <w:ind w:left="360"/>
+      </w:pPr>
+      <w:r>
+        <w:rPr>
+          <w:rFonts w:ascii="Consolas" w:cs="Consolas" w:eastAsia="Consolas" w:hAnsi="Consolas"/>
+          <w:sz w:val="19"/>
+          <w:szCs w:val="19"/>
+        </w:rPr>
+        <w:t xml:space="preserve">5:      X_aligned ← Align_Crop_Resize(X, X_face, [380, 380])      // eyes level, small margin</w:t>
+      </w:r>
+    </w:p>
+    <w:p>
+      <w:pPr>
+        <w:shd w:fill="F2F2F2" w:color="auto" w:val="clear"/>
+        <w:spacing w:after="0"/>
+        <w:ind w:left="360"/>
+      </w:pPr>
+      <w:r>
+        <w:rPr>
+          <w:rFonts w:ascii="Consolas" w:cs="Consolas" w:eastAsia="Consolas" w:hAnsi="Consolas"/>
+          <w:sz w:val="19"/>
+          <w:szCs w:val="19"/>
+        </w:rPr>
+        <w:t xml:space="preserve">6:      X_norm ← Normalize(X_aligned)                             // ImageNet mean and std</w:t>
+      </w:r>
+    </w:p>
+    <w:p>
+      <w:pPr>
+        <w:shd w:fill="F2F2F2" w:color="auto" w:val="clear"/>
+        <w:spacing w:after="0"/>
+        <w:ind w:left="360"/>
+      </w:pPr>
+      <w:r>
+        <w:rPr>
+          <w:rFonts w:ascii="Consolas" w:cs="Consolas" w:eastAsia="Consolas" w:hAnsi="Consolas"/>
+          <w:sz w:val="19"/>
+          <w:szCs w:val="19"/>
+        </w:rPr>
+        <w:t xml:space="preserve">7:      F_1 ← EfficientNet_B4(X_norm)                             // local features (1,792-d)</w:t>
+      </w:r>
+    </w:p>
+    <w:p>
+      <w:pPr>
+        <w:shd w:fill="F2F2F2" w:color="auto" w:val="clear"/>
+        <w:spacing w:after="0"/>
+        <w:ind w:left="360"/>
+      </w:pPr>
+      <w:r>
+        <w:rPr>
+          <w:rFonts w:ascii="Consolas" w:cs="Consolas" w:eastAsia="Consolas" w:hAnsi="Consolas"/>
+          <w:sz w:val="19"/>
+          <w:szCs w:val="19"/>
+        </w:rPr>
+        <w:t xml:space="preserve">8:      F_2 ← Vision_Transformer(Resize(X_norm, [384, 384]))      // global features (384-d)</w:t>
+      </w:r>
+    </w:p>
+    <w:p>
+      <w:pPr>
+        <w:shd w:fill="F2F2F2" w:color="auto" w:val="clear"/>
+        <w:spacing w:after="0"/>
+        <w:ind w:left="360"/>
+      </w:pPr>
+      <w:r>
+        <w:rPr>
+          <w:rFonts w:ascii="Consolas" w:cs="Consolas" w:eastAsia="Consolas" w:hAnsi="Consolas"/>
+          <w:sz w:val="19"/>
+          <w:szCs w:val="19"/>
+        </w:rPr>
+        <w:t xml:space="preserve">9:      X_fused ← L2_Normalize(LayerNorm(Linear(Concatenate(F_1, F_2))))   // 512-d embedding</w:t>
+      </w:r>
+    </w:p>
+    <w:p>
+      <w:pPr>
+        <w:shd w:fill="F2F2F2" w:color="auto" w:val="clear"/>
+        <w:spacing w:after="0"/>
+        <w:ind w:left="360"/>
+      </w:pPr>
+      <w:r>
+        <w:rPr>
+          <w:rFonts w:ascii="Consolas" w:cs="Consolas" w:eastAsia="Consolas" w:hAnsi="Consolas"/>
+          <w:sz w:val="19"/>
+          <w:szCs w:val="19"/>
+        </w:rPr>
+        <w:t xml:space="preserve">10:   end for</w:t>
+      </w:r>
+    </w:p>
+    <w:p>
+      <w:pPr>
+        <w:shd w:fill="F2F2F2" w:color="auto" w:val="clear"/>
+        <w:spacing w:after="0"/>
+        <w:ind w:left="360"/>
+      </w:pPr>
+      <w:r>
+        <w:rPr>
+          <w:rFonts w:ascii="Consolas" w:cs="Consolas" w:eastAsia="Consolas" w:hAnsi="Consolas"/>
+          <w:sz w:val="19"/>
+          <w:szCs w:val="19"/>
+        </w:rPr>
+        <w:t xml:space="preserve">11:   Score_Cos ← (CosineSimilarity(I_fused, R_fused) + 1) / 2</w:t>
+      </w:r>
+    </w:p>
+    <w:p>
+      <w:pPr>
+        <w:shd w:fill="F2F2F2" w:color="auto" w:val="clear"/>
+        <w:spacing w:after="0"/>
+        <w:ind w:left="360"/>
+      </w:pPr>
+      <w:r>
+        <w:rPr>
+          <w:rFonts w:ascii="Consolas" w:cs="Consolas" w:eastAsia="Consolas" w:hAnsi="Consolas"/>
+          <w:sz w:val="19"/>
+          <w:szCs w:val="19"/>
+        </w:rPr>
+        <w:t xml:space="preserve">12:   Score_Euc ← 1 − EuclideanDistance(I_fused, R_fused) / 2</w:t>
+      </w:r>
+    </w:p>
+    <w:p>
+      <w:pPr>
+        <w:shd w:fill="F2F2F2" w:color="auto" w:val="clear"/>
+        <w:spacing w:after="0"/>
+        <w:ind w:left="360"/>
+      </w:pPr>
+      <w:r>
+        <w:rPr>
+          <w:rFonts w:ascii="Consolas" w:cs="Consolas" w:eastAsia="Consolas" w:hAnsi="Consolas"/>
+          <w:sz w:val="19"/>
+          <w:szCs w:val="19"/>
+        </w:rPr>
+        <w:t xml:space="preserve">13:   Score_SSIM ← SSIM(Grayscale(I_aligned), Grayscale(R_aligned))        // on face crops</w:t>
+      </w:r>
+    </w:p>
+    <w:p>
+      <w:pPr>
+        <w:shd w:fill="F2F2F2" w:color="auto" w:val="clear"/>
+        <w:spacing w:after="0"/>
+        <w:ind w:left="360"/>
+      </w:pPr>
+      <w:r>
+        <w:rPr>
+          <w:rFonts w:ascii="Consolas" w:cs="Consolas" w:eastAsia="Consolas" w:hAnsi="Consolas"/>
+          <w:sz w:val="19"/>
+          <w:szCs w:val="19"/>
+        </w:rPr>
+        <w:t xml:space="preserve">14:   S ← w_cos·Score_Cos + w_euc·Score_Euc + w_ssim·Score_SSIM</w:t>
+      </w:r>
+    </w:p>
+    <w:p>
+      <w:pPr>
+        <w:shd w:fill="F2F2F2" w:color="auto" w:val="clear"/>
+        <w:spacing w:after="0"/>
+        <w:ind w:left="360"/>
+      </w:pPr>
+      <w:r>
+        <w:rPr>
+          <w:rFonts w:ascii="Consolas" w:cs="Consolas" w:eastAsia="Consolas" w:hAnsi="Consolas"/>
+          <w:sz w:val="19"/>
+          <w:szCs w:val="19"/>
+        </w:rPr>
+        <w:t xml:space="preserve">15:   if S ≥ τ then C ← "Real" else C ← "Deepfake"</w:t>
+      </w:r>
+    </w:p>
+    <w:p>
+      <w:pPr>
+        <w:shd w:fill="F2F2F2" w:color="auto" w:val="clear"/>
+        <w:spacing w:after="0"/>
+        <w:ind w:left="360"/>
+      </w:pPr>
+      <w:r>
+        <w:rPr>
+          <w:rFonts w:ascii="Consolas" w:cs="Consolas" w:eastAsia="Consolas" w:hAnsi="Consolas"/>
+          <w:sz w:val="19"/>
+          <w:szCs w:val="19"/>
+        </w:rPr>
+        <w:t xml:space="preserve">16:   conf ← 0.5 + 0.5 · min(1, |S − τ| / max(τ, 1 − τ))</w:t>
+      </w:r>
+    </w:p>
+    <w:p>
+      <w:pPr>
+        <w:shd w:fill="F2F2F2" w:color="auto" w:val="clear"/>
+        <w:spacing w:after="0"/>
+        <w:ind w:left="360"/>
+      </w:pPr>
+      <w:r>
+        <w:rPr>
+          <w:rFonts w:ascii="Consolas" w:cs="Consolas" w:eastAsia="Consolas" w:hAnsi="Consolas"/>
+          <w:sz w:val="19"/>
+          <w:szCs w:val="19"/>
+        </w:rPr>
+        <w:t xml:space="preserve">17:   Add case (C, conf, S, scores) to the review queue as "pending"   // automated stage ends</w:t>
+      </w:r>
+    </w:p>
+    <w:p>
+      <w:pPr>
+        <w:shd w:fill="F2F2F2" w:color="auto" w:val="clear"/>
+        <w:spacing w:after="0"/>
+        <w:ind w:left="360"/>
+      </w:pPr>
+      <w:r>
+        <w:rPr>
+          <w:rFonts w:ascii="Consolas" w:cs="Consolas" w:eastAsia="Consolas" w:hAnsi="Consolas"/>
+          <w:sz w:val="19"/>
+          <w:szCs w:val="19"/>
+        </w:rPr>
+        <w:t xml:space="preserve">18:   D, Rationale ← Human_In_The_Loop_Review(C, conf, S, scores, I_aligned, R_aligned)</w:t>
+      </w:r>
+    </w:p>
+    <w:p>
+      <w:pPr>
+        <w:shd w:fill="F2F2F2" w:color="auto" w:val="clear"/>
+        <w:spacing w:after="0"/>
+        <w:ind w:left="360"/>
+      </w:pPr>
+      <w:r>
+        <w:rPr>
+          <w:rFonts w:ascii="Consolas" w:cs="Consolas" w:eastAsia="Consolas" w:hAnsi="Consolas"/>
+          <w:sz w:val="19"/>
+          <w:szCs w:val="19"/>
+        </w:rPr>
+        <w:t xml:space="preserve">          // Confirm: D ← C;  Override: D ← opposite of C;  Flag: D ← "Inconclusive"</w:t>
+      </w:r>
+    </w:p>
+    <w:p>
+      <w:pPr>
+        <w:shd w:fill="F2F2F2" w:color="auto" w:val="clear"/>
+        <w:spacing w:after="0"/>
+        <w:ind w:left="360"/>
+      </w:pPr>
+      <w:r>
+        <w:rPr>
+          <w:rFonts w:ascii="Consolas" w:cs="Consolas" w:eastAsia="Consolas" w:hAnsi="Consolas"/>
+          <w:sz w:val="19"/>
+          <w:szCs w:val="19"/>
+        </w:rPr>
+        <w:t xml:space="preserve">19:   FR ← Generate_Forensic_Report(C, conf, S, scores, D, Rationale)</w:t>
+      </w:r>
+    </w:p>
+    <w:p>
+      <w:pPr>
+        <w:shd w:fill="F2F2F2" w:color="auto" w:val="clear"/>
+        <w:spacing w:after="0"/>
+        <w:ind w:left="360"/>
+      </w:pPr>
+      <w:r>
+        <w:rPr>
+          <w:rFonts w:ascii="Consolas" w:cs="Consolas" w:eastAsia="Consolas" w:hAnsi="Consolas"/>
+          <w:sz w:val="19"/>
+          <w:szCs w:val="19"/>
+        </w:rPr>
+        <w:t xml:space="preserve">20:   return C, S, D, FR</w:t>
+      </w:r>
+    </w:p>
+    <w:p>
+      <w:pPr>
+        <w:shd w:fill="F2F2F2" w:color="auto" w:val="clear"/>
+        <w:spacing w:after="160"/>
+        <w:ind w:left="360"/>
+      </w:pPr>
+      <w:r>
+        <w:rPr>
+          <w:rFonts w:ascii="Consolas" w:cs="Consolas" w:eastAsia="Consolas" w:hAnsi="Consolas"/>
+          <w:sz w:val="19"/>
+          <w:szCs w:val="19"/>
+        </w:rPr>
+        <w:t xml:space="preserve">21: end procedure</w:t>
       </w:r>
     </w:p>
     <w:sectPr>

</xml_diff>

<commit_message>
Add admin-only 'Delete case' button to the dashboard
Admins can securely delete a case from the web interface. A reason and a
confirmation are required; the deletion uses the same secure purge as the
CLI and is logged with the reason and file hashes. Investigators and
analysts cannot delete. README and defense script updated.

Co-Authored-By: Claude Opus 5.5 <noreply@anthropic.com>
Claude-Session: https://claude.ai/code/session_01HzDX4JgA3rVyVP8b16fmMh
</commit_message>
<xml_diff>
--- a/deepfake_hitl/docs/Presentation_Script.docx
+++ b/deepfake_hitl/docs/Presentation_Script.docx
@@ -11977,7 +11977,23 @@
                 <w:sz w:val="19"/>
                 <w:szCs w:val="19"/>
               </w:rPr>
-              <w:t xml:space="preserve">Only an admin, through a secure purge command that overwrites the files and logs the deletion.</w:t>
+              <w:t xml:space="preserve">Only an admin, using the </w:t>
+            </w:r>
+            <w:r>
+              <w:rPr>
+                <w:b/>
+                <w:bCs/>
+                <w:sz w:val="19"/>
+                <w:szCs w:val="19"/>
+              </w:rPr>
+              <w:t xml:space="preserve">Delete case</w:t>
+            </w:r>
+            <w:r>
+              <w:rPr>
+                <w:sz w:val="19"/>
+                <w:szCs w:val="19"/>
+              </w:rPr>
+              <w:t xml:space="preserve"> button (with a required reason and confirmation) or the purge command. Files are overwritten before deletion, and each deletion is logged with the reason and the file hashes.</w:t>
             </w:r>
           </w:p>
         </w:tc>

</xml_diff>